<commit_message>
Ajoute les licences : CC BY 4.0 (supports) et MIT (scripts)
Mention de licence sur la page de garde des notes et sur la diapo contact.

Co-Authored-By: Claude Opus 5.5 <noreply@anthropic.com>
</commit_message>
<xml_diff>
--- a/skills-claude-notes-presentateur.docx
+++ b/skills-claude-notes-presentateur.docx
@@ -104,7 +104,7 @@
         <w:pStyle w:val="Body"/>
         <w:spacing w:after="40"/>
       </w:pPr>
-      <w:hyperlink w:history="1" r:id="rIdw9sjbksdx-hvglrgyv98u">
+      <w:hyperlink w:history="1" r:id="rIdyyu0ib4tjzkrd7gnx3toy">
         <w:r>
           <w:rPr>
             <w:rStyle w:val="Hyperlink"/>
@@ -120,7 +120,7 @@
         <w:pStyle w:val="Body"/>
         <w:spacing w:after="120"/>
       </w:pPr>
-      <w:hyperlink w:history="1" r:id="rIdqp4guigbda8bxmoiqpewh">
+      <w:hyperlink w:history="1" r:id="rIdgrycoiheudsmj9fqc49-z">
         <w:r>
           <w:rPr>
             <w:rStyle w:val="Hyperlink"/>
@@ -152,7 +152,7 @@
         <w:pStyle w:val="Body"/>
         <w:spacing w:after="120"/>
       </w:pPr>
-      <w:hyperlink w:history="1" r:id="rId7fxk_1fn63rxwlfbywxjh">
+      <w:hyperlink w:history="1" r:id="rIds-x3vxa821whd84o8d-d6">
         <w:r>
           <w:rPr>
             <w:rStyle w:val="Hyperlink"/>
@@ -162,6 +162,22 @@
           <w:t xml:space="preserve">github.com/StephaneBayle/creer-une-skill-claude</w:t>
         </w:r>
       </w:hyperlink>
+    </w:p>
+    <w:p>
+      <w:pPr>
+        <w:pStyle w:val="Body"/>
+        <w:spacing w:before="200"/>
+      </w:pPr>
+      <w:r>
+        <w:rPr>
+          <w:rFonts w:ascii="Calibri" w:cs="Calibri" w:eastAsia="Calibri" w:hAnsi="Calibri"/>
+          <w:color w:val="566070"/>
+          <w:sz w:val="18"/>
+          <w:szCs w:val="18"/>
+          <w:lang w:val="fr-FR"/>
+        </w:rPr>
+        <w:t xml:space="preserve">Supports sous licence Creative Commons Attribution 4.0 (CC BY 4.0) : réutilisation et adaptation libres en citant l'auteur et le lien du dépôt. Scripts de génération sous licence MIT.</w:t>
+      </w:r>
     </w:p>
     <w:p>
       <w:pPr>
@@ -19534,7 +19550,7 @@
         </w:rPr>
         <w:t xml:space="preserve">Tous les supports de cette séance (présentation, notes, cartons, sources) : </w:t>
       </w:r>
-      <w:hyperlink w:history="1" r:id="rId6udcncndstkeqephrizpl">
+      <w:hyperlink w:history="1" r:id="rId1b_qc0bgv5r85sbejb2ur">
         <w:r>
           <w:rPr>
             <w:rStyle w:val="Hyperlink"/>
@@ -19561,7 +19577,7 @@
         </w:rPr>
         <w:t xml:space="preserve">Utiliser les skills dans Claude (aide officielle) : </w:t>
       </w:r>
-      <w:hyperlink w:history="1" r:id="rIdp2bfmt4vbxzzre7qfmn93">
+      <w:hyperlink w:history="1" r:id="rIdlolemfm8fmyuhmsuwn12h">
         <w:r>
           <w:rPr>
             <w:rStyle w:val="Hyperlink"/>
@@ -19588,7 +19604,7 @@
         </w:rPr>
         <w:t xml:space="preserve">Qu'est-ce qu'une skill ? : </w:t>
       </w:r>
-      <w:hyperlink w:history="1" r:id="rIdczkw6fhsfiyrsw9jn0hjr">
+      <w:hyperlink w:history="1" r:id="rIdw70bd2p1d5cl-7jvq9s0x">
         <w:r>
           <w:rPr>
             <w:rStyle w:val="Hyperlink"/>
@@ -19615,7 +19631,7 @@
         </w:rPr>
         <w:t xml:space="preserve">Créer une skill personnalisée : </w:t>
       </w:r>
-      <w:hyperlink w:history="1" r:id="rIdqzhco_u48qwfur0fsnlo7">
+      <w:hyperlink w:history="1" r:id="rIdp1nrucsrqn-fl35oop86d">
         <w:r>
           <w:rPr>
             <w:rStyle w:val="Hyperlink"/>
@@ -19642,7 +19658,7 @@
         </w:rPr>
         <w:t xml:space="preserve">Gérer les skills d'une organisation : </w:t>
       </w:r>
-      <w:hyperlink w:history="1" r:id="rIdp5vt2sfw3d1zhud8cv0ct">
+      <w:hyperlink w:history="1" r:id="rIdpjyfeg6zz8l1xx43bj-lz">
         <w:r>
           <w:rPr>
             <w:rStyle w:val="Hyperlink"/>
@@ -19669,7 +19685,7 @@
         </w:rPr>
         <w:t xml:space="preserve">Utiliser les plugins : </w:t>
       </w:r>
-      <w:hyperlink w:history="1" r:id="rId7rwormu_-q3kun-qej5mz">
+      <w:hyperlink w:history="1" r:id="rIdqutyfa-kx-x8nhxbp1ffb">
         <w:r>
           <w:rPr>
             <w:rStyle w:val="Hyperlink"/>
@@ -19696,7 +19712,7 @@
         </w:rPr>
         <w:t xml:space="preserve">Dépôt d'exemples d'Anthropic : </w:t>
       </w:r>
-      <w:hyperlink w:history="1" r:id="rId2kmtgsyg_dpomnw0cendw">
+      <w:hyperlink w:history="1" r:id="rIdf2su_jayvbzhi9_cjes6x">
         <w:r>
           <w:rPr>
             <w:rStyle w:val="Hyperlink"/>
@@ -19723,7 +19739,7 @@
         </w:rPr>
         <w:t xml:space="preserve">Skills dans Claude Code : </w:t>
       </w:r>
-      <w:hyperlink w:history="1" r:id="rId5yxw0jixqj0rnewq0lhj2">
+      <w:hyperlink w:history="1" r:id="rIdubwlepuxkrurt8w65kqn2">
         <w:r>
           <w:rPr>
             <w:rStyle w:val="Hyperlink"/>
@@ -19750,7 +19766,7 @@
         </w:rPr>
         <w:t xml:space="preserve">Standard ouvert Agent Skills : </w:t>
       </w:r>
-      <w:hyperlink w:history="1" r:id="rIdhm-g4oadx7avwvkvttfxd">
+      <w:hyperlink w:history="1" r:id="rIdzpncwuqk1wzc0zvmtj_qr">
         <w:r>
           <w:rPr>
             <w:rStyle w:val="Hyperlink"/>
@@ -19777,7 +19793,7 @@
         </w:rPr>
         <w:t xml:space="preserve">Cas d'usage : empaqueter sa charte de marque (Claude Academy) : </w:t>
       </w:r>
-      <w:hyperlink w:history="1" r:id="rIdkwroq38so0w-jyegisqvc">
+      <w:hyperlink w:history="1" r:id="rIdtsrf7buawd-kviknn4ndr">
         <w:r>
           <w:rPr>
             <w:rStyle w:val="Hyperlink"/>
@@ -19804,7 +19820,7 @@
         </w:rPr>
         <w:t xml:space="preserve">Créer une skill en conversation avec Claude (Claude Academy) : </w:t>
       </w:r>
-      <w:hyperlink w:history="1" r:id="rIdrk2li24yeyr6b6euexrnh">
+      <w:hyperlink w:history="1" r:id="rIdnege0qqfvzlj3tkwfzbmg">
         <w:r>
           <w:rPr>
             <w:rStyle w:val="Hyperlink"/>
@@ -19831,7 +19847,7 @@
         </w:rPr>
         <w:t xml:space="preserve">Modes de permission et mode plan (Claude Code) : </w:t>
       </w:r>
-      <w:hyperlink w:history="1" r:id="rIdgkugjs1fhpgciq7pqvyy-">
+      <w:hyperlink w:history="1" r:id="rIdgghzvdt987nxr6gbdor-8">
         <w:r>
           <w:rPr>
             <w:rStyle w:val="Hyperlink"/>
@@ -19858,7 +19874,7 @@
         </w:rPr>
         <w:t xml:space="preserve">Claude Code dans des dossiers de notes et de documents : </w:t>
       </w:r>
-      <w:hyperlink w:history="1" r:id="rIdzyxbi3sf7arch1ulbzm4k">
+      <w:hyperlink w:history="1" r:id="rIdx7baxacyqbwhlni2rrrrx">
         <w:r>
           <w:rPr>
             <w:rStyle w:val="Hyperlink"/>
@@ -19885,7 +19901,7 @@
         </w:rPr>
         <w:t xml:space="preserve">Fusion de Cowork et de Chat (annonce) : </w:t>
       </w:r>
-      <w:hyperlink w:history="1" r:id="rIdtdminmnqnublw8glryyvi">
+      <w:hyperlink w:history="1" r:id="rIdmumutvqzu_ichgft1z5iz">
         <w:r>
           <w:rPr>
             <w:rStyle w:val="Hyperlink"/>
@@ -20093,7 +20109,7 @@
         </w:rPr>
         <w:t xml:space="preserve">Claude Academy, « Empaquetez vos directives de marque dans un skill » (environ 20 min, catégorie Marketing). </w:t>
       </w:r>
-      <w:hyperlink w:history="1" r:id="rIdrwnlvnchrnvgghtutbxli">
+      <w:hyperlink w:history="1" r:id="rIdid1jm1hol8xv2nxkk6qmn">
         <w:r>
           <w:rPr>
             <w:rStyle w:val="Hyperlink"/>

</xml_diff>

<commit_message>
Relecture experte : exactitude et bonnes pratiques de création de skills
- Description d'exemple sous 200 caractères, sur une ligne ; règles du nom
- Démo Code : nouvelle session si .claude/skills vient d'être créé
- Mode auto par défaut sur Pro/Max/Team : conseiller Manuel ou Plan
- Enregistrement du fichier de skill ; synchronisation à sens unique
- Tests positifs et négatifs, indice « Using… », fichiers annexes, allowed-tools

Co-Authored-By: Claude Opus 5.5 <noreply@anthropic.com>
</commit_message>
<xml_diff>
--- a/skills-claude-notes-presentateur.docx
+++ b/skills-claude-notes-presentateur.docx
@@ -111,7 +111,7 @@
         </w:rPr>
         <w:t xml:space="preserve">LinkedIn : </w:t>
       </w:r>
-      <w:hyperlink w:history="1" r:id="rIdqezdmbwmg_n_olzvimt4d">
+      <w:hyperlink w:history="1" r:id="rIdwq6cquv5uje1ft1mqnc52">
         <w:r>
           <w:rPr>
             <w:rStyle w:val="Hyperlink"/>
@@ -142,7 +142,7 @@
         </w:rPr>
         <w:t xml:space="preserve">GitHub : </w:t>
       </w:r>
-      <w:hyperlink w:history="1" r:id="rIdi4qvq2hanot-pzekpkirn">
+      <w:hyperlink w:history="1" r:id="rId9_szkcw0wyo-qqvx72wj7">
         <w:r>
           <w:rPr>
             <w:rStyle w:val="Hyperlink"/>
@@ -182,7 +182,7 @@
         <w:pStyle w:val="Body"/>
         <w:spacing w:after="120"/>
       </w:pPr>
-      <w:hyperlink w:history="1" r:id="rId3hsleldcnt2wqawrplb0k">
+      <w:hyperlink w:history="1" r:id="rIdvw1nufrzep5kjp7i9ri27">
         <w:r>
           <w:rPr>
             <w:rStyle w:val="Hyperlink"/>
@@ -8978,7 +8978,7 @@
           <w:rFonts w:ascii="Calibri" w:cs="Calibri" w:eastAsia="Calibri" w:hAnsi="Calibri"/>
           <w:lang w:val="fr-FR"/>
         </w:rPr>
-        <w:t xml:space="preserve">Une skill, ce sont des instructions que Claude va suivre, parfois accompagnées de scripts qu'il exécutera. Une skill malveillante pourrait lui demander d'envoyer vos données ailleurs, ou de faire autre chose que ce qu'annonce son titre. Trois réflexes : je connais l'auteur, ou la source est officielle ; j'ouvre le SKILL.md et je le lis (c'est du texte, ça se lit en deux minutes) ; s'il y a des scripts que je ne comprends pas, je demande à quelqu'un de compétent, ou je demande à Claude de m'expliquer ce qu'ils font avant d'installer. En entreprise, l'offre Enterprise peut analyser automatiquement les skills importées. Ça n'empêche pas de lire.</w:t>
+        <w:t xml:space="preserve">Une skill, ce sont des instructions que Claude va suivre, parfois accompagnées de scripts qu'il exécutera. Une skill malveillante pourrait lui demander d'envoyer vos données ailleurs, ou de faire autre chose que ce qu'annonce son titre. Trois réflexes : je connais l'auteur, ou la source est officielle ; j'ouvre le SKILL.md et je le lis (c'est du texte, ça se lit en deux minutes) ; s'il y a des scripts que je ne comprends pas, je demande à quelqu'un de compétent, ou je demande à Claude de m'expliquer ce qu'ils font avant d'installer. Pour Claude Code, un point de plus : l'en-tête d'une skill peut contenir une ligne allowed-tools qui autorise d'avance certaines commandes sans rien vous demander. Si vous la voyez, lisez-la avec attention. En entreprise, l'offre Enterprise peut analyser automatiquement les skills importées. Ça n'empêche pas de lire.</w:t>
       </w:r>
     </w:p>
     <w:p>
@@ -9246,7 +9246,7 @@
           <w:rFonts w:ascii="Calibri" w:cs="Calibri" w:eastAsia="Calibri" w:hAnsi="Calibri"/>
           <w:lang w:val="fr-FR"/>
         </w:rPr>
-        <w:t xml:space="preserve">Trois portes, une même skill. Chat, c'est la conversation classique, sur le web ou dans l'application : vous dites « aide-moi à créer une skill », Claude vous interroge, rédige, et propose de l'enregistrer. Cowork, c'est le mode où Claude travaille dans vos dossiers et produit de vrais fichiers. Petite actualité : Anthropic est en train de fusionner Chat et Cowork en un seul Claude. Selon votre offre, vous verrez encore deux onglets ou un seul (le déploiement a commencé pour Pro et Max, Team et Free suivront, et les administrateurs Enterprise sont prévenus à l'avance). Rien ne se perd : vos skills, projets et connecteurs suivent. Code, enfin, c'est Claude Code. Son nom fait peur, mais c'est simplement Claude qui travaille dans un dossier de votre ordinateur, avec plus de contrôle. Il est disponible dans un onglet de l'application de bureau, sans écran noir ni ligne de commande. Une bonne nouvelle pour finir : une skill enregistrée dans votre compte Claude vous suit dans les trois portes.</w:t>
+        <w:t xml:space="preserve">Trois portes, une même skill. Chat, c'est la conversation classique, sur le web ou dans l'application : vous dites « aide-moi à créer une skill », Claude vous interroge, rédige, et vous remet un fichier de skill à enregistrer. Cowork, c'est le mode où Claude travaille dans vos dossiers et produit de vrais fichiers. Petite actualité : Anthropic est en train de fusionner Chat et Cowork en un seul Claude. Selon votre offre, vous verrez encore deux onglets ou un seul (le déploiement a commencé pour Pro et Max, Team et Free suivront, et les administrateurs Enterprise sont prévenus à l'avance). Rien ne se perd : vos skills, projets et connecteurs suivent. Code, enfin, c'est Claude Code. Son nom fait peur, mais c'est simplement Claude qui travaille dans un dossier de votre ordinateur, avec plus de contrôle. Il est disponible dans un onglet de l'application de bureau, sans écran noir ni ligne de commande. Une bonne nouvelle pour finir : une skill enregistrée dans votre compte Claude vous suit dans les trois portes. Attention, la synchronisation va dans un seul sens : une skill créée dans Claude Code reste dans son dossier, et n'apparaît pas dans Chat ou Cowork tant qu'on ne l'a pas importée dans le compte.</w:t>
       </w:r>
     </w:p>
     <w:p>
@@ -9430,7 +9430,7 @@
           <w:rFonts w:ascii="Calibri" w:cs="Calibri" w:eastAsia="Calibri" w:hAnsi="Calibri"/>
           <w:lang w:val="fr-FR"/>
         </w:rPr>
-        <w:t xml:space="preserve">Chat. Avantages : rien à installer, ça marche dans le navigateur ; Claude vous guide avec sa skill de création de skills et vous pose les bonnes questions ; à la fin, un bouton enregistre la skill dans votre compte. Limites : Claude ne voit pas vos dossiers. Il faut joindre les fichiers un à un, et ajouter plus tard un modèle ou un exemple est moins fluide. Cowork. Avantages : Claude travaille directement dans un dossier de votre ordinateur. Il peut lire votre charte en PDF, vos anciens comptes rendus, vos modèles Word, et produire de vrais fichiers. C'est idéal quand la skill s'appuie sur des documents. Limites : il faut l'application de bureau, et la disponibilité dépend de votre offre (fusion en cours avec Chat). Code. Avantages : Claude voit tout le dossier de la skill, donc SKILL.md, exemples et modèles ensemble ; vous pouvez relire son plan avant qu'il ne touche à quoi que ce soit (le mode plan, j'y reviens) ; la skill est un simple dossier, facile à copier, à versionner et à partager avec une équipe ; enfin, on la teste immédiatement en tapant « / » suivi de son nom. Limites : l'interface impressionne la première fois, et il y a quelques mots nouveaux (dossier de travail, permission). C'est tout. Aucune de ces limites n'est technique : c'est de l'habitude.</w:t>
+        <w:t xml:space="preserve">Chat. Avantages : rien à installer, ça marche dans le navigateur ; Claude vous guide avec sa skill de création de skills et vous pose les bonnes questions ; à la fin, il vous remet un fichier de skill, qu'il suffit d'enregistrer dans votre compte. Limites : Claude ne voit pas vos dossiers. Il faut joindre les fichiers un à un, et ajouter plus tard un modèle ou un exemple est moins fluide. Cowork. Avantages : Claude travaille directement dans un dossier de votre ordinateur. Il peut lire votre charte en PDF, vos anciens comptes rendus, vos modèles Word, et produire de vrais fichiers. C'est idéal quand la skill s'appuie sur des documents. Limites : il faut l'application de bureau, et la disponibilité dépend de votre offre (fusion en cours avec Chat). Code. Avantages : Claude voit tout le dossier de la skill, donc SKILL.md, exemples et modèles ensemble ; vous pouvez relire son plan avant qu'il ne touche à quoi que ce soit (le mode plan, j'y reviens) ; la skill est un simple dossier, facile à copier, à versionner et à partager avec une équipe ; enfin, on la teste immédiatement en tapant « / » suivi de son nom. Limites : l'interface impressionne la première fois, et il y a quelques mots nouveaux (dossier de travail, permission). C'est tout. Aucune de ces limites n'est technique : c'est de l'habitude.</w:t>
       </w:r>
     </w:p>
     <w:p>
@@ -9614,7 +9614,7 @@
           <w:rFonts w:ascii="Calibri" w:cs="Calibri" w:eastAsia="Calibri" w:hAnsi="Calibri"/>
           <w:lang w:val="fr-FR"/>
         </w:rPr>
-        <w:t xml:space="preserve">Quatre idées reçues. Première : « il faut savoir coder ». Non : on écrit à Claude Code exactement comme dans Chat, en français, avec des phrases. Il écrit le SKILL.md pour vous, et c'est du texte. Deuxième : « c'est un écran noir de hacker ». Le terminal existe pour ceux qui l'aiment, mais Claude Code est aussi un onglet de l'application Claude sur ordinateur : une zone de message, un dossier choisi dans une fenêtre, des boutons. Troisième : « je vais tout casser ». Claude Code demande la permission avant de modifier un fichier ou de lancer une commande, et vous pouvez répondre non. Le mode plan va encore plus loin : Claude lit, réfléchit et propose, mais ne modifie rien tant que vous n'avez pas validé. Pour une première fois, travaillez sur une copie de votre dossier : vous ne risquez littéralement rien. Quatrième : « c'est pour les développeurs ». Claude Code fonctionne dans n'importe quel dossier : un dossier de notes, de modèles Word, de comptes rendus. Pour créer une skill, c'est même la porte la plus naturelle, puisqu'une skill… est un dossier.</w:t>
+        <w:t xml:space="preserve">Quatre idées reçues. Première : « il faut savoir coder ». Non : on écrit à Claude Code exactement comme dans Chat, en français, avec des phrases. Il écrit le SKILL.md pour vous, et c'est du texte. Deuxième : « c'est un écran noir de hacker ». Le terminal existe pour ceux qui l'aiment, mais Claude Code est aussi un onglet de l'application Claude sur ordinateur : une zone de message, un dossier choisi dans une fenêtre, des boutons. Troisième : « je vais tout casser ». C'est vous qui réglez le niveau de contrôle. Attention : sur les offres Pro, Max et Team, Claude Code démarre en mode auto, où un second modèle vérifie les actions à votre place sans vous demander. Pour une première fois, passez en mode Manuel : Claude demande alors avant chaque modification ou commande, et vous pouvez répondre non. Le mode plan va encore plus loin : Claude lit, réfléchit et propose, mais ne modifie rien tant que vous n'avez pas validé. Pour une première fois, travaillez sur une copie de votre dossier : vous ne risquez littéralement rien. Quatrième : « c'est pour les développeurs ». Claude Code fonctionne dans n'importe quel dossier : un dossier de notes, de modèles Word, de comptes rendus. Pour créer une skill, c'est même la porte la plus naturelle, puisqu'une skill… est un dossier.</w:t>
       </w:r>
     </w:p>
     <w:p>
@@ -9982,7 +9982,7 @@
           <w:rFonts w:ascii="Calibri" w:cs="Calibri" w:eastAsia="Calibri" w:hAnsi="Calibri"/>
           <w:lang w:val="fr-FR"/>
         </w:rPr>
-        <w:t xml:space="preserve">En direct si possible, dans l'onglet Code de l'application de bureau ; sinon, commentez la maquette. Étape 1 : ouvrir un dossier. Ici, « charte » contient la charte graphique en PDF, le logo et un exemple de présentation réussie. Travaillez sur une copie. Étape 2 : passer en mode plan (sélecteur de mode ou Maj + Tab) et écrire : « Crée une skill charte-graphique à partir des fichiers de ce dossier, pour appliquer notre charte à toute présentation ou tout document. » Étape 3 : Claude lit les fichiers et affiche son plan : lire la charte et l'exemple, créer .claude/skills/charte-graphique/SKILL.md, ajouter un fichier de couleurs et de typographie, tester sur une diapo. Lisez-le à voix haute avec la salle et corrigez une chose, pour montrer qu'on garde la main. Étape 4 : approuver en validant chaque modification, pour que la salle voie chaque fichier apparaître. Puis tester : tapez /charte-graphique, ou demandez « fais-moi une diapo de bienvenue ». La skill est rangée dans le dossier .claude/skills du projet : quiconque ouvre ce dossier avec Claude Code en profite. Pour l'avoir aussi dans Claude sur le web, demandez à Claude Code de la compresser en .zip, puis importez-la dans Personnaliser › Skills.</w:t>
+        <w:t xml:space="preserve">En direct si possible, dans l'onglet Code de l'application de bureau ; sinon, commentez la maquette. Étape 1 : ouvrir un dossier. Ici, « charte » contient la charte graphique en PDF, le logo et un exemple de présentation réussie. Travaillez sur une copie. Étape 2 : passer en mode plan (sélecteur de mode ou Maj + Tab) et écrire : « Crée une skill charte-graphique à partir des fichiers de ce dossier, pour appliquer notre charte à toute présentation ou tout document. » Étape 3 : Claude lit les fichiers et affiche son plan : lire la charte et l'exemple, créer .claude/skills/charte-graphique/SKILL.md, ajouter un fichier de couleurs et de typographie, tester sur une diapo. Lisez-le à voix haute avec la salle et corrigez une chose, pour montrer qu'on garde la main. Étape 4 : approuver en validant chaque modification, pour que la salle voie chaque fichier apparaître (si la session a démarré en mode auto, c'est l'occasion de montrer qu'on peut choisir ce niveau de contrôle). Point de vigilance : si le dossier .claude/skills vient d'être créé pendant la session, Claude Code ne le voit pas encore. Ouvrez une nouvelle session sur le même dossier avant de tester, ou, mieux, créez ce dossier vide à l'avance dans le dossier de démo. Puis tester : tapez /charte-graphique, ou demandez « fais-moi une diapo de bienvenue ». La skill est rangée dans le dossier .claude/skills du projet : quiconque ouvre ce dossier avec Claude Code en profite. Pour l'avoir aussi dans Claude sur le web, demandez à Claude Code de la compresser en .zip, puis importez-la dans Personnaliser › Skills.</w:t>
       </w:r>
     </w:p>
     <w:p>
@@ -10434,7 +10434,7 @@
           <w:rFonts w:ascii="Calibri" w:cs="Calibri" w:eastAsia="Calibri" w:hAnsi="Calibri"/>
           <w:lang w:val="fr-FR"/>
         </w:rPr>
-        <w:t xml:space="preserve">Un : repérer une tâche qui revient au moins une fois par semaine et qui se fait toujours de la même façon. Deux : la décrire à Claude comme à un nouveau collègue, avec si possible un exemple réussi (un ancien compte rendu, un mail type). Trois : laisser Claude générer la skill ; il va vous poser des questions, répondez-y franchement. Quatre : tester, dans une nouvelle conversation, avec une demande naturelle, sans nommer la skill. Est-ce qu'elle se déclenche ? Est-ce que le résultat est bon ? Cinq : ajuster. Si elle ne se déclenche pas, c'est presque toujours la description qu'il faut revoir. Si le résultat n'est pas bon, ce sont les instructions ou l'exemple. On boucle entre quatre et cinq deux ou trois fois : c'est normal.</w:t>
+        <w:t xml:space="preserve">Un : repérer une tâche qui revient au moins une fois par semaine et qui se fait toujours de la même façon. Deux : la décrire à Claude comme à un nouveau collègue, avec si possible un exemple réussi (un ancien compte rendu, un mail type). Trois : laisser Claude générer la skill ; il va vous poser des questions, répondez-y franchement. Quatre : tester, dans une nouvelle conversation, avec une demande naturelle, sans nommer la skill. Préparez trois demandes : deux qui doivent déclencher la skill, et une qui ne doit pas (par exemple « résume cet article » pour une skill de compte rendu). La mention « Using… » dans la réflexion de Claude indique si la skill a servi. Comparez aussi avec le résultat obtenu sans la skill : c'est ce qui prouve qu'elle apporte quelque chose. Anthropic résume la méthode ainsi : on conçoit avec un premier Claude, on teste avec un second dans une conversation neuve, et on rapporte au premier ce qu'on a observé. Cinq : ajuster. Si elle ne se déclenche pas, c'est presque toujours la description qu'il faut revoir. Si le résultat n'est pas bon, ce sont les instructions ou l'exemple. On boucle entre quatre et cinq deux ou trois fois : c'est normal.</w:t>
       </w:r>
     </w:p>
     <w:p>
@@ -10595,7 +10595,7 @@
           <w:rFonts w:ascii="Calibri" w:cs="Calibri" w:eastAsia="Calibri" w:hAnsi="Calibri"/>
           <w:lang w:val="fr-FR"/>
         </w:rPr>
-        <w:t xml:space="preserve">Si la connexion le permet, faites la démo en direct dans Chat ; sinon, commentez la maquette. Tapez : « Aide-moi à créer une skill qui transforme mes notes de réunion en compte rendu à notre format. » Claude s'appuie sur sa skill intégrée de création de skills (« skill-creator ») et pose des questions : qui lit ces comptes rendus ? quelle longueur ? avez-vous un exemple ? Répondez, collez un ancien compte rendu réussi. Claude rédige le SKILL.md et vous le montre : faites lire la description à voix haute à la salle. Puis il propose d'enregistrer la skill : un clic, et elle apparaît dans Personnaliser › Skills. Enfin, testez : ouvrez une nouvelle conversation, collez des notes en vrac et dites simplement « tu peux m'en faire un compte rendu ? ». La skill doit se déclencher seule. Si la démo prend du retard, arrêtez-vous après l'enregistrement : le test sera fait pendant l'atelier.</w:t>
+        <w:t xml:space="preserve">Si la connexion le permet, faites la démo en direct dans Chat ; sinon, commentez la maquette. Tapez : « Aide-moi à créer une skill qui transforme mes notes de réunion en compte rendu à notre format. » Claude s'appuie sur sa skill intégrée de création de skills (« skill-creator ») et pose des questions : qui lit ces comptes rendus ? quelle longueur ? avez-vous un exemple ? Répondez, collez un ancien compte rendu réussi. Claude rédige le SKILL.md et vous le montre : faites lire la description à voix haute à la salle. Puis il empaquette le tout en un fichier de skill : enregistrez-le (selon la version, un bouton d'enregistrement s'affiche, ou l'on télécharge le fichier et on l'importe avec le bouton « + »), puis vérifiez qu'il est activé dans la liste des skills (Personnaliser › Skills, ou Paramètres › Capacités selon l'interface). Enfin, testez : ouvrez une nouvelle conversation, collez des notes en vrac et dites simplement « tu peux m'en faire un compte rendu ? ». La skill doit se déclencher seule : on le voit à la mention « Using compte-rendu » (utilisation de la skill) dans la réflexion de Claude. Montrez cet indice à la salle, c'est le meilleur moyen de savoir si une skill a été utilisée. Si la démo prend du retard, arrêtez-vous après l'enregistrement : le test sera fait pendant l'atelier.</w:t>
       </w:r>
     </w:p>
     <w:p>
@@ -10779,7 +10779,7 @@
           <w:rFonts w:ascii="Calibri" w:cs="Calibri" w:eastAsia="Calibri" w:hAnsi="Calibri"/>
           <w:lang w:val="fr-FR"/>
         </w:rPr>
-        <w:t xml:space="preserve">Premier secret : la description doit dire QUAND utiliser la skill, pas seulement ce qu'elle fait. « Compte rendu » ne suffit pas. Écrivez plutôt « Rédige un compte rendu de réunion à notre format. Utiliser quand l'utilisateur colle des notes de réunion ou demande un CR, une synthèse de réunion ou un relevé de décisions. » Mettez les mots que vous emploieriez vraiment. Deuxième secret : un exemple réussi vaut dix consignes. Claude imite très bien : donnez-lui un vrai compte rendu que vous aimez. Troisième secret : une skill, une tâche. Mieux vaut trois petites skills claires qu'une grosse skill « tout-en-un » que Claude ne saura pas quand déclencher. Et restez court : si vos instructions dépassent deux pages, c'est souvent qu'il y a deux skills.</w:t>
+        <w:t xml:space="preserve">Premier secret : la description doit dire QUAND utiliser la skill, pas seulement ce qu'elle fait. « Compte rendu » ne suffit pas. Écrivez plutôt « Rédige un compte rendu de réunion à notre format. Utiliser quand l'utilisateur colle des notes de réunion ou demande un CR, une synthèse de réunion ou un relevé de décisions. » Écrivez-la comme la notice d'un outil, à la troisième personne (« Rédige… », pas « Je peux t'aider à… »), avec les mots que vos collègues emploient vraiment pour demander cette tâche. Deuxième secret : un exemple réussi vaut dix consignes. Claude imite très bien : donnez-lui un vrai compte rendu que vous aimez. Et dosez la liberté : des consignes souples pour une tâche de jugement (un compte rendu, un mail), des consignes strictes, voire un petit script, quand le résultat doit être identique à chaque fois (une charte graphique, un calcul). Troisième secret : une skill, une tâche. Mieux vaut trois petites skills claires qu'une grosse skill « tout-en-un » que Claude ne saura pas quand déclencher. Et restez concis : Claude est déjà très compétent, n'expliquez que ce qu'il ne peut pas deviner (votre format, vos règles, vos exemples). Si la skill grossit, gardez le SKILL.md court (moins de 500 lignes selon Anthropic) et rangez le détail dans des fichiers annexes que le SKILL.md cite directement, en disant quand les lire. Deux règles de forme : la description tient en 200 caractères maximum dans Claude, et le nom s'écrit en minuscules avec des tirets, sans les mots « claude » ni « anthropic ».</w:t>
       </w:r>
     </w:p>
     <w:p>
@@ -11124,7 +11124,7 @@
           <w:rFonts w:ascii="Calibri" w:cs="Calibri" w:eastAsia="Calibri" w:hAnsi="Calibri"/>
           <w:lang w:val="fr-FR"/>
         </w:rPr>
-        <w:t xml:space="preserve">Même objectif, trois chemins. Dans Chat, vous collez le prompt de la page Academy avec vos couleurs et vos règles : Claude crée la skill et vous l'enregistrez. C'est le chemin décrit par la ressource. Dans Cowork, vous pointez le dossier qui contient votre charte en PDF : Claude la lit lui-même, crée la skill et produit une présentation d'exemple pour vérifier. Dans Code, vous faites pareil en mode plan : vous relisez la structure proposée, vous la corrigez, puis Claude écrit les fichiers et vous testez aussitôt avec /charte-graphique. Le résultat est le même : une skill qui applique votre charte partout. Ce qui change, c'est votre niveau de contrôle. Pendant l'atelier, vous pourrez suivre ce cas dans la porte de votre choix.</w:t>
+        <w:t xml:space="preserve">Même objectif, trois chemins. Dans Chat, vous collez le prompt de la page Academy avec vos couleurs et vos règles : Claude crée le fichier de skill et vous l'enregistrez dans votre compte. C'est le chemin décrit par la ressource. Dans Cowork, vous pointez le dossier qui contient votre charte en PDF : Claude la lit lui-même, crée la skill et produit une présentation d'exemple pour vérifier. Dans Code, vous faites pareil en mode plan : vous relisez la structure proposée, vous la corrigez, puis Claude écrit les fichiers et vous testez aussitôt avec /charte-graphique. Le résultat est le même : une skill qui applique votre charte partout. Ce qui change, c'est votre niveau de contrôle. Pendant l'atelier, vous pourrez suivre ce cas dans la porte de votre choix.</w:t>
       </w:r>
     </w:p>
     <w:p>
@@ -11392,7 +11392,7 @@
           <w:rFonts w:ascii="Calibri" w:cs="Calibri" w:eastAsia="Calibri" w:hAnsi="Calibri"/>
           <w:lang w:val="fr-FR"/>
         </w:rPr>
-        <w:t xml:space="preserve">Premier cercle, vous-même et quelques personnes : dans Personnaliser › Skills, vous pouvez télécharger votre skill en .zip et l'envoyer. Le destinataire l'importe avec le bouton « + ». Ça marche quelle que soit l'offre, gratuite, Pro ou Max. Deuxième cercle, votre équipe : en offre Team ou Enterprise, le menu « … » d'une skill propose « Partager » à des collègues choisis (ils peuvent l'activer, pas la modifier) et « Publier dans l'organisation » pour la rendre disponible à tous. Selon le réglage de l'administrateur, la publication peut passer par une relecture ; les skills fournies par l'administrateur sont activées d'office pour tout le monde. Troisième cercle, tout le monde : on publie le dossier sur GitHub, ou on l'emballe dans un plugin avec d'autres skills. Pour les équipes tech, il suffit aussi de déposer la skill dans le dossier .claude/skills d'un projet de code : toute l'équipe l'aura. Rappel : ce que vous partagez, les autres vont le lire… et Claude va l'exécuter. Relisez avant de publier, et n'y mettez jamais de mot de passe ni de donnée personnelle.</w:t>
+        <w:t xml:space="preserve">Premier cercle, vous-même et quelques personnes : on envoie le fichier de la skill (celui que Claude vous a remis à la création, ou un .zip du dossier ; selon la version, le menu de la skill propose aussi de la télécharger, à vérifier le jour J). Le destinataire l'importe avec le bouton « + ». Ça marche quelle que soit l'offre, gratuite, Pro ou Max. Deuxième cercle, votre équipe : en offre Team ou Enterprise, le menu « … » d'une skill propose « Partager » à des collègues choisis (ils peuvent l'activer, pas la modifier) et « Publier dans l'organisation » pour la rendre disponible à tous. Selon le réglage de l'administrateur, la publication peut passer par une relecture ; les skills fournies par l'administrateur sont activées d'office pour tout le monde. Troisième cercle, tout le monde : on publie le dossier sur GitHub, ou on l'emballe dans un plugin avec d'autres skills. Pour les équipes tech, il suffit aussi de déposer la skill dans le dossier .claude/skills d'un projet de code : toute l'équipe l'aura. Rappel : ce que vous partagez, les autres vont le lire… et Claude va l'exécuter. Relisez avant de publier, et n'y mettez jamais de mot de passe ni de donnée personnelle.</w:t>
       </w:r>
     </w:p>
     <w:p>
@@ -11921,7 +11921,7 @@
           <w:rFonts w:ascii="Calibri" w:cs="Calibri" w:eastAsia="Calibri" w:hAnsi="Calibri"/>
           <w:lang w:val="fr-FR"/>
         </w:rPr>
-        <w:t xml:space="preserve">Bonne réponse : B, « Sa description ». Claude lit en permanence la description de chaque skill activée, et elle seule, pour décider s'il ouvre la skill. Une description floue fait une skill qui ne se déclenche jamais, ou qui se déclenche à tort. C'est la phrase la plus importante de la skill.</w:t>
+        <w:t xml:space="preserve">Bonne réponse : B, « Sa description ». Claude lit en permanence le nom et la description de chaque skill activée, et c'est la description qui fait l'essentiel du choix. Une description floue fait une skill qui ne se déclenche jamais, ou qui se déclenche à tort. C'est la phrase la plus importante de la skill.</w:t>
       </w:r>
     </w:p>
     <w:p>
@@ -16025,7 +16025,7 @@
           <w:rFonts w:ascii="Calibri" w:cs="Calibri" w:eastAsia="Calibri" w:hAnsi="Calibri"/>
           <w:lang w:val="fr-FR"/>
         </w:rPr>
-        <w:t xml:space="preserve">Accepter l'enregistrement : la skill apparaît dans Personnaliser › Skills.</w:t>
+        <w:t xml:space="preserve">Enregistrer le fichier de skill que Claude remet (bouton d'enregistrement, ou téléchargement puis import par le bouton « + »), et vérifier qu'elle est activée : Personnaliser › Skills, ou Paramètres › Capacités selon l'interface.</w:t>
       </w:r>
     </w:p>
     <w:p>
@@ -16042,7 +16042,24 @@
           <w:rFonts w:ascii="Calibri" w:cs="Calibri" w:eastAsia="Calibri" w:hAnsi="Calibri"/>
           <w:lang w:val="fr-FR"/>
         </w:rPr>
-        <w:t xml:space="preserve">Tester dans une NOUVELLE conversation avec une demande naturelle, sans nommer la skill.</w:t>
+        <w:t xml:space="preserve">Tester dans une NOUVELLE conversation, sans nommer la skill, avec trois demandes : deux qui doivent la déclencher, une qui ne doit pas. La mention « Using [nom de la skill] » dans la réflexion de Claude montre qu'elle a servi.</w:t>
+      </w:r>
+    </w:p>
+    <w:p>
+      <w:pPr>
+        <w:pStyle w:val="Body"/>
+        <w:numPr>
+          <w:ilvl w:val="0"/>
+          <w:numId w:val="6"/>
+        </w:numPr>
+        <w:spacing w:after="60"/>
+      </w:pPr>
+      <w:r>
+        <w:rPr>
+          <w:rFonts w:ascii="Calibri" w:cs="Calibri" w:eastAsia="Calibri" w:hAnsi="Calibri"/>
+          <w:lang w:val="fr-FR"/>
+        </w:rPr>
+        <w:t xml:space="preserve">Si le résultat ne convient pas, revenir dans la conversation de création et décrire précisément ce qui a manqué : Claude met la skill à jour.</w:t>
       </w:r>
     </w:p>
     <w:p>
@@ -16338,7 +16355,7 @@
                 <w:rFonts w:ascii="Calibri" w:cs="Calibri" w:eastAsia="Calibri" w:hAnsi="Calibri"/>
                 <w:lang w:val="fr-FR"/>
               </w:rPr>
-              <w:t xml:space="preserve">Personnaliser › Skills › menu « … » de la skill › télécharger le .zip, puis l'envoyer. Le destinataire l'importe (fiche B2).</w:t>
+              <w:t xml:space="preserve">Envoyer le fichier de la skill (celui remis par Claude à la création, ou un .zip du dossier). Selon la version, le menu « … » de la skill permet aussi de la télécharger. Le destinataire l'importe (fiche B2).</w:t>
             </w:r>
           </w:p>
         </w:tc>
@@ -16798,7 +16815,7 @@
           <w:rFonts w:ascii="Calibri" w:cs="Calibri" w:eastAsia="Calibri" w:hAnsi="Calibri"/>
           <w:lang w:val="fr-FR"/>
         </w:rPr>
-        <w:t xml:space="preserve">Passer en mode plan : sélecteur de mode à côté de la zone de message, touches Maj + Tab jusqu'à « mode plan », ou commencer le message par /plan.</w:t>
+        <w:t xml:space="preserve">Vérifier le mode de départ : sur Pro, Max et Team, Claude Code démarre en mode auto (il agit sans demander, un second modèle vérifie). Pour une première fois, choisir Manuel ou Plan.</w:t>
       </w:r>
     </w:p>
     <w:p>
@@ -16815,7 +16832,7 @@
           <w:rFonts w:ascii="Calibri" w:cs="Calibri" w:eastAsia="Calibri" w:hAnsi="Calibri"/>
           <w:lang w:val="fr-FR"/>
         </w:rPr>
-        <w:t xml:space="preserve">Écrire la demande (prompt ci-dessous). Claude lit les fichiers mais ne modifie rien.</w:t>
+        <w:t xml:space="preserve">Passer en mode plan : sélecteur de mode à côté de la zone de message, touches Maj + Tab jusqu'à « mode plan », ou commencer le message par /plan.</w:t>
       </w:r>
     </w:p>
     <w:p>
@@ -16832,7 +16849,7 @@
           <w:rFonts w:ascii="Calibri" w:cs="Calibri" w:eastAsia="Calibri" w:hAnsi="Calibri"/>
           <w:lang w:val="fr-FR"/>
         </w:rPr>
-        <w:t xml:space="preserve">Relire le plan proposé. Pour corriger, répondre « continue à planifier » avec vos remarques (« ajoute une section sur le logo »).</w:t>
+        <w:t xml:space="preserve">Écrire la demande (prompt ci-dessous). Claude lit les fichiers mais ne modifie rien.</w:t>
       </w:r>
     </w:p>
     <w:p>
@@ -16849,7 +16866,7 @@
           <w:rFonts w:ascii="Calibri" w:cs="Calibri" w:eastAsia="Calibri" w:hAnsi="Calibri"/>
           <w:lang w:val="fr-FR"/>
         </w:rPr>
-        <w:t xml:space="preserve">Approuver. Pour une première fois, choisir l'option qui fait valider chaque modification une par une.</w:t>
+        <w:t xml:space="preserve">Relire le plan proposé. Pour corriger, répondre « continue à planifier » avec vos remarques (« ajoute une section sur le logo »).</w:t>
       </w:r>
     </w:p>
     <w:p>
@@ -16866,7 +16883,7 @@
           <w:rFonts w:ascii="Calibri" w:cs="Calibri" w:eastAsia="Calibri" w:hAnsi="Calibri"/>
           <w:lang w:val="fr-FR"/>
         </w:rPr>
-        <w:t xml:space="preserve">Tester : taper / suivi du nom de la skill (ex. /charte-graphique), ou faire une demande naturelle (« fais-moi une diapo de bienvenue »).</w:t>
+        <w:t xml:space="preserve">Approuver. Pour une première fois, choisir l'option qui fait valider chaque modification une par une.</w:t>
       </w:r>
     </w:p>
     <w:p>
@@ -16883,7 +16900,58 @@
           <w:rFonts w:ascii="Calibri" w:cs="Calibri" w:eastAsia="Calibri" w:hAnsi="Calibri"/>
           <w:lang w:val="fr-FR"/>
         </w:rPr>
-        <w:t xml:space="preserve">Retrouver la skill dans le dossier .claude/skills/ du projet. Pour l'utiliser aussi dans Claude sur le web : demander à Claude Code de la compresser en .zip, puis l'importer (fiche B2).</w:t>
+        <w:t xml:space="preserve">Si le dossier .claude/skills/ vient d'être créé, ouvrir une nouvelle session sur le même dossier : Claude Code ne voit pas encore ce nouveau dossier. Astuce : le créer vide à l'avance.</w:t>
+      </w:r>
+    </w:p>
+    <w:p>
+      <w:pPr>
+        <w:pStyle w:val="Body"/>
+        <w:numPr>
+          <w:ilvl w:val="0"/>
+          <w:numId w:val="7"/>
+        </w:numPr>
+        <w:spacing w:after="60"/>
+      </w:pPr>
+      <w:r>
+        <w:rPr>
+          <w:rFonts w:ascii="Calibri" w:cs="Calibri" w:eastAsia="Calibri" w:hAnsi="Calibri"/>
+          <w:lang w:val="fr-FR"/>
+        </w:rPr>
+        <w:t xml:space="preserve">Tester : taper / suivi du nom de la skill (ex. /charte-graphique), ou faire une demande naturelle (« fais-moi une diapo de bienvenue »).</w:t>
+      </w:r>
+    </w:p>
+    <w:p>
+      <w:pPr>
+        <w:pStyle w:val="Body"/>
+        <w:numPr>
+          <w:ilvl w:val="0"/>
+          <w:numId w:val="7"/>
+        </w:numPr>
+        <w:spacing w:after="60"/>
+      </w:pPr>
+      <w:r>
+        <w:rPr>
+          <w:rFonts w:ascii="Calibri" w:cs="Calibri" w:eastAsia="Calibri" w:hAnsi="Calibri"/>
+          <w:lang w:val="fr-FR"/>
+        </w:rPr>
+        <w:t xml:space="preserve">Retrouver la skill dans le dossier .claude/skills/ du projet. Elle reste locale : la synchronisation va du compte Claude vers Claude Code, pas l'inverse. Pour l'utiliser aussi dans Claude sur le web : demander à Claude Code de la compresser en .zip, puis l'importer (fiche B2).</w:t>
+      </w:r>
+    </w:p>
+    <w:p>
+      <w:pPr>
+        <w:pStyle w:val="Body"/>
+        <w:numPr>
+          <w:ilvl w:val="0"/>
+          <w:numId w:val="7"/>
+        </w:numPr>
+        <w:spacing w:after="60"/>
+      </w:pPr>
+      <w:r>
+        <w:rPr>
+          <w:rFonts w:ascii="Calibri" w:cs="Calibri" w:eastAsia="Calibri" w:hAnsi="Calibri"/>
+          <w:lang w:val="fr-FR"/>
+        </w:rPr>
+        <w:t xml:space="preserve">Avant d'installer une skill venue d'ailleurs dans Claude Code, lire la ligne allowed-tools de son en-tête : elle peut autoriser des commandes sans rien vous demander.</w:t>
       </w:r>
     </w:p>
     <w:p>
@@ -17333,6 +17401,84 @@
     <w:p>
       <w:pPr>
         <w:pStyle w:val="Body"/>
+        <w:numPr>
+          <w:ilvl w:val="0"/>
+          <w:numId w:val="2"/>
+        </w:numPr>
+        <w:spacing w:after="60"/>
+      </w:pPr>
+      <w:r>
+        <w:rPr>
+          <w:rFonts w:ascii="Calibri" w:cs="Calibri" w:eastAsia="Calibri" w:hAnsi="Calibri"/>
+          <w:b/>
+          <w:bCs/>
+          <w:lang w:val="fr-FR"/>
+        </w:rPr>
+        <w:t xml:space="preserve">Nom</w:t>
+      </w:r>
+      <w:r>
+        <w:rPr>
+          <w:rFonts w:ascii="Calibri" w:cs="Calibri" w:eastAsia="Calibri" w:hAnsi="Calibri"/>
+          <w:lang w:val="fr-FR"/>
+        </w:rPr>
+        <w:t xml:space="preserve"> : minuscules, chiffres et tirets, 64 caractères au plus, sans les mots « claude » ni « anthropic ».</w:t>
+      </w:r>
+    </w:p>
+    <w:p>
+      <w:pPr>
+        <w:pStyle w:val="Body"/>
+        <w:numPr>
+          <w:ilvl w:val="0"/>
+          <w:numId w:val="2"/>
+        </w:numPr>
+        <w:spacing w:after="60"/>
+      </w:pPr>
+      <w:r>
+        <w:rPr>
+          <w:rFonts w:ascii="Calibri" w:cs="Calibri" w:eastAsia="Calibri" w:hAnsi="Calibri"/>
+          <w:b/>
+          <w:bCs/>
+          <w:lang w:val="fr-FR"/>
+        </w:rPr>
+        <w:t xml:space="preserve">Description</w:t>
+      </w:r>
+      <w:r>
+        <w:rPr>
+          <w:rFonts w:ascii="Calibri" w:cs="Calibri" w:eastAsia="Calibri" w:hAnsi="Calibri"/>
+          <w:lang w:val="fr-FR"/>
+        </w:rPr>
+        <w:t xml:space="preserve"> : une seule ligne, 200 caractères au plus dans Claude, à la troisième personne, avec ce que fait la skill ET « Utiliser quand… ».</w:t>
+      </w:r>
+    </w:p>
+    <w:p>
+      <w:pPr>
+        <w:pStyle w:val="Body"/>
+        <w:numPr>
+          <w:ilvl w:val="0"/>
+          <w:numId w:val="2"/>
+        </w:numPr>
+        <w:spacing w:after="60"/>
+      </w:pPr>
+      <w:r>
+        <w:rPr>
+          <w:rFonts w:ascii="Calibri" w:cs="Calibri" w:eastAsia="Calibri" w:hAnsi="Calibri"/>
+          <w:b/>
+          <w:bCs/>
+          <w:lang w:val="fr-FR"/>
+        </w:rPr>
+        <w:t xml:space="preserve">Fichiers annexes</w:t>
+      </w:r>
+      <w:r>
+        <w:rPr>
+          <w:rFonts w:ascii="Calibri" w:cs="Calibri" w:eastAsia="Calibri" w:hAnsi="Calibri"/>
+          <w:lang w:val="fr-FR"/>
+        </w:rPr>
+        <w:t xml:space="preserve"> : les citer depuis le SKILL.md en disant quand les lire, sur un seul niveau (pas de renvoi en cascade). Garder le SKILL.md sous 500 lignes.</w:t>
+      </w:r>
+    </w:p>
+    <w:p>
+      <w:pPr>
+        <w:pStyle w:val="Body"/>
         <w:shd w:fill="F1F3F6" w:color="auto" w:val="clear"/>
         <w:spacing w:after="0"/>
         <w:ind w:left="200" w:right="200"/>
@@ -17378,7 +17524,7 @@
           <w:szCs w:val="18"/>
           <w:lang w:val="fr-FR"/>
         </w:rPr>
-        <w:t xml:space="preserve">description: Rédige un compte rendu de réunion à notre format (1 page,</w:t>
+        <w:t xml:space="preserve">description: Rédige un compte rendu de réunion d'une page à notre format. Utiliser quand l'utilisateur colle des notes de réunion ou demande un CR ou une synthèse.</w:t>
       </w:r>
     </w:p>
     <w:p>
@@ -17395,7 +17541,7 @@
           <w:szCs w:val="18"/>
           <w:lang w:val="fr-FR"/>
         </w:rPr>
-        <w:t xml:space="preserve">  décisions, tableau d'actions). Utiliser quand l'utilisateur colle des</w:t>
+        <w:t xml:space="preserve">---</w:t>
       </w:r>
     </w:p>
     <w:p>
@@ -17412,7 +17558,7 @@
           <w:szCs w:val="18"/>
           <w:lang w:val="fr-FR"/>
         </w:rPr>
-        <w:t xml:space="preserve">  notes de réunion ou demande un CR, une synthèse ou un relevé de décisions.</w:t>
+        <w:t xml:space="preserve"> </w:t>
       </w:r>
     </w:p>
     <w:p>
@@ -17429,7 +17575,7 @@
           <w:szCs w:val="18"/>
           <w:lang w:val="fr-FR"/>
         </w:rPr>
-        <w:t xml:space="preserve">---</w:t>
+        <w:t xml:space="preserve"># Compte rendu de réunion</w:t>
       </w:r>
     </w:p>
     <w:p>
@@ -17463,7 +17609,7 @@
           <w:szCs w:val="18"/>
           <w:lang w:val="fr-FR"/>
         </w:rPr>
-        <w:t xml:space="preserve"># Compte rendu de réunion</w:t>
+        <w:t xml:space="preserve">## Étapes</w:t>
       </w:r>
     </w:p>
     <w:p>
@@ -17480,7 +17626,7 @@
           <w:szCs w:val="18"/>
           <w:lang w:val="fr-FR"/>
         </w:rPr>
-        <w:t xml:space="preserve"> </w:t>
+        <w:t xml:space="preserve">1. Repérer dans les notes : date, participants, sujets, décisions.</w:t>
       </w:r>
     </w:p>
     <w:p>
@@ -17497,7 +17643,7 @@
           <w:szCs w:val="18"/>
           <w:lang w:val="fr-FR"/>
         </w:rPr>
-        <w:t xml:space="preserve">## Étapes</w:t>
+        <w:t xml:space="preserve">2. Rédiger en 3 parties : Contexte (2 lignes), Décisions, Actions.</w:t>
       </w:r>
     </w:p>
     <w:p>
@@ -17514,7 +17660,7 @@
           <w:szCs w:val="18"/>
           <w:lang w:val="fr-FR"/>
         </w:rPr>
-        <w:t xml:space="preserve">1. Repérer dans les notes : date, participants, sujets, décisions.</w:t>
+        <w:t xml:space="preserve">3. Terminer par un tableau : Qui | Quoi | Pour quand.</w:t>
       </w:r>
     </w:p>
     <w:p>
@@ -17531,7 +17677,7 @@
           <w:szCs w:val="18"/>
           <w:lang w:val="fr-FR"/>
         </w:rPr>
-        <w:t xml:space="preserve">2. Rédiger en 3 parties : Contexte (2 lignes), Décisions, Actions.</w:t>
+        <w:t xml:space="preserve"> </w:t>
       </w:r>
     </w:p>
     <w:p>
@@ -17548,7 +17694,7 @@
           <w:szCs w:val="18"/>
           <w:lang w:val="fr-FR"/>
         </w:rPr>
-        <w:t xml:space="preserve">3. Terminer par un tableau : Qui | Quoi | Pour quand.</w:t>
+        <w:t xml:space="preserve">## Règles</w:t>
       </w:r>
     </w:p>
     <w:p>
@@ -17565,7 +17711,7 @@
           <w:szCs w:val="18"/>
           <w:lang w:val="fr-FR"/>
         </w:rPr>
-        <w:t xml:space="preserve"> </w:t>
+        <w:t xml:space="preserve">- Une page maximum, phrases courtes, ton factuel.</w:t>
       </w:r>
     </w:p>
     <w:p>
@@ -17582,7 +17728,7 @@
           <w:szCs w:val="18"/>
           <w:lang w:val="fr-FR"/>
         </w:rPr>
-        <w:t xml:space="preserve">## Règles</w:t>
+        <w:t xml:space="preserve">- Prénoms seulement, jamais d'information personnelle.</w:t>
       </w:r>
     </w:p>
     <w:p>
@@ -17599,7 +17745,7 @@
           <w:szCs w:val="18"/>
           <w:lang w:val="fr-FR"/>
         </w:rPr>
-        <w:t xml:space="preserve">- Une page maximum, phrases courtes, ton factuel.</w:t>
+        <w:t xml:space="preserve">- Si une échéance manque, écrire « à définir » plutôt qu'inventer.</w:t>
       </w:r>
     </w:p>
     <w:p>
@@ -17616,7 +17762,7 @@
           <w:szCs w:val="18"/>
           <w:lang w:val="fr-FR"/>
         </w:rPr>
-        <w:t xml:space="preserve">- Prénoms seulement, jamais d'information personnelle.</w:t>
+        <w:t xml:space="preserve"> </w:t>
       </w:r>
     </w:p>
     <w:p>
@@ -17633,14 +17779,14 @@
           <w:szCs w:val="18"/>
           <w:lang w:val="fr-FR"/>
         </w:rPr>
-        <w:t xml:space="preserve">- Si une échéance manque, écrire « à définir » plutôt qu'inventer.</w:t>
+        <w:t xml:space="preserve">## Exemple réussi</w:t>
       </w:r>
     </w:p>
     <w:p>
       <w:pPr>
         <w:pStyle w:val="Body"/>
         <w:shd w:fill="F1F3F6" w:color="auto" w:val="clear"/>
-        <w:spacing w:after="0"/>
+        <w:spacing w:after="160"/>
         <w:ind w:left="200" w:right="200"/>
       </w:pPr>
       <w:r>
@@ -17650,41 +17796,7 @@
           <w:szCs w:val="18"/>
           <w:lang w:val="fr-FR"/>
         </w:rPr>
-        <w:t xml:space="preserve"> </w:t>
-      </w:r>
-    </w:p>
-    <w:p>
-      <w:pPr>
-        <w:pStyle w:val="Body"/>
-        <w:shd w:fill="F1F3F6" w:color="auto" w:val="clear"/>
-        <w:spacing w:after="0"/>
-        <w:ind w:left="200" w:right="200"/>
-      </w:pPr>
-      <w:r>
-        <w:rPr>
-          <w:rFonts w:ascii="Courier New" w:cs="Courier New" w:eastAsia="Courier New" w:hAnsi="Courier New"/>
-          <w:sz w:val="18"/>
-          <w:szCs w:val="18"/>
-          <w:lang w:val="fr-FR"/>
-        </w:rPr>
-        <w:t xml:space="preserve">## Exemple réussi</w:t>
-      </w:r>
-    </w:p>
-    <w:p>
-      <w:pPr>
-        <w:pStyle w:val="Body"/>
-        <w:shd w:fill="F1F3F6" w:color="auto" w:val="clear"/>
-        <w:spacing w:after="160"/>
-        <w:ind w:left="200" w:right="200"/>
-      </w:pPr>
-      <w:r>
-        <w:rPr>
-          <w:rFonts w:ascii="Courier New" w:cs="Courier New" w:eastAsia="Courier New" w:hAnsi="Courier New"/>
-          <w:sz w:val="18"/>
-          <w:szCs w:val="18"/>
-          <w:lang w:val="fr-FR"/>
-        </w:rPr>
-        <w:t xml:space="preserve">Voir exemples/cr-2026-09-12.md</w:t>
+        <w:t xml:space="preserve">Avant de rédiger, lire exemples/cr-type.md et en reprendre la structure.</w:t>
       </w:r>
     </w:p>
     <w:p>
@@ -17779,7 +17891,7 @@
           <w:rFonts w:ascii="Calibri" w:cs="Calibri" w:eastAsia="Calibri" w:hAnsi="Calibri"/>
           <w:lang w:val="fr-FR"/>
         </w:rPr>
-        <w:t xml:space="preserve">Claude lit en permanence la description de chaque skill activée, et elle seule, pour décider s'il ouvre la skill. Une description floue fait une skill qui ne se déclenche jamais, ou qui se déclenche à tort. C'est la phrase la plus importante de la skill.</w:t>
+        <w:t xml:space="preserve">Claude lit en permanence le nom et la description de chaque skill activée, et c'est la description qui fait l'essentiel du choix. Une description floue fait une skill qui ne se déclenche jamais, ou qui se déclenche à tort. C'est la phrase la plus importante de la skill.</w:t>
       </w:r>
     </w:p>
     <w:p>
@@ -19139,7 +19251,7 @@
                 <w:rFonts w:ascii="Calibri" w:cs="Calibri" w:eastAsia="Calibri" w:hAnsi="Calibri"/>
                 <w:lang w:val="fr-FR"/>
               </w:rPr>
-              <w:t xml:space="preserve">La skill se déclenche seule dans une nouvelle conversation</w:t>
+              <w:t xml:space="preserve">La skill se déclenche seule dans une nouvelle conversation (mention « Using… »)</w:t>
             </w:r>
           </w:p>
         </w:tc>
@@ -19203,7 +19315,7 @@
                 <w:rFonts w:ascii="Calibri" w:cs="Calibri" w:eastAsia="Calibri" w:hAnsi="Calibri"/>
                 <w:lang w:val="fr-FR"/>
               </w:rPr>
-              <w:t xml:space="preserve">Elle contient au moins un exemple réussi</w:t>
+              <w:t xml:space="preserve">Elle ne se déclenche PAS sur une demande sans rapport</w:t>
             </w:r>
           </w:p>
         </w:tc>
@@ -19267,7 +19379,7 @@
                 <w:rFonts w:ascii="Calibri" w:cs="Calibri" w:eastAsia="Calibri" w:hAnsi="Calibri"/>
                 <w:lang w:val="fr-FR"/>
               </w:rPr>
-              <w:t xml:space="preserve">Elle traite une seule tâche</w:t>
+              <w:t xml:space="preserve">La description tient en 200 caractères et le nom est en minuscules avec tirets</w:t>
             </w:r>
           </w:p>
         </w:tc>
@@ -19331,6 +19443,134 @@
                 <w:rFonts w:ascii="Calibri" w:cs="Calibri" w:eastAsia="Calibri" w:hAnsi="Calibri"/>
                 <w:lang w:val="fr-FR"/>
               </w:rPr>
+              <w:t xml:space="preserve">Elle contient au moins un exemple réussi</w:t>
+            </w:r>
+          </w:p>
+        </w:tc>
+        <w:tc>
+          <w:tcPr>
+            <w:tcW w:type="dxa" w:w="2400"/>
+            <w:tcBorders>
+              <w:top w:val="single" w:color="D5D9E0" w:sz="4"/>
+              <w:left w:val="single" w:color="D5D9E0" w:sz="4"/>
+              <w:bottom w:val="single" w:color="D5D9E0" w:sz="4"/>
+              <w:right w:val="single" w:color="D5D9E0" w:sz="4"/>
+            </w:tcBorders>
+            <w:tcMar>
+              <w:top w:type="dxa" w:w="60"/>
+              <w:left w:type="dxa" w:w="100"/>
+              <w:bottom w:type="dxa" w:w="60"/>
+              <w:right w:type="dxa" w:w="100"/>
+            </w:tcMar>
+          </w:tcPr>
+          <w:p>
+            <w:pPr>
+              <w:pStyle w:val="Body"/>
+            </w:pPr>
+            <w:r>
+              <w:rPr>
+                <w:rFonts w:ascii="Calibri" w:cs="Calibri" w:eastAsia="Calibri" w:hAnsi="Calibri"/>
+                <w:lang w:val="fr-FR"/>
+              </w:rPr>
+              <w:t xml:space="preserve"/>
+            </w:r>
+          </w:p>
+        </w:tc>
+      </w:tr>
+      <w:tr>
+        <w:trPr>
+          <w:tblHeader w:val="false"/>
+        </w:trPr>
+        <w:tc>
+          <w:tcPr>
+            <w:tcW w:type="dxa" w:w="7238"/>
+            <w:tcBorders>
+              <w:top w:val="single" w:color="D5D9E0" w:sz="4"/>
+              <w:left w:val="single" w:color="D5D9E0" w:sz="4"/>
+              <w:bottom w:val="single" w:color="D5D9E0" w:sz="4"/>
+              <w:right w:val="single" w:color="D5D9E0" w:sz="4"/>
+            </w:tcBorders>
+            <w:shd w:fill="F1F3F6" w:color="auto" w:val="clear"/>
+            <w:tcMar>
+              <w:top w:type="dxa" w:w="60"/>
+              <w:left w:type="dxa" w:w="100"/>
+              <w:bottom w:type="dxa" w:w="60"/>
+              <w:right w:type="dxa" w:w="100"/>
+            </w:tcMar>
+          </w:tcPr>
+          <w:p>
+            <w:pPr>
+              <w:pStyle w:val="Body"/>
+            </w:pPr>
+            <w:r>
+              <w:rPr>
+                <w:rFonts w:ascii="Calibri" w:cs="Calibri" w:eastAsia="Calibri" w:hAnsi="Calibri"/>
+                <w:lang w:val="fr-FR"/>
+              </w:rPr>
+              <w:t xml:space="preserve">Elle traite une seule tâche</w:t>
+            </w:r>
+          </w:p>
+        </w:tc>
+        <w:tc>
+          <w:tcPr>
+            <w:tcW w:type="dxa" w:w="2400"/>
+            <w:tcBorders>
+              <w:top w:val="single" w:color="D5D9E0" w:sz="4"/>
+              <w:left w:val="single" w:color="D5D9E0" w:sz="4"/>
+              <w:bottom w:val="single" w:color="D5D9E0" w:sz="4"/>
+              <w:right w:val="single" w:color="D5D9E0" w:sz="4"/>
+            </w:tcBorders>
+            <w:shd w:fill="F1F3F6" w:color="auto" w:val="clear"/>
+            <w:tcMar>
+              <w:top w:type="dxa" w:w="60"/>
+              <w:left w:type="dxa" w:w="100"/>
+              <w:bottom w:type="dxa" w:w="60"/>
+              <w:right w:type="dxa" w:w="100"/>
+            </w:tcMar>
+          </w:tcPr>
+          <w:p>
+            <w:pPr>
+              <w:pStyle w:val="Body"/>
+            </w:pPr>
+            <w:r>
+              <w:rPr>
+                <w:rFonts w:ascii="Calibri" w:cs="Calibri" w:eastAsia="Calibri" w:hAnsi="Calibri"/>
+                <w:lang w:val="fr-FR"/>
+              </w:rPr>
+              <w:t xml:space="preserve"/>
+            </w:r>
+          </w:p>
+        </w:tc>
+      </w:tr>
+      <w:tr>
+        <w:trPr>
+          <w:tblHeader w:val="false"/>
+        </w:trPr>
+        <w:tc>
+          <w:tcPr>
+            <w:tcW w:type="dxa" w:w="7238"/>
+            <w:tcBorders>
+              <w:top w:val="single" w:color="D5D9E0" w:sz="4"/>
+              <w:left w:val="single" w:color="D5D9E0" w:sz="4"/>
+              <w:bottom w:val="single" w:color="D5D9E0" w:sz="4"/>
+              <w:right w:val="single" w:color="D5D9E0" w:sz="4"/>
+            </w:tcBorders>
+            <w:tcMar>
+              <w:top w:type="dxa" w:w="60"/>
+              <w:left w:type="dxa" w:w="100"/>
+              <w:bottom w:type="dxa" w:w="60"/>
+              <w:right w:type="dxa" w:w="100"/>
+            </w:tcMar>
+          </w:tcPr>
+          <w:p>
+            <w:pPr>
+              <w:pStyle w:val="Body"/>
+            </w:pPr>
+            <w:r>
+              <w:rPr>
+                <w:rFonts w:ascii="Calibri" w:cs="Calibri" w:eastAsia="Calibri" w:hAnsi="Calibri"/>
+                <w:lang w:val="fr-FR"/>
+              </w:rPr>
               <w:t xml:space="preserve">Elle ne contient aucune donnée personnelle ni confidentielle</w:t>
             </w:r>
           </w:p>
@@ -19344,6 +19584,71 @@
               <w:bottom w:val="single" w:color="D5D9E0" w:sz="4"/>
               <w:right w:val="single" w:color="D5D9E0" w:sz="4"/>
             </w:tcBorders>
+            <w:tcMar>
+              <w:top w:type="dxa" w:w="60"/>
+              <w:left w:type="dxa" w:w="100"/>
+              <w:bottom w:type="dxa" w:w="60"/>
+              <w:right w:type="dxa" w:w="100"/>
+            </w:tcMar>
+          </w:tcPr>
+          <w:p>
+            <w:pPr>
+              <w:pStyle w:val="Body"/>
+            </w:pPr>
+            <w:r>
+              <w:rPr>
+                <w:rFonts w:ascii="Calibri" w:cs="Calibri" w:eastAsia="Calibri" w:hAnsi="Calibri"/>
+                <w:lang w:val="fr-FR"/>
+              </w:rPr>
+              <w:t xml:space="preserve"/>
+            </w:r>
+          </w:p>
+        </w:tc>
+      </w:tr>
+      <w:tr>
+        <w:trPr>
+          <w:tblHeader w:val="false"/>
+        </w:trPr>
+        <w:tc>
+          <w:tcPr>
+            <w:tcW w:type="dxa" w:w="7238"/>
+            <w:tcBorders>
+              <w:top w:val="single" w:color="D5D9E0" w:sz="4"/>
+              <w:left w:val="single" w:color="D5D9E0" w:sz="4"/>
+              <w:bottom w:val="single" w:color="D5D9E0" w:sz="4"/>
+              <w:right w:val="single" w:color="D5D9E0" w:sz="4"/>
+            </w:tcBorders>
+            <w:shd w:fill="F1F3F6" w:color="auto" w:val="clear"/>
+            <w:tcMar>
+              <w:top w:type="dxa" w:w="60"/>
+              <w:left w:type="dxa" w:w="100"/>
+              <w:bottom w:type="dxa" w:w="60"/>
+              <w:right w:type="dxa" w:w="100"/>
+            </w:tcMar>
+          </w:tcPr>
+          <w:p>
+            <w:pPr>
+              <w:pStyle w:val="Body"/>
+            </w:pPr>
+            <w:r>
+              <w:rPr>
+                <w:rFonts w:ascii="Calibri" w:cs="Calibri" w:eastAsia="Calibri" w:hAnsi="Calibri"/>
+                <w:lang w:val="fr-FR"/>
+              </w:rPr>
+              <w:t xml:space="preserve">Elle ne contient aucune date ni mention « cette année » qui vieillira</w:t>
+            </w:r>
+          </w:p>
+        </w:tc>
+        <w:tc>
+          <w:tcPr>
+            <w:tcW w:type="dxa" w:w="2400"/>
+            <w:tcBorders>
+              <w:top w:val="single" w:color="D5D9E0" w:sz="4"/>
+              <w:left w:val="single" w:color="D5D9E0" w:sz="4"/>
+              <w:bottom w:val="single" w:color="D5D9E0" w:sz="4"/>
+              <w:right w:val="single" w:color="D5D9E0" w:sz="4"/>
+            </w:tcBorders>
+            <w:shd w:fill="F1F3F6" w:color="auto" w:val="clear"/>
             <w:tcMar>
               <w:top w:type="dxa" w:w="60"/>
               <w:left w:type="dxa" w:w="100"/>
@@ -19395,7 +19700,7 @@
         </w:numPr>
         <w:spacing w:after="60"/>
       </w:pPr>
-      <w:hyperlink w:history="1" r:id="rIdozzxxessomhtnk6hos14e">
+      <w:hyperlink w:history="1" r:id="rIddrbzau4lhshibz7osknn4">
         <w:r>
           <w:rPr>
             <w:rStyle w:val="Hyperlink"/>
@@ -19425,7 +19730,7 @@
         </w:numPr>
         <w:spacing w:after="60"/>
       </w:pPr>
-      <w:hyperlink w:history="1" r:id="rId-9oiro8arx623ysf8kauq">
+      <w:hyperlink w:history="1" r:id="rIdg1fej7krfiejz30ra0s4h">
         <w:r>
           <w:rPr>
             <w:rStyle w:val="Hyperlink"/>
@@ -19455,7 +19760,7 @@
         </w:numPr>
         <w:spacing w:after="60"/>
       </w:pPr>
-      <w:hyperlink w:history="1" r:id="rIdr1xelgozhmjfqmtiqhmgh">
+      <w:hyperlink w:history="1" r:id="rIdtyfq2ex4-ewk2qff1zsff">
         <w:r>
           <w:rPr>
             <w:rStyle w:val="Hyperlink"/>
@@ -19485,7 +19790,7 @@
         </w:numPr>
         <w:spacing w:after="60"/>
       </w:pPr>
-      <w:hyperlink w:history="1" r:id="rIdtimqrbeodmf5vvwoaqusi">
+      <w:hyperlink w:history="1" r:id="rIdybv3jgniuauejlsf9brhd">
         <w:r>
           <w:rPr>
             <w:rStyle w:val="Hyperlink"/>
@@ -19515,7 +19820,7 @@
         </w:numPr>
         <w:spacing w:after="60"/>
       </w:pPr>
-      <w:hyperlink w:history="1" r:id="rIdvtgsrynb9g_fufllyqc5u">
+      <w:hyperlink w:history="1" r:id="rId8tbqy3iesne3c8vmhwydu">
         <w:r>
           <w:rPr>
             <w:rStyle w:val="Hyperlink"/>
@@ -19545,7 +19850,7 @@
         </w:numPr>
         <w:spacing w:after="60"/>
       </w:pPr>
-      <w:hyperlink w:history="1" r:id="rIdhaeb00juksy1kshhgkvxe">
+      <w:hyperlink w:history="1" r:id="rIdzwi5raw7kj4ldj1_w_rbq">
         <w:r>
           <w:rPr>
             <w:rStyle w:val="Hyperlink"/>
@@ -19575,7 +19880,7 @@
         </w:numPr>
         <w:spacing w:after="60"/>
       </w:pPr>
-      <w:hyperlink w:history="1" r:id="rIdebrbylioa5ywlnqif9jrv">
+      <w:hyperlink w:history="1" r:id="rIdhga-ovrbq5j0ppzgkf7tr">
         <w:r>
           <w:rPr>
             <w:rStyle w:val="Hyperlink"/>
@@ -19605,7 +19910,37 @@
         </w:numPr>
         <w:spacing w:after="60"/>
       </w:pPr>
-      <w:hyperlink w:history="1" r:id="rIdbvvc6x3itpkxgodwxcdkx">
+      <w:hyperlink w:history="1" r:id="rIdny26qt-giwnfjm7ygt8xk">
+        <w:r>
+          <w:rPr>
+            <w:rStyle w:val="Hyperlink"/>
+            <w:rFonts w:ascii="Calibri" w:cs="Calibri" w:eastAsia="Calibri" w:hAnsi="Calibri"/>
+            <w:lang w:val="fr-FR"/>
+          </w:rPr>
+          <w:t xml:space="preserve">Bonnes pratiques de rédaction de skills (Anthropic)</w:t>
+        </w:r>
+      </w:hyperlink>
+      <w:r>
+        <w:rPr>
+          <w:rFonts w:ascii="Calibri" w:cs="Calibri" w:eastAsia="Calibri" w:hAnsi="Calibri"/>
+          <w:color w:val="566070"/>
+          <w:sz w:val="18"/>
+          <w:szCs w:val="18"/>
+          <w:lang w:val="fr-FR"/>
+        </w:rPr>
+        <w:t xml:space="preserve">  platform.claude.com/docs/en/agents-and-tools/agent-skills/best-practices</w:t>
+      </w:r>
+    </w:p>
+    <w:p>
+      <w:pPr>
+        <w:pStyle w:val="Body"/>
+        <w:numPr>
+          <w:ilvl w:val="0"/>
+          <w:numId w:val="2"/>
+        </w:numPr>
+        <w:spacing w:after="60"/>
+      </w:pPr>
+      <w:hyperlink w:history="1" r:id="rIdmvnlczu8cyfutqiofrwyr">
         <w:r>
           <w:rPr>
             <w:rStyle w:val="Hyperlink"/>
@@ -19635,7 +19970,7 @@
         </w:numPr>
         <w:spacing w:after="60"/>
       </w:pPr>
-      <w:hyperlink w:history="1" r:id="rIdybpd1rdk7jjabzmb4n3hl">
+      <w:hyperlink w:history="1" r:id="rIdgpghzpqpsyphhgzitfqmb">
         <w:r>
           <w:rPr>
             <w:rStyle w:val="Hyperlink"/>
@@ -19665,7 +20000,7 @@
         </w:numPr>
         <w:spacing w:after="60"/>
       </w:pPr>
-      <w:hyperlink w:history="1" r:id="rIde8ntgn3gtqwfpqwo02sym">
+      <w:hyperlink w:history="1" r:id="rIdb1dikr1lg0-8zaozqhdmo">
         <w:r>
           <w:rPr>
             <w:rStyle w:val="Hyperlink"/>
@@ -19695,7 +20030,7 @@
         </w:numPr>
         <w:spacing w:after="60"/>
       </w:pPr>
-      <w:hyperlink w:history="1" r:id="rIddqjpcatn7lrb05_pknv47">
+      <w:hyperlink w:history="1" r:id="rIdwqjieksqrigctddbddw9x">
         <w:r>
           <w:rPr>
             <w:rStyle w:val="Hyperlink"/>
@@ -19725,7 +20060,7 @@
         </w:numPr>
         <w:spacing w:after="60"/>
       </w:pPr>
-      <w:hyperlink w:history="1" r:id="rIdacbt_b-md3vq7f-ovzayn">
+      <w:hyperlink w:history="1" r:id="rIdbgzcmffqt3mhwjavxmcws">
         <w:r>
           <w:rPr>
             <w:rStyle w:val="Hyperlink"/>
@@ -19755,7 +20090,7 @@
         </w:numPr>
         <w:spacing w:after="60"/>
       </w:pPr>
-      <w:hyperlink w:history="1" r:id="rIdm3esk5zhqkgpf7-ped56m">
+      <w:hyperlink w:history="1" r:id="rIdmknghitlt5g-3s7rz9hbm">
         <w:r>
           <w:rPr>
             <w:rStyle w:val="Hyperlink"/>
@@ -19785,7 +20120,7 @@
         </w:numPr>
         <w:spacing w:after="60"/>
       </w:pPr>
-      <w:hyperlink w:history="1" r:id="rIdo50ebvvlxt1e7hjyf5mr8">
+      <w:hyperlink w:history="1" r:id="rIdwuylu154izhmg8bdyd6hs">
         <w:r>
           <w:rPr>
             <w:rStyle w:val="Hyperlink"/>
@@ -19832,7 +20167,7 @@
           <w:rFonts w:ascii="Calibri" w:cs="Calibri" w:eastAsia="Calibri" w:hAnsi="Calibri"/>
           <w:lang w:val="fr-FR"/>
         </w:rPr>
-        <w:t xml:space="preserve">Le libellé exact des menus dans la langue de l'interface (« Personnaliser » / « Customize », « Importer une skill »…).</w:t>
+        <w:t xml:space="preserve">Le libellé exact des menus dans la langue de l'interface (« Personnaliser » / « Customize », « Importer une skill »…) et l'emplacement de la liste des skills : l'aide cite Personnaliser › Skills, le tutoriel Academy Paramètres › Capacités › Skills.</w:t>
       </w:r>
     </w:p>
     <w:p>
@@ -19849,7 +20184,7 @@
           <w:rFonts w:ascii="Calibri" w:cs="Calibri" w:eastAsia="Calibri" w:hAnsi="Calibri"/>
           <w:lang w:val="fr-FR"/>
         </w:rPr>
-        <w:t xml:space="preserve">Que l'option « Exécution de code et création de fichiers » est bien active sur le poste de démo et sur ceux des participants.</w:t>
+        <w:t xml:space="preserve">Comment le fichier de skill créé en conversation s'enregistre (bouton ou téléchargement puis import), et si le menu d'une skill permet de la télécharger.</w:t>
       </w:r>
     </w:p>
     <w:p>
@@ -19866,7 +20201,7 @@
           <w:rFonts w:ascii="Calibri" w:cs="Calibri" w:eastAsia="Calibri" w:hAnsi="Calibri"/>
           <w:lang w:val="fr-FR"/>
         </w:rPr>
-        <w:t xml:space="preserve">En Team/Enterprise : que l'administrateur a autorisé les skills et le partage, et quel est le réglage de publication (à partir du 2 octobre 2026, « Relecture requise » s’appliquera par défaut aux organisations qui n’ont rien choisi).</w:t>
+        <w:t xml:space="preserve">Dans le dossier de démo Code, créer à l'avance le dossier vide .claude/skills/ et régler le mode sur Manuel ou Plan.</w:t>
       </w:r>
     </w:p>
     <w:p>
@@ -19883,7 +20218,7 @@
           <w:rFonts w:ascii="Calibri" w:cs="Calibri" w:eastAsia="Calibri" w:hAnsi="Calibri"/>
           <w:lang w:val="fr-FR"/>
         </w:rPr>
-        <w:t xml:space="preserve">Les démos en direct (diapos 24 et 20) : prévoir les maquettes comme solution de repli si le réseau fait défaut.</w:t>
+        <w:t xml:space="preserve">Que l'option « Exécution de code et création de fichiers » est bien active sur le poste de démo et sur ceux des participants.</w:t>
       </w:r>
     </w:p>
     <w:p>
@@ -19900,7 +20235,7 @@
           <w:rFonts w:ascii="Calibri" w:cs="Calibri" w:eastAsia="Calibri" w:hAnsi="Calibri"/>
           <w:lang w:val="fr-FR"/>
         </w:rPr>
-        <w:t xml:space="preserve">L'état de la fusion Chat/Cowork selon l'offre des participants : deux onglets ou un seul « Claude » (déploiement commencé en septembre 2026 pour Pro et Max).</w:t>
+        <w:t xml:space="preserve">En Team/Enterprise : que l'administrateur a autorisé les skills et le partage, et quel est le réglage de publication (à partir du 2 octobre 2026, « Relecture requise » s’appliquera par défaut aux organisations qui n’ont rien choisi).</w:t>
       </w:r>
     </w:p>
     <w:p>
@@ -19917,7 +20252,7 @@
           <w:rFonts w:ascii="Calibri" w:cs="Calibri" w:eastAsia="Calibri" w:hAnsi="Calibri"/>
           <w:lang w:val="fr-FR"/>
         </w:rPr>
-        <w:t xml:space="preserve">Que l'onglet Code de l'application de bureau est installé et connecté au compte sur le poste de démo, et sur les postes du parcours « Code accompagné ».</w:t>
+        <w:t xml:space="preserve">Les démos en direct (diapos 24 et 20) : prévoir les maquettes comme solution de repli si le réseau fait défaut.</w:t>
       </w:r>
     </w:p>
     <w:p>
@@ -19934,6 +20269,40 @@
           <w:rFonts w:ascii="Calibri" w:cs="Calibri" w:eastAsia="Calibri" w:hAnsi="Calibri"/>
           <w:lang w:val="fr-FR"/>
         </w:rPr>
+        <w:t xml:space="preserve">L'état de la fusion Chat/Cowork selon l'offre des participants : deux onglets ou un seul « Claude » (déploiement commencé en septembre 2026 pour Pro et Max).</w:t>
+      </w:r>
+    </w:p>
+    <w:p>
+      <w:pPr>
+        <w:pStyle w:val="Body"/>
+        <w:numPr>
+          <w:ilvl w:val="0"/>
+          <w:numId w:val="2"/>
+        </w:numPr>
+        <w:spacing w:after="60"/>
+      </w:pPr>
+      <w:r>
+        <w:rPr>
+          <w:rFonts w:ascii="Calibri" w:cs="Calibri" w:eastAsia="Calibri" w:hAnsi="Calibri"/>
+          <w:lang w:val="fr-FR"/>
+        </w:rPr>
+        <w:t xml:space="preserve">Que l'onglet Code de l'application de bureau est installé et connecté au compte sur le poste de démo, et sur les postes du parcours « Code accompagné ».</w:t>
+      </w:r>
+    </w:p>
+    <w:p>
+      <w:pPr>
+        <w:pStyle w:val="Body"/>
+        <w:numPr>
+          <w:ilvl w:val="0"/>
+          <w:numId w:val="2"/>
+        </w:numPr>
+        <w:spacing w:after="60"/>
+      </w:pPr>
+      <w:r>
+        <w:rPr>
+          <w:rFonts w:ascii="Calibri" w:cs="Calibri" w:eastAsia="Calibri" w:hAnsi="Calibri"/>
+          <w:lang w:val="fr-FR"/>
+        </w:rPr>
         <w:t xml:space="preserve">En Team/Enterprise : si l'administrateur a désactivé le mode auto, l'option d'approbation du plan s'intitule « accepter automatiquement les modifications ».</w:t>
       </w:r>
     </w:p>
@@ -19996,7 +20365,7 @@
         </w:rPr>
         <w:t xml:space="preserve">Source : </w:t>
       </w:r>
-      <w:hyperlink w:history="1" r:id="rId-tueu1wnsckokkhxugvch">
+      <w:hyperlink w:history="1" r:id="rIddm_qc4ut8mupehuzeadwy">
         <w:r>
           <w:rPr>
             <w:rStyle w:val="Hyperlink"/>

</xml_diff>

<commit_message>
Ajoute la comparaison Cowork / Code pour créer une skill
- Diapo 26 « Cowork ou Code pour créer une skill ? » et ses notes
- Encadré dans la fiche B8 du document distribué

Co-Authored-By: Claude Opus 5.5 <noreply@anthropic.com>
</commit_message>
<xml_diff>
--- a/skills-claude-notes-presentateur.docx
+++ b/skills-claude-notes-presentateur.docx
@@ -65,7 +65,7 @@
           <w:color w:val="566070"/>
           <w:lang w:val="fr-FR"/>
         </w:rPr>
-        <w:t xml:space="preserve">Présentation de 54 minutes environ, suivie d'une mise en pratique. Public : utilisateurs de Claude, sans prérequis technique.</w:t>
+        <w:t xml:space="preserve">Présentation de 56 minutes environ, suivie d'une mise en pratique. Public : utilisateurs de Claude, sans prérequis technique.</w:t>
       </w:r>
     </w:p>
     <w:p>
@@ -111,7 +111,7 @@
         </w:rPr>
         <w:t xml:space="preserve">LinkedIn : </w:t>
       </w:r>
-      <w:hyperlink w:history="1" r:id="rIdqeehsfqlkqcbxpgo3v-xg">
+      <w:hyperlink w:history="1" r:id="rId2zexdq08h6gmon_2dbwef">
         <w:r>
           <w:rPr>
             <w:rStyle w:val="Hyperlink"/>
@@ -142,7 +142,7 @@
         </w:rPr>
         <w:t xml:space="preserve">GitHub : </w:t>
       </w:r>
-      <w:hyperlink w:history="1" r:id="rIdvajjrhgqgraopwfm04ql-">
+      <w:hyperlink w:history="1" r:id="rIdkvobaci_x5fzvjtzzcyk5">
         <w:r>
           <w:rPr>
             <w:rStyle w:val="Hyperlink"/>
@@ -182,7 +182,7 @@
         <w:pStyle w:val="Body"/>
         <w:spacing w:after="120"/>
       </w:pPr>
-      <w:hyperlink w:history="1" r:id="rIdmjpiazvvmmmjxav0wfi0g">
+      <w:hyperlink w:history="1" r:id="rIdeqa7wa9y_uomu_wxgs4pr">
         <w:r>
           <w:rPr>
             <w:rStyle w:val="Hyperlink"/>
@@ -526,7 +526,7 @@
           <w:rFonts w:ascii="Calibri" w:cs="Calibri" w:eastAsia="Calibri" w:hAnsi="Calibri"/>
           <w:lang w:val="fr-FR"/>
         </w:rPr>
-        <w:t xml:space="preserve"> conseillé (total : 54 min environ) ;</w:t>
+        <w:t xml:space="preserve"> conseillé (total : 56 min environ) ;</w:t>
       </w:r>
     </w:p>
     <w:p>
@@ -620,7 +620,7 @@
           <w:rFonts w:ascii="Calibri" w:cs="Calibri" w:eastAsia="Calibri" w:hAnsi="Calibri"/>
           <w:lang w:val="fr-FR"/>
         </w:rPr>
-        <w:t xml:space="preserve">Vidéoprojecteur, accès à Claude sur le poste du présentateur (démo de la diapo 26), et l'onglet Code de l'application de bureau connecté au même compte (démo de la diapo 20).</w:t>
+        <w:t xml:space="preserve">Vidéoprojecteur, accès à Claude sur le poste du présentateur (démo de la diapo 27), et l'onglet Code de l'application de bureau connecté au même compte (démo de la diapo 20).</w:t>
       </w:r>
     </w:p>
     <w:p>
@@ -3974,7 +3974,7 @@
                 <w:rFonts w:ascii="Calibri" w:cs="Calibri" w:eastAsia="Calibri" w:hAnsi="Calibri"/>
                 <w:lang w:val="fr-FR"/>
               </w:rPr>
-              <w:t xml:space="preserve">Démo : on le demande à Claude</w:t>
+              <w:t xml:space="preserve">Cowork ou Code pour créer une skill ?</w:t>
             </w:r>
           </w:p>
         </w:tc>
@@ -4004,7 +4004,7 @@
                 <w:rFonts w:ascii="Calibri" w:cs="Calibri" w:eastAsia="Calibri" w:hAnsi="Calibri"/>
                 <w:lang w:val="fr-FR"/>
               </w:rPr>
-              <w:t xml:space="preserve">3:00</w:t>
+              <w:t xml:space="preserve">2:00</w:t>
             </w:r>
           </w:p>
         </w:tc>
@@ -4034,7 +4034,7 @@
                 <w:rFonts w:ascii="Calibri" w:cs="Calibri" w:eastAsia="Calibri" w:hAnsi="Calibri"/>
                 <w:lang w:val="fr-FR"/>
               </w:rPr>
-              <w:t xml:space="preserve">34:35</w:t>
+              <w:t xml:space="preserve">33:35</w:t>
             </w:r>
           </w:p>
         </w:tc>
@@ -4097,7 +4097,7 @@
                 <w:rFonts w:ascii="Calibri" w:cs="Calibri" w:eastAsia="Calibri" w:hAnsi="Calibri"/>
                 <w:lang w:val="fr-FR"/>
               </w:rPr>
-              <w:t xml:space="preserve">Les 3 secrets d'une bonne skill</w:t>
+              <w:t xml:space="preserve">Démo : on le demande à Claude</w:t>
             </w:r>
           </w:p>
         </w:tc>
@@ -4126,7 +4126,7 @@
                 <w:rFonts w:ascii="Calibri" w:cs="Calibri" w:eastAsia="Calibri" w:hAnsi="Calibri"/>
                 <w:lang w:val="fr-FR"/>
               </w:rPr>
-              <w:t xml:space="preserve">1:15</w:t>
+              <w:t xml:space="preserve">3:00</w:t>
             </w:r>
           </w:p>
         </w:tc>
@@ -4155,7 +4155,7 @@
                 <w:rFonts w:ascii="Calibri" w:cs="Calibri" w:eastAsia="Calibri" w:hAnsi="Calibri"/>
                 <w:lang w:val="fr-FR"/>
               </w:rPr>
-              <w:t xml:space="preserve">35:50</w:t>
+              <w:t xml:space="preserve">36:35</w:t>
             </w:r>
           </w:p>
         </w:tc>
@@ -4220,7 +4220,7 @@
                 <w:rFonts w:ascii="Calibri" w:cs="Calibri" w:eastAsia="Calibri" w:hAnsi="Calibri"/>
                 <w:lang w:val="fr-FR"/>
               </w:rPr>
-              <w:t xml:space="preserve">Cas d'usage : votre charte dans une skill</w:t>
+              <w:t xml:space="preserve">Les 3 secrets d'une bonne skill</w:t>
             </w:r>
           </w:p>
         </w:tc>
@@ -4250,7 +4250,7 @@
                 <w:rFonts w:ascii="Calibri" w:cs="Calibri" w:eastAsia="Calibri" w:hAnsi="Calibri"/>
                 <w:lang w:val="fr-FR"/>
               </w:rPr>
-              <w:t xml:space="preserve">2:30</w:t>
+              <w:t xml:space="preserve">1:15</w:t>
             </w:r>
           </w:p>
         </w:tc>
@@ -4280,7 +4280,7 @@
                 <w:rFonts w:ascii="Calibri" w:cs="Calibri" w:eastAsia="Calibri" w:hAnsi="Calibri"/>
                 <w:lang w:val="fr-FR"/>
               </w:rPr>
-              <w:t xml:space="preserve">38:20</w:t>
+              <w:t xml:space="preserve">37:50</w:t>
             </w:r>
           </w:p>
         </w:tc>
@@ -4343,7 +4343,7 @@
                 <w:rFonts w:ascii="Calibri" w:cs="Calibri" w:eastAsia="Calibri" w:hAnsi="Calibri"/>
                 <w:lang w:val="fr-FR"/>
               </w:rPr>
-              <w:t xml:space="preserve">Même charte, trois portes</w:t>
+              <w:t xml:space="preserve">Cas d'usage : votre charte dans une skill</w:t>
             </w:r>
           </w:p>
         </w:tc>
@@ -4372,7 +4372,7 @@
                 <w:rFonts w:ascii="Calibri" w:cs="Calibri" w:eastAsia="Calibri" w:hAnsi="Calibri"/>
                 <w:lang w:val="fr-FR"/>
               </w:rPr>
-              <w:t xml:space="preserve">1:30</w:t>
+              <w:t xml:space="preserve">2:30</w:t>
             </w:r>
           </w:p>
         </w:tc>
@@ -4401,7 +4401,7 @@
                 <w:rFonts w:ascii="Calibri" w:cs="Calibri" w:eastAsia="Calibri" w:hAnsi="Calibri"/>
                 <w:lang w:val="fr-FR"/>
               </w:rPr>
-              <w:t xml:space="preserve">39:50</w:t>
+              <w:t xml:space="preserve">40:20</w:t>
             </w:r>
           </w:p>
         </w:tc>
@@ -4466,7 +4466,7 @@
                 <w:rFonts w:ascii="Calibri" w:cs="Calibri" w:eastAsia="Calibri" w:hAnsi="Calibri"/>
                 <w:lang w:val="fr-FR"/>
               </w:rPr>
-              <w:t xml:space="preserve">Partager</w:t>
+              <w:t xml:space="preserve">Même charte, trois portes</w:t>
             </w:r>
           </w:p>
         </w:tc>
@@ -4496,7 +4496,7 @@
                 <w:rFonts w:ascii="Calibri" w:cs="Calibri" w:eastAsia="Calibri" w:hAnsi="Calibri"/>
                 <w:lang w:val="fr-FR"/>
               </w:rPr>
-              <w:t xml:space="preserve">0:10</w:t>
+              <w:t xml:space="preserve">1:30</w:t>
             </w:r>
           </w:p>
         </w:tc>
@@ -4526,7 +4526,7 @@
                 <w:rFonts w:ascii="Calibri" w:cs="Calibri" w:eastAsia="Calibri" w:hAnsi="Calibri"/>
                 <w:lang w:val="fr-FR"/>
               </w:rPr>
-              <w:t xml:space="preserve">40:00</w:t>
+              <w:t xml:space="preserve">41:50</w:t>
             </w:r>
           </w:p>
         </w:tc>
@@ -4589,7 +4589,7 @@
                 <w:rFonts w:ascii="Calibri" w:cs="Calibri" w:eastAsia="Calibri" w:hAnsi="Calibri"/>
                 <w:lang w:val="fr-FR"/>
               </w:rPr>
-              <w:t xml:space="preserve">Partager : trois cercles</w:t>
+              <w:t xml:space="preserve">Partager</w:t>
             </w:r>
           </w:p>
         </w:tc>
@@ -4618,7 +4618,7 @@
                 <w:rFonts w:ascii="Calibri" w:cs="Calibri" w:eastAsia="Calibri" w:hAnsi="Calibri"/>
                 <w:lang w:val="fr-FR"/>
               </w:rPr>
-              <w:t xml:space="preserve">2:30</w:t>
+              <w:t xml:space="preserve">0:10</w:t>
             </w:r>
           </w:p>
         </w:tc>
@@ -4647,7 +4647,7 @@
                 <w:rFonts w:ascii="Calibri" w:cs="Calibri" w:eastAsia="Calibri" w:hAnsi="Calibri"/>
                 <w:lang w:val="fr-FR"/>
               </w:rPr>
-              <w:t xml:space="preserve">42:30</w:t>
+              <w:t xml:space="preserve">42:00</w:t>
             </w:r>
           </w:p>
         </w:tc>
@@ -4712,7 +4712,7 @@
                 <w:rFonts w:ascii="Calibri" w:cs="Calibri" w:eastAsia="Calibri" w:hAnsi="Calibri"/>
                 <w:lang w:val="fr-FR"/>
               </w:rPr>
-              <w:t xml:space="preserve">Quiz : levez votre carton !</w:t>
+              <w:t xml:space="preserve">Partager : trois cercles</w:t>
             </w:r>
           </w:p>
         </w:tc>
@@ -4742,7 +4742,7 @@
                 <w:rFonts w:ascii="Calibri" w:cs="Calibri" w:eastAsia="Calibri" w:hAnsi="Calibri"/>
                 <w:lang w:val="fr-FR"/>
               </w:rPr>
-              <w:t xml:space="preserve">0:30</w:t>
+              <w:t xml:space="preserve">2:30</w:t>
             </w:r>
           </w:p>
         </w:tc>
@@ -4772,7 +4772,7 @@
                 <w:rFonts w:ascii="Calibri" w:cs="Calibri" w:eastAsia="Calibri" w:hAnsi="Calibri"/>
                 <w:lang w:val="fr-FR"/>
               </w:rPr>
-              <w:t xml:space="preserve">43:00</w:t>
+              <w:t xml:space="preserve">44:30</w:t>
             </w:r>
           </w:p>
         </w:tc>
@@ -4835,7 +4835,7 @@
                 <w:rFonts w:ascii="Calibri" w:cs="Calibri" w:eastAsia="Calibri" w:hAnsi="Calibri"/>
                 <w:lang w:val="fr-FR"/>
               </w:rPr>
-              <w:t xml:space="preserve">Question 1</w:t>
+              <w:t xml:space="preserve">Quiz : levez votre carton !</w:t>
             </w:r>
           </w:p>
         </w:tc>
@@ -4864,7 +4864,7 @@
                 <w:rFonts w:ascii="Calibri" w:cs="Calibri" w:eastAsia="Calibri" w:hAnsi="Calibri"/>
                 <w:lang w:val="fr-FR"/>
               </w:rPr>
-              <w:t xml:space="preserve">0:40</w:t>
+              <w:t xml:space="preserve">0:30</w:t>
             </w:r>
           </w:p>
         </w:tc>
@@ -4893,7 +4893,7 @@
                 <w:rFonts w:ascii="Calibri" w:cs="Calibri" w:eastAsia="Calibri" w:hAnsi="Calibri"/>
                 <w:lang w:val="fr-FR"/>
               </w:rPr>
-              <w:t xml:space="preserve">43:40</w:t>
+              <w:t xml:space="preserve">45:00</w:t>
             </w:r>
           </w:p>
         </w:tc>
@@ -4958,7 +4958,7 @@
                 <w:rFonts w:ascii="Calibri" w:cs="Calibri" w:eastAsia="Calibri" w:hAnsi="Calibri"/>
                 <w:lang w:val="fr-FR"/>
               </w:rPr>
-              <w:t xml:space="preserve">Question 1 · réponse</w:t>
+              <w:t xml:space="preserve">Question 1</w:t>
             </w:r>
           </w:p>
         </w:tc>
@@ -4988,7 +4988,7 @@
                 <w:rFonts w:ascii="Calibri" w:cs="Calibri" w:eastAsia="Calibri" w:hAnsi="Calibri"/>
                 <w:lang w:val="fr-FR"/>
               </w:rPr>
-              <w:t xml:space="preserve">0:20</w:t>
+              <w:t xml:space="preserve">0:40</w:t>
             </w:r>
           </w:p>
         </w:tc>
@@ -5018,7 +5018,7 @@
                 <w:rFonts w:ascii="Calibri" w:cs="Calibri" w:eastAsia="Calibri" w:hAnsi="Calibri"/>
                 <w:lang w:val="fr-FR"/>
               </w:rPr>
-              <w:t xml:space="preserve">44:00</w:t>
+              <w:t xml:space="preserve">45:40</w:t>
             </w:r>
           </w:p>
         </w:tc>
@@ -5081,7 +5081,7 @@
                 <w:rFonts w:ascii="Calibri" w:cs="Calibri" w:eastAsia="Calibri" w:hAnsi="Calibri"/>
                 <w:lang w:val="fr-FR"/>
               </w:rPr>
-              <w:t xml:space="preserve">Question 2</w:t>
+              <w:t xml:space="preserve">Question 1 · réponse</w:t>
             </w:r>
           </w:p>
         </w:tc>
@@ -5110,7 +5110,7 @@
                 <w:rFonts w:ascii="Calibri" w:cs="Calibri" w:eastAsia="Calibri" w:hAnsi="Calibri"/>
                 <w:lang w:val="fr-FR"/>
               </w:rPr>
-              <w:t xml:space="preserve">0:40</w:t>
+              <w:t xml:space="preserve">0:20</w:t>
             </w:r>
           </w:p>
         </w:tc>
@@ -5139,7 +5139,7 @@
                 <w:rFonts w:ascii="Calibri" w:cs="Calibri" w:eastAsia="Calibri" w:hAnsi="Calibri"/>
                 <w:lang w:val="fr-FR"/>
               </w:rPr>
-              <w:t xml:space="preserve">44:40</w:t>
+              <w:t xml:space="preserve">46:00</w:t>
             </w:r>
           </w:p>
         </w:tc>
@@ -5204,7 +5204,7 @@
                 <w:rFonts w:ascii="Calibri" w:cs="Calibri" w:eastAsia="Calibri" w:hAnsi="Calibri"/>
                 <w:lang w:val="fr-FR"/>
               </w:rPr>
-              <w:t xml:space="preserve">Question 2 · réponse</w:t>
+              <w:t xml:space="preserve">Question 2</w:t>
             </w:r>
           </w:p>
         </w:tc>
@@ -5234,7 +5234,7 @@
                 <w:rFonts w:ascii="Calibri" w:cs="Calibri" w:eastAsia="Calibri" w:hAnsi="Calibri"/>
                 <w:lang w:val="fr-FR"/>
               </w:rPr>
-              <w:t xml:space="preserve">0:20</w:t>
+              <w:t xml:space="preserve">0:40</w:t>
             </w:r>
           </w:p>
         </w:tc>
@@ -5264,7 +5264,7 @@
                 <w:rFonts w:ascii="Calibri" w:cs="Calibri" w:eastAsia="Calibri" w:hAnsi="Calibri"/>
                 <w:lang w:val="fr-FR"/>
               </w:rPr>
-              <w:t xml:space="preserve">45:00</w:t>
+              <w:t xml:space="preserve">46:40</w:t>
             </w:r>
           </w:p>
         </w:tc>
@@ -5327,7 +5327,7 @@
                 <w:rFonts w:ascii="Calibri" w:cs="Calibri" w:eastAsia="Calibri" w:hAnsi="Calibri"/>
                 <w:lang w:val="fr-FR"/>
               </w:rPr>
-              <w:t xml:space="preserve">Question 3</w:t>
+              <w:t xml:space="preserve">Question 2 · réponse</w:t>
             </w:r>
           </w:p>
         </w:tc>
@@ -5356,7 +5356,7 @@
                 <w:rFonts w:ascii="Calibri" w:cs="Calibri" w:eastAsia="Calibri" w:hAnsi="Calibri"/>
                 <w:lang w:val="fr-FR"/>
               </w:rPr>
-              <w:t xml:space="preserve">0:40</w:t>
+              <w:t xml:space="preserve">0:20</w:t>
             </w:r>
           </w:p>
         </w:tc>
@@ -5385,7 +5385,7 @@
                 <w:rFonts w:ascii="Calibri" w:cs="Calibri" w:eastAsia="Calibri" w:hAnsi="Calibri"/>
                 <w:lang w:val="fr-FR"/>
               </w:rPr>
-              <w:t xml:space="preserve">45:40</w:t>
+              <w:t xml:space="preserve">47:00</w:t>
             </w:r>
           </w:p>
         </w:tc>
@@ -5450,7 +5450,7 @@
                 <w:rFonts w:ascii="Calibri" w:cs="Calibri" w:eastAsia="Calibri" w:hAnsi="Calibri"/>
                 <w:lang w:val="fr-FR"/>
               </w:rPr>
-              <w:t xml:space="preserve">Question 3 · réponse</w:t>
+              <w:t xml:space="preserve">Question 3</w:t>
             </w:r>
           </w:p>
         </w:tc>
@@ -5480,7 +5480,7 @@
                 <w:rFonts w:ascii="Calibri" w:cs="Calibri" w:eastAsia="Calibri" w:hAnsi="Calibri"/>
                 <w:lang w:val="fr-FR"/>
               </w:rPr>
-              <w:t xml:space="preserve">0:20</w:t>
+              <w:t xml:space="preserve">0:40</w:t>
             </w:r>
           </w:p>
         </w:tc>
@@ -5510,7 +5510,7 @@
                 <w:rFonts w:ascii="Calibri" w:cs="Calibri" w:eastAsia="Calibri" w:hAnsi="Calibri"/>
                 <w:lang w:val="fr-FR"/>
               </w:rPr>
-              <w:t xml:space="preserve">46:00</w:t>
+              <w:t xml:space="preserve">47:40</w:t>
             </w:r>
           </w:p>
         </w:tc>
@@ -5573,7 +5573,7 @@
                 <w:rFonts w:ascii="Calibri" w:cs="Calibri" w:eastAsia="Calibri" w:hAnsi="Calibri"/>
                 <w:lang w:val="fr-FR"/>
               </w:rPr>
-              <w:t xml:space="preserve">Question 4</w:t>
+              <w:t xml:space="preserve">Question 3 · réponse</w:t>
             </w:r>
           </w:p>
         </w:tc>
@@ -5602,7 +5602,7 @@
                 <w:rFonts w:ascii="Calibri" w:cs="Calibri" w:eastAsia="Calibri" w:hAnsi="Calibri"/>
                 <w:lang w:val="fr-FR"/>
               </w:rPr>
-              <w:t xml:space="preserve">0:40</w:t>
+              <w:t xml:space="preserve">0:20</w:t>
             </w:r>
           </w:p>
         </w:tc>
@@ -5631,7 +5631,7 @@
                 <w:rFonts w:ascii="Calibri" w:cs="Calibri" w:eastAsia="Calibri" w:hAnsi="Calibri"/>
                 <w:lang w:val="fr-FR"/>
               </w:rPr>
-              <w:t xml:space="preserve">46:40</w:t>
+              <w:t xml:space="preserve">48:00</w:t>
             </w:r>
           </w:p>
         </w:tc>
@@ -5696,7 +5696,7 @@
                 <w:rFonts w:ascii="Calibri" w:cs="Calibri" w:eastAsia="Calibri" w:hAnsi="Calibri"/>
                 <w:lang w:val="fr-FR"/>
               </w:rPr>
-              <w:t xml:space="preserve">Question 4 · réponse</w:t>
+              <w:t xml:space="preserve">Question 4</w:t>
             </w:r>
           </w:p>
         </w:tc>
@@ -5726,7 +5726,7 @@
                 <w:rFonts w:ascii="Calibri" w:cs="Calibri" w:eastAsia="Calibri" w:hAnsi="Calibri"/>
                 <w:lang w:val="fr-FR"/>
               </w:rPr>
-              <w:t xml:space="preserve">0:20</w:t>
+              <w:t xml:space="preserve">0:40</w:t>
             </w:r>
           </w:p>
         </w:tc>
@@ -5756,7 +5756,7 @@
                 <w:rFonts w:ascii="Calibri" w:cs="Calibri" w:eastAsia="Calibri" w:hAnsi="Calibri"/>
                 <w:lang w:val="fr-FR"/>
               </w:rPr>
-              <w:t xml:space="preserve">47:00</w:t>
+              <w:t xml:space="preserve">48:40</w:t>
             </w:r>
           </w:p>
         </w:tc>
@@ -5819,7 +5819,7 @@
                 <w:rFonts w:ascii="Calibri" w:cs="Calibri" w:eastAsia="Calibri" w:hAnsi="Calibri"/>
                 <w:lang w:val="fr-FR"/>
               </w:rPr>
-              <w:t xml:space="preserve">Question 5</w:t>
+              <w:t xml:space="preserve">Question 4 · réponse</w:t>
             </w:r>
           </w:p>
         </w:tc>
@@ -5848,7 +5848,7 @@
                 <w:rFonts w:ascii="Calibri" w:cs="Calibri" w:eastAsia="Calibri" w:hAnsi="Calibri"/>
                 <w:lang w:val="fr-FR"/>
               </w:rPr>
-              <w:t xml:space="preserve">0:40</w:t>
+              <w:t xml:space="preserve">0:20</w:t>
             </w:r>
           </w:p>
         </w:tc>
@@ -5877,7 +5877,7 @@
                 <w:rFonts w:ascii="Calibri" w:cs="Calibri" w:eastAsia="Calibri" w:hAnsi="Calibri"/>
                 <w:lang w:val="fr-FR"/>
               </w:rPr>
-              <w:t xml:space="preserve">47:40</w:t>
+              <w:t xml:space="preserve">49:00</w:t>
             </w:r>
           </w:p>
         </w:tc>
@@ -5942,7 +5942,7 @@
                 <w:rFonts w:ascii="Calibri" w:cs="Calibri" w:eastAsia="Calibri" w:hAnsi="Calibri"/>
                 <w:lang w:val="fr-FR"/>
               </w:rPr>
-              <w:t xml:space="preserve">Question 5 · réponse</w:t>
+              <w:t xml:space="preserve">Question 5</w:t>
             </w:r>
           </w:p>
         </w:tc>
@@ -5972,7 +5972,7 @@
                 <w:rFonts w:ascii="Calibri" w:cs="Calibri" w:eastAsia="Calibri" w:hAnsi="Calibri"/>
                 <w:lang w:val="fr-FR"/>
               </w:rPr>
-              <w:t xml:space="preserve">0:20</w:t>
+              <w:t xml:space="preserve">0:40</w:t>
             </w:r>
           </w:p>
         </w:tc>
@@ -6002,7 +6002,7 @@
                 <w:rFonts w:ascii="Calibri" w:cs="Calibri" w:eastAsia="Calibri" w:hAnsi="Calibri"/>
                 <w:lang w:val="fr-FR"/>
               </w:rPr>
-              <w:t xml:space="preserve">48:00</w:t>
+              <w:t xml:space="preserve">49:40</w:t>
             </w:r>
           </w:p>
         </w:tc>
@@ -6065,7 +6065,7 @@
                 <w:rFonts w:ascii="Calibri" w:cs="Calibri" w:eastAsia="Calibri" w:hAnsi="Calibri"/>
                 <w:lang w:val="fr-FR"/>
               </w:rPr>
-              <w:t xml:space="preserve">Question 6</w:t>
+              <w:t xml:space="preserve">Question 5 · réponse</w:t>
             </w:r>
           </w:p>
         </w:tc>
@@ -6094,7 +6094,7 @@
                 <w:rFonts w:ascii="Calibri" w:cs="Calibri" w:eastAsia="Calibri" w:hAnsi="Calibri"/>
                 <w:lang w:val="fr-FR"/>
               </w:rPr>
-              <w:t xml:space="preserve">0:40</w:t>
+              <w:t xml:space="preserve">0:20</w:t>
             </w:r>
           </w:p>
         </w:tc>
@@ -6123,7 +6123,7 @@
                 <w:rFonts w:ascii="Calibri" w:cs="Calibri" w:eastAsia="Calibri" w:hAnsi="Calibri"/>
                 <w:lang w:val="fr-FR"/>
               </w:rPr>
-              <w:t xml:space="preserve">48:40</w:t>
+              <w:t xml:space="preserve">50:00</w:t>
             </w:r>
           </w:p>
         </w:tc>
@@ -6188,7 +6188,7 @@
                 <w:rFonts w:ascii="Calibri" w:cs="Calibri" w:eastAsia="Calibri" w:hAnsi="Calibri"/>
                 <w:lang w:val="fr-FR"/>
               </w:rPr>
-              <w:t xml:space="preserve">Question 6 · réponse</w:t>
+              <w:t xml:space="preserve">Question 6</w:t>
             </w:r>
           </w:p>
         </w:tc>
@@ -6218,7 +6218,7 @@
                 <w:rFonts w:ascii="Calibri" w:cs="Calibri" w:eastAsia="Calibri" w:hAnsi="Calibri"/>
                 <w:lang w:val="fr-FR"/>
               </w:rPr>
-              <w:t xml:space="preserve">0:20</w:t>
+              <w:t xml:space="preserve">0:40</w:t>
             </w:r>
           </w:p>
         </w:tc>
@@ -6248,7 +6248,7 @@
                 <w:rFonts w:ascii="Calibri" w:cs="Calibri" w:eastAsia="Calibri" w:hAnsi="Calibri"/>
                 <w:lang w:val="fr-FR"/>
               </w:rPr>
-              <w:t xml:space="preserve">49:00</w:t>
+              <w:t xml:space="preserve">50:40</w:t>
             </w:r>
           </w:p>
         </w:tc>
@@ -6311,7 +6311,7 @@
                 <w:rFonts w:ascii="Calibri" w:cs="Calibri" w:eastAsia="Calibri" w:hAnsi="Calibri"/>
                 <w:lang w:val="fr-FR"/>
               </w:rPr>
-              <w:t xml:space="preserve">Question 7</w:t>
+              <w:t xml:space="preserve">Question 6 · réponse</w:t>
             </w:r>
           </w:p>
         </w:tc>
@@ -6340,7 +6340,7 @@
                 <w:rFonts w:ascii="Calibri" w:cs="Calibri" w:eastAsia="Calibri" w:hAnsi="Calibri"/>
                 <w:lang w:val="fr-FR"/>
               </w:rPr>
-              <w:t xml:space="preserve">0:40</w:t>
+              <w:t xml:space="preserve">0:20</w:t>
             </w:r>
           </w:p>
         </w:tc>
@@ -6369,7 +6369,7 @@
                 <w:rFonts w:ascii="Calibri" w:cs="Calibri" w:eastAsia="Calibri" w:hAnsi="Calibri"/>
                 <w:lang w:val="fr-FR"/>
               </w:rPr>
-              <w:t xml:space="preserve">49:40</w:t>
+              <w:t xml:space="preserve">51:00</w:t>
             </w:r>
           </w:p>
         </w:tc>
@@ -6434,7 +6434,7 @@
                 <w:rFonts w:ascii="Calibri" w:cs="Calibri" w:eastAsia="Calibri" w:hAnsi="Calibri"/>
                 <w:lang w:val="fr-FR"/>
               </w:rPr>
-              <w:t xml:space="preserve">Question 7 · réponse</w:t>
+              <w:t xml:space="preserve">Question 7</w:t>
             </w:r>
           </w:p>
         </w:tc>
@@ -6464,7 +6464,7 @@
                 <w:rFonts w:ascii="Calibri" w:cs="Calibri" w:eastAsia="Calibri" w:hAnsi="Calibri"/>
                 <w:lang w:val="fr-FR"/>
               </w:rPr>
-              <w:t xml:space="preserve">0:20</w:t>
+              <w:t xml:space="preserve">0:40</w:t>
             </w:r>
           </w:p>
         </w:tc>
@@ -6494,7 +6494,7 @@
                 <w:rFonts w:ascii="Calibri" w:cs="Calibri" w:eastAsia="Calibri" w:hAnsi="Calibri"/>
                 <w:lang w:val="fr-FR"/>
               </w:rPr>
-              <w:t xml:space="preserve">50:00</w:t>
+              <w:t xml:space="preserve">51:40</w:t>
             </w:r>
           </w:p>
         </w:tc>
@@ -6557,7 +6557,7 @@
                 <w:rFonts w:ascii="Calibri" w:cs="Calibri" w:eastAsia="Calibri" w:hAnsi="Calibri"/>
                 <w:lang w:val="fr-FR"/>
               </w:rPr>
-              <w:t xml:space="preserve">Question 8</w:t>
+              <w:t xml:space="preserve">Question 7 · réponse</w:t>
             </w:r>
           </w:p>
         </w:tc>
@@ -6586,7 +6586,7 @@
                 <w:rFonts w:ascii="Calibri" w:cs="Calibri" w:eastAsia="Calibri" w:hAnsi="Calibri"/>
                 <w:lang w:val="fr-FR"/>
               </w:rPr>
-              <w:t xml:space="preserve">0:40</w:t>
+              <w:t xml:space="preserve">0:20</w:t>
             </w:r>
           </w:p>
         </w:tc>
@@ -6615,7 +6615,7 @@
                 <w:rFonts w:ascii="Calibri" w:cs="Calibri" w:eastAsia="Calibri" w:hAnsi="Calibri"/>
                 <w:lang w:val="fr-FR"/>
               </w:rPr>
-              <w:t xml:space="preserve">50:40</w:t>
+              <w:t xml:space="preserve">52:00</w:t>
             </w:r>
           </w:p>
         </w:tc>
@@ -6680,7 +6680,7 @@
                 <w:rFonts w:ascii="Calibri" w:cs="Calibri" w:eastAsia="Calibri" w:hAnsi="Calibri"/>
                 <w:lang w:val="fr-FR"/>
               </w:rPr>
-              <w:t xml:space="preserve">Question 8 · réponse</w:t>
+              <w:t xml:space="preserve">Question 8</w:t>
             </w:r>
           </w:p>
         </w:tc>
@@ -6710,7 +6710,7 @@
                 <w:rFonts w:ascii="Calibri" w:cs="Calibri" w:eastAsia="Calibri" w:hAnsi="Calibri"/>
                 <w:lang w:val="fr-FR"/>
               </w:rPr>
-              <w:t xml:space="preserve">0:20</w:t>
+              <w:t xml:space="preserve">0:40</w:t>
             </w:r>
           </w:p>
         </w:tc>
@@ -6740,7 +6740,7 @@
                 <w:rFonts w:ascii="Calibri" w:cs="Calibri" w:eastAsia="Calibri" w:hAnsi="Calibri"/>
                 <w:lang w:val="fr-FR"/>
               </w:rPr>
-              <w:t xml:space="preserve">51:00</w:t>
+              <w:t xml:space="preserve">52:40</w:t>
             </w:r>
           </w:p>
         </w:tc>
@@ -6803,7 +6803,7 @@
                 <w:rFonts w:ascii="Calibri" w:cs="Calibri" w:eastAsia="Calibri" w:hAnsi="Calibri"/>
                 <w:lang w:val="fr-FR"/>
               </w:rPr>
-              <w:t xml:space="preserve">Question 9</w:t>
+              <w:t xml:space="preserve">Question 8 · réponse</w:t>
             </w:r>
           </w:p>
         </w:tc>
@@ -6832,7 +6832,7 @@
                 <w:rFonts w:ascii="Calibri" w:cs="Calibri" w:eastAsia="Calibri" w:hAnsi="Calibri"/>
                 <w:lang w:val="fr-FR"/>
               </w:rPr>
-              <w:t xml:space="preserve">0:40</w:t>
+              <w:t xml:space="preserve">0:20</w:t>
             </w:r>
           </w:p>
         </w:tc>
@@ -6861,7 +6861,7 @@
                 <w:rFonts w:ascii="Calibri" w:cs="Calibri" w:eastAsia="Calibri" w:hAnsi="Calibri"/>
                 <w:lang w:val="fr-FR"/>
               </w:rPr>
-              <w:t xml:space="preserve">51:40</w:t>
+              <w:t xml:space="preserve">53:00</w:t>
             </w:r>
           </w:p>
         </w:tc>
@@ -6926,7 +6926,7 @@
                 <w:rFonts w:ascii="Calibri" w:cs="Calibri" w:eastAsia="Calibri" w:hAnsi="Calibri"/>
                 <w:lang w:val="fr-FR"/>
               </w:rPr>
-              <w:t xml:space="preserve">Question 9 · réponse</w:t>
+              <w:t xml:space="preserve">Question 9</w:t>
             </w:r>
           </w:p>
         </w:tc>
@@ -6956,7 +6956,7 @@
                 <w:rFonts w:ascii="Calibri" w:cs="Calibri" w:eastAsia="Calibri" w:hAnsi="Calibri"/>
                 <w:lang w:val="fr-FR"/>
               </w:rPr>
-              <w:t xml:space="preserve">0:20</w:t>
+              <w:t xml:space="preserve">0:40</w:t>
             </w:r>
           </w:p>
         </w:tc>
@@ -6986,7 +6986,7 @@
                 <w:rFonts w:ascii="Calibri" w:cs="Calibri" w:eastAsia="Calibri" w:hAnsi="Calibri"/>
                 <w:lang w:val="fr-FR"/>
               </w:rPr>
-              <w:t xml:space="preserve">52:00</w:t>
+              <w:t xml:space="preserve">53:40</w:t>
             </w:r>
           </w:p>
         </w:tc>
@@ -7049,7 +7049,7 @@
                 <w:rFonts w:ascii="Calibri" w:cs="Calibri" w:eastAsia="Calibri" w:hAnsi="Calibri"/>
                 <w:lang w:val="fr-FR"/>
               </w:rPr>
-              <w:t xml:space="preserve">À retenir</w:t>
+              <w:t xml:space="preserve">Question 9 · réponse</w:t>
             </w:r>
           </w:p>
         </w:tc>
@@ -7078,7 +7078,7 @@
                 <w:rFonts w:ascii="Calibri" w:cs="Calibri" w:eastAsia="Calibri" w:hAnsi="Calibri"/>
                 <w:lang w:val="fr-FR"/>
               </w:rPr>
-              <w:t xml:space="preserve">1:30</w:t>
+              <w:t xml:space="preserve">0:20</w:t>
             </w:r>
           </w:p>
         </w:tc>
@@ -7107,7 +7107,7 @@
                 <w:rFonts w:ascii="Calibri" w:cs="Calibri" w:eastAsia="Calibri" w:hAnsi="Calibri"/>
                 <w:lang w:val="fr-FR"/>
               </w:rPr>
-              <w:t xml:space="preserve">53:30</w:t>
+              <w:t xml:space="preserve">54:00</w:t>
             </w:r>
           </w:p>
         </w:tc>
@@ -7172,6 +7172,129 @@
                 <w:rFonts w:ascii="Calibri" w:cs="Calibri" w:eastAsia="Calibri" w:hAnsi="Calibri"/>
                 <w:lang w:val="fr-FR"/>
               </w:rPr>
+              <w:t xml:space="preserve">À retenir</w:t>
+            </w:r>
+          </w:p>
+        </w:tc>
+        <w:tc>
+          <w:tcPr>
+            <w:tcW w:type="dxa" w:w="1400"/>
+            <w:tcBorders>
+              <w:top w:val="single" w:color="D5D9E0" w:sz="4"/>
+              <w:left w:val="single" w:color="D5D9E0" w:sz="4"/>
+              <w:bottom w:val="single" w:color="D5D9E0" w:sz="4"/>
+              <w:right w:val="single" w:color="D5D9E0" w:sz="4"/>
+            </w:tcBorders>
+            <w:shd w:fill="F1F3F6" w:color="auto" w:val="clear"/>
+            <w:tcMar>
+              <w:top w:type="dxa" w:w="60"/>
+              <w:left w:type="dxa" w:w="100"/>
+              <w:bottom w:type="dxa" w:w="60"/>
+              <w:right w:type="dxa" w:w="100"/>
+            </w:tcMar>
+          </w:tcPr>
+          <w:p>
+            <w:pPr>
+              <w:pStyle w:val="Body"/>
+            </w:pPr>
+            <w:r>
+              <w:rPr>
+                <w:rFonts w:ascii="Calibri" w:cs="Calibri" w:eastAsia="Calibri" w:hAnsi="Calibri"/>
+                <w:lang w:val="fr-FR"/>
+              </w:rPr>
+              <w:t xml:space="preserve">1:30</w:t>
+            </w:r>
+          </w:p>
+        </w:tc>
+        <w:tc>
+          <w:tcPr>
+            <w:tcW w:type="dxa" w:w="1400"/>
+            <w:tcBorders>
+              <w:top w:val="single" w:color="D5D9E0" w:sz="4"/>
+              <w:left w:val="single" w:color="D5D9E0" w:sz="4"/>
+              <w:bottom w:val="single" w:color="D5D9E0" w:sz="4"/>
+              <w:right w:val="single" w:color="D5D9E0" w:sz="4"/>
+            </w:tcBorders>
+            <w:shd w:fill="F1F3F6" w:color="auto" w:val="clear"/>
+            <w:tcMar>
+              <w:top w:type="dxa" w:w="60"/>
+              <w:left w:type="dxa" w:w="100"/>
+              <w:bottom w:type="dxa" w:w="60"/>
+              <w:right w:type="dxa" w:w="100"/>
+            </w:tcMar>
+          </w:tcPr>
+          <w:p>
+            <w:pPr>
+              <w:pStyle w:val="Body"/>
+            </w:pPr>
+            <w:r>
+              <w:rPr>
+                <w:rFonts w:ascii="Calibri" w:cs="Calibri" w:eastAsia="Calibri" w:hAnsi="Calibri"/>
+                <w:lang w:val="fr-FR"/>
+              </w:rPr>
+              <w:t xml:space="preserve">55:30</w:t>
+            </w:r>
+          </w:p>
+        </w:tc>
+      </w:tr>
+      <w:tr>
+        <w:trPr>
+          <w:tblHeader w:val="false"/>
+        </w:trPr>
+        <w:tc>
+          <w:tcPr>
+            <w:tcW w:type="dxa" w:w="700"/>
+            <w:tcBorders>
+              <w:top w:val="single" w:color="D5D9E0" w:sz="4"/>
+              <w:left w:val="single" w:color="D5D9E0" w:sz="4"/>
+              <w:bottom w:val="single" w:color="D5D9E0" w:sz="4"/>
+              <w:right w:val="single" w:color="D5D9E0" w:sz="4"/>
+            </w:tcBorders>
+            <w:tcMar>
+              <w:top w:type="dxa" w:w="60"/>
+              <w:left w:type="dxa" w:w="100"/>
+              <w:bottom w:type="dxa" w:w="60"/>
+              <w:right w:type="dxa" w:w="100"/>
+            </w:tcMar>
+          </w:tcPr>
+          <w:p>
+            <w:pPr>
+              <w:pStyle w:val="Body"/>
+            </w:pPr>
+            <w:r>
+              <w:rPr>
+                <w:rFonts w:ascii="Calibri" w:cs="Calibri" w:eastAsia="Calibri" w:hAnsi="Calibri"/>
+                <w:lang w:val="fr-FR"/>
+              </w:rPr>
+              <w:t xml:space="preserve">53</w:t>
+            </w:r>
+          </w:p>
+        </w:tc>
+        <w:tc>
+          <w:tcPr>
+            <w:tcW w:type="dxa" w:w="6138"/>
+            <w:tcBorders>
+              <w:top w:val="single" w:color="D5D9E0" w:sz="4"/>
+              <w:left w:val="single" w:color="D5D9E0" w:sz="4"/>
+              <w:bottom w:val="single" w:color="D5D9E0" w:sz="4"/>
+              <w:right w:val="single" w:color="D5D9E0" w:sz="4"/>
+            </w:tcBorders>
+            <w:tcMar>
+              <w:top w:type="dxa" w:w="60"/>
+              <w:left w:type="dxa" w:w="100"/>
+              <w:bottom w:type="dxa" w:w="60"/>
+              <w:right w:type="dxa" w:w="100"/>
+            </w:tcMar>
+          </w:tcPr>
+          <w:p>
+            <w:pPr>
+              <w:pStyle w:val="Body"/>
+            </w:pPr>
+            <w:r>
+              <w:rPr>
+                <w:rFonts w:ascii="Calibri" w:cs="Calibri" w:eastAsia="Calibri" w:hAnsi="Calibri"/>
+                <w:lang w:val="fr-FR"/>
+              </w:rPr>
               <w:t xml:space="preserve">Restons en contact</w:t>
             </w:r>
           </w:p>
@@ -7185,7 +7308,6 @@
               <w:bottom w:val="single" w:color="D5D9E0" w:sz="4"/>
               <w:right w:val="single" w:color="D5D9E0" w:sz="4"/>
             </w:tcBorders>
-            <w:shd w:fill="F1F3F6" w:color="auto" w:val="clear"/>
             <w:tcMar>
               <w:top w:type="dxa" w:w="60"/>
               <w:left w:type="dxa" w:w="100"/>
@@ -7215,7 +7337,6 @@
               <w:bottom w:val="single" w:color="D5D9E0" w:sz="4"/>
               <w:right w:val="single" w:color="D5D9E0" w:sz="4"/>
             </w:tcBorders>
-            <w:shd w:fill="F1F3F6" w:color="auto" w:val="clear"/>
             <w:tcMar>
               <w:top w:type="dxa" w:w="60"/>
               <w:left w:type="dxa" w:w="100"/>
@@ -7251,7 +7372,7 @@
           <w:color w:val="566070"/>
           <w:lang w:val="fr-FR"/>
         </w:rPr>
-        <w:t xml:space="preserve">Si vous prenez du retard, raccourcissez la diapo 10 (ne traiter que deux cartes), la démo de la diapo 26 (s'arrêter à l'enregistrement de la skill) et la diapo 29 (la survoler). Ne sacrifiez pas la démo Code (diapo 20) : c'est elle qui lève les peurs.</w:t>
+        <w:t xml:space="preserve">Si vous prenez du retard, raccourcissez la diapo 10 (ne traiter que deux cartes), la démo de la diapo 27 (s'arrêter à l'enregistrement de la skill) et la diapo 30 (la survoler). Ne sacrifiez pas la démo Code (diapo 20) : c'est elle qui lève les peurs.</w:t>
       </w:r>
     </w:p>
     <w:p>
@@ -11294,7 +11415,7 @@
           <w:rFonts w:ascii="Calibri" w:cs="Calibri" w:eastAsia="Calibri" w:hAnsi="Calibri"/>
           <w:lang w:val="fr-FR"/>
         </w:rPr>
-        <w:t xml:space="preserve">Voyons-la à l'œuvre.</w:t>
+        <w:t xml:space="preserve">Entre Cowork et Code, justement : pour une skill, où est la différence ?</w:t>
       </w:r>
     </w:p>
     <w:p>
@@ -11314,7 +11435,7 @@
           <w:rFonts w:ascii="Calibri" w:cs="Calibri" w:eastAsia="Calibri" w:hAnsi="Calibri"/>
           <w:lang w:val="fr-FR"/>
         </w:rPr>
-        <w:t xml:space="preserve">Diapo 26 · Démo : on le demande à Claude</w:t>
+        <w:t xml:space="preserve">Diapo 26 · Cowork ou Code pour créer une skill ?</w:t>
       </w:r>
     </w:p>
     <w:p>
@@ -11328,7 +11449,7 @@
           <wp:inline distT="0" distB="0" distL="0" distR="0">
             <wp:extent cx="4191000" cy="2362200"/>
             <wp:effectExtent t="0" r="0" b="0" l="0"/>
-            <wp:docPr id="21" name="diapo26" descr="Diapo 26 : Démo : on le demande à Claude" title="Diapo 26"/>
+            <wp:docPr id="21" name="diapo26" descr="Diapo 26 : Cowork ou Code pour créer une skill ?" title="Diapo 26"/>
             <wp:cNvGraphicFramePr>
               <a:graphicFrameLocks xmlns:a="http://schemas.openxmlformats.org/drawingml/2006/main" noChangeAspect="1"/>
             </wp:cNvGraphicFramePr>
@@ -11384,7 +11505,7 @@
           <w:rFonts w:ascii="Calibri" w:cs="Calibri" w:eastAsia="Calibri" w:hAnsi="Calibri"/>
           <w:lang w:val="fr-FR"/>
         </w:rPr>
-        <w:t xml:space="preserve">Démystifier la création par une démonstration courte (en direct, ou sur la maquette si le réseau fait défaut).</w:t>
+        <w:t xml:space="preserve">Distinguer Cowork et Code pour la création de skills : où vit la skill, ce que chacun permet, comment on partage.</w:t>
       </w:r>
     </w:p>
     <w:p>
@@ -11407,7 +11528,7 @@
           <w:rFonts w:ascii="Calibri" w:cs="Calibri" w:eastAsia="Calibri" w:hAnsi="Calibri"/>
           <w:lang w:val="fr-FR"/>
         </w:rPr>
-        <w:t xml:space="preserve">3:00</w:t>
+        <w:t xml:space="preserve">2:00</w:t>
       </w:r>
     </w:p>
     <w:p>
@@ -11432,7 +11553,7 @@
           <w:rFonts w:ascii="Calibri" w:cs="Calibri" w:eastAsia="Calibri" w:hAnsi="Calibri"/>
           <w:lang w:val="fr-FR"/>
         </w:rPr>
-        <w:t xml:space="preserve">Si la connexion le permet, faites la démo en direct dans Chat ; sinon, commentez la maquette. Tapez : « Aide-moi à créer une skill qui transforme mes notes de réunion en compte rendu à notre format. » Claude ouvre skill-creator : montrez à la salle la mention correspondante dans sa réflexion. Il pose les questions de la méthode : que doit faire la skill, quand la déclencher, quel format, qui lit ces comptes rendus, avez-vous un exemple ? Répondez, collez un ancien compte rendu réussi. Claude rédige le SKILL.md et vous le montre : faites lire la description à voix haute à la salle. Il propose ensuite deux ou trois demandes test : acceptez-les, c'est l'étape que tout le monde oublie. Puis il empaquette le tout en un fichier .skill : cliquez sur « Save skill » sur la carte du fichier (si ce bouton n'apparaît pas, par exemple parce que l'organisation ne l'autorise pas, téléchargez le fichier et importez-le avec le bouton « + »), puis vérifiez qu'il est activé dans la liste des skills (Personnaliser › Skills, ou Paramètres › Capacités selon l'interface). Enfin, testez : ouvrez une nouvelle conversation, collez des notes en vrac et dites simplement « tu peux m'en faire un compte rendu ? ». La skill doit se déclencher seule : on le voit à la mention « Using compte-rendu » (utilisation de la skill) dans la réflexion de Claude. Montrez cet indice à la salle, c'est le meilleur moyen de savoir si une skill a été utilisée. Si la démo prend du retard, arrêtez-vous après l'enregistrement : le test sera fait pendant l'atelier.</w:t>
+        <w:t xml:space="preserve">Cowork et Code savent tous deux créer une skill avec la méthode complète de skill-creator. La vraie différence, c'est l'endroit où la skill vit. Dans Cowork, elle vit dans votre compte Claude : skill-creator vous remet un fichier .skill, vous cliquez sur « Save skill », et elle est disponible partout où vous êtes connecté, dans Chat, dans Cowork et même dans Claude Code. Dans Code, la skill est un simple dossier, rangé dans .claude/skills du projet ou dans votre dossier personnel : rien à importer, elle marche tout de suite, mais seulement dans Claude Code. La synchronisation va du compte vers Code, jamais dans l'autre sens : pour l'avoir aussi dans Cowork, on compresse le dossier et on l'importe dans le compte. Deuxième différence : Code sait faire des choses que Cowork ne sait pas. Une skill écrite pour Code peut recevoir des paramètres (par exemple /compte-rendu réunion-du-12), lancer une commande pour récupérer des données fraîches avant de démarrer, ou être réservée à un lancement manuel, pour une action sensible. On y a aussi le mode plan, l'historique des versions et la relecture de chaque modification. Troisième différence, le partage : dans Cowork, on publie la skill dans l'organisation (offres Team et Enterprise) ; dans Code, on la range dans le dépôt Git du projet, et toute l'équipe l'obtient avec le projet. Un détail pratique pour la relecture des tests : dans Cowork, skill-creator produit une page de résultats à ouvrir soi-même ; dans Code, elle s'ouvre directement. En pratique : une skill métier pour tous, utilisée dans l'interface de Claude, c'est Cowork. Une skill qu'on veut versionner, faire relire ou partager avec une équipe technique, c'est Code. Et le meilleur des deux mondes : créer et tester dans Code, puis importer le fichier .skill dans le compte pour que tout le monde en profite. Réserve à mentionner : Cowork fusionne en ce moment avec Chat, l'interface peut évoluer.</w:t>
       </w:r>
     </w:p>
     <w:p>
@@ -11455,7 +11576,7 @@
           <w:rFonts w:ascii="Calibri" w:cs="Calibri" w:eastAsia="Calibri" w:hAnsi="Calibri"/>
           <w:lang w:val="fr-FR"/>
         </w:rPr>
-        <w:t xml:space="preserve">Pendant que Claude rédige : « D'après vous, quelle question va-t-il nous poser ensuite ? »</w:t>
+        <w:t xml:space="preserve">Pour la skill que vous avez en tête : qui doit l'utiliser, et où ? Cela vous dit déjà quelle porte choisir.</w:t>
       </w:r>
     </w:p>
     <w:p>
@@ -11478,7 +11599,7 @@
           <w:rFonts w:ascii="Calibri" w:cs="Calibri" w:eastAsia="Calibri" w:hAnsi="Calibri"/>
           <w:lang w:val="fr-FR"/>
         </w:rPr>
-        <w:t xml:space="preserve">Ce qui fait la différence entre une skill moyenne et une bonne skill tient en trois secrets.</w:t>
+        <w:t xml:space="preserve">Voyons maintenant skill-creator à l'œuvre.</w:t>
       </w:r>
     </w:p>
     <w:p>
@@ -11498,7 +11619,7 @@
           <w:rFonts w:ascii="Calibri" w:cs="Calibri" w:eastAsia="Calibri" w:hAnsi="Calibri"/>
           <w:lang w:val="fr-FR"/>
         </w:rPr>
-        <w:t xml:space="preserve">Diapo 27 · Les 3 secrets d'une bonne skill</w:t>
+        <w:t xml:space="preserve">Diapo 27 · Démo : on le demande à Claude</w:t>
       </w:r>
     </w:p>
     <w:p>
@@ -11512,7 +11633,7 @@
           <wp:inline distT="0" distB="0" distL="0" distR="0">
             <wp:extent cx="4191000" cy="2362200"/>
             <wp:effectExtent t="0" r="0" b="0" l="0"/>
-            <wp:docPr id="22" name="diapo27" descr="Diapo 27 : Les 3 secrets d'une bonne skill" title="Diapo 27"/>
+            <wp:docPr id="22" name="diapo27" descr="Diapo 27 : Démo : on le demande à Claude" title="Diapo 27"/>
             <wp:cNvGraphicFramePr>
               <a:graphicFrameLocks xmlns:a="http://schemas.openxmlformats.org/drawingml/2006/main" noChangeAspect="1"/>
             </wp:cNvGraphicFramePr>
@@ -11568,7 +11689,7 @@
           <w:rFonts w:ascii="Calibri" w:cs="Calibri" w:eastAsia="Calibri" w:hAnsi="Calibri"/>
           <w:lang w:val="fr-FR"/>
         </w:rPr>
-        <w:t xml:space="preserve">Donner les trois critères de qualité à appliquer dès l'atelier.</w:t>
+        <w:t xml:space="preserve">Démystifier la création par une démonstration courte (en direct, ou sur la maquette si le réseau fait défaut).</w:t>
       </w:r>
     </w:p>
     <w:p>
@@ -11591,7 +11712,7 @@
           <w:rFonts w:ascii="Calibri" w:cs="Calibri" w:eastAsia="Calibri" w:hAnsi="Calibri"/>
           <w:lang w:val="fr-FR"/>
         </w:rPr>
-        <w:t xml:space="preserve">1:15</w:t>
+        <w:t xml:space="preserve">3:00</w:t>
       </w:r>
     </w:p>
     <w:p>
@@ -11616,7 +11737,30 @@
           <w:rFonts w:ascii="Calibri" w:cs="Calibri" w:eastAsia="Calibri" w:hAnsi="Calibri"/>
           <w:lang w:val="fr-FR"/>
         </w:rPr>
-        <w:t xml:space="preserve">Premier secret : la description doit dire QUAND utiliser la skill, pas seulement ce qu'elle fait. « Compte rendu » ne suffit pas. Écrivez plutôt « Rédige un compte rendu de réunion à notre format. Utiliser quand l'utilisateur colle des notes de réunion ou demande un CR, une synthèse de réunion ou un relevé de décisions. » Écrivez-la comme la notice d'un outil, à la troisième personne (« Rédige… », pas « Je peux t'aider à… »), avec les mots que vos collègues emploient vraiment pour demander cette tâche. Deuxième secret : un exemple réussi vaut dix consignes. Claude imite très bien : donnez-lui un vrai compte rendu que vous aimez. Et dosez la liberté : des consignes souples pour une tâche de jugement (un compte rendu, un mail), des consignes strictes, voire un petit script, quand le résultat doit être identique à chaque fois (une charte graphique, un calcul). Troisième secret : une skill, une tâche. Mieux vaut trois petites skills claires qu'une grosse skill « tout-en-un » que Claude ne saura pas quand déclencher. Et restez concis : Claude est déjà très compétent, n'expliquez que ce qu'il ne peut pas deviner (votre format, vos règles, vos exemples). Si la skill grossit, gardez le SKILL.md court (moins de 500 lignes selon Anthropic) et rangez le détail dans des fichiers annexes que le SKILL.md cite directement, en disant quand les lire. Deux règles de forme : la description tient en 200 caractères maximum dans Claude, et le nom s'écrit en minuscules avec des tirets, sans les mots « claude » ni « anthropic ».</w:t>
+        <w:t xml:space="preserve">Si la connexion le permet, faites la démo en direct dans Chat ; sinon, commentez la maquette. Tapez : « Aide-moi à créer une skill qui transforme mes notes de réunion en compte rendu à notre format. » Claude ouvre skill-creator : montrez à la salle la mention correspondante dans sa réflexion. Il pose les questions de la méthode : que doit faire la skill, quand la déclencher, quel format, qui lit ces comptes rendus, avez-vous un exemple ? Répondez, collez un ancien compte rendu réussi. Claude rédige le SKILL.md et vous le montre : faites lire la description à voix haute à la salle. Il propose ensuite deux ou trois demandes test : acceptez-les, c'est l'étape que tout le monde oublie. Puis il empaquette le tout en un fichier .skill : cliquez sur « Save skill » sur la carte du fichier (si ce bouton n'apparaît pas, par exemple parce que l'organisation ne l'autorise pas, téléchargez le fichier et importez-le avec le bouton « + »), puis vérifiez qu'il est activé dans la liste des skills (Personnaliser › Skills, ou Paramètres › Capacités selon l'interface). Enfin, testez : ouvrez une nouvelle conversation, collez des notes en vrac et dites simplement « tu peux m'en faire un compte rendu ? ». La skill doit se déclencher seule : on le voit à la mention « Using compte-rendu » (utilisation de la skill) dans la réflexion de Claude. Montrez cet indice à la salle, c'est le meilleur moyen de savoir si une skill a été utilisée. Si la démo prend du retard, arrêtez-vous après l'enregistrement : le test sera fait pendant l'atelier.</w:t>
+      </w:r>
+    </w:p>
+    <w:p>
+      <w:pPr>
+        <w:pStyle w:val="Body"/>
+        <w:spacing w:after="120"/>
+      </w:pPr>
+      <w:r>
+        <w:rPr>
+          <w:rFonts w:ascii="Calibri" w:cs="Calibri" w:eastAsia="Calibri" w:hAnsi="Calibri"/>
+          <w:b/>
+          <w:bCs/>
+          <w:color w:val="2F5FC4"/>
+          <w:lang w:val="fr-FR"/>
+        </w:rPr>
+        <w:t xml:space="preserve">Question à la salle — </w:t>
+      </w:r>
+      <w:r>
+        <w:rPr>
+          <w:rFonts w:ascii="Calibri" w:cs="Calibri" w:eastAsia="Calibri" w:hAnsi="Calibri"/>
+          <w:lang w:val="fr-FR"/>
+        </w:rPr>
+        <w:t xml:space="preserve">Pendant que Claude rédige : « D'après vous, quelle question va-t-il nous poser ensuite ? »</w:t>
       </w:r>
     </w:p>
     <w:p>
@@ -11639,7 +11783,7 @@
           <w:rFonts w:ascii="Calibri" w:cs="Calibri" w:eastAsia="Calibri" w:hAnsi="Calibri"/>
           <w:lang w:val="fr-FR"/>
         </w:rPr>
-        <w:t xml:space="preserve">Pour finir cette partie, un cas d'usage complet, proposé par Anthropic.</w:t>
+        <w:t xml:space="preserve">Ce qui fait la différence entre une skill moyenne et une bonne skill tient en trois secrets.</w:t>
       </w:r>
     </w:p>
     <w:p>
@@ -11659,7 +11803,7 @@
           <w:rFonts w:ascii="Calibri" w:cs="Calibri" w:eastAsia="Calibri" w:hAnsi="Calibri"/>
           <w:lang w:val="fr-FR"/>
         </w:rPr>
-        <w:t xml:space="preserve">Diapo 28 · Cas d'usage : votre charte dans une skill</w:t>
+        <w:t xml:space="preserve">Diapo 28 · Les 3 secrets d'une bonne skill</w:t>
       </w:r>
     </w:p>
     <w:p>
@@ -11673,7 +11817,7 @@
           <wp:inline distT="0" distB="0" distL="0" distR="0">
             <wp:extent cx="4191000" cy="2362200"/>
             <wp:effectExtent t="0" r="0" b="0" l="0"/>
-            <wp:docPr id="23" name="diapo28" descr="Diapo 28 : Cas d'usage : votre charte dans une skill" title="Diapo 28"/>
+            <wp:docPr id="23" name="diapo28" descr="Diapo 28 : Les 3 secrets d'une bonne skill" title="Diapo 28"/>
             <wp:cNvGraphicFramePr>
               <a:graphicFrameLocks xmlns:a="http://schemas.openxmlformats.org/drawingml/2006/main" noChangeAspect="1"/>
             </wp:cNvGraphicFramePr>
@@ -11729,7 +11873,7 @@
           <w:rFonts w:ascii="Calibri" w:cs="Calibri" w:eastAsia="Calibri" w:hAnsi="Calibri"/>
           <w:lang w:val="fr-FR"/>
         </w:rPr>
-        <w:t xml:space="preserve">Montrer un cas d'usage complet et officiel, que chacun pourra refaire seul.</w:t>
+        <w:t xml:space="preserve">Donner les trois critères de qualité à appliquer dès l'atelier.</w:t>
       </w:r>
     </w:p>
     <w:p>
@@ -11752,7 +11896,7 @@
           <w:rFonts w:ascii="Calibri" w:cs="Calibri" w:eastAsia="Calibri" w:hAnsi="Calibri"/>
           <w:lang w:val="fr-FR"/>
         </w:rPr>
-        <w:t xml:space="preserve">2:30</w:t>
+        <w:t xml:space="preserve">1:15</w:t>
       </w:r>
     </w:p>
     <w:p>
@@ -11777,30 +11921,7 @@
           <w:rFonts w:ascii="Calibri" w:cs="Calibri" w:eastAsia="Calibri" w:hAnsi="Calibri"/>
           <w:lang w:val="fr-FR"/>
         </w:rPr>
-        <w:t xml:space="preserve">Ce cas vient de Claude Academy, le site de formation d'Anthropic : « Empaquetez vos directives de marque dans un skill », environ vingt minutes. Le principe : vous donnez une fois pour toutes votre charte, et Claude l'applique à chaque présentation, document ou tableur, sans que vous ayez à la rappeler. À gauche, ce qu'on donne dans le prompt : la palette de couleurs avec le rôle de chacune (texte, fond, accent principal, accents secondaires), la typographie (une police pour les titres, une pour le texte, avec des polices de secours) et les règles d'application (quelle couleur pour quel élément, alterner les accents…). On peut aussi brancher Google Drive pour que Claude lise le fichier de charte lui-même. Au centre, ce que Claude crée : le SKILL.md, un fichier détaillé sur les couleurs et la typographie, des exemples d'usage et un petit script qui applique les couleurs toujours de la même façon. Vous n'avez pas à comprendre le script : il garantit simplement un résultat identique à chaque fois. Enfin, on teste avec une demande qui ne parle pas de charte : « crée une présentation de bilan trimestriel ». Si les couleurs et les polices sont justes, la skill fonctionne. La page propose ensuite de mettre à jour la skill et de la combiner avec d'autres. Le QR code mène à la ressource.</w:t>
-      </w:r>
-    </w:p>
-    <w:p>
-      <w:pPr>
-        <w:pStyle w:val="Body"/>
-        <w:spacing w:after="120"/>
-      </w:pPr>
-      <w:r>
-        <w:rPr>
-          <w:rFonts w:ascii="Calibri" w:cs="Calibri" w:eastAsia="Calibri" w:hAnsi="Calibri"/>
-          <w:b/>
-          <w:bCs/>
-          <w:color w:val="2F5FC4"/>
-          <w:lang w:val="fr-FR"/>
-        </w:rPr>
-        <w:t xml:space="preserve">Question à la salle — </w:t>
-      </w:r>
-      <w:r>
-        <w:rPr>
-          <w:rFonts w:ascii="Calibri" w:cs="Calibri" w:eastAsia="Calibri" w:hAnsi="Calibri"/>
-          <w:lang w:val="fr-FR"/>
-        </w:rPr>
-        <w:t xml:space="preserve">Qui a une charte graphique dans sa structure ? Où est-elle rangée aujourd'hui ?</w:t>
+        <w:t xml:space="preserve">Premier secret : la description doit dire QUAND utiliser la skill, pas seulement ce qu'elle fait. « Compte rendu » ne suffit pas. Écrivez plutôt « Rédige un compte rendu de réunion à notre format. Utiliser quand l'utilisateur colle des notes de réunion ou demande un CR, une synthèse de réunion ou un relevé de décisions. » Écrivez-la comme la notice d'un outil, à la troisième personne (« Rédige… », pas « Je peux t'aider à… »), avec les mots que vos collègues emploient vraiment pour demander cette tâche. Deuxième secret : un exemple réussi vaut dix consignes. Claude imite très bien : donnez-lui un vrai compte rendu que vous aimez. Et dosez la liberté : des consignes souples pour une tâche de jugement (un compte rendu, un mail), des consignes strictes, voire un petit script, quand le résultat doit être identique à chaque fois (une charte graphique, un calcul). Troisième secret : une skill, une tâche. Mieux vaut trois petites skills claires qu'une grosse skill « tout-en-un » que Claude ne saura pas quand déclencher. Et restez concis : Claude est déjà très compétent, n'expliquez que ce qu'il ne peut pas deviner (votre format, vos règles, vos exemples). Si la skill grossit, gardez le SKILL.md court (moins de 500 lignes selon Anthropic) et rangez le détail dans des fichiers annexes que le SKILL.md cite directement, en disant quand les lire. Deux règles de forme : la description tient en 200 caractères maximum dans Claude, et le nom s'écrit en minuscules avec des tirets, sans les mots « claude » ni « anthropic ».</w:t>
       </w:r>
     </w:p>
     <w:p>
@@ -11823,7 +11944,7 @@
           <w:rFonts w:ascii="Calibri" w:cs="Calibri" w:eastAsia="Calibri" w:hAnsi="Calibri"/>
           <w:lang w:val="fr-FR"/>
         </w:rPr>
-        <w:t xml:space="preserve">Ce même cas se réalise dans les trois portes. Comparons.</w:t>
+        <w:t xml:space="preserve">Pour finir cette partie, un cas d'usage complet, proposé par Anthropic.</w:t>
       </w:r>
     </w:p>
     <w:p>
@@ -11843,7 +11964,7 @@
           <w:rFonts w:ascii="Calibri" w:cs="Calibri" w:eastAsia="Calibri" w:hAnsi="Calibri"/>
           <w:lang w:val="fr-FR"/>
         </w:rPr>
-        <w:t xml:space="preserve">Diapo 29 · Même charte, trois portes</w:t>
+        <w:t xml:space="preserve">Diapo 29 · Cas d'usage : votre charte dans une skill</w:t>
       </w:r>
     </w:p>
     <w:p>
@@ -11857,7 +11978,7 @@
           <wp:inline distT="0" distB="0" distL="0" distR="0">
             <wp:extent cx="4191000" cy="2362200"/>
             <wp:effectExtent t="0" r="0" b="0" l="0"/>
-            <wp:docPr id="24" name="diapo29" descr="Diapo 29 : Même charte, trois portes" title="Diapo 29"/>
+            <wp:docPr id="24" name="diapo29" descr="Diapo 29 : Cas d'usage : votre charte dans une skill" title="Diapo 29"/>
             <wp:cNvGraphicFramePr>
               <a:graphicFrameLocks xmlns:a="http://schemas.openxmlformats.org/drawingml/2006/main" noChangeAspect="1"/>
             </wp:cNvGraphicFramePr>
@@ -11913,7 +12034,7 @@
           <w:rFonts w:ascii="Calibri" w:cs="Calibri" w:eastAsia="Calibri" w:hAnsi="Calibri"/>
           <w:lang w:val="fr-FR"/>
         </w:rPr>
-        <w:t xml:space="preserve">Relier le cas d'usage aux avantages de chaque porte, et montrer que Code est une option réaliste.</w:t>
+        <w:t xml:space="preserve">Montrer un cas d'usage complet et officiel, que chacun pourra refaire seul.</w:t>
       </w:r>
     </w:p>
     <w:p>
@@ -11936,7 +12057,7 @@
           <w:rFonts w:ascii="Calibri" w:cs="Calibri" w:eastAsia="Calibri" w:hAnsi="Calibri"/>
           <w:lang w:val="fr-FR"/>
         </w:rPr>
-        <w:t xml:space="preserve">1:30</w:t>
+        <w:t xml:space="preserve">2:30</w:t>
       </w:r>
     </w:p>
     <w:p>
@@ -11961,7 +12082,30 @@
           <w:rFonts w:ascii="Calibri" w:cs="Calibri" w:eastAsia="Calibri" w:hAnsi="Calibri"/>
           <w:lang w:val="fr-FR"/>
         </w:rPr>
-        <w:t xml:space="preserve">Même objectif, trois chemins. Dans Chat, vous collez le prompt de la page Academy avec vos couleurs et vos règles : Claude crée le fichier de skill et vous l'enregistrez dans votre compte. C'est le chemin décrit par la ressource. Dans Cowork, vous pointez le dossier qui contient votre charte en PDF : Claude la lit lui-même, crée la skill et produit une présentation d'exemple pour vérifier. Dans Code, vous faites pareil en mode plan : vous relisez la structure proposée, vous la corrigez, puis Claude écrit les fichiers et vous testez aussitôt avec /charte-graphique. Le résultat est le même : une skill qui applique votre charte partout. Ce qui change, c'est votre niveau de contrôle. Pendant l'atelier, vous pourrez suivre ce cas dans la porte de votre choix.</w:t>
+        <w:t xml:space="preserve">Ce cas vient de Claude Academy, le site de formation d'Anthropic : « Empaquetez vos directives de marque dans un skill », environ vingt minutes. Le principe : vous donnez une fois pour toutes votre charte, et Claude l'applique à chaque présentation, document ou tableur, sans que vous ayez à la rappeler. À gauche, ce qu'on donne dans le prompt : la palette de couleurs avec le rôle de chacune (texte, fond, accent principal, accents secondaires), la typographie (une police pour les titres, une pour le texte, avec des polices de secours) et les règles d'application (quelle couleur pour quel élément, alterner les accents…). On peut aussi brancher Google Drive pour que Claude lise le fichier de charte lui-même. Au centre, ce que Claude crée : le SKILL.md, un fichier détaillé sur les couleurs et la typographie, des exemples d'usage et un petit script qui applique les couleurs toujours de la même façon. Vous n'avez pas à comprendre le script : il garantit simplement un résultat identique à chaque fois. Enfin, on teste avec une demande qui ne parle pas de charte : « crée une présentation de bilan trimestriel ». Si les couleurs et les polices sont justes, la skill fonctionne. La page propose ensuite de mettre à jour la skill et de la combiner avec d'autres. Le QR code mène à la ressource.</w:t>
+      </w:r>
+    </w:p>
+    <w:p>
+      <w:pPr>
+        <w:pStyle w:val="Body"/>
+        <w:spacing w:after="120"/>
+      </w:pPr>
+      <w:r>
+        <w:rPr>
+          <w:rFonts w:ascii="Calibri" w:cs="Calibri" w:eastAsia="Calibri" w:hAnsi="Calibri"/>
+          <w:b/>
+          <w:bCs/>
+          <w:color w:val="2F5FC4"/>
+          <w:lang w:val="fr-FR"/>
+        </w:rPr>
+        <w:t xml:space="preserve">Question à la salle — </w:t>
+      </w:r>
+      <w:r>
+        <w:rPr>
+          <w:rFonts w:ascii="Calibri" w:cs="Calibri" w:eastAsia="Calibri" w:hAnsi="Calibri"/>
+          <w:lang w:val="fr-FR"/>
+        </w:rPr>
+        <w:t xml:space="preserve">Qui a une charte graphique dans sa structure ? Où est-elle rangée aujourd'hui ?</w:t>
       </w:r>
     </w:p>
     <w:p>
@@ -11984,7 +12128,7 @@
           <w:rFonts w:ascii="Calibri" w:cs="Calibri" w:eastAsia="Calibri" w:hAnsi="Calibri"/>
           <w:lang w:val="fr-FR"/>
         </w:rPr>
-        <w:t xml:space="preserve">Votre skill fonctionne : comment en faire profiter les autres ?</w:t>
+        <w:t xml:space="preserve">Ce même cas se réalise dans les trois portes. Comparons.</w:t>
       </w:r>
     </w:p>
     <w:p>
@@ -12004,114 +12148,7 @@
           <w:rFonts w:ascii="Calibri" w:cs="Calibri" w:eastAsia="Calibri" w:hAnsi="Calibri"/>
           <w:lang w:val="fr-FR"/>
         </w:rPr>
-        <w:t xml:space="preserve">Diapo 30 · Partager</w:t>
-      </w:r>
-    </w:p>
-    <w:p>
-      <w:pPr>
-        <w:pStyle w:val="Body"/>
-        <w:spacing w:after="120"/>
-      </w:pPr>
-      <w:r>
-        <w:rPr>
-          <w:rFonts w:ascii="Calibri" w:cs="Calibri" w:eastAsia="Calibri" w:hAnsi="Calibri"/>
-          <w:i/>
-          <w:iCs/>
-          <w:color w:val="566070"/>
-          <w:lang w:val="fr-FR"/>
-        </w:rPr>
-        <w:t xml:space="preserve">Diapo d'ouverture de partie : grand numéro et titre sur fond framboise.</w:t>
-      </w:r>
-    </w:p>
-    <w:p>
-      <w:pPr>
-        <w:pStyle w:val="Body"/>
-        <w:spacing w:after="120"/>
-      </w:pPr>
-      <w:r>
-        <w:rPr>
-          <w:rFonts w:ascii="Calibri" w:cs="Calibri" w:eastAsia="Calibri" w:hAnsi="Calibri"/>
-          <w:b/>
-          <w:bCs/>
-          <w:color w:val="B8235A"/>
-          <w:lang w:val="fr-FR"/>
-        </w:rPr>
-        <w:t xml:space="preserve">Objectif — </w:t>
-      </w:r>
-      <w:r>
-        <w:rPr>
-          <w:rFonts w:ascii="Calibri" w:cs="Calibri" w:eastAsia="Calibri" w:hAnsi="Calibri"/>
-          <w:lang w:val="fr-FR"/>
-        </w:rPr>
-        <w:t xml:space="preserve">Marquer le passage à la partie 6 et relancer l'attention.</w:t>
-      </w:r>
-    </w:p>
-    <w:p>
-      <w:pPr>
-        <w:pStyle w:val="Body"/>
-        <w:spacing w:after="120"/>
-      </w:pPr>
-      <w:r>
-        <w:rPr>
-          <w:rFonts w:ascii="Calibri" w:cs="Calibri" w:eastAsia="Calibri" w:hAnsi="Calibri"/>
-          <w:b/>
-          <w:bCs/>
-          <w:color w:val="566070"/>
-          <w:lang w:val="fr-FR"/>
-        </w:rPr>
-        <w:t xml:space="preserve">Timing — </w:t>
-      </w:r>
-      <w:r>
-        <w:rPr>
-          <w:rFonts w:ascii="Calibri" w:cs="Calibri" w:eastAsia="Calibri" w:hAnsi="Calibri"/>
-          <w:lang w:val="fr-FR"/>
-        </w:rPr>
-        <w:t xml:space="preserve">0:10</w:t>
-      </w:r>
-    </w:p>
-    <w:p>
-      <w:pPr>
-        <w:pStyle w:val="Heading3"/>
-      </w:pPr>
-      <w:r>
-        <w:rPr>
-          <w:rFonts w:ascii="Calibri" w:cs="Calibri" w:eastAsia="Calibri" w:hAnsi="Calibri"/>
-          <w:lang w:val="fr-FR"/>
-        </w:rPr>
-        <w:t xml:space="preserve">Script</w:t>
-      </w:r>
-    </w:p>
-    <w:p>
-      <w:pPr>
-        <w:pStyle w:val="Body"/>
-        <w:spacing w:after="120"/>
-      </w:pPr>
-      <w:r>
-        <w:rPr>
-          <w:rFonts w:ascii="Calibri" w:cs="Calibri" w:eastAsia="Calibri" w:hAnsi="Calibri"/>
-          <w:lang w:val="fr-FR"/>
-        </w:rPr>
-        <w:t xml:space="preserve">Dernière étape avant le quiz : comment faire profiter les autres de votre skill, selon votre offre et votre public. Laissez la diapo quelques secondes, le temps que la salle se repère dans le programme.</w:t>
-      </w:r>
-    </w:p>
-    <w:p>
-      <w:pPr>
-        <w:pStyle w:val="Body"/>
-      </w:pPr>
-      <w:r>
-        <w:br w:type="page"/>
-      </w:r>
-    </w:p>
-    <w:p>
-      <w:pPr>
-        <w:pStyle w:val="Heading2"/>
-      </w:pPr>
-      <w:r>
-        <w:rPr>
-          <w:rFonts w:ascii="Calibri" w:cs="Calibri" w:eastAsia="Calibri" w:hAnsi="Calibri"/>
-          <w:lang w:val="fr-FR"/>
-        </w:rPr>
-        <w:t xml:space="preserve">Diapo 31 · Partager : trois cercles</w:t>
+        <w:t xml:space="preserve">Diapo 30 · Même charte, trois portes</w:t>
       </w:r>
     </w:p>
     <w:p>
@@ -12125,7 +12162,7 @@
           <wp:inline distT="0" distB="0" distL="0" distR="0">
             <wp:extent cx="4191000" cy="2362200"/>
             <wp:effectExtent t="0" r="0" b="0" l="0"/>
-            <wp:docPr id="25" name="diapo31" descr="Diapo 31 : Partager : trois cercles" title="Diapo 31"/>
+            <wp:docPr id="25" name="diapo30" descr="Diapo 30 : Même charte, trois portes" title="Diapo 30"/>
             <wp:cNvGraphicFramePr>
               <a:graphicFrameLocks xmlns:a="http://schemas.openxmlformats.org/drawingml/2006/main" noChangeAspect="1"/>
             </wp:cNvGraphicFramePr>
@@ -12181,7 +12218,7 @@
           <w:rFonts w:ascii="Calibri" w:cs="Calibri" w:eastAsia="Calibri" w:hAnsi="Calibri"/>
           <w:lang w:val="fr-FR"/>
         </w:rPr>
-        <w:t xml:space="preserve">Présenter les modes de partage selon l'offre Claude et le public visé.</w:t>
+        <w:t xml:space="preserve">Relier le cas d'usage aux avantages de chaque porte, et montrer que Code est une option réaliste.</w:t>
       </w:r>
     </w:p>
     <w:p>
@@ -12204,7 +12241,7 @@
           <w:rFonts w:ascii="Calibri" w:cs="Calibri" w:eastAsia="Calibri" w:hAnsi="Calibri"/>
           <w:lang w:val="fr-FR"/>
         </w:rPr>
-        <w:t xml:space="preserve">2:30</w:t>
+        <w:t xml:space="preserve">1:30</w:t>
       </w:r>
     </w:p>
     <w:p>
@@ -12229,30 +12266,7 @@
           <w:rFonts w:ascii="Calibri" w:cs="Calibri" w:eastAsia="Calibri" w:hAnsi="Calibri"/>
           <w:lang w:val="fr-FR"/>
         </w:rPr>
-        <w:t xml:space="preserve">Premier cercle, vous-même et quelques personnes : on envoie le fichier de la skill (celui que Claude vous a remis à la création, ou un .zip du dossier ; selon la version, le menu de la skill propose aussi de la télécharger, à vérifier le jour J). Le destinataire l'importe avec le bouton « + ». Ça marche quelle que soit l'offre, gratuite, Pro ou Max. Deuxième cercle, votre équipe : en offre Team ou Enterprise, le menu « … » d'une skill propose « Partager » à des collègues choisis (ils peuvent l'activer, pas la modifier) et « Publier dans l'organisation » pour la rendre disponible à tous. Selon le réglage de l'administrateur, la publication peut passer par une relecture ; les skills fournies par l'administrateur sont activées d'office pour tout le monde. Troisième cercle, tout le monde : on publie le dossier sur GitHub, ou on l'emballe dans un plugin avec d'autres skills. Pour les équipes tech, il suffit aussi de déposer la skill dans le dossier .claude/skills d'un projet de code : toute l'équipe l'aura. Rappel : ce que vous partagez, les autres vont le lire… et Claude va l'exécuter. Relisez avant de publier, et n'y mettez jamais de mot de passe ni de donnée personnelle.</w:t>
-      </w:r>
-    </w:p>
-    <w:p>
-      <w:pPr>
-        <w:pStyle w:val="Body"/>
-        <w:spacing w:after="120"/>
-      </w:pPr>
-      <w:r>
-        <w:rPr>
-          <w:rFonts w:ascii="Calibri" w:cs="Calibri" w:eastAsia="Calibri" w:hAnsi="Calibri"/>
-          <w:b/>
-          <w:bCs/>
-          <w:color w:val="2F5FC4"/>
-          <w:lang w:val="fr-FR"/>
-        </w:rPr>
-        <w:t xml:space="preserve">Question à la salle — </w:t>
-      </w:r>
-      <w:r>
-        <w:rPr>
-          <w:rFonts w:ascii="Calibri" w:cs="Calibri" w:eastAsia="Calibri" w:hAnsi="Calibri"/>
-          <w:lang w:val="fr-FR"/>
-        </w:rPr>
-        <w:t xml:space="preserve">Dans votre structure, quelle offre avez-vous : individuelle, Team, Enterprise ? Qui est l'administrateur ?</w:t>
+        <w:t xml:space="preserve">Même objectif, trois chemins. Dans Chat, vous collez le prompt de la page Academy avec vos couleurs et vos règles : Claude crée le fichier de skill et vous l'enregistrez dans votre compte. C'est le chemin décrit par la ressource. Dans Cowork, vous pointez le dossier qui contient votre charte en PDF : Claude la lit lui-même, crée la skill et produit une présentation d'exemple pour vérifier. Dans Code, vous faites pareil en mode plan : vous relisez la structure proposée, vous la corrigez, puis Claude écrit les fichiers et vous testez aussitôt avec /charte-graphique. Le résultat est le même : une skill qui applique votre charte partout. Ce qui change, c'est votre niveau de contrôle. Pendant l'atelier, vous pourrez suivre ce cas dans la porte de votre choix.</w:t>
       </w:r>
     </w:p>
     <w:p>
@@ -12275,7 +12289,7 @@
           <w:rFonts w:ascii="Calibri" w:cs="Calibri" w:eastAsia="Calibri" w:hAnsi="Calibri"/>
           <w:lang w:val="fr-FR"/>
         </w:rPr>
-        <w:t xml:space="preserve">Vous avez tout. Sortez vos cartons : c'est l'heure du quiz !</w:t>
+        <w:t xml:space="preserve">Votre skill fonctionne : comment en faire profiter les autres ?</w:t>
       </w:r>
     </w:p>
     <w:p>
@@ -12295,7 +12309,114 @@
           <w:rFonts w:ascii="Calibri" w:cs="Calibri" w:eastAsia="Calibri" w:hAnsi="Calibri"/>
           <w:lang w:val="fr-FR"/>
         </w:rPr>
-        <w:t xml:space="preserve">Diapo 32 · Quiz : levez votre carton !</w:t>
+        <w:t xml:space="preserve">Diapo 31 · Partager</w:t>
+      </w:r>
+    </w:p>
+    <w:p>
+      <w:pPr>
+        <w:pStyle w:val="Body"/>
+        <w:spacing w:after="120"/>
+      </w:pPr>
+      <w:r>
+        <w:rPr>
+          <w:rFonts w:ascii="Calibri" w:cs="Calibri" w:eastAsia="Calibri" w:hAnsi="Calibri"/>
+          <w:i/>
+          <w:iCs/>
+          <w:color w:val="566070"/>
+          <w:lang w:val="fr-FR"/>
+        </w:rPr>
+        <w:t xml:space="preserve">Diapo d'ouverture de partie : grand numéro et titre sur fond framboise.</w:t>
+      </w:r>
+    </w:p>
+    <w:p>
+      <w:pPr>
+        <w:pStyle w:val="Body"/>
+        <w:spacing w:after="120"/>
+      </w:pPr>
+      <w:r>
+        <w:rPr>
+          <w:rFonts w:ascii="Calibri" w:cs="Calibri" w:eastAsia="Calibri" w:hAnsi="Calibri"/>
+          <w:b/>
+          <w:bCs/>
+          <w:color w:val="B8235A"/>
+          <w:lang w:val="fr-FR"/>
+        </w:rPr>
+        <w:t xml:space="preserve">Objectif — </w:t>
+      </w:r>
+      <w:r>
+        <w:rPr>
+          <w:rFonts w:ascii="Calibri" w:cs="Calibri" w:eastAsia="Calibri" w:hAnsi="Calibri"/>
+          <w:lang w:val="fr-FR"/>
+        </w:rPr>
+        <w:t xml:space="preserve">Marquer le passage à la partie 6 et relancer l'attention.</w:t>
+      </w:r>
+    </w:p>
+    <w:p>
+      <w:pPr>
+        <w:pStyle w:val="Body"/>
+        <w:spacing w:after="120"/>
+      </w:pPr>
+      <w:r>
+        <w:rPr>
+          <w:rFonts w:ascii="Calibri" w:cs="Calibri" w:eastAsia="Calibri" w:hAnsi="Calibri"/>
+          <w:b/>
+          <w:bCs/>
+          <w:color w:val="566070"/>
+          <w:lang w:val="fr-FR"/>
+        </w:rPr>
+        <w:t xml:space="preserve">Timing — </w:t>
+      </w:r>
+      <w:r>
+        <w:rPr>
+          <w:rFonts w:ascii="Calibri" w:cs="Calibri" w:eastAsia="Calibri" w:hAnsi="Calibri"/>
+          <w:lang w:val="fr-FR"/>
+        </w:rPr>
+        <w:t xml:space="preserve">0:10</w:t>
+      </w:r>
+    </w:p>
+    <w:p>
+      <w:pPr>
+        <w:pStyle w:val="Heading3"/>
+      </w:pPr>
+      <w:r>
+        <w:rPr>
+          <w:rFonts w:ascii="Calibri" w:cs="Calibri" w:eastAsia="Calibri" w:hAnsi="Calibri"/>
+          <w:lang w:val="fr-FR"/>
+        </w:rPr>
+        <w:t xml:space="preserve">Script</w:t>
+      </w:r>
+    </w:p>
+    <w:p>
+      <w:pPr>
+        <w:pStyle w:val="Body"/>
+        <w:spacing w:after="120"/>
+      </w:pPr>
+      <w:r>
+        <w:rPr>
+          <w:rFonts w:ascii="Calibri" w:cs="Calibri" w:eastAsia="Calibri" w:hAnsi="Calibri"/>
+          <w:lang w:val="fr-FR"/>
+        </w:rPr>
+        <w:t xml:space="preserve">Dernière étape avant le quiz : comment faire profiter les autres de votre skill, selon votre offre et votre public. Laissez la diapo quelques secondes, le temps que la salle se repère dans le programme.</w:t>
+      </w:r>
+    </w:p>
+    <w:p>
+      <w:pPr>
+        <w:pStyle w:val="Body"/>
+      </w:pPr>
+      <w:r>
+        <w:br w:type="page"/>
+      </w:r>
+    </w:p>
+    <w:p>
+      <w:pPr>
+        <w:pStyle w:val="Heading2"/>
+      </w:pPr>
+      <w:r>
+        <w:rPr>
+          <w:rFonts w:ascii="Calibri" w:cs="Calibri" w:eastAsia="Calibri" w:hAnsi="Calibri"/>
+          <w:lang w:val="fr-FR"/>
+        </w:rPr>
+        <w:t xml:space="preserve">Diapo 32 · Partager : trois cercles</w:t>
       </w:r>
     </w:p>
     <w:p>
@@ -12307,9 +12428,9 @@
       <w:r>
         <w:drawing>
           <wp:inline distT="0" distB="0" distL="0" distR="0">
-            <wp:extent cx="2667000" cy="1504950"/>
+            <wp:extent cx="4191000" cy="2362200"/>
             <wp:effectExtent t="0" r="0" b="0" l="0"/>
-            <wp:docPr id="26" name="diapo32" descr="Diapo 32 : Quiz : levez votre carton !" title="Diapo 32"/>
+            <wp:docPr id="26" name="diapo32" descr="Diapo 32 : Partager : trois cercles" title="Diapo 32"/>
             <wp:cNvGraphicFramePr>
               <a:graphicFrameLocks xmlns:a="http://schemas.openxmlformats.org/drawingml/2006/main" noChangeAspect="1"/>
             </wp:cNvGraphicFramePr>
@@ -12332,7 +12453,7 @@
                   <pic:spPr bwMode="auto">
                     <a:xfrm>
                       <a:off x="0" y="0"/>
-                      <a:ext cx="2667000" cy="1504950"/>
+                      <a:ext cx="4191000" cy="2362200"/>
                     </a:xfrm>
                     <a:prstGeom prst="rect">
                       <a:avLst/>
@@ -12365,7 +12486,7 @@
           <w:rFonts w:ascii="Calibri" w:cs="Calibri" w:eastAsia="Calibri" w:hAnsi="Calibri"/>
           <w:lang w:val="fr-FR"/>
         </w:rPr>
-        <w:t xml:space="preserve">Lancer l'interaction et vérifier que chacun a ses cartons.</w:t>
+        <w:t xml:space="preserve">Présenter les modes de partage selon l'offre Claude et le public visé.</w:t>
       </w:r>
     </w:p>
     <w:p>
@@ -12388,7 +12509,7 @@
           <w:rFonts w:ascii="Calibri" w:cs="Calibri" w:eastAsia="Calibri" w:hAnsi="Calibri"/>
           <w:lang w:val="fr-FR"/>
         </w:rPr>
-        <w:t xml:space="preserve">0:30</w:t>
+        <w:t xml:space="preserve">2:30</w:t>
       </w:r>
     </w:p>
     <w:p>
@@ -12413,7 +12534,30 @@
           <w:rFonts w:ascii="Calibri" w:cs="Calibri" w:eastAsia="Calibri" w:hAnsi="Calibri"/>
           <w:lang w:val="fr-FR"/>
         </w:rPr>
-        <w:t xml:space="preserve">Neuf questions. Pour chacune, je lis la question et les quatre réponses, je compte jusqu'à trois et tout le monde lève son carton en même temps. Pas de honte à se tromper : c'est justement ce qui nous intéresse. On regarde la répartition des couleurs dans la salle, puis je révèle la bonne réponse. Si vous n'avez pas de cartons, levez 1 à 4 doigts : un doigt pour A, deux pour B, trois pour C, quatre pour D.</w:t>
+        <w:t xml:space="preserve">Premier cercle, vous-même et quelques personnes : on envoie le fichier de la skill (celui que Claude vous a remis à la création, ou un .zip du dossier ; selon la version, le menu de la skill propose aussi de la télécharger, à vérifier le jour J). Le destinataire l'importe avec le bouton « + ». Ça marche quelle que soit l'offre, gratuite, Pro ou Max. Deuxième cercle, votre équipe : en offre Team ou Enterprise, le menu « … » d'une skill propose « Partager » à des collègues choisis (ils peuvent l'activer, pas la modifier) et « Publier dans l'organisation » pour la rendre disponible à tous. Selon le réglage de l'administrateur, la publication peut passer par une relecture ; les skills fournies par l'administrateur sont activées d'office pour tout le monde. Troisième cercle, tout le monde : on publie le dossier sur GitHub, ou on l'emballe dans un plugin avec d'autres skills. Pour les équipes tech, il suffit aussi de déposer la skill dans le dossier .claude/skills d'un projet de code : toute l'équipe l'aura. Rappel : ce que vous partagez, les autres vont le lire… et Claude va l'exécuter. Relisez avant de publier, et n'y mettez jamais de mot de passe ni de donnée personnelle.</w:t>
+      </w:r>
+    </w:p>
+    <w:p>
+      <w:pPr>
+        <w:pStyle w:val="Body"/>
+        <w:spacing w:after="120"/>
+      </w:pPr>
+      <w:r>
+        <w:rPr>
+          <w:rFonts w:ascii="Calibri" w:cs="Calibri" w:eastAsia="Calibri" w:hAnsi="Calibri"/>
+          <w:b/>
+          <w:bCs/>
+          <w:color w:val="2F5FC4"/>
+          <w:lang w:val="fr-FR"/>
+        </w:rPr>
+        <w:t xml:space="preserve">Question à la salle — </w:t>
+      </w:r>
+      <w:r>
+        <w:rPr>
+          <w:rFonts w:ascii="Calibri" w:cs="Calibri" w:eastAsia="Calibri" w:hAnsi="Calibri"/>
+          <w:lang w:val="fr-FR"/>
+        </w:rPr>
+        <w:t xml:space="preserve">Dans votre structure, quelle offre avez-vous : individuelle, Team, Enterprise ? Qui est l'administrateur ?</w:t>
       </w:r>
     </w:p>
     <w:p>
@@ -12436,7 +12580,7 @@
           <w:rFonts w:ascii="Calibri" w:cs="Calibri" w:eastAsia="Calibri" w:hAnsi="Calibri"/>
           <w:lang w:val="fr-FR"/>
         </w:rPr>
-        <w:t xml:space="preserve">Question 1.</w:t>
+        <w:t xml:space="preserve">Vous avez tout. Sortez vos cartons : c'est l'heure du quiz !</w:t>
       </w:r>
     </w:p>
     <w:p>
@@ -12456,7 +12600,7 @@
           <w:rFonts w:ascii="Calibri" w:cs="Calibri" w:eastAsia="Calibri" w:hAnsi="Calibri"/>
           <w:lang w:val="fr-FR"/>
         </w:rPr>
-        <w:t xml:space="preserve">Diapo 33 · Question 1</w:t>
+        <w:t xml:space="preserve">Diapo 33 · Quiz : levez votre carton !</w:t>
       </w:r>
     </w:p>
     <w:p>
@@ -12470,7 +12614,7 @@
           <wp:inline distT="0" distB="0" distL="0" distR="0">
             <wp:extent cx="2667000" cy="1504950"/>
             <wp:effectExtent t="0" r="0" b="0" l="0"/>
-            <wp:docPr id="27" name="diapo33" descr="Diapo 33 : Question 1" title="Diapo 33"/>
+            <wp:docPr id="27" name="diapo33" descr="Diapo 33 : Quiz : levez votre carton !" title="Diapo 33"/>
             <wp:cNvGraphicFramePr>
               <a:graphicFrameLocks xmlns:a="http://schemas.openxmlformats.org/drawingml/2006/main" noChangeAspect="1"/>
             </wp:cNvGraphicFramePr>
@@ -12526,7 +12670,7 @@
           <w:rFonts w:ascii="Calibri" w:cs="Calibri" w:eastAsia="Calibri" w:hAnsi="Calibri"/>
           <w:lang w:val="fr-FR"/>
         </w:rPr>
-        <w:t xml:space="preserve">Question 1 : faire voter la salle.</w:t>
+        <w:t xml:space="preserve">Lancer l'interaction et vérifier que chacun a ses cartons.</w:t>
       </w:r>
     </w:p>
     <w:p>
@@ -12549,7 +12693,7 @@
           <w:rFonts w:ascii="Calibri" w:cs="Calibri" w:eastAsia="Calibri" w:hAnsi="Calibri"/>
           <w:lang w:val="fr-FR"/>
         </w:rPr>
-        <w:t xml:space="preserve">0:40</w:t>
+        <w:t xml:space="preserve">0:30</w:t>
       </w:r>
     </w:p>
     <w:p>
@@ -12574,30 +12718,7 @@
           <w:rFonts w:ascii="Calibri" w:cs="Calibri" w:eastAsia="Calibri" w:hAnsi="Calibri"/>
           <w:lang w:val="fr-FR"/>
         </w:rPr>
-        <w:t xml:space="preserve">Lire la question : « Qu'est-ce qui décide Claude à utiliser une skill ? » Puis les réponses : A, Son nom de fichier ; B, Sa description ; C, Sa longueur ; D, Sa date de création. Compter « 1, 2, 3, cartons ! » Observer la salle et commenter la répartition (« beaucoup de bleu… quelques verts… ») sans donner d'indice.</w:t>
-      </w:r>
-    </w:p>
-    <w:p>
-      <w:pPr>
-        <w:pStyle w:val="Body"/>
-        <w:spacing w:after="120"/>
-      </w:pPr>
-      <w:r>
-        <w:rPr>
-          <w:rFonts w:ascii="Calibri" w:cs="Calibri" w:eastAsia="Calibri" w:hAnsi="Calibri"/>
-          <w:b/>
-          <w:bCs/>
-          <w:color w:val="2F5FC4"/>
-          <w:lang w:val="fr-FR"/>
-        </w:rPr>
-        <w:t xml:space="preserve">Question à la salle — </w:t>
-      </w:r>
-      <w:r>
-        <w:rPr>
-          <w:rFonts w:ascii="Calibri" w:cs="Calibri" w:eastAsia="Calibri" w:hAnsi="Calibri"/>
-          <w:lang w:val="fr-FR"/>
-        </w:rPr>
-        <w:t xml:space="preserve">Un volontaire pour défendre une autre réponse que celle de la majorité ?</w:t>
+        <w:t xml:space="preserve">Neuf questions. Pour chacune, je lis la question et les quatre réponses, je compte jusqu'à trois et tout le monde lève son carton en même temps. Pas de honte à se tromper : c'est justement ce qui nous intéresse. On regarde la répartition des couleurs dans la salle, puis je révèle la bonne réponse. Si vous n'avez pas de cartons, levez 1 à 4 doigts : un doigt pour A, deux pour B, trois pour C, quatre pour D.</w:t>
       </w:r>
     </w:p>
     <w:p>
@@ -12620,7 +12741,7 @@
           <w:rFonts w:ascii="Calibri" w:cs="Calibri" w:eastAsia="Calibri" w:hAnsi="Calibri"/>
           <w:lang w:val="fr-FR"/>
         </w:rPr>
-        <w:t xml:space="preserve">Clic : révélation de la réponse.</w:t>
+        <w:t xml:space="preserve">Question 1.</w:t>
       </w:r>
     </w:p>
     <w:p>
@@ -12640,7 +12761,7 @@
           <w:rFonts w:ascii="Calibri" w:cs="Calibri" w:eastAsia="Calibri" w:hAnsi="Calibri"/>
           <w:lang w:val="fr-FR"/>
         </w:rPr>
-        <w:t xml:space="preserve">Diapo 34 · Question 1 · réponse</w:t>
+        <w:t xml:space="preserve">Diapo 34 · Question 1</w:t>
       </w:r>
     </w:p>
     <w:p>
@@ -12654,7 +12775,7 @@
           <wp:inline distT="0" distB="0" distL="0" distR="0">
             <wp:extent cx="2667000" cy="1504950"/>
             <wp:effectExtent t="0" r="0" b="0" l="0"/>
-            <wp:docPr id="28" name="diapo34" descr="Diapo 34 : Question 1 · réponse" title="Diapo 34"/>
+            <wp:docPr id="28" name="diapo34" descr="Diapo 34 : Question 1" title="Diapo 34"/>
             <wp:cNvGraphicFramePr>
               <a:graphicFrameLocks xmlns:a="http://schemas.openxmlformats.org/drawingml/2006/main" noChangeAspect="1"/>
             </wp:cNvGraphicFramePr>
@@ -12710,7 +12831,7 @@
           <w:rFonts w:ascii="Calibri" w:cs="Calibri" w:eastAsia="Calibri" w:hAnsi="Calibri"/>
           <w:lang w:val="fr-FR"/>
         </w:rPr>
-        <w:t xml:space="preserve">Corriger et consolider la notion de la question 1.</w:t>
+        <w:t xml:space="preserve">Question 1 : faire voter la salle.</w:t>
       </w:r>
     </w:p>
     <w:p>
@@ -12733,7 +12854,7 @@
           <w:rFonts w:ascii="Calibri" w:cs="Calibri" w:eastAsia="Calibri" w:hAnsi="Calibri"/>
           <w:lang w:val="fr-FR"/>
         </w:rPr>
-        <w:t xml:space="preserve">0:20</w:t>
+        <w:t xml:space="preserve">0:40</w:t>
       </w:r>
     </w:p>
     <w:p>
@@ -12758,7 +12879,30 @@
           <w:rFonts w:ascii="Calibri" w:cs="Calibri" w:eastAsia="Calibri" w:hAnsi="Calibri"/>
           <w:lang w:val="fr-FR"/>
         </w:rPr>
-        <w:t xml:space="preserve">Bonne réponse : B, « Sa description ». Claude lit en permanence le nom et la description de chaque skill activée, et c'est la description qui fait l'essentiel du choix. Une description floue fait une skill qui ne se déclenche jamais, ou qui se déclenche à tort. C'est la phrase la plus importante de la skill.</w:t>
+        <w:t xml:space="preserve">Lire la question : « Qu'est-ce qui décide Claude à utiliser une skill ? » Puis les réponses : A, Son nom de fichier ; B, Sa description ; C, Sa longueur ; D, Sa date de création. Compter « 1, 2, 3, cartons ! » Observer la salle et commenter la répartition (« beaucoup de bleu… quelques verts… ») sans donner d'indice.</w:t>
+      </w:r>
+    </w:p>
+    <w:p>
+      <w:pPr>
+        <w:pStyle w:val="Body"/>
+        <w:spacing w:after="120"/>
+      </w:pPr>
+      <w:r>
+        <w:rPr>
+          <w:rFonts w:ascii="Calibri" w:cs="Calibri" w:eastAsia="Calibri" w:hAnsi="Calibri"/>
+          <w:b/>
+          <w:bCs/>
+          <w:color w:val="2F5FC4"/>
+          <w:lang w:val="fr-FR"/>
+        </w:rPr>
+        <w:t xml:space="preserve">Question à la salle — </w:t>
+      </w:r>
+      <w:r>
+        <w:rPr>
+          <w:rFonts w:ascii="Calibri" w:cs="Calibri" w:eastAsia="Calibri" w:hAnsi="Calibri"/>
+          <w:lang w:val="fr-FR"/>
+        </w:rPr>
+        <w:t xml:space="preserve">Un volontaire pour défendre une autre réponse que celle de la majorité ?</w:t>
       </w:r>
     </w:p>
     <w:p>
@@ -12781,7 +12925,7 @@
           <w:rFonts w:ascii="Calibri" w:cs="Calibri" w:eastAsia="Calibri" w:hAnsi="Calibri"/>
           <w:lang w:val="fr-FR"/>
         </w:rPr>
-        <w:t xml:space="preserve">Question 2.</w:t>
+        <w:t xml:space="preserve">Clic : révélation de la réponse.</w:t>
       </w:r>
     </w:p>
     <w:p>
@@ -12801,7 +12945,7 @@
           <w:rFonts w:ascii="Calibri" w:cs="Calibri" w:eastAsia="Calibri" w:hAnsi="Calibri"/>
           <w:lang w:val="fr-FR"/>
         </w:rPr>
-        <w:t xml:space="preserve">Diapo 35 · Question 2</w:t>
+        <w:t xml:space="preserve">Diapo 35 · Question 1 · réponse</w:t>
       </w:r>
     </w:p>
     <w:p>
@@ -12815,7 +12959,7 @@
           <wp:inline distT="0" distB="0" distL="0" distR="0">
             <wp:extent cx="2667000" cy="1504950"/>
             <wp:effectExtent t="0" r="0" b="0" l="0"/>
-            <wp:docPr id="29" name="diapo35" descr="Diapo 35 : Question 2" title="Diapo 35"/>
+            <wp:docPr id="29" name="diapo35" descr="Diapo 35 : Question 1 · réponse" title="Diapo 35"/>
             <wp:cNvGraphicFramePr>
               <a:graphicFrameLocks xmlns:a="http://schemas.openxmlformats.org/drawingml/2006/main" noChangeAspect="1"/>
             </wp:cNvGraphicFramePr>
@@ -12871,7 +13015,7 @@
           <w:rFonts w:ascii="Calibri" w:cs="Calibri" w:eastAsia="Calibri" w:hAnsi="Calibri"/>
           <w:lang w:val="fr-FR"/>
         </w:rPr>
-        <w:t xml:space="preserve">Question 2 : faire voter la salle.</w:t>
+        <w:t xml:space="preserve">Corriger et consolider la notion de la question 1.</w:t>
       </w:r>
     </w:p>
     <w:p>
@@ -12894,7 +13038,7 @@
           <w:rFonts w:ascii="Calibri" w:cs="Calibri" w:eastAsia="Calibri" w:hAnsi="Calibri"/>
           <w:lang w:val="fr-FR"/>
         </w:rPr>
-        <w:t xml:space="preserve">0:40</w:t>
+        <w:t xml:space="preserve">0:20</w:t>
       </w:r>
     </w:p>
     <w:p>
@@ -12919,30 +13063,7 @@
           <w:rFonts w:ascii="Calibri" w:cs="Calibri" w:eastAsia="Calibri" w:hAnsi="Calibri"/>
           <w:lang w:val="fr-FR"/>
         </w:rPr>
-        <w:t xml:space="preserve">Lire la question : « « Tout le suivi du client Dupont » : projet ou skill ? » Puis les réponses : A, Un projet ; B, Une skill ; C, Les deux, obligatoirement ; D, Ni l'un ni l'autre. Compter « 1, 2, 3, cartons ! » Observer la salle et commenter la répartition (« beaucoup de bleu… quelques verts… ») sans donner d'indice.</w:t>
-      </w:r>
-    </w:p>
-    <w:p>
-      <w:pPr>
-        <w:pStyle w:val="Body"/>
-        <w:spacing w:after="120"/>
-      </w:pPr>
-      <w:r>
-        <w:rPr>
-          <w:rFonts w:ascii="Calibri" w:cs="Calibri" w:eastAsia="Calibri" w:hAnsi="Calibri"/>
-          <w:b/>
-          <w:bCs/>
-          <w:color w:val="2F5FC4"/>
-          <w:lang w:val="fr-FR"/>
-        </w:rPr>
-        <w:t xml:space="preserve">Question à la salle — </w:t>
-      </w:r>
-      <w:r>
-        <w:rPr>
-          <w:rFonts w:ascii="Calibri" w:cs="Calibri" w:eastAsia="Calibri" w:hAnsi="Calibri"/>
-          <w:lang w:val="fr-FR"/>
-        </w:rPr>
-        <w:t xml:space="preserve">Un volontaire pour défendre une autre réponse que celle de la majorité ?</w:t>
+        <w:t xml:space="preserve">Bonne réponse : B, « Sa description ». Claude lit en permanence le nom et la description de chaque skill activée, et c'est la description qui fait l'essentiel du choix. Une description floue fait une skill qui ne se déclenche jamais, ou qui se déclenche à tort. C'est la phrase la plus importante de la skill.</w:t>
       </w:r>
     </w:p>
     <w:p>
@@ -12965,7 +13086,7 @@
           <w:rFonts w:ascii="Calibri" w:cs="Calibri" w:eastAsia="Calibri" w:hAnsi="Calibri"/>
           <w:lang w:val="fr-FR"/>
         </w:rPr>
-        <w:t xml:space="preserve">Clic : révélation de la réponse.</w:t>
+        <w:t xml:space="preserve">Question 2.</w:t>
       </w:r>
     </w:p>
     <w:p>
@@ -12985,7 +13106,7 @@
           <w:rFonts w:ascii="Calibri" w:cs="Calibri" w:eastAsia="Calibri" w:hAnsi="Calibri"/>
           <w:lang w:val="fr-FR"/>
         </w:rPr>
-        <w:t xml:space="preserve">Diapo 36 · Question 2 · réponse</w:t>
+        <w:t xml:space="preserve">Diapo 36 · Question 2</w:t>
       </w:r>
     </w:p>
     <w:p>
@@ -12999,7 +13120,7 @@
           <wp:inline distT="0" distB="0" distL="0" distR="0">
             <wp:extent cx="2667000" cy="1504950"/>
             <wp:effectExtent t="0" r="0" b="0" l="0"/>
-            <wp:docPr id="30" name="diapo36" descr="Diapo 36 : Question 2 · réponse" title="Diapo 36"/>
+            <wp:docPr id="30" name="diapo36" descr="Diapo 36 : Question 2" title="Diapo 36"/>
             <wp:cNvGraphicFramePr>
               <a:graphicFrameLocks xmlns:a="http://schemas.openxmlformats.org/drawingml/2006/main" noChangeAspect="1"/>
             </wp:cNvGraphicFramePr>
@@ -13055,7 +13176,7 @@
           <w:rFonts w:ascii="Calibri" w:cs="Calibri" w:eastAsia="Calibri" w:hAnsi="Calibri"/>
           <w:lang w:val="fr-FR"/>
         </w:rPr>
-        <w:t xml:space="preserve">Corriger et consolider la notion de la question 2.</w:t>
+        <w:t xml:space="preserve">Question 2 : faire voter la salle.</w:t>
       </w:r>
     </w:p>
     <w:p>
@@ -13078,7 +13199,7 @@
           <w:rFonts w:ascii="Calibri" w:cs="Calibri" w:eastAsia="Calibri" w:hAnsi="Calibri"/>
           <w:lang w:val="fr-FR"/>
         </w:rPr>
-        <w:t xml:space="preserve">0:20</w:t>
+        <w:t xml:space="preserve">0:40</w:t>
       </w:r>
     </w:p>
     <w:p>
@@ -13103,7 +13224,30 @@
           <w:rFonts w:ascii="Calibri" w:cs="Calibri" w:eastAsia="Calibri" w:hAnsi="Calibri"/>
           <w:lang w:val="fr-FR"/>
         </w:rPr>
-        <w:t xml:space="preserve">Bonne réponse : A, « Un projet ». Un sujet précis, avec ses documents et son historique, relève du projet. Le client Dupont n'est pas un savoir-faire réutilisable ailleurs. En revanche, « rédiger une relance client à notre manière » serait une skill… qu'on pourrait utiliser dans le projet Dupont.</w:t>
+        <w:t xml:space="preserve">Lire la question : « « Tout le suivi du client Dupont » : projet ou skill ? » Puis les réponses : A, Un projet ; B, Une skill ; C, Les deux, obligatoirement ; D, Ni l'un ni l'autre. Compter « 1, 2, 3, cartons ! » Observer la salle et commenter la répartition (« beaucoup de bleu… quelques verts… ») sans donner d'indice.</w:t>
+      </w:r>
+    </w:p>
+    <w:p>
+      <w:pPr>
+        <w:pStyle w:val="Body"/>
+        <w:spacing w:after="120"/>
+      </w:pPr>
+      <w:r>
+        <w:rPr>
+          <w:rFonts w:ascii="Calibri" w:cs="Calibri" w:eastAsia="Calibri" w:hAnsi="Calibri"/>
+          <w:b/>
+          <w:bCs/>
+          <w:color w:val="2F5FC4"/>
+          <w:lang w:val="fr-FR"/>
+        </w:rPr>
+        <w:t xml:space="preserve">Question à la salle — </w:t>
+      </w:r>
+      <w:r>
+        <w:rPr>
+          <w:rFonts w:ascii="Calibri" w:cs="Calibri" w:eastAsia="Calibri" w:hAnsi="Calibri"/>
+          <w:lang w:val="fr-FR"/>
+        </w:rPr>
+        <w:t xml:space="preserve">Un volontaire pour défendre une autre réponse que celle de la majorité ?</w:t>
       </w:r>
     </w:p>
     <w:p>
@@ -13126,7 +13270,7 @@
           <w:rFonts w:ascii="Calibri" w:cs="Calibri" w:eastAsia="Calibri" w:hAnsi="Calibri"/>
           <w:lang w:val="fr-FR"/>
         </w:rPr>
-        <w:t xml:space="preserve">Question 3.</w:t>
+        <w:t xml:space="preserve">Clic : révélation de la réponse.</w:t>
       </w:r>
     </w:p>
     <w:p>
@@ -13146,7 +13290,7 @@
           <w:rFonts w:ascii="Calibri" w:cs="Calibri" w:eastAsia="Calibri" w:hAnsi="Calibri"/>
           <w:lang w:val="fr-FR"/>
         </w:rPr>
-        <w:t xml:space="preserve">Diapo 37 · Question 3</w:t>
+        <w:t xml:space="preserve">Diapo 37 · Question 2 · réponse</w:t>
       </w:r>
     </w:p>
     <w:p>
@@ -13160,7 +13304,7 @@
           <wp:inline distT="0" distB="0" distL="0" distR="0">
             <wp:extent cx="2667000" cy="1504950"/>
             <wp:effectExtent t="0" r="0" b="0" l="0"/>
-            <wp:docPr id="31" name="diapo37" descr="Diapo 37 : Question 3" title="Diapo 37"/>
+            <wp:docPr id="31" name="diapo37" descr="Diapo 37 : Question 2 · réponse" title="Diapo 37"/>
             <wp:cNvGraphicFramePr>
               <a:graphicFrameLocks xmlns:a="http://schemas.openxmlformats.org/drawingml/2006/main" noChangeAspect="1"/>
             </wp:cNvGraphicFramePr>
@@ -13216,7 +13360,7 @@
           <w:rFonts w:ascii="Calibri" w:cs="Calibri" w:eastAsia="Calibri" w:hAnsi="Calibri"/>
           <w:lang w:val="fr-FR"/>
         </w:rPr>
-        <w:t xml:space="preserve">Question 3 : faire voter la salle.</w:t>
+        <w:t xml:space="preserve">Corriger et consolider la notion de la question 2.</w:t>
       </w:r>
     </w:p>
     <w:p>
@@ -13239,7 +13383,7 @@
           <w:rFonts w:ascii="Calibri" w:cs="Calibri" w:eastAsia="Calibri" w:hAnsi="Calibri"/>
           <w:lang w:val="fr-FR"/>
         </w:rPr>
-        <w:t xml:space="preserve">0:40</w:t>
+        <w:t xml:space="preserve">0:20</w:t>
       </w:r>
     </w:p>
     <w:p>
@@ -13264,30 +13408,7 @@
           <w:rFonts w:ascii="Calibri" w:cs="Calibri" w:eastAsia="Calibri" w:hAnsi="Calibri"/>
           <w:lang w:val="fr-FR"/>
         </w:rPr>
-        <w:t xml:space="preserve">Lire la question : « Quel fichier est indispensable dans une skill ? » Puis les réponses : A, README.txt ; B, config.json ; C, SKILL.md ; D, index.html. Compter « 1, 2, 3, cartons ! » Observer la salle et commenter la répartition (« beaucoup de bleu… quelques verts… ») sans donner d'indice.</w:t>
-      </w:r>
-    </w:p>
-    <w:p>
-      <w:pPr>
-        <w:pStyle w:val="Body"/>
-        <w:spacing w:after="120"/>
-      </w:pPr>
-      <w:r>
-        <w:rPr>
-          <w:rFonts w:ascii="Calibri" w:cs="Calibri" w:eastAsia="Calibri" w:hAnsi="Calibri"/>
-          <w:b/>
-          <w:bCs/>
-          <w:color w:val="2F5FC4"/>
-          <w:lang w:val="fr-FR"/>
-        </w:rPr>
-        <w:t xml:space="preserve">Question à la salle — </w:t>
-      </w:r>
-      <w:r>
-        <w:rPr>
-          <w:rFonts w:ascii="Calibri" w:cs="Calibri" w:eastAsia="Calibri" w:hAnsi="Calibri"/>
-          <w:lang w:val="fr-FR"/>
-        </w:rPr>
-        <w:t xml:space="preserve">Un volontaire pour défendre une autre réponse que celle de la majorité ?</w:t>
+        <w:t xml:space="preserve">Bonne réponse : A, « Un projet ». Un sujet précis, avec ses documents et son historique, relève du projet. Le client Dupont n'est pas un savoir-faire réutilisable ailleurs. En revanche, « rédiger une relance client à notre manière » serait une skill… qu'on pourrait utiliser dans le projet Dupont.</w:t>
       </w:r>
     </w:p>
     <w:p>
@@ -13310,7 +13431,7 @@
           <w:rFonts w:ascii="Calibri" w:cs="Calibri" w:eastAsia="Calibri" w:hAnsi="Calibri"/>
           <w:lang w:val="fr-FR"/>
         </w:rPr>
-        <w:t xml:space="preserve">Clic : révélation de la réponse.</w:t>
+        <w:t xml:space="preserve">Question 3.</w:t>
       </w:r>
     </w:p>
     <w:p>
@@ -13330,7 +13451,7 @@
           <w:rFonts w:ascii="Calibri" w:cs="Calibri" w:eastAsia="Calibri" w:hAnsi="Calibri"/>
           <w:lang w:val="fr-FR"/>
         </w:rPr>
-        <w:t xml:space="preserve">Diapo 38 · Question 3 · réponse</w:t>
+        <w:t xml:space="preserve">Diapo 38 · Question 3</w:t>
       </w:r>
     </w:p>
     <w:p>
@@ -13344,7 +13465,7 @@
           <wp:inline distT="0" distB="0" distL="0" distR="0">
             <wp:extent cx="2667000" cy="1504950"/>
             <wp:effectExtent t="0" r="0" b="0" l="0"/>
-            <wp:docPr id="32" name="diapo38" descr="Diapo 38 : Question 3 · réponse" title="Diapo 38"/>
+            <wp:docPr id="32" name="diapo38" descr="Diapo 38 : Question 3" title="Diapo 38"/>
             <wp:cNvGraphicFramePr>
               <a:graphicFrameLocks xmlns:a="http://schemas.openxmlformats.org/drawingml/2006/main" noChangeAspect="1"/>
             </wp:cNvGraphicFramePr>
@@ -13400,7 +13521,7 @@
           <w:rFonts w:ascii="Calibri" w:cs="Calibri" w:eastAsia="Calibri" w:hAnsi="Calibri"/>
           <w:lang w:val="fr-FR"/>
         </w:rPr>
-        <w:t xml:space="preserve">Corriger et consolider la notion de la question 3.</w:t>
+        <w:t xml:space="preserve">Question 3 : faire voter la salle.</w:t>
       </w:r>
     </w:p>
     <w:p>
@@ -13423,7 +13544,7 @@
           <w:rFonts w:ascii="Calibri" w:cs="Calibri" w:eastAsia="Calibri" w:hAnsi="Calibri"/>
           <w:lang w:val="fr-FR"/>
         </w:rPr>
-        <w:t xml:space="preserve">0:20</w:t>
+        <w:t xml:space="preserve">0:40</w:t>
       </w:r>
     </w:p>
     <w:p>
@@ -13448,7 +13569,30 @@
           <w:rFonts w:ascii="Calibri" w:cs="Calibri" w:eastAsia="Calibri" w:hAnsi="Calibri"/>
           <w:lang w:val="fr-FR"/>
         </w:rPr>
-        <w:t xml:space="preserve">Bonne réponse : C, « SKILL.md ». Une skill, c'est un dossier qui contient au minimum un fichier SKILL.md : un en-tête avec le nom et la description, puis les instructions en texte simple. Tout le reste (modèles, exemples, scripts) est facultatif.</w:t>
+        <w:t xml:space="preserve">Lire la question : « Quel fichier est indispensable dans une skill ? » Puis les réponses : A, README.txt ; B, config.json ; C, SKILL.md ; D, index.html. Compter « 1, 2, 3, cartons ! » Observer la salle et commenter la répartition (« beaucoup de bleu… quelques verts… ») sans donner d'indice.</w:t>
+      </w:r>
+    </w:p>
+    <w:p>
+      <w:pPr>
+        <w:pStyle w:val="Body"/>
+        <w:spacing w:after="120"/>
+      </w:pPr>
+      <w:r>
+        <w:rPr>
+          <w:rFonts w:ascii="Calibri" w:cs="Calibri" w:eastAsia="Calibri" w:hAnsi="Calibri"/>
+          <w:b/>
+          <w:bCs/>
+          <w:color w:val="2F5FC4"/>
+          <w:lang w:val="fr-FR"/>
+        </w:rPr>
+        <w:t xml:space="preserve">Question à la salle — </w:t>
+      </w:r>
+      <w:r>
+        <w:rPr>
+          <w:rFonts w:ascii="Calibri" w:cs="Calibri" w:eastAsia="Calibri" w:hAnsi="Calibri"/>
+          <w:lang w:val="fr-FR"/>
+        </w:rPr>
+        <w:t xml:space="preserve">Un volontaire pour défendre une autre réponse que celle de la majorité ?</w:t>
       </w:r>
     </w:p>
     <w:p>
@@ -13471,7 +13615,7 @@
           <w:rFonts w:ascii="Calibri" w:cs="Calibri" w:eastAsia="Calibri" w:hAnsi="Calibri"/>
           <w:lang w:val="fr-FR"/>
         </w:rPr>
-        <w:t xml:space="preserve">Question 4.</w:t>
+        <w:t xml:space="preserve">Clic : révélation de la réponse.</w:t>
       </w:r>
     </w:p>
     <w:p>
@@ -13491,7 +13635,7 @@
           <w:rFonts w:ascii="Calibri" w:cs="Calibri" w:eastAsia="Calibri" w:hAnsi="Calibri"/>
           <w:lang w:val="fr-FR"/>
         </w:rPr>
-        <w:t xml:space="preserve">Diapo 39 · Question 4</w:t>
+        <w:t xml:space="preserve">Diapo 39 · Question 3 · réponse</w:t>
       </w:r>
     </w:p>
     <w:p>
@@ -13505,7 +13649,7 @@
           <wp:inline distT="0" distB="0" distL="0" distR="0">
             <wp:extent cx="2667000" cy="1504950"/>
             <wp:effectExtent t="0" r="0" b="0" l="0"/>
-            <wp:docPr id="33" name="diapo39" descr="Diapo 39 : Question 4" title="Diapo 39"/>
+            <wp:docPr id="33" name="diapo39" descr="Diapo 39 : Question 3 · réponse" title="Diapo 39"/>
             <wp:cNvGraphicFramePr>
               <a:graphicFrameLocks xmlns:a="http://schemas.openxmlformats.org/drawingml/2006/main" noChangeAspect="1"/>
             </wp:cNvGraphicFramePr>
@@ -13561,7 +13705,7 @@
           <w:rFonts w:ascii="Calibri" w:cs="Calibri" w:eastAsia="Calibri" w:hAnsi="Calibri"/>
           <w:lang w:val="fr-FR"/>
         </w:rPr>
-        <w:t xml:space="preserve">Question 4 : faire voter la salle.</w:t>
+        <w:t xml:space="preserve">Corriger et consolider la notion de la question 3.</w:t>
       </w:r>
     </w:p>
     <w:p>
@@ -13584,7 +13728,7 @@
           <w:rFonts w:ascii="Calibri" w:cs="Calibri" w:eastAsia="Calibri" w:hAnsi="Calibri"/>
           <w:lang w:val="fr-FR"/>
         </w:rPr>
-        <w:t xml:space="preserve">0:40</w:t>
+        <w:t xml:space="preserve">0:20</w:t>
       </w:r>
     </w:p>
     <w:p>
@@ -13609,30 +13753,7 @@
           <w:rFonts w:ascii="Calibri" w:cs="Calibri" w:eastAsia="Calibri" w:hAnsi="Calibri"/>
           <w:lang w:val="fr-FR"/>
         </w:rPr>
-        <w:t xml:space="preserve">Lire la question : « Une skill géniale trouvée sur GitHub. Première chose ? » Puis les réponses : A, L'installer tout de suite ; B, La partager à l'équipe ; C, La renommer ; D, Lire son contenu. Compter « 1, 2, 3, cartons ! » Observer la salle et commenter la répartition (« beaucoup de bleu… quelques verts… ») sans donner d'indice.</w:t>
-      </w:r>
-    </w:p>
-    <w:p>
-      <w:pPr>
-        <w:pStyle w:val="Body"/>
-        <w:spacing w:after="120"/>
-      </w:pPr>
-      <w:r>
-        <w:rPr>
-          <w:rFonts w:ascii="Calibri" w:cs="Calibri" w:eastAsia="Calibri" w:hAnsi="Calibri"/>
-          <w:b/>
-          <w:bCs/>
-          <w:color w:val="2F5FC4"/>
-          <w:lang w:val="fr-FR"/>
-        </w:rPr>
-        <w:t xml:space="preserve">Question à la salle — </w:t>
-      </w:r>
-      <w:r>
-        <w:rPr>
-          <w:rFonts w:ascii="Calibri" w:cs="Calibri" w:eastAsia="Calibri" w:hAnsi="Calibri"/>
-          <w:lang w:val="fr-FR"/>
-        </w:rPr>
-        <w:t xml:space="preserve">Un volontaire pour défendre une autre réponse que celle de la majorité ?</w:t>
+        <w:t xml:space="preserve">Bonne réponse : C, « SKILL.md ». Une skill, c'est un dossier qui contient au minimum un fichier SKILL.md : un en-tête avec le nom et la description, puis les instructions en texte simple. Tout le reste (modèles, exemples, scripts) est facultatif.</w:t>
       </w:r>
     </w:p>
     <w:p>
@@ -13655,7 +13776,7 @@
           <w:rFonts w:ascii="Calibri" w:cs="Calibri" w:eastAsia="Calibri" w:hAnsi="Calibri"/>
           <w:lang w:val="fr-FR"/>
         </w:rPr>
-        <w:t xml:space="preserve">Clic : révélation de la réponse.</w:t>
+        <w:t xml:space="preserve">Question 4.</w:t>
       </w:r>
     </w:p>
     <w:p>
@@ -13675,7 +13796,7 @@
           <w:rFonts w:ascii="Calibri" w:cs="Calibri" w:eastAsia="Calibri" w:hAnsi="Calibri"/>
           <w:lang w:val="fr-FR"/>
         </w:rPr>
-        <w:t xml:space="preserve">Diapo 40 · Question 4 · réponse</w:t>
+        <w:t xml:space="preserve">Diapo 40 · Question 4</w:t>
       </w:r>
     </w:p>
     <w:p>
@@ -13689,7 +13810,7 @@
           <wp:inline distT="0" distB="0" distL="0" distR="0">
             <wp:extent cx="2667000" cy="1504950"/>
             <wp:effectExtent t="0" r="0" b="0" l="0"/>
-            <wp:docPr id="34" name="diapo40" descr="Diapo 40 : Question 4 · réponse" title="Diapo 40"/>
+            <wp:docPr id="34" name="diapo40" descr="Diapo 40 : Question 4" title="Diapo 40"/>
             <wp:cNvGraphicFramePr>
               <a:graphicFrameLocks xmlns:a="http://schemas.openxmlformats.org/drawingml/2006/main" noChangeAspect="1"/>
             </wp:cNvGraphicFramePr>
@@ -13745,7 +13866,7 @@
           <w:rFonts w:ascii="Calibri" w:cs="Calibri" w:eastAsia="Calibri" w:hAnsi="Calibri"/>
           <w:lang w:val="fr-FR"/>
         </w:rPr>
-        <w:t xml:space="preserve">Corriger et consolider la notion de la question 4.</w:t>
+        <w:t xml:space="preserve">Question 4 : faire voter la salle.</w:t>
       </w:r>
     </w:p>
     <w:p>
@@ -13768,7 +13889,7 @@
           <w:rFonts w:ascii="Calibri" w:cs="Calibri" w:eastAsia="Calibri" w:hAnsi="Calibri"/>
           <w:lang w:val="fr-FR"/>
         </w:rPr>
-        <w:t xml:space="preserve">0:20</w:t>
+        <w:t xml:space="preserve">0:40</w:t>
       </w:r>
     </w:p>
     <w:p>
@@ -13793,7 +13914,30 @@
           <w:rFonts w:ascii="Calibri" w:cs="Calibri" w:eastAsia="Calibri" w:hAnsi="Calibri"/>
           <w:lang w:val="fr-FR"/>
         </w:rPr>
-        <w:t xml:space="preserve">Bonne réponse : D, « Lire son contenu ». Une skill donne des instructions à Claude et peut contenir des scripts qu'il exécutera. On ne l'installe donc qu'après l'avoir lue et avoir identifié son auteur. C'est la même hygiène que pour une pièce jointe inconnue.</w:t>
+        <w:t xml:space="preserve">Lire la question : « Une skill géniale trouvée sur GitHub. Première chose ? » Puis les réponses : A, L'installer tout de suite ; B, La partager à l'équipe ; C, La renommer ; D, Lire son contenu. Compter « 1, 2, 3, cartons ! » Observer la salle et commenter la répartition (« beaucoup de bleu… quelques verts… ») sans donner d'indice.</w:t>
+      </w:r>
+    </w:p>
+    <w:p>
+      <w:pPr>
+        <w:pStyle w:val="Body"/>
+        <w:spacing w:after="120"/>
+      </w:pPr>
+      <w:r>
+        <w:rPr>
+          <w:rFonts w:ascii="Calibri" w:cs="Calibri" w:eastAsia="Calibri" w:hAnsi="Calibri"/>
+          <w:b/>
+          <w:bCs/>
+          <w:color w:val="2F5FC4"/>
+          <w:lang w:val="fr-FR"/>
+        </w:rPr>
+        <w:t xml:space="preserve">Question à la salle — </w:t>
+      </w:r>
+      <w:r>
+        <w:rPr>
+          <w:rFonts w:ascii="Calibri" w:cs="Calibri" w:eastAsia="Calibri" w:hAnsi="Calibri"/>
+          <w:lang w:val="fr-FR"/>
+        </w:rPr>
+        <w:t xml:space="preserve">Un volontaire pour défendre une autre réponse que celle de la majorité ?</w:t>
       </w:r>
     </w:p>
     <w:p>
@@ -13816,7 +13960,7 @@
           <w:rFonts w:ascii="Calibri" w:cs="Calibri" w:eastAsia="Calibri" w:hAnsi="Calibri"/>
           <w:lang w:val="fr-FR"/>
         </w:rPr>
-        <w:t xml:space="preserve">Question 5.</w:t>
+        <w:t xml:space="preserve">Clic : révélation de la réponse.</w:t>
       </w:r>
     </w:p>
     <w:p>
@@ -13836,7 +13980,7 @@
           <w:rFonts w:ascii="Calibri" w:cs="Calibri" w:eastAsia="Calibri" w:hAnsi="Calibri"/>
           <w:lang w:val="fr-FR"/>
         </w:rPr>
-        <w:t xml:space="preserve">Diapo 41 · Question 5</w:t>
+        <w:t xml:space="preserve">Diapo 41 · Question 4 · réponse</w:t>
       </w:r>
     </w:p>
     <w:p>
@@ -13850,7 +13994,7 @@
           <wp:inline distT="0" distB="0" distL="0" distR="0">
             <wp:extent cx="2667000" cy="1504950"/>
             <wp:effectExtent t="0" r="0" b="0" l="0"/>
-            <wp:docPr id="35" name="diapo41" descr="Diapo 41 : Question 5" title="Diapo 41"/>
+            <wp:docPr id="35" name="diapo41" descr="Diapo 41 : Question 4 · réponse" title="Diapo 41"/>
             <wp:cNvGraphicFramePr>
               <a:graphicFrameLocks xmlns:a="http://schemas.openxmlformats.org/drawingml/2006/main" noChangeAspect="1"/>
             </wp:cNvGraphicFramePr>
@@ -13906,7 +14050,7 @@
           <w:rFonts w:ascii="Calibri" w:cs="Calibri" w:eastAsia="Calibri" w:hAnsi="Calibri"/>
           <w:lang w:val="fr-FR"/>
         </w:rPr>
-        <w:t xml:space="preserve">Question 5 : faire voter la salle.</w:t>
+        <w:t xml:space="preserve">Corriger et consolider la notion de la question 4.</w:t>
       </w:r>
     </w:p>
     <w:p>
@@ -13929,7 +14073,7 @@
           <w:rFonts w:ascii="Calibri" w:cs="Calibri" w:eastAsia="Calibri" w:hAnsi="Calibri"/>
           <w:lang w:val="fr-FR"/>
         </w:rPr>
-        <w:t xml:space="preserve">0:40</w:t>
+        <w:t xml:space="preserve">0:20</w:t>
       </w:r>
     </w:p>
     <w:p>
@@ -13954,30 +14098,7 @@
           <w:rFonts w:ascii="Calibri" w:cs="Calibri" w:eastAsia="Calibri" w:hAnsi="Calibri"/>
           <w:lang w:val="fr-FR"/>
         </w:rPr>
-        <w:t xml:space="preserve">Lire la question : « Le plus simple pour créer votre première skill ? » Puis les réponses : A, Apprendre à coder ; B, Le demander à Claude ; C, Acheter un plugin ; D, Écrire au support. Compter « 1, 2, 3, cartons ! » Observer la salle et commenter la répartition (« beaucoup de bleu… quelques verts… ») sans donner d'indice.</w:t>
-      </w:r>
-    </w:p>
-    <w:p>
-      <w:pPr>
-        <w:pStyle w:val="Body"/>
-        <w:spacing w:after="120"/>
-      </w:pPr>
-      <w:r>
-        <w:rPr>
-          <w:rFonts w:ascii="Calibri" w:cs="Calibri" w:eastAsia="Calibri" w:hAnsi="Calibri"/>
-          <w:b/>
-          <w:bCs/>
-          <w:color w:val="2F5FC4"/>
-          <w:lang w:val="fr-FR"/>
-        </w:rPr>
-        <w:t xml:space="preserve">Question à la salle — </w:t>
-      </w:r>
-      <w:r>
-        <w:rPr>
-          <w:rFonts w:ascii="Calibri" w:cs="Calibri" w:eastAsia="Calibri" w:hAnsi="Calibri"/>
-          <w:lang w:val="fr-FR"/>
-        </w:rPr>
-        <w:t xml:space="preserve">Un volontaire pour défendre une autre réponse que celle de la majorité ?</w:t>
+        <w:t xml:space="preserve">Bonne réponse : D, « Lire son contenu ». Une skill donne des instructions à Claude et peut contenir des scripts qu'il exécutera. On ne l'installe donc qu'après l'avoir lue et avoir identifié son auteur. C'est la même hygiène que pour une pièce jointe inconnue.</w:t>
       </w:r>
     </w:p>
     <w:p>
@@ -14000,7 +14121,7 @@
           <w:rFonts w:ascii="Calibri" w:cs="Calibri" w:eastAsia="Calibri" w:hAnsi="Calibri"/>
           <w:lang w:val="fr-FR"/>
         </w:rPr>
-        <w:t xml:space="preserve">Clic : révélation de la réponse.</w:t>
+        <w:t xml:space="preserve">Question 5.</w:t>
       </w:r>
     </w:p>
     <w:p>
@@ -14020,7 +14141,7 @@
           <w:rFonts w:ascii="Calibri" w:cs="Calibri" w:eastAsia="Calibri" w:hAnsi="Calibri"/>
           <w:lang w:val="fr-FR"/>
         </w:rPr>
-        <w:t xml:space="preserve">Diapo 42 · Question 5 · réponse</w:t>
+        <w:t xml:space="preserve">Diapo 42 · Question 5</w:t>
       </w:r>
     </w:p>
     <w:p>
@@ -14034,7 +14155,7 @@
           <wp:inline distT="0" distB="0" distL="0" distR="0">
             <wp:extent cx="2667000" cy="1504950"/>
             <wp:effectExtent t="0" r="0" b="0" l="0"/>
-            <wp:docPr id="36" name="diapo42" descr="Diapo 42 : Question 5 · réponse" title="Diapo 42"/>
+            <wp:docPr id="36" name="diapo42" descr="Diapo 42 : Question 5" title="Diapo 42"/>
             <wp:cNvGraphicFramePr>
               <a:graphicFrameLocks xmlns:a="http://schemas.openxmlformats.org/drawingml/2006/main" noChangeAspect="1"/>
             </wp:cNvGraphicFramePr>
@@ -14090,7 +14211,7 @@
           <w:rFonts w:ascii="Calibri" w:cs="Calibri" w:eastAsia="Calibri" w:hAnsi="Calibri"/>
           <w:lang w:val="fr-FR"/>
         </w:rPr>
-        <w:t xml:space="preserve">Corriger et consolider la notion de la question 5.</w:t>
+        <w:t xml:space="preserve">Question 5 : faire voter la salle.</w:t>
       </w:r>
     </w:p>
     <w:p>
@@ -14113,7 +14234,7 @@
           <w:rFonts w:ascii="Calibri" w:cs="Calibri" w:eastAsia="Calibri" w:hAnsi="Calibri"/>
           <w:lang w:val="fr-FR"/>
         </w:rPr>
-        <w:t xml:space="preserve">0:20</w:t>
+        <w:t xml:space="preserve">0:40</w:t>
       </w:r>
     </w:p>
     <w:p>
@@ -14138,7 +14259,30 @@
           <w:rFonts w:ascii="Calibri" w:cs="Calibri" w:eastAsia="Calibri" w:hAnsi="Calibri"/>
           <w:lang w:val="fr-FR"/>
         </w:rPr>
-        <w:t xml:space="preserve">Bonne réponse : B, « Le demander à Claude ». Il suffit de dire à Claude « aide-moi à créer une skill qui… ». Il pose des questions, rédige le SKILL.md et propose de l'enregistrer. Aucune ligne de code n'est nécessaire.</w:t>
+        <w:t xml:space="preserve">Lire la question : « Le plus simple pour créer votre première skill ? » Puis les réponses : A, Apprendre à coder ; B, Le demander à Claude ; C, Acheter un plugin ; D, Écrire au support. Compter « 1, 2, 3, cartons ! » Observer la salle et commenter la répartition (« beaucoup de bleu… quelques verts… ») sans donner d'indice.</w:t>
+      </w:r>
+    </w:p>
+    <w:p>
+      <w:pPr>
+        <w:pStyle w:val="Body"/>
+        <w:spacing w:after="120"/>
+      </w:pPr>
+      <w:r>
+        <w:rPr>
+          <w:rFonts w:ascii="Calibri" w:cs="Calibri" w:eastAsia="Calibri" w:hAnsi="Calibri"/>
+          <w:b/>
+          <w:bCs/>
+          <w:color w:val="2F5FC4"/>
+          <w:lang w:val="fr-FR"/>
+        </w:rPr>
+        <w:t xml:space="preserve">Question à la salle — </w:t>
+      </w:r>
+      <w:r>
+        <w:rPr>
+          <w:rFonts w:ascii="Calibri" w:cs="Calibri" w:eastAsia="Calibri" w:hAnsi="Calibri"/>
+          <w:lang w:val="fr-FR"/>
+        </w:rPr>
+        <w:t xml:space="preserve">Un volontaire pour défendre une autre réponse que celle de la majorité ?</w:t>
       </w:r>
     </w:p>
     <w:p>
@@ -14161,7 +14305,7 @@
           <w:rFonts w:ascii="Calibri" w:cs="Calibri" w:eastAsia="Calibri" w:hAnsi="Calibri"/>
           <w:lang w:val="fr-FR"/>
         </w:rPr>
-        <w:t xml:space="preserve">Question 6.</w:t>
+        <w:t xml:space="preserve">Clic : révélation de la réponse.</w:t>
       </w:r>
     </w:p>
     <w:p>
@@ -14181,7 +14325,7 @@
           <w:rFonts w:ascii="Calibri" w:cs="Calibri" w:eastAsia="Calibri" w:hAnsi="Calibri"/>
           <w:lang w:val="fr-FR"/>
         </w:rPr>
-        <w:t xml:space="preserve">Diapo 43 · Question 6</w:t>
+        <w:t xml:space="preserve">Diapo 43 · Question 5 · réponse</w:t>
       </w:r>
     </w:p>
     <w:p>
@@ -14195,7 +14339,7 @@
           <wp:inline distT="0" distB="0" distL="0" distR="0">
             <wp:extent cx="2667000" cy="1504950"/>
             <wp:effectExtent t="0" r="0" b="0" l="0"/>
-            <wp:docPr id="37" name="diapo43" descr="Diapo 43 : Question 6" title="Diapo 43"/>
+            <wp:docPr id="37" name="diapo43" descr="Diapo 43 : Question 5 · réponse" title="Diapo 43"/>
             <wp:cNvGraphicFramePr>
               <a:graphicFrameLocks xmlns:a="http://schemas.openxmlformats.org/drawingml/2006/main" noChangeAspect="1"/>
             </wp:cNvGraphicFramePr>
@@ -14251,7 +14395,7 @@
           <w:rFonts w:ascii="Calibri" w:cs="Calibri" w:eastAsia="Calibri" w:hAnsi="Calibri"/>
           <w:lang w:val="fr-FR"/>
         </w:rPr>
-        <w:t xml:space="preserve">Question 6 : faire voter la salle.</w:t>
+        <w:t xml:space="preserve">Corriger et consolider la notion de la question 5.</w:t>
       </w:r>
     </w:p>
     <w:p>
@@ -14274,7 +14418,7 @@
           <w:rFonts w:ascii="Calibri" w:cs="Calibri" w:eastAsia="Calibri" w:hAnsi="Calibri"/>
           <w:lang w:val="fr-FR"/>
         </w:rPr>
-        <w:t xml:space="preserve">0:40</w:t>
+        <w:t xml:space="preserve">0:20</w:t>
       </w:r>
     </w:p>
     <w:p>
@@ -14299,30 +14443,7 @@
           <w:rFonts w:ascii="Calibri" w:cs="Calibri" w:eastAsia="Calibri" w:hAnsi="Calibri"/>
           <w:lang w:val="fr-FR"/>
         </w:rPr>
-        <w:t xml:space="preserve">Lire la question : « Team/Enterprise : la rendre disponible à tous ? » Puis les réponses : A, L'envoyer par mail à chacun ; B, La copier dans un projet ; C, La publier dans l'organisation ; D, C'est impossible. Compter « 1, 2, 3, cartons ! » Observer la salle et commenter la répartition (« beaucoup de bleu… quelques verts… ») sans donner d'indice.</w:t>
-      </w:r>
-    </w:p>
-    <w:p>
-      <w:pPr>
-        <w:pStyle w:val="Body"/>
-        <w:spacing w:after="120"/>
-      </w:pPr>
-      <w:r>
-        <w:rPr>
-          <w:rFonts w:ascii="Calibri" w:cs="Calibri" w:eastAsia="Calibri" w:hAnsi="Calibri"/>
-          <w:b/>
-          <w:bCs/>
-          <w:color w:val="2F5FC4"/>
-          <w:lang w:val="fr-FR"/>
-        </w:rPr>
-        <w:t xml:space="preserve">Question à la salle — </w:t>
-      </w:r>
-      <w:r>
-        <w:rPr>
-          <w:rFonts w:ascii="Calibri" w:cs="Calibri" w:eastAsia="Calibri" w:hAnsi="Calibri"/>
-          <w:lang w:val="fr-FR"/>
-        </w:rPr>
-        <w:t xml:space="preserve">Un volontaire pour défendre une autre réponse que celle de la majorité ?</w:t>
+        <w:t xml:space="preserve">Bonne réponse : B, « Le demander à Claude ». Il suffit de dire à Claude « aide-moi à créer une skill qui… ». Il pose des questions, rédige le SKILL.md et propose de l'enregistrer. Aucune ligne de code n'est nécessaire.</w:t>
       </w:r>
     </w:p>
     <w:p>
@@ -14345,7 +14466,7 @@
           <w:rFonts w:ascii="Calibri" w:cs="Calibri" w:eastAsia="Calibri" w:hAnsi="Calibri"/>
           <w:lang w:val="fr-FR"/>
         </w:rPr>
-        <w:t xml:space="preserve">Clic : révélation de la réponse.</w:t>
+        <w:t xml:space="preserve">Question 6.</w:t>
       </w:r>
     </w:p>
     <w:p>
@@ -14365,7 +14486,7 @@
           <w:rFonts w:ascii="Calibri" w:cs="Calibri" w:eastAsia="Calibri" w:hAnsi="Calibri"/>
           <w:lang w:val="fr-FR"/>
         </w:rPr>
-        <w:t xml:space="preserve">Diapo 44 · Question 6 · réponse</w:t>
+        <w:t xml:space="preserve">Diapo 44 · Question 6</w:t>
       </w:r>
     </w:p>
     <w:p>
@@ -14379,7 +14500,7 @@
           <wp:inline distT="0" distB="0" distL="0" distR="0">
             <wp:extent cx="2667000" cy="1504950"/>
             <wp:effectExtent t="0" r="0" b="0" l="0"/>
-            <wp:docPr id="38" name="diapo44" descr="Diapo 44 : Question 6 · réponse" title="Diapo 44"/>
+            <wp:docPr id="38" name="diapo44" descr="Diapo 44 : Question 6" title="Diapo 44"/>
             <wp:cNvGraphicFramePr>
               <a:graphicFrameLocks xmlns:a="http://schemas.openxmlformats.org/drawingml/2006/main" noChangeAspect="1"/>
             </wp:cNvGraphicFramePr>
@@ -14435,7 +14556,7 @@
           <w:rFonts w:ascii="Calibri" w:cs="Calibri" w:eastAsia="Calibri" w:hAnsi="Calibri"/>
           <w:lang w:val="fr-FR"/>
         </w:rPr>
-        <w:t xml:space="preserve">Corriger et consolider la notion de la question 6.</w:t>
+        <w:t xml:space="preserve">Question 6 : faire voter la salle.</w:t>
       </w:r>
     </w:p>
     <w:p>
@@ -14458,7 +14579,7 @@
           <w:rFonts w:ascii="Calibri" w:cs="Calibri" w:eastAsia="Calibri" w:hAnsi="Calibri"/>
           <w:lang w:val="fr-FR"/>
         </w:rPr>
-        <w:t xml:space="preserve">0:20</w:t>
+        <w:t xml:space="preserve">0:40</w:t>
       </w:r>
     </w:p>
     <w:p>
@@ -14483,7 +14604,30 @@
           <w:rFonts w:ascii="Calibri" w:cs="Calibri" w:eastAsia="Calibri" w:hAnsi="Calibri"/>
           <w:lang w:val="fr-FR"/>
         </w:rPr>
-        <w:t xml:space="preserve">Bonne réponse : C, « La publier dans l'organisation ». Dans Personnaliser › Skills, « Publier dans l'organisation » la rend disponible à tous (avec une relecture si l'administrateur l'exige). « Partager » la donne à quelques collègues choisis. En offre individuelle, on passe par le fichier .zip.</w:t>
+        <w:t xml:space="preserve">Lire la question : « Team/Enterprise : la rendre disponible à tous ? » Puis les réponses : A, L'envoyer par mail à chacun ; B, La copier dans un projet ; C, La publier dans l'organisation ; D, C'est impossible. Compter « 1, 2, 3, cartons ! » Observer la salle et commenter la répartition (« beaucoup de bleu… quelques verts… ») sans donner d'indice.</w:t>
+      </w:r>
+    </w:p>
+    <w:p>
+      <w:pPr>
+        <w:pStyle w:val="Body"/>
+        <w:spacing w:after="120"/>
+      </w:pPr>
+      <w:r>
+        <w:rPr>
+          <w:rFonts w:ascii="Calibri" w:cs="Calibri" w:eastAsia="Calibri" w:hAnsi="Calibri"/>
+          <w:b/>
+          <w:bCs/>
+          <w:color w:val="2F5FC4"/>
+          <w:lang w:val="fr-FR"/>
+        </w:rPr>
+        <w:t xml:space="preserve">Question à la salle — </w:t>
+      </w:r>
+      <w:r>
+        <w:rPr>
+          <w:rFonts w:ascii="Calibri" w:cs="Calibri" w:eastAsia="Calibri" w:hAnsi="Calibri"/>
+          <w:lang w:val="fr-FR"/>
+        </w:rPr>
+        <w:t xml:space="preserve">Un volontaire pour défendre une autre réponse que celle de la majorité ?</w:t>
       </w:r>
     </w:p>
     <w:p>
@@ -14506,7 +14650,7 @@
           <w:rFonts w:ascii="Calibri" w:cs="Calibri" w:eastAsia="Calibri" w:hAnsi="Calibri"/>
           <w:lang w:val="fr-FR"/>
         </w:rPr>
-        <w:t xml:space="preserve">Question 7.</w:t>
+        <w:t xml:space="preserve">Clic : révélation de la réponse.</w:t>
       </w:r>
     </w:p>
     <w:p>
@@ -14526,7 +14670,7 @@
           <w:rFonts w:ascii="Calibri" w:cs="Calibri" w:eastAsia="Calibri" w:hAnsi="Calibri"/>
           <w:lang w:val="fr-FR"/>
         </w:rPr>
-        <w:t xml:space="preserve">Diapo 45 · Question 7</w:t>
+        <w:t xml:space="preserve">Diapo 45 · Question 6 · réponse</w:t>
       </w:r>
     </w:p>
     <w:p>
@@ -14540,7 +14684,7 @@
           <wp:inline distT="0" distB="0" distL="0" distR="0">
             <wp:extent cx="2667000" cy="1504950"/>
             <wp:effectExtent t="0" r="0" b="0" l="0"/>
-            <wp:docPr id="39" name="diapo45" descr="Diapo 45 : Question 7" title="Diapo 45"/>
+            <wp:docPr id="39" name="diapo45" descr="Diapo 45 : Question 6 · réponse" title="Diapo 45"/>
             <wp:cNvGraphicFramePr>
               <a:graphicFrameLocks xmlns:a="http://schemas.openxmlformats.org/drawingml/2006/main" noChangeAspect="1"/>
             </wp:cNvGraphicFramePr>
@@ -14596,7 +14740,7 @@
           <w:rFonts w:ascii="Calibri" w:cs="Calibri" w:eastAsia="Calibri" w:hAnsi="Calibri"/>
           <w:lang w:val="fr-FR"/>
         </w:rPr>
-        <w:t xml:space="preserve">Question 7 : faire voter la salle.</w:t>
+        <w:t xml:space="preserve">Corriger et consolider la notion de la question 6.</w:t>
       </w:r>
     </w:p>
     <w:p>
@@ -14619,7 +14763,7 @@
           <w:rFonts w:ascii="Calibri" w:cs="Calibri" w:eastAsia="Calibri" w:hAnsi="Calibri"/>
           <w:lang w:val="fr-FR"/>
         </w:rPr>
-        <w:t xml:space="preserve">0:40</w:t>
+        <w:t xml:space="preserve">0:20</w:t>
       </w:r>
     </w:p>
     <w:p>
@@ -14644,30 +14788,7 @@
           <w:rFonts w:ascii="Calibri" w:cs="Calibri" w:eastAsia="Calibri" w:hAnsi="Calibri"/>
           <w:lang w:val="fr-FR"/>
         </w:rPr>
-        <w:t xml:space="preserve">Lire la question : « En mode plan, que fait Claude ? » Puis les réponses : A, Il modifie directement vos fichiers ; B, Il propose un plan et attend votre feu vert ; C, Il programme une tâche récurrente ; D, Il remplit votre agenda. Compter « 1, 2, 3, cartons ! » Observer la salle et commenter la répartition (« beaucoup de bleu… quelques verts… ») sans donner d'indice.</w:t>
-      </w:r>
-    </w:p>
-    <w:p>
-      <w:pPr>
-        <w:pStyle w:val="Body"/>
-        <w:spacing w:after="120"/>
-      </w:pPr>
-      <w:r>
-        <w:rPr>
-          <w:rFonts w:ascii="Calibri" w:cs="Calibri" w:eastAsia="Calibri" w:hAnsi="Calibri"/>
-          <w:b/>
-          <w:bCs/>
-          <w:color w:val="2F5FC4"/>
-          <w:lang w:val="fr-FR"/>
-        </w:rPr>
-        <w:t xml:space="preserve">Question à la salle — </w:t>
-      </w:r>
-      <w:r>
-        <w:rPr>
-          <w:rFonts w:ascii="Calibri" w:cs="Calibri" w:eastAsia="Calibri" w:hAnsi="Calibri"/>
-          <w:lang w:val="fr-FR"/>
-        </w:rPr>
-        <w:t xml:space="preserve">Un volontaire pour défendre une autre réponse que celle de la majorité ?</w:t>
+        <w:t xml:space="preserve">Bonne réponse : C, « La publier dans l'organisation ». Dans Personnaliser › Skills, « Publier dans l'organisation » la rend disponible à tous (avec une relecture si l'administrateur l'exige). « Partager » la donne à quelques collègues choisis. En offre individuelle, on passe par le fichier .zip.</w:t>
       </w:r>
     </w:p>
     <w:p>
@@ -14690,7 +14811,7 @@
           <w:rFonts w:ascii="Calibri" w:cs="Calibri" w:eastAsia="Calibri" w:hAnsi="Calibri"/>
           <w:lang w:val="fr-FR"/>
         </w:rPr>
-        <w:t xml:space="preserve">Clic : révélation de la réponse.</w:t>
+        <w:t xml:space="preserve">Question 7.</w:t>
       </w:r>
     </w:p>
     <w:p>
@@ -14710,7 +14831,7 @@
           <w:rFonts w:ascii="Calibri" w:cs="Calibri" w:eastAsia="Calibri" w:hAnsi="Calibri"/>
           <w:lang w:val="fr-FR"/>
         </w:rPr>
-        <w:t xml:space="preserve">Diapo 46 · Question 7 · réponse</w:t>
+        <w:t xml:space="preserve">Diapo 46 · Question 7</w:t>
       </w:r>
     </w:p>
     <w:p>
@@ -14724,7 +14845,7 @@
           <wp:inline distT="0" distB="0" distL="0" distR="0">
             <wp:extent cx="2667000" cy="1504950"/>
             <wp:effectExtent t="0" r="0" b="0" l="0"/>
-            <wp:docPr id="40" name="diapo46" descr="Diapo 46 : Question 7 · réponse" title="Diapo 46"/>
+            <wp:docPr id="40" name="diapo46" descr="Diapo 46 : Question 7" title="Diapo 46"/>
             <wp:cNvGraphicFramePr>
               <a:graphicFrameLocks xmlns:a="http://schemas.openxmlformats.org/drawingml/2006/main" noChangeAspect="1"/>
             </wp:cNvGraphicFramePr>
@@ -14780,7 +14901,7 @@
           <w:rFonts w:ascii="Calibri" w:cs="Calibri" w:eastAsia="Calibri" w:hAnsi="Calibri"/>
           <w:lang w:val="fr-FR"/>
         </w:rPr>
-        <w:t xml:space="preserve">Corriger et consolider la notion de la question 7.</w:t>
+        <w:t xml:space="preserve">Question 7 : faire voter la salle.</w:t>
       </w:r>
     </w:p>
     <w:p>
@@ -14803,7 +14924,7 @@
           <w:rFonts w:ascii="Calibri" w:cs="Calibri" w:eastAsia="Calibri" w:hAnsi="Calibri"/>
           <w:lang w:val="fr-FR"/>
         </w:rPr>
-        <w:t xml:space="preserve">0:20</w:t>
+        <w:t xml:space="preserve">0:40</w:t>
       </w:r>
     </w:p>
     <w:p>
@@ -14828,7 +14949,30 @@
           <w:rFonts w:ascii="Calibri" w:cs="Calibri" w:eastAsia="Calibri" w:hAnsi="Calibri"/>
           <w:lang w:val="fr-FR"/>
         </w:rPr>
-        <w:t xml:space="preserve">Bonne réponse : B, « Il propose un plan et attend votre feu vert ». En mode plan, Claude lit et explore, mais ne modifie rien. Il présente un plan, et vous choisissez : approuver, approuver en validant chaque modification, ou continuer à planifier en le corrigeant. C'est la meilleure façon de débuter avec Claude Code.</w:t>
+        <w:t xml:space="preserve">Lire la question : « En mode plan, que fait Claude ? » Puis les réponses : A, Il modifie directement vos fichiers ; B, Il propose un plan et attend votre feu vert ; C, Il programme une tâche récurrente ; D, Il remplit votre agenda. Compter « 1, 2, 3, cartons ! » Observer la salle et commenter la répartition (« beaucoup de bleu… quelques verts… ») sans donner d'indice.</w:t>
+      </w:r>
+    </w:p>
+    <w:p>
+      <w:pPr>
+        <w:pStyle w:val="Body"/>
+        <w:spacing w:after="120"/>
+      </w:pPr>
+      <w:r>
+        <w:rPr>
+          <w:rFonts w:ascii="Calibri" w:cs="Calibri" w:eastAsia="Calibri" w:hAnsi="Calibri"/>
+          <w:b/>
+          <w:bCs/>
+          <w:color w:val="2F5FC4"/>
+          <w:lang w:val="fr-FR"/>
+        </w:rPr>
+        <w:t xml:space="preserve">Question à la salle — </w:t>
+      </w:r>
+      <w:r>
+        <w:rPr>
+          <w:rFonts w:ascii="Calibri" w:cs="Calibri" w:eastAsia="Calibri" w:hAnsi="Calibri"/>
+          <w:lang w:val="fr-FR"/>
+        </w:rPr>
+        <w:t xml:space="preserve">Un volontaire pour défendre une autre réponse que celle de la majorité ?</w:t>
       </w:r>
     </w:p>
     <w:p>
@@ -14851,7 +14995,7 @@
           <w:rFonts w:ascii="Calibri" w:cs="Calibri" w:eastAsia="Calibri" w:hAnsi="Calibri"/>
           <w:lang w:val="fr-FR"/>
         </w:rPr>
-        <w:t xml:space="preserve">Question 8.</w:t>
+        <w:t xml:space="preserve">Clic : révélation de la réponse.</w:t>
       </w:r>
     </w:p>
     <w:p>
@@ -14871,7 +15015,7 @@
           <w:rFonts w:ascii="Calibri" w:cs="Calibri" w:eastAsia="Calibri" w:hAnsi="Calibri"/>
           <w:lang w:val="fr-FR"/>
         </w:rPr>
-        <w:t xml:space="preserve">Diapo 47 · Question 8</w:t>
+        <w:t xml:space="preserve">Diapo 47 · Question 7 · réponse</w:t>
       </w:r>
     </w:p>
     <w:p>
@@ -14885,7 +15029,7 @@
           <wp:inline distT="0" distB="0" distL="0" distR="0">
             <wp:extent cx="2667000" cy="1504950"/>
             <wp:effectExtent t="0" r="0" b="0" l="0"/>
-            <wp:docPr id="41" name="diapo47" descr="Diapo 47 : Question 8" title="Diapo 47"/>
+            <wp:docPr id="41" name="diapo47" descr="Diapo 47 : Question 7 · réponse" title="Diapo 47"/>
             <wp:cNvGraphicFramePr>
               <a:graphicFrameLocks xmlns:a="http://schemas.openxmlformats.org/drawingml/2006/main" noChangeAspect="1"/>
             </wp:cNvGraphicFramePr>
@@ -14941,7 +15085,7 @@
           <w:rFonts w:ascii="Calibri" w:cs="Calibri" w:eastAsia="Calibri" w:hAnsi="Calibri"/>
           <w:lang w:val="fr-FR"/>
         </w:rPr>
-        <w:t xml:space="preserve">Question 8 : faire voter la salle.</w:t>
+        <w:t xml:space="preserve">Corriger et consolider la notion de la question 7.</w:t>
       </w:r>
     </w:p>
     <w:p>
@@ -14964,7 +15108,7 @@
           <w:rFonts w:ascii="Calibri" w:cs="Calibri" w:eastAsia="Calibri" w:hAnsi="Calibri"/>
           <w:lang w:val="fr-FR"/>
         </w:rPr>
-        <w:t xml:space="preserve">0:40</w:t>
+        <w:t xml:space="preserve">0:20</w:t>
       </w:r>
     </w:p>
     <w:p>
@@ -14989,30 +15133,7 @@
           <w:rFonts w:ascii="Calibri" w:cs="Calibri" w:eastAsia="Calibri" w:hAnsi="Calibri"/>
           <w:lang w:val="fr-FR"/>
         </w:rPr>
-        <w:t xml:space="preserve">Lire la question : « Pour utiliser Claude Code, il faut… » Puis les réponses : A, Savoir programmer ; B, Ouvrir un terminal ; C, Un dossier et des consignes en français ; D, Une licence développeur. Compter « 1, 2, 3, cartons ! » Observer la salle et commenter la répartition (« beaucoup de bleu… quelques verts… ») sans donner d'indice.</w:t>
-      </w:r>
-    </w:p>
-    <w:p>
-      <w:pPr>
-        <w:pStyle w:val="Body"/>
-        <w:spacing w:after="120"/>
-      </w:pPr>
-      <w:r>
-        <w:rPr>
-          <w:rFonts w:ascii="Calibri" w:cs="Calibri" w:eastAsia="Calibri" w:hAnsi="Calibri"/>
-          <w:b/>
-          <w:bCs/>
-          <w:color w:val="2F5FC4"/>
-          <w:lang w:val="fr-FR"/>
-        </w:rPr>
-        <w:t xml:space="preserve">Question à la salle — </w:t>
-      </w:r>
-      <w:r>
-        <w:rPr>
-          <w:rFonts w:ascii="Calibri" w:cs="Calibri" w:eastAsia="Calibri" w:hAnsi="Calibri"/>
-          <w:lang w:val="fr-FR"/>
-        </w:rPr>
-        <w:t xml:space="preserve">Un volontaire pour défendre une autre réponse que celle de la majorité ?</w:t>
+        <w:t xml:space="preserve">Bonne réponse : B, « Il propose un plan et attend votre feu vert ». En mode plan, Claude lit et explore, mais ne modifie rien. Il présente un plan, et vous choisissez : approuver, approuver en validant chaque modification, ou continuer à planifier en le corrigeant. C'est la meilleure façon de débuter avec Claude Code.</w:t>
       </w:r>
     </w:p>
     <w:p>
@@ -15035,7 +15156,7 @@
           <w:rFonts w:ascii="Calibri" w:cs="Calibri" w:eastAsia="Calibri" w:hAnsi="Calibri"/>
           <w:lang w:val="fr-FR"/>
         </w:rPr>
-        <w:t xml:space="preserve">Clic : révélation de la réponse.</w:t>
+        <w:t xml:space="preserve">Question 8.</w:t>
       </w:r>
     </w:p>
     <w:p>
@@ -15055,7 +15176,7 @@
           <w:rFonts w:ascii="Calibri" w:cs="Calibri" w:eastAsia="Calibri" w:hAnsi="Calibri"/>
           <w:lang w:val="fr-FR"/>
         </w:rPr>
-        <w:t xml:space="preserve">Diapo 48 · Question 8 · réponse</w:t>
+        <w:t xml:space="preserve">Diapo 48 · Question 8</w:t>
       </w:r>
     </w:p>
     <w:p>
@@ -15069,7 +15190,7 @@
           <wp:inline distT="0" distB="0" distL="0" distR="0">
             <wp:extent cx="2667000" cy="1504950"/>
             <wp:effectExtent t="0" r="0" b="0" l="0"/>
-            <wp:docPr id="42" name="diapo48" descr="Diapo 48 : Question 8 · réponse" title="Diapo 48"/>
+            <wp:docPr id="42" name="diapo48" descr="Diapo 48 : Question 8" title="Diapo 48"/>
             <wp:cNvGraphicFramePr>
               <a:graphicFrameLocks xmlns:a="http://schemas.openxmlformats.org/drawingml/2006/main" noChangeAspect="1"/>
             </wp:cNvGraphicFramePr>
@@ -15125,7 +15246,7 @@
           <w:rFonts w:ascii="Calibri" w:cs="Calibri" w:eastAsia="Calibri" w:hAnsi="Calibri"/>
           <w:lang w:val="fr-FR"/>
         </w:rPr>
-        <w:t xml:space="preserve">Corriger et consolider la notion de la question 8.</w:t>
+        <w:t xml:space="preserve">Question 8 : faire voter la salle.</w:t>
       </w:r>
     </w:p>
     <w:p>
@@ -15148,7 +15269,7 @@
           <w:rFonts w:ascii="Calibri" w:cs="Calibri" w:eastAsia="Calibri" w:hAnsi="Calibri"/>
           <w:lang w:val="fr-FR"/>
         </w:rPr>
-        <w:t xml:space="preserve">0:20</w:t>
+        <w:t xml:space="preserve">0:40</w:t>
       </w:r>
     </w:p>
     <w:p>
@@ -15173,7 +15294,30 @@
           <w:rFonts w:ascii="Calibri" w:cs="Calibri" w:eastAsia="Calibri" w:hAnsi="Calibri"/>
           <w:lang w:val="fr-FR"/>
         </w:rPr>
-        <w:t xml:space="preserve">Bonne réponse : C, « Un dossier et des consignes en français ». Claude Code travaille dans n'importe quel dossier, y compris un dossier de documents. Il existe un onglet Code dans l'application de bureau, donc pas besoin de terminal, et on lui écrit en français comme dans Chat.</w:t>
+        <w:t xml:space="preserve">Lire la question : « Pour utiliser Claude Code, il faut… » Puis les réponses : A, Savoir programmer ; B, Ouvrir un terminal ; C, Un dossier et des consignes en français ; D, Une licence développeur. Compter « 1, 2, 3, cartons ! » Observer la salle et commenter la répartition (« beaucoup de bleu… quelques verts… ») sans donner d'indice.</w:t>
+      </w:r>
+    </w:p>
+    <w:p>
+      <w:pPr>
+        <w:pStyle w:val="Body"/>
+        <w:spacing w:after="120"/>
+      </w:pPr>
+      <w:r>
+        <w:rPr>
+          <w:rFonts w:ascii="Calibri" w:cs="Calibri" w:eastAsia="Calibri" w:hAnsi="Calibri"/>
+          <w:b/>
+          <w:bCs/>
+          <w:color w:val="2F5FC4"/>
+          <w:lang w:val="fr-FR"/>
+        </w:rPr>
+        <w:t xml:space="preserve">Question à la salle — </w:t>
+      </w:r>
+      <w:r>
+        <w:rPr>
+          <w:rFonts w:ascii="Calibri" w:cs="Calibri" w:eastAsia="Calibri" w:hAnsi="Calibri"/>
+          <w:lang w:val="fr-FR"/>
+        </w:rPr>
+        <w:t xml:space="preserve">Un volontaire pour défendre une autre réponse que celle de la majorité ?</w:t>
       </w:r>
     </w:p>
     <w:p>
@@ -15196,7 +15340,7 @@
           <w:rFonts w:ascii="Calibri" w:cs="Calibri" w:eastAsia="Calibri" w:hAnsi="Calibri"/>
           <w:lang w:val="fr-FR"/>
         </w:rPr>
-        <w:t xml:space="preserve">Question 9.</w:t>
+        <w:t xml:space="preserve">Clic : révélation de la réponse.</w:t>
       </w:r>
     </w:p>
     <w:p>
@@ -15216,7 +15360,7 @@
           <w:rFonts w:ascii="Calibri" w:cs="Calibri" w:eastAsia="Calibri" w:hAnsi="Calibri"/>
           <w:lang w:val="fr-FR"/>
         </w:rPr>
-        <w:t xml:space="preserve">Diapo 49 · Question 9</w:t>
+        <w:t xml:space="preserve">Diapo 49 · Question 8 · réponse</w:t>
       </w:r>
     </w:p>
     <w:p>
@@ -15230,7 +15374,7 @@
           <wp:inline distT="0" distB="0" distL="0" distR="0">
             <wp:extent cx="2667000" cy="1504950"/>
             <wp:effectExtent t="0" r="0" b="0" l="0"/>
-            <wp:docPr id="43" name="diapo49" descr="Diapo 49 : Question 9" title="Diapo 49"/>
+            <wp:docPr id="43" name="diapo49" descr="Diapo 49 : Question 8 · réponse" title="Diapo 49"/>
             <wp:cNvGraphicFramePr>
               <a:graphicFrameLocks xmlns:a="http://schemas.openxmlformats.org/drawingml/2006/main" noChangeAspect="1"/>
             </wp:cNvGraphicFramePr>
@@ -15286,7 +15430,7 @@
           <w:rFonts w:ascii="Calibri" w:cs="Calibri" w:eastAsia="Calibri" w:hAnsi="Calibri"/>
           <w:lang w:val="fr-FR"/>
         </w:rPr>
-        <w:t xml:space="preserve">Question 9 : faire voter la salle.</w:t>
+        <w:t xml:space="preserve">Corriger et consolider la notion de la question 8.</w:t>
       </w:r>
     </w:p>
     <w:p>
@@ -15309,7 +15453,7 @@
           <w:rFonts w:ascii="Calibri" w:cs="Calibri" w:eastAsia="Calibri" w:hAnsi="Calibri"/>
           <w:lang w:val="fr-FR"/>
         </w:rPr>
-        <w:t xml:space="preserve">0:40</w:t>
+        <w:t xml:space="preserve">0:20</w:t>
       </w:r>
     </w:p>
     <w:p>
@@ -15334,30 +15478,7 @@
           <w:rFonts w:ascii="Calibri" w:cs="Calibri" w:eastAsia="Calibri" w:hAnsi="Calibri"/>
           <w:lang w:val="fr-FR"/>
         </w:rPr>
-        <w:t xml:space="preserve">Lire la question : « Pour vous aider à créer une skill, Claude s'appuie sur… » Puis les réponses : A, brand-guidelines ; B, skill-creator ; C, docx ; D, Rien, il improvise. Compter « 1, 2, 3, cartons ! » Observer la salle et commenter la répartition (« beaucoup de bleu… quelques verts… ») sans donner d'indice.</w:t>
-      </w:r>
-    </w:p>
-    <w:p>
-      <w:pPr>
-        <w:pStyle w:val="Body"/>
-        <w:spacing w:after="120"/>
-      </w:pPr>
-      <w:r>
-        <w:rPr>
-          <w:rFonts w:ascii="Calibri" w:cs="Calibri" w:eastAsia="Calibri" w:hAnsi="Calibri"/>
-          <w:b/>
-          <w:bCs/>
-          <w:color w:val="2F5FC4"/>
-          <w:lang w:val="fr-FR"/>
-        </w:rPr>
-        <w:t xml:space="preserve">Question à la salle — </w:t>
-      </w:r>
-      <w:r>
-        <w:rPr>
-          <w:rFonts w:ascii="Calibri" w:cs="Calibri" w:eastAsia="Calibri" w:hAnsi="Calibri"/>
-          <w:lang w:val="fr-FR"/>
-        </w:rPr>
-        <w:t xml:space="preserve">Un volontaire pour défendre une autre réponse que celle de la majorité ?</w:t>
+        <w:t xml:space="preserve">Bonne réponse : C, « Un dossier et des consignes en français ». Claude Code travaille dans n'importe quel dossier, y compris un dossier de documents. Il existe un onglet Code dans l'application de bureau, donc pas besoin de terminal, et on lui écrit en français comme dans Chat.</w:t>
       </w:r>
     </w:p>
     <w:p>
@@ -15380,7 +15501,7 @@
           <w:rFonts w:ascii="Calibri" w:cs="Calibri" w:eastAsia="Calibri" w:hAnsi="Calibri"/>
           <w:lang w:val="fr-FR"/>
         </w:rPr>
-        <w:t xml:space="preserve">Clic : révélation de la réponse.</w:t>
+        <w:t xml:space="preserve">Question 9.</w:t>
       </w:r>
     </w:p>
     <w:p>
@@ -15400,7 +15521,7 @@
           <w:rFonts w:ascii="Calibri" w:cs="Calibri" w:eastAsia="Calibri" w:hAnsi="Calibri"/>
           <w:lang w:val="fr-FR"/>
         </w:rPr>
-        <w:t xml:space="preserve">Diapo 50 · Question 9 · réponse</w:t>
+        <w:t xml:space="preserve">Diapo 50 · Question 9</w:t>
       </w:r>
     </w:p>
     <w:p>
@@ -15414,7 +15535,7 @@
           <wp:inline distT="0" distB="0" distL="0" distR="0">
             <wp:extent cx="2667000" cy="1504950"/>
             <wp:effectExtent t="0" r="0" b="0" l="0"/>
-            <wp:docPr id="44" name="diapo50" descr="Diapo 50 : Question 9 · réponse" title="Diapo 50"/>
+            <wp:docPr id="44" name="diapo50" descr="Diapo 50 : Question 9" title="Diapo 50"/>
             <wp:cNvGraphicFramePr>
               <a:graphicFrameLocks xmlns:a="http://schemas.openxmlformats.org/drawingml/2006/main" noChangeAspect="1"/>
             </wp:cNvGraphicFramePr>
@@ -15470,7 +15591,7 @@
           <w:rFonts w:ascii="Calibri" w:cs="Calibri" w:eastAsia="Calibri" w:hAnsi="Calibri"/>
           <w:lang w:val="fr-FR"/>
         </w:rPr>
-        <w:t xml:space="preserve">Corriger et consolider la notion de la question 9.</w:t>
+        <w:t xml:space="preserve">Question 9 : faire voter la salle.</w:t>
       </w:r>
     </w:p>
     <w:p>
@@ -15493,7 +15614,7 @@
           <w:rFonts w:ascii="Calibri" w:cs="Calibri" w:eastAsia="Calibri" w:hAnsi="Calibri"/>
           <w:lang w:val="fr-FR"/>
         </w:rPr>
-        <w:t xml:space="preserve">0:20</w:t>
+        <w:t xml:space="preserve">0:40</w:t>
       </w:r>
     </w:p>
     <w:p>
@@ -15518,7 +15639,30 @@
           <w:rFonts w:ascii="Calibri" w:cs="Calibri" w:eastAsia="Calibri" w:hAnsi="Calibri"/>
           <w:lang w:val="fr-FR"/>
         </w:rPr>
-        <w:t xml:space="preserve">Bonne réponse : B, « skill-creator ». skill-creator est la skill d'Anthropic qui fabrique les skills : elle guide l'entretien, la rédaction du SKILL.md, les tests, l'amélioration et l'affinage de la description, puis empaquette le résultat. Elle est plus complète dans Cowork et Claude Code que dans Chat.</w:t>
+        <w:t xml:space="preserve">Lire la question : « Pour vous aider à créer une skill, Claude s'appuie sur… » Puis les réponses : A, brand-guidelines ; B, skill-creator ; C, docx ; D, Rien, il improvise. Compter « 1, 2, 3, cartons ! » Observer la salle et commenter la répartition (« beaucoup de bleu… quelques verts… ») sans donner d'indice.</w:t>
+      </w:r>
+    </w:p>
+    <w:p>
+      <w:pPr>
+        <w:pStyle w:val="Body"/>
+        <w:spacing w:after="120"/>
+      </w:pPr>
+      <w:r>
+        <w:rPr>
+          <w:rFonts w:ascii="Calibri" w:cs="Calibri" w:eastAsia="Calibri" w:hAnsi="Calibri"/>
+          <w:b/>
+          <w:bCs/>
+          <w:color w:val="2F5FC4"/>
+          <w:lang w:val="fr-FR"/>
+        </w:rPr>
+        <w:t xml:space="preserve">Question à la salle — </w:t>
+      </w:r>
+      <w:r>
+        <w:rPr>
+          <w:rFonts w:ascii="Calibri" w:cs="Calibri" w:eastAsia="Calibri" w:hAnsi="Calibri"/>
+          <w:lang w:val="fr-FR"/>
+        </w:rPr>
+        <w:t xml:space="preserve">Un volontaire pour défendre une autre réponse que celle de la majorité ?</w:t>
       </w:r>
     </w:p>
     <w:p>
@@ -15541,7 +15685,7 @@
           <w:rFonts w:ascii="Calibri" w:cs="Calibri" w:eastAsia="Calibri" w:hAnsi="Calibri"/>
           <w:lang w:val="fr-FR"/>
         </w:rPr>
-        <w:t xml:space="preserve">Dernière diapo avant l'atelier : ce qu'il faut retenir.</w:t>
+        <w:t xml:space="preserve">Clic : révélation de la réponse.</w:t>
       </w:r>
     </w:p>
     <w:p>
@@ -15561,7 +15705,7 @@
           <w:rFonts w:ascii="Calibri" w:cs="Calibri" w:eastAsia="Calibri" w:hAnsi="Calibri"/>
           <w:lang w:val="fr-FR"/>
         </w:rPr>
-        <w:t xml:space="preserve">Diapo 51 · À retenir</w:t>
+        <w:t xml:space="preserve">Diapo 51 · Question 9 · réponse</w:t>
       </w:r>
     </w:p>
     <w:p>
@@ -15573,9 +15717,9 @@
       <w:r>
         <w:drawing>
           <wp:inline distT="0" distB="0" distL="0" distR="0">
-            <wp:extent cx="4191000" cy="2362200"/>
+            <wp:extent cx="2667000" cy="1504950"/>
             <wp:effectExtent t="0" r="0" b="0" l="0"/>
-            <wp:docPr id="45" name="diapo51" descr="Diapo 51 : À retenir" title="Diapo 51"/>
+            <wp:docPr id="45" name="diapo51" descr="Diapo 51 : Question 9 · réponse" title="Diapo 51"/>
             <wp:cNvGraphicFramePr>
               <a:graphicFrameLocks xmlns:a="http://schemas.openxmlformats.org/drawingml/2006/main" noChangeAspect="1"/>
             </wp:cNvGraphicFramePr>
@@ -15598,7 +15742,7 @@
                   <pic:spPr bwMode="auto">
                     <a:xfrm>
                       <a:off x="0" y="0"/>
-                      <a:ext cx="4191000" cy="2362200"/>
+                      <a:ext cx="2667000" cy="1504950"/>
                     </a:xfrm>
                     <a:prstGeom prst="rect">
                       <a:avLst/>
@@ -15631,7 +15775,7 @@
           <w:rFonts w:ascii="Calibri" w:cs="Calibri" w:eastAsia="Calibri" w:hAnsi="Calibri"/>
           <w:lang w:val="fr-FR"/>
         </w:rPr>
-        <w:t xml:space="preserve">Synthétiser en trois idées et lancer l'atelier.</w:t>
+        <w:t xml:space="preserve">Corriger et consolider la notion de la question 9.</w:t>
       </w:r>
     </w:p>
     <w:p>
@@ -15654,7 +15798,7 @@
           <w:rFonts w:ascii="Calibri" w:cs="Calibri" w:eastAsia="Calibri" w:hAnsi="Calibri"/>
           <w:lang w:val="fr-FR"/>
         </w:rPr>
-        <w:t xml:space="preserve">1:30</w:t>
+        <w:t xml:space="preserve">0:20</w:t>
       </w:r>
     </w:p>
     <w:p>
@@ -15679,30 +15823,7 @@
           <w:rFonts w:ascii="Calibri" w:cs="Calibri" w:eastAsia="Calibri" w:hAnsi="Calibri"/>
           <w:lang w:val="fr-FR"/>
         </w:rPr>
-        <w:t xml:space="preserve">Quatre idées à garder. Une : une skill, c'est un savoir-faire rangé dans un dossier, que Claude ressort au bon moment. Deux : sa qualité tient à sa description, qui dit QUAND l'utiliser, et à un exemple réussi. Trois : on teste, on ajuste, et seulement ensuite on partage. Quatre : Claude Code n'est pas réservé aux développeurs. Commencez en mode plan, sur une copie de votre dossier, et vous garderez la main à chaque étape. Refaites le test du début : qui a encore peur de Claude Code ? Place à l'atelier. Consigne : choisissez une tâche que vous répétez chaque semaine (celles que nous avons notées au début peuvent servir) et créez-en la skill dans la porte de votre choix. Trois parcours sont proposés dans le document distribué : Chat, Cowork, ou Code accompagné en mode plan. Vous pouvez aussi suivre le cas de la charte graphique de Claude Academy. Objectif de fin d'atelier : une skill enregistrée, testée une fois dans une nouvelle conversation, et dont la description commence par ce qu'elle fait et continue par « Utiliser quand… ». Les notes distribuées contiennent le pas-à-pas et un prompt de départ ; tous les supports, présentation comprise, sont en ligne sur le dépôt GitHub dont l'adresse s'affiche en bas de la diapo.</w:t>
-      </w:r>
-    </w:p>
-    <w:p>
-      <w:pPr>
-        <w:pStyle w:val="Body"/>
-        <w:spacing w:after="120"/>
-      </w:pPr>
-      <w:r>
-        <w:rPr>
-          <w:rFonts w:ascii="Calibri" w:cs="Calibri" w:eastAsia="Calibri" w:hAnsi="Calibri"/>
-          <w:b/>
-          <w:bCs/>
-          <w:color w:val="2F5FC4"/>
-          <w:lang w:val="fr-FR"/>
-        </w:rPr>
-        <w:t xml:space="preserve">Question à la salle — </w:t>
-      </w:r>
-      <w:r>
-        <w:rPr>
-          <w:rFonts w:ascii="Calibri" w:cs="Calibri" w:eastAsia="Calibri" w:hAnsi="Calibri"/>
-          <w:lang w:val="fr-FR"/>
-        </w:rPr>
-        <w:t xml:space="preserve">Qui sait déjà quelle skill il ou elle va créer ?</w:t>
+        <w:t xml:space="preserve">Bonne réponse : B, « skill-creator ». skill-creator est la skill d'Anthropic qui fabrique les skills : elle guide l'entretien, la rédaction du SKILL.md, les tests, l'amélioration et l'affinage de la description, puis empaquette le résultat. Elle est plus complète dans Cowork et Claude Code que dans Chat.</w:t>
       </w:r>
     </w:p>
     <w:p>
@@ -15725,7 +15846,7 @@
           <w:rFonts w:ascii="Calibri" w:cs="Calibri" w:eastAsia="Calibri" w:hAnsi="Calibri"/>
           <w:lang w:val="fr-FR"/>
         </w:rPr>
-        <w:t xml:space="preserve">Je laisse mes coordonnées à l'écran pendant l'atelier.</w:t>
+        <w:t xml:space="preserve">Dernière diapo avant l'atelier : ce qu'il faut retenir.</w:t>
       </w:r>
     </w:p>
     <w:p>
@@ -15745,7 +15866,7 @@
           <w:rFonts w:ascii="Calibri" w:cs="Calibri" w:eastAsia="Calibri" w:hAnsi="Calibri"/>
           <w:lang w:val="fr-FR"/>
         </w:rPr>
-        <w:t xml:space="preserve">Diapo 52 · Restons en contact</w:t>
+        <w:t xml:space="preserve">Diapo 52 · À retenir</w:t>
       </w:r>
     </w:p>
     <w:p>
@@ -15757,9 +15878,9 @@
       <w:r>
         <w:drawing>
           <wp:inline distT="0" distB="0" distL="0" distR="0">
-            <wp:extent cx="2667000" cy="1504950"/>
+            <wp:extent cx="4191000" cy="2362200"/>
             <wp:effectExtent t="0" r="0" b="0" l="0"/>
-            <wp:docPr id="46" name="diapo52" descr="Diapo 52 : Restons en contact" title="Diapo 52"/>
+            <wp:docPr id="46" name="diapo52" descr="Diapo 52 : À retenir" title="Diapo 52"/>
             <wp:cNvGraphicFramePr>
               <a:graphicFrameLocks xmlns:a="http://schemas.openxmlformats.org/drawingml/2006/main" noChangeAspect="1"/>
             </wp:cNvGraphicFramePr>
@@ -15782,6 +15903,190 @@
                   <pic:spPr bwMode="auto">
                     <a:xfrm>
                       <a:off x="0" y="0"/>
+                      <a:ext cx="4191000" cy="2362200"/>
+                    </a:xfrm>
+                    <a:prstGeom prst="rect">
+                      <a:avLst/>
+                    </a:prstGeom>
+                  </pic:spPr>
+                </pic:pic>
+              </a:graphicData>
+            </a:graphic>
+          </wp:inline>
+        </w:drawing>
+      </w:r>
+    </w:p>
+    <w:p>
+      <w:pPr>
+        <w:pStyle w:val="Body"/>
+        <w:spacing w:after="120"/>
+      </w:pPr>
+      <w:r>
+        <w:rPr>
+          <w:rFonts w:ascii="Calibri" w:cs="Calibri" w:eastAsia="Calibri" w:hAnsi="Calibri"/>
+          <w:b/>
+          <w:bCs/>
+          <w:color w:val="B8235A"/>
+          <w:lang w:val="fr-FR"/>
+        </w:rPr>
+        <w:t xml:space="preserve">Objectif — </w:t>
+      </w:r>
+      <w:r>
+        <w:rPr>
+          <w:rFonts w:ascii="Calibri" w:cs="Calibri" w:eastAsia="Calibri" w:hAnsi="Calibri"/>
+          <w:lang w:val="fr-FR"/>
+        </w:rPr>
+        <w:t xml:space="preserve">Synthétiser en trois idées et lancer l'atelier.</w:t>
+      </w:r>
+    </w:p>
+    <w:p>
+      <w:pPr>
+        <w:pStyle w:val="Body"/>
+        <w:spacing w:after="120"/>
+      </w:pPr>
+      <w:r>
+        <w:rPr>
+          <w:rFonts w:ascii="Calibri" w:cs="Calibri" w:eastAsia="Calibri" w:hAnsi="Calibri"/>
+          <w:b/>
+          <w:bCs/>
+          <w:color w:val="566070"/>
+          <w:lang w:val="fr-FR"/>
+        </w:rPr>
+        <w:t xml:space="preserve">Timing — </w:t>
+      </w:r>
+      <w:r>
+        <w:rPr>
+          <w:rFonts w:ascii="Calibri" w:cs="Calibri" w:eastAsia="Calibri" w:hAnsi="Calibri"/>
+          <w:lang w:val="fr-FR"/>
+        </w:rPr>
+        <w:t xml:space="preserve">1:30</w:t>
+      </w:r>
+    </w:p>
+    <w:p>
+      <w:pPr>
+        <w:pStyle w:val="Heading3"/>
+      </w:pPr>
+      <w:r>
+        <w:rPr>
+          <w:rFonts w:ascii="Calibri" w:cs="Calibri" w:eastAsia="Calibri" w:hAnsi="Calibri"/>
+          <w:lang w:val="fr-FR"/>
+        </w:rPr>
+        <w:t xml:space="preserve">Script</w:t>
+      </w:r>
+    </w:p>
+    <w:p>
+      <w:pPr>
+        <w:pStyle w:val="Body"/>
+        <w:spacing w:after="120"/>
+      </w:pPr>
+      <w:r>
+        <w:rPr>
+          <w:rFonts w:ascii="Calibri" w:cs="Calibri" w:eastAsia="Calibri" w:hAnsi="Calibri"/>
+          <w:lang w:val="fr-FR"/>
+        </w:rPr>
+        <w:t xml:space="preserve">Quatre idées à garder. Une : une skill, c'est un savoir-faire rangé dans un dossier, que Claude ressort au bon moment. Deux : sa qualité tient à sa description, qui dit QUAND l'utiliser, et à un exemple réussi. Trois : on teste, on ajuste, et seulement ensuite on partage. Quatre : Claude Code n'est pas réservé aux développeurs. Commencez en mode plan, sur une copie de votre dossier, et vous garderez la main à chaque étape. Refaites le test du début : qui a encore peur de Claude Code ? Place à l'atelier. Consigne : choisissez une tâche que vous répétez chaque semaine (celles que nous avons notées au début peuvent servir) et créez-en la skill dans la porte de votre choix. Trois parcours sont proposés dans le document distribué : Chat, Cowork, ou Code accompagné en mode plan. Vous pouvez aussi suivre le cas de la charte graphique de Claude Academy. Objectif de fin d'atelier : une skill enregistrée, testée une fois dans une nouvelle conversation, et dont la description commence par ce qu'elle fait et continue par « Utiliser quand… ». Les notes distribuées contiennent le pas-à-pas et un prompt de départ ; tous les supports, présentation comprise, sont en ligne sur le dépôt GitHub dont l'adresse s'affiche en bas de la diapo.</w:t>
+      </w:r>
+    </w:p>
+    <w:p>
+      <w:pPr>
+        <w:pStyle w:val="Body"/>
+        <w:spacing w:after="120"/>
+      </w:pPr>
+      <w:r>
+        <w:rPr>
+          <w:rFonts w:ascii="Calibri" w:cs="Calibri" w:eastAsia="Calibri" w:hAnsi="Calibri"/>
+          <w:b/>
+          <w:bCs/>
+          <w:color w:val="2F5FC4"/>
+          <w:lang w:val="fr-FR"/>
+        </w:rPr>
+        <w:t xml:space="preserve">Question à la salle — </w:t>
+      </w:r>
+      <w:r>
+        <w:rPr>
+          <w:rFonts w:ascii="Calibri" w:cs="Calibri" w:eastAsia="Calibri" w:hAnsi="Calibri"/>
+          <w:lang w:val="fr-FR"/>
+        </w:rPr>
+        <w:t xml:space="preserve">Qui sait déjà quelle skill il ou elle va créer ?</w:t>
+      </w:r>
+    </w:p>
+    <w:p>
+      <w:pPr>
+        <w:pStyle w:val="Body"/>
+        <w:spacing w:after="120"/>
+      </w:pPr>
+      <w:r>
+        <w:rPr>
+          <w:rFonts w:ascii="Calibri" w:cs="Calibri" w:eastAsia="Calibri" w:hAnsi="Calibri"/>
+          <w:b/>
+          <w:bCs/>
+          <w:color w:val="1F7A50"/>
+          <w:lang w:val="fr-FR"/>
+        </w:rPr>
+        <w:t xml:space="preserve">Transition — </w:t>
+      </w:r>
+      <w:r>
+        <w:rPr>
+          <w:rFonts w:ascii="Calibri" w:cs="Calibri" w:eastAsia="Calibri" w:hAnsi="Calibri"/>
+          <w:lang w:val="fr-FR"/>
+        </w:rPr>
+        <w:t xml:space="preserve">Je laisse mes coordonnées à l'écran pendant l'atelier.</w:t>
+      </w:r>
+    </w:p>
+    <w:p>
+      <w:pPr>
+        <w:pStyle w:val="Body"/>
+      </w:pPr>
+      <w:r>
+        <w:br w:type="page"/>
+      </w:r>
+    </w:p>
+    <w:p>
+      <w:pPr>
+        <w:pStyle w:val="Heading2"/>
+      </w:pPr>
+      <w:r>
+        <w:rPr>
+          <w:rFonts w:ascii="Calibri" w:cs="Calibri" w:eastAsia="Calibri" w:hAnsi="Calibri"/>
+          <w:lang w:val="fr-FR"/>
+        </w:rPr>
+        <w:t xml:space="preserve">Diapo 53 · Restons en contact</w:t>
+      </w:r>
+    </w:p>
+    <w:p>
+      <w:pPr>
+        <w:pStyle w:val="Body"/>
+        <w:spacing w:after="160"/>
+        <w:jc w:val="center"/>
+      </w:pPr>
+      <w:r>
+        <w:drawing>
+          <wp:inline distT="0" distB="0" distL="0" distR="0">
+            <wp:extent cx="2667000" cy="1504950"/>
+            <wp:effectExtent t="0" r="0" b="0" l="0"/>
+            <wp:docPr id="47" name="diapo53" descr="Diapo 53 : Restons en contact" title="Diapo 53"/>
+            <wp:cNvGraphicFramePr>
+              <a:graphicFrameLocks xmlns:a="http://schemas.openxmlformats.org/drawingml/2006/main" noChangeAspect="1"/>
+            </wp:cNvGraphicFramePr>
+            <a:graphic xmlns:a="http://schemas.openxmlformats.org/drawingml/2006/main">
+              <a:graphicData uri="http://schemas.openxmlformats.org/drawingml/2006/picture">
+                <pic:pic xmlns:pic="http://schemas.openxmlformats.org/drawingml/2006/picture">
+                  <pic:nvPicPr>
+                    <pic:cNvPr id="0" name="" descr=""/>
+                    <pic:cNvPicPr>
+                      <a:picLocks noChangeAspect="1" noChangeArrowheads="1"/>
+                    </pic:cNvPicPr>
+                  </pic:nvPicPr>
+                  <pic:blipFill>
+                    <a:blip r:embed="rId54" cstate="none"/>
+                    <a:srcRect/>
+                    <a:stretch>
+                      <a:fillRect/>
+                    </a:stretch>
+                  </pic:blipFill>
+                  <pic:spPr bwMode="auto">
+                    <a:xfrm>
+                      <a:off x="0" y="0"/>
                       <a:ext cx="2667000" cy="1504950"/>
                     </a:xfrm>
                     <a:prstGeom prst="rect">
@@ -19830,6 +20135,208 @@
         <w:t xml:space="preserve">Vous pouvez dire « pas besoin de tests, on avance » : la méthode est souple. Mais pour une skill partagée à une équipe, gardez les tests.</w:t>
       </w:r>
     </w:p>
+    <w:tbl>
+      <w:tblPr>
+        <w:tblW w:type="dxa" w:w="9638"/>
+        <w:tblBorders>
+          <w:top w:val="single" w:color="auto" w:sz="4"/>
+          <w:left w:val="single" w:color="auto" w:sz="4"/>
+          <w:bottom w:val="single" w:color="auto" w:sz="4"/>
+          <w:right w:val="single" w:color="auto" w:sz="4"/>
+          <w:insideH w:val="single" w:color="auto" w:sz="4"/>
+          <w:insideV w:val="single" w:color="auto" w:sz="4"/>
+        </w:tblBorders>
+      </w:tblPr>
+      <w:tblGrid>
+        <w:gridCol w:w="9638"/>
+      </w:tblGrid>
+      <w:tr>
+        <w:tc>
+          <w:tcPr>
+            <w:tcW w:type="dxa" w:w="9638"/>
+            <w:tcBorders>
+              <w:top w:val="single" w:color="B8235A" w:sz="12"/>
+              <w:left w:val="single" w:color="B8235A" w:sz="12"/>
+              <w:bottom w:val="single" w:color="B8235A" w:sz="12"/>
+              <w:right w:val="single" w:color="B8235A" w:sz="12"/>
+            </w:tcBorders>
+            <w:shd w:fill="FBE7EF" w:color="auto" w:val="clear"/>
+            <w:tcMar>
+              <w:top w:type="dxa" w:w="160"/>
+              <w:left w:type="dxa" w:w="220"/>
+              <w:bottom w:type="dxa" w:w="160"/>
+              <w:right w:type="dxa" w:w="220"/>
+            </w:tcMar>
+          </w:tcPr>
+          <w:p>
+            <w:pPr>
+              <w:pStyle w:val="Body"/>
+              <w:spacing w:after="120"/>
+            </w:pPr>
+            <w:r>
+              <w:rPr>
+                <w:rFonts w:ascii="Calibri" w:cs="Calibri" w:eastAsia="Calibri" w:hAnsi="Calibri"/>
+                <w:b/>
+                <w:bCs/>
+                <w:color w:val="B8235A"/>
+                <w:sz w:val="26"/>
+                <w:szCs w:val="26"/>
+                <w:lang w:val="fr-FR"/>
+              </w:rPr>
+              <w:t xml:space="preserve">Cowork ou Code pour créer une skill ?</w:t>
+            </w:r>
+          </w:p>
+          <w:p>
+            <w:pPr>
+              <w:pStyle w:val="Body"/>
+              <w:spacing w:after="100"/>
+            </w:pPr>
+            <w:r>
+              <w:rPr>
+                <w:rFonts w:ascii="Calibri" w:cs="Calibri" w:eastAsia="Calibri" w:hAnsi="Calibri"/>
+                <w:b/>
+                <w:bCs/>
+                <w:lang w:val="fr-FR"/>
+              </w:rPr>
+              <w:t xml:space="preserve">Où vit la skill. </w:t>
+            </w:r>
+            <w:r>
+              <w:rPr>
+                <w:rFonts w:ascii="Calibri" w:cs="Calibri" w:eastAsia="Calibri" w:hAnsi="Calibri"/>
+                <w:lang w:val="fr-FR"/>
+              </w:rPr>
+              <w:t xml:space="preserve">Cowork : dans votre compte Claude (fichier .skill, bouton « Save skill »), donc disponible partout : Chat, Cowork et Claude Code. Code : dans un dossier (.claude/skills/ du projet, ou ~/.claude/skills/ pour vous), utilisable tout de suite mais seulement dans Claude Code.</w:t>
+            </w:r>
+          </w:p>
+          <w:p>
+            <w:pPr>
+              <w:pStyle w:val="Body"/>
+              <w:spacing w:after="100"/>
+            </w:pPr>
+            <w:r>
+              <w:rPr>
+                <w:rFonts w:ascii="Calibri" w:cs="Calibri" w:eastAsia="Calibri" w:hAnsi="Calibri"/>
+                <w:b/>
+                <w:bCs/>
+                <w:lang w:val="fr-FR"/>
+              </w:rPr>
+              <w:t xml:space="preserve">Sens de la synchronisation. </w:t>
+            </w:r>
+            <w:r>
+              <w:rPr>
+                <w:rFonts w:ascii="Calibri" w:cs="Calibri" w:eastAsia="Calibri" w:hAnsi="Calibri"/>
+                <w:lang w:val="fr-FR"/>
+              </w:rPr>
+              <w:t xml:space="preserve">Du compte vers Code, jamais l'inverse. Une skill créée dans Code s'importe dans le compte en compressant son dossier (fiche B2).</w:t>
+            </w:r>
+          </w:p>
+          <w:p>
+            <w:pPr>
+              <w:pStyle w:val="Body"/>
+              <w:spacing w:after="100"/>
+            </w:pPr>
+            <w:r>
+              <w:rPr>
+                <w:rFonts w:ascii="Calibri" w:cs="Calibri" w:eastAsia="Calibri" w:hAnsi="Calibri"/>
+                <w:b/>
+                <w:bCs/>
+                <w:lang w:val="fr-FR"/>
+              </w:rPr>
+              <w:t xml:space="preserve">Réservé à Code. </w:t>
+            </w:r>
+            <w:r>
+              <w:rPr>
+                <w:rFonts w:ascii="Calibri" w:cs="Calibri" w:eastAsia="Calibri" w:hAnsi="Calibri"/>
+                <w:lang w:val="fr-FR"/>
+              </w:rPr>
+              <w:t xml:space="preserve">Paramètres ($ARGUMENTS), commande lancée avant la skill pour injecter des données, lancement manuel uniquement (disable-model-invocation), exécution isolée (context: fork), mode plan, historique des versions avec Git. Écrits pour Code, ces réglages ne fonctionnent pas ou autrement dans Cowork et Chat.</w:t>
+            </w:r>
+          </w:p>
+          <w:p>
+            <w:pPr>
+              <w:pStyle w:val="Body"/>
+              <w:spacing w:after="100"/>
+            </w:pPr>
+            <w:r>
+              <w:rPr>
+                <w:rFonts w:ascii="Calibri" w:cs="Calibri" w:eastAsia="Calibri" w:hAnsi="Calibri"/>
+                <w:b/>
+                <w:bCs/>
+                <w:lang w:val="fr-FR"/>
+              </w:rPr>
+              <w:t xml:space="preserve">Relire les tests de skill-creator. </w:t>
+            </w:r>
+            <w:r>
+              <w:rPr>
+                <w:rFonts w:ascii="Calibri" w:cs="Calibri" w:eastAsia="Calibri" w:hAnsi="Calibri"/>
+                <w:lang w:val="fr-FR"/>
+              </w:rPr>
+              <w:t xml:space="preserve">Cowork : une page HTML à ouvrir soi-même, les commentaires reviennent sous forme de fichier. Code : la page s'ouvre directement.</w:t>
+            </w:r>
+          </w:p>
+          <w:p>
+            <w:pPr>
+              <w:pStyle w:val="Body"/>
+              <w:spacing w:after="100"/>
+            </w:pPr>
+            <w:r>
+              <w:rPr>
+                <w:rFonts w:ascii="Calibri" w:cs="Calibri" w:eastAsia="Calibri" w:hAnsi="Calibri"/>
+                <w:b/>
+                <w:bCs/>
+                <w:lang w:val="fr-FR"/>
+              </w:rPr>
+              <w:t xml:space="preserve">Partager en équipe. </w:t>
+            </w:r>
+            <w:r>
+              <w:rPr>
+                <w:rFonts w:ascii="Calibri" w:cs="Calibri" w:eastAsia="Calibri" w:hAnsi="Calibri"/>
+                <w:lang w:val="fr-FR"/>
+              </w:rPr>
+              <w:t xml:space="preserve">Cowork : Partager ou Publier dans l'organisation (Team/Enterprise). Code : ranger la skill dans le dépôt Git du projet.</w:t>
+            </w:r>
+          </w:p>
+          <w:p>
+            <w:pPr>
+              <w:pStyle w:val="Body"/>
+              <w:spacing w:after="100"/>
+            </w:pPr>
+            <w:r>
+              <w:rPr>
+                <w:rFonts w:ascii="Calibri" w:cs="Calibri" w:eastAsia="Calibri" w:hAnsi="Calibri"/>
+                <w:b/>
+                <w:bCs/>
+                <w:lang w:val="fr-FR"/>
+              </w:rPr>
+              <w:t xml:space="preserve">En pratique. </w:t>
+            </w:r>
+            <w:r>
+              <w:rPr>
+                <w:rFonts w:ascii="Calibri" w:cs="Calibri" w:eastAsia="Calibri" w:hAnsi="Calibri"/>
+                <w:lang w:val="fr-FR"/>
+              </w:rPr>
+              <w:t xml:space="preserve">Skill métier pour tous : Cowork. Skill à versionner, relire ou partager avec une équipe technique : Code. Le meilleur des deux : créer et tester dans Code, puis importer le .skill dans le compte.</w:t>
+            </w:r>
+          </w:p>
+          <w:p>
+            <w:pPr>
+              <w:pStyle w:val="Body"/>
+              <w:spacing w:after="100"/>
+            </w:pPr>
+            <w:r>
+              <w:rPr>
+                <w:rFonts w:ascii="Calibri" w:cs="Calibri" w:eastAsia="Calibri" w:hAnsi="Calibri"/>
+                <w:i/>
+                <w:iCs/>
+                <w:color w:val="566070"/>
+                <w:lang w:val="fr-FR"/>
+              </w:rPr>
+              <w:t xml:space="preserve">Cowork fusionne avec Chat en ce moment : l'interface peut évoluer. Le mode plan n'est documenté que pour Claude Code.</w:t>
+            </w:r>
+          </w:p>
+        </w:tc>
+      </w:tr>
+    </w:tbl>
     <w:p>
       <w:pPr>
         <w:pStyle w:val="Body"/>
@@ -22240,7 +22747,7 @@
         </w:numPr>
         <w:spacing w:after="60"/>
       </w:pPr>
-      <w:hyperlink w:history="1" r:id="rIdwdzpggriomsfjp5gbhvro">
+      <w:hyperlink w:history="1" r:id="rIdyvwswbbfrvhlbth3zrvra">
         <w:r>
           <w:rPr>
             <w:rStyle w:val="Hyperlink"/>
@@ -22270,7 +22777,7 @@
         </w:numPr>
         <w:spacing w:after="60"/>
       </w:pPr>
-      <w:hyperlink w:history="1" r:id="rIdlayjeizlqxhzz5tfwnlib">
+      <w:hyperlink w:history="1" r:id="rIdlqqxyu9d0rnqlbenv6rz_">
         <w:r>
           <w:rPr>
             <w:rStyle w:val="Hyperlink"/>
@@ -22300,7 +22807,7 @@
         </w:numPr>
         <w:spacing w:after="60"/>
       </w:pPr>
-      <w:hyperlink w:history="1" r:id="rIdfg6jbpsalt2hiomqqsktk">
+      <w:hyperlink w:history="1" r:id="rIde6tveop0a-tjpd-yka1g7">
         <w:r>
           <w:rPr>
             <w:rStyle w:val="Hyperlink"/>
@@ -22330,7 +22837,7 @@
         </w:numPr>
         <w:spacing w:after="60"/>
       </w:pPr>
-      <w:hyperlink w:history="1" r:id="rIdjdvx9xkdobsnpdrzsheg9">
+      <w:hyperlink w:history="1" r:id="rIdm8pfervtbyncw_zt-xcmp">
         <w:r>
           <w:rPr>
             <w:rStyle w:val="Hyperlink"/>
@@ -22360,7 +22867,7 @@
         </w:numPr>
         <w:spacing w:after="60"/>
       </w:pPr>
-      <w:hyperlink w:history="1" r:id="rId_9kli8pvmcubmimwytqxc">
+      <w:hyperlink w:history="1" r:id="rId7idkdlthjetrllyash2am">
         <w:r>
           <w:rPr>
             <w:rStyle w:val="Hyperlink"/>
@@ -22390,7 +22897,7 @@
         </w:numPr>
         <w:spacing w:after="60"/>
       </w:pPr>
-      <w:hyperlink w:history="1" r:id="rIdzzul7ei7yd-ihbjzmkdob">
+      <w:hyperlink w:history="1" r:id="rIdke6elt98tip7z8dvizvr_">
         <w:r>
           <w:rPr>
             <w:rStyle w:val="Hyperlink"/>
@@ -22420,7 +22927,7 @@
         </w:numPr>
         <w:spacing w:after="60"/>
       </w:pPr>
-      <w:hyperlink w:history="1" r:id="rId8zi1uh_y31wiwlivaihpt">
+      <w:hyperlink w:history="1" r:id="rIdamc8lvmolbud4-tko2jmo">
         <w:r>
           <w:rPr>
             <w:rStyle w:val="Hyperlink"/>
@@ -22450,7 +22957,7 @@
         </w:numPr>
         <w:spacing w:after="60"/>
       </w:pPr>
-      <w:hyperlink w:history="1" r:id="rIdpbco4i_ew9pqqyn9won1o">
+      <w:hyperlink w:history="1" r:id="rIdeswh2mys2algtg7atxke4">
         <w:r>
           <w:rPr>
             <w:rStyle w:val="Hyperlink"/>
@@ -22480,7 +22987,7 @@
         </w:numPr>
         <w:spacing w:after="60"/>
       </w:pPr>
-      <w:hyperlink w:history="1" r:id="rIdalnwjtiz0cqjrjpvqnhsv">
+      <w:hyperlink w:history="1" r:id="rIdh6m_zlkxiqzs3wi1zgu6l">
         <w:r>
           <w:rPr>
             <w:rStyle w:val="Hyperlink"/>
@@ -22510,7 +23017,7 @@
         </w:numPr>
         <w:spacing w:after="60"/>
       </w:pPr>
-      <w:hyperlink w:history="1" r:id="rIdr3fp4th3vythv_0lz_khr">
+      <w:hyperlink w:history="1" r:id="rIdc3zxfvavdngb5zamqzhhm">
         <w:r>
           <w:rPr>
             <w:rStyle w:val="Hyperlink"/>
@@ -22540,7 +23047,7 @@
         </w:numPr>
         <w:spacing w:after="60"/>
       </w:pPr>
-      <w:hyperlink w:history="1" r:id="rIdgty0amh1lznhdwjei-bzj">
+      <w:hyperlink w:history="1" r:id="rIdxkqflswbcg9_q4ofgzf5i">
         <w:r>
           <w:rPr>
             <w:rStyle w:val="Hyperlink"/>
@@ -22570,7 +23077,7 @@
         </w:numPr>
         <w:spacing w:after="60"/>
       </w:pPr>
-      <w:hyperlink w:history="1" r:id="rIdhcid_xbea_sxhqw08pilp">
+      <w:hyperlink w:history="1" r:id="rIdr4kkywep9aofy-tyzalg2">
         <w:r>
           <w:rPr>
             <w:rStyle w:val="Hyperlink"/>
@@ -22600,7 +23107,7 @@
         </w:numPr>
         <w:spacing w:after="60"/>
       </w:pPr>
-      <w:hyperlink w:history="1" r:id="rId1e5gq1bt7ms8hfubjw9ka">
+      <w:hyperlink w:history="1" r:id="rIdyuz9ukmb6enk8uizfxjjj">
         <w:r>
           <w:rPr>
             <w:rStyle w:val="Hyperlink"/>
@@ -22630,7 +23137,7 @@
         </w:numPr>
         <w:spacing w:after="60"/>
       </w:pPr>
-      <w:hyperlink w:history="1" r:id="rIdozws9zneszgkngf0fugdw">
+      <w:hyperlink w:history="1" r:id="rIdnos9iig369yy3zqigh4dp">
         <w:r>
           <w:rPr>
             <w:rStyle w:val="Hyperlink"/>
@@ -22660,7 +23167,7 @@
         </w:numPr>
         <w:spacing w:after="60"/>
       </w:pPr>
-      <w:hyperlink w:history="1" r:id="rIdztqhy2t99ow8lz1yis4wb">
+      <w:hyperlink w:history="1" r:id="rIdp-urhrtzdd-sj8ybj3fjo">
         <w:r>
           <w:rPr>
             <w:rStyle w:val="Hyperlink"/>
@@ -22690,7 +23197,7 @@
         </w:numPr>
         <w:spacing w:after="60"/>
       </w:pPr>
-      <w:hyperlink w:history="1" r:id="rIde3tiselr0pb-ybbtj5lej">
+      <w:hyperlink w:history="1" r:id="rIdezim3mzf-hm5gnvkadd42">
         <w:r>
           <w:rPr>
             <w:rStyle w:val="Hyperlink"/>
@@ -22839,7 +23346,7 @@
           <w:rFonts w:ascii="Calibri" w:cs="Calibri" w:eastAsia="Calibri" w:hAnsi="Calibri"/>
           <w:lang w:val="fr-FR"/>
         </w:rPr>
-        <w:t xml:space="preserve">Les démos en direct (diapos 26 et 20) : prévoir les maquettes comme solution de repli si le réseau fait défaut.</w:t>
+        <w:t xml:space="preserve">Les démos en direct (diapos 27 et 20) : prévoir les maquettes comme solution de repli si le réseau fait défaut.</w:t>
       </w:r>
     </w:p>
     <w:p>
@@ -22952,7 +23459,7 @@
         </w:rPr>
         <w:t xml:space="preserve">Source : </w:t>
       </w:r>
-      <w:hyperlink w:history="1" r:id="rIdmdcpfvuxehfzegcdii2jd">
+      <w:hyperlink w:history="1" r:id="rId2_jigbkiilswfpict4bkm">
         <w:r>
           <w:rPr>
             <w:rStyle w:val="Hyperlink"/>

</xml_diff>

<commit_message>
Quiz oral, fusion Chat/Cowork actée, diapo de démo Code retirée
- Chat et Cowork réunis : mentions « en cours » supprimées (diapos, notes, document distribué)
- Mode plan : activation par /plan ou le sélecteur de mode (Maj + Tab retiré)
- Diapo « Démo : une skill avec Code » supprimée, transitions et renvois ajustés
- Quiz sans cartons, réponses à voix haute ; cartons-quiz-ABCD.pdf retiré

Co-Authored-By: Claude Opus 5.5 <noreply@anthropic.com>
</commit_message>
<xml_diff>
--- a/skills-claude-notes-presentateur.docx
+++ b/skills-claude-notes-presentateur.docx
@@ -65,7 +65,7 @@
           <w:color w:val="566070"/>
           <w:lang w:val="fr-FR"/>
         </w:rPr>
-        <w:t xml:space="preserve">Présentation de 56 minutes environ, suivie d'une mise en pratique. Public : utilisateurs de Claude, sans prérequis technique.</w:t>
+        <w:t xml:space="preserve">Présentation de 53 minutes environ, suivie d'une mise en pratique. Public : utilisateurs de Claude, sans prérequis technique.</w:t>
       </w:r>
     </w:p>
     <w:p>
@@ -111,7 +111,7 @@
         </w:rPr>
         <w:t xml:space="preserve">LinkedIn : </w:t>
       </w:r>
-      <w:hyperlink w:history="1" r:id="rId2zexdq08h6gmon_2dbwef">
+      <w:hyperlink w:history="1" r:id="rIdv1wy0wv_ilu-i8og3opof">
         <w:r>
           <w:rPr>
             <w:rStyle w:val="Hyperlink"/>
@@ -142,7 +142,7 @@
         </w:rPr>
         <w:t xml:space="preserve">GitHub : </w:t>
       </w:r>
-      <w:hyperlink w:history="1" r:id="rIdkvobaci_x5fzvjtzzcyk5">
+      <w:hyperlink w:history="1" r:id="rIdzkf1dgtht2kmzxz-g8nzv">
         <w:r>
           <w:rPr>
             <w:rStyle w:val="Hyperlink"/>
@@ -182,7 +182,7 @@
         <w:pStyle w:val="Body"/>
         <w:spacing w:after="120"/>
       </w:pPr>
-      <w:hyperlink w:history="1" r:id="rIdeqa7wa9y_uomu_wxgs4pr">
+      <w:hyperlink w:history="1" r:id="rIdgcflye4pspimdyqy0db4g">
         <w:r>
           <w:rPr>
             <w:rStyle w:val="Hyperlink"/>
@@ -526,7 +526,7 @@
           <w:rFonts w:ascii="Calibri" w:cs="Calibri" w:eastAsia="Calibri" w:hAnsi="Calibri"/>
           <w:lang w:val="fr-FR"/>
         </w:rPr>
-        <w:t xml:space="preserve"> conseillé (total : 56 min environ) ;</w:t>
+        <w:t xml:space="preserve"> conseillé (total : 53 min environ) ;</w:t>
       </w:r>
     </w:p>
     <w:p>
@@ -620,41 +620,7 @@
           <w:rFonts w:ascii="Calibri" w:cs="Calibri" w:eastAsia="Calibri" w:hAnsi="Calibri"/>
           <w:lang w:val="fr-FR"/>
         </w:rPr>
-        <w:t xml:space="preserve">Vidéoprojecteur, accès à Claude sur le poste du présentateur (démo de la diapo 27), et l'onglet Code de l'application de bureau connecté au même compte (démo de la diapo 20).</w:t>
-      </w:r>
-    </w:p>
-    <w:p>
-      <w:pPr>
-        <w:pStyle w:val="Body"/>
-        <w:numPr>
-          <w:ilvl w:val="0"/>
-          <w:numId w:val="2"/>
-        </w:numPr>
-        <w:spacing w:after="60"/>
-      </w:pPr>
-      <w:r>
-        <w:rPr>
-          <w:rFonts w:ascii="Calibri" w:cs="Calibri" w:eastAsia="Calibri" w:hAnsi="Calibri"/>
-          <w:lang w:val="fr-FR"/>
-        </w:rPr>
-        <w:t xml:space="preserve">Un dossier « charte » de démonstration (une charte en PDF, un logo, une présentation d'exemple), copié à part pour la démo Code.</w:t>
-      </w:r>
-    </w:p>
-    <w:p>
-      <w:pPr>
-        <w:pStyle w:val="Body"/>
-        <w:numPr>
-          <w:ilvl w:val="0"/>
-          <w:numId w:val="2"/>
-        </w:numPr>
-        <w:spacing w:after="60"/>
-      </w:pPr>
-      <w:r>
-        <w:rPr>
-          <w:rFonts w:ascii="Calibri" w:cs="Calibri" w:eastAsia="Calibri" w:hAnsi="Calibri"/>
-          <w:lang w:val="fr-FR"/>
-        </w:rPr>
-        <w:t xml:space="preserve">Un jeu de 4 cartons A/B/C/D par participant (fichier cartons-quiz-ABCD.pdf, 4 pages A4 à imprimer en couleur, à découper ou non).</w:t>
+        <w:t xml:space="preserve">Vidéoprojecteur et accès à Claude sur le poste du présentateur (démo de la diapo 26).</w:t>
       </w:r>
     </w:p>
     <w:p>
@@ -3236,7 +3202,7 @@
                 <w:rFonts w:ascii="Calibri" w:cs="Calibri" w:eastAsia="Calibri" w:hAnsi="Calibri"/>
                 <w:lang w:val="fr-FR"/>
               </w:rPr>
-              <w:t xml:space="preserve">Démo : une skill avec Code</w:t>
+              <w:t xml:space="preserve">Quelle porte pour moi ?</w:t>
             </w:r>
           </w:p>
         </w:tc>
@@ -3266,7 +3232,7 @@
                 <w:rFonts w:ascii="Calibri" w:cs="Calibri" w:eastAsia="Calibri" w:hAnsi="Calibri"/>
                 <w:lang w:val="fr-FR"/>
               </w:rPr>
-              <w:t xml:space="preserve">3:00</w:t>
+              <w:t xml:space="preserve">1:30</w:t>
             </w:r>
           </w:p>
         </w:tc>
@@ -3296,7 +3262,7 @@
                 <w:rFonts w:ascii="Calibri" w:cs="Calibri" w:eastAsia="Calibri" w:hAnsi="Calibri"/>
                 <w:lang w:val="fr-FR"/>
               </w:rPr>
-              <w:t xml:space="preserve">25:25</w:t>
+              <w:t xml:space="preserve">23:55</w:t>
             </w:r>
           </w:p>
         </w:tc>
@@ -3359,7 +3325,7 @@
                 <w:rFonts w:ascii="Calibri" w:cs="Calibri" w:eastAsia="Calibri" w:hAnsi="Calibri"/>
                 <w:lang w:val="fr-FR"/>
               </w:rPr>
-              <w:t xml:space="preserve">Quelle porte pour moi ?</w:t>
+              <w:t xml:space="preserve">Créer</w:t>
             </w:r>
           </w:p>
         </w:tc>
@@ -3388,7 +3354,7 @@
                 <w:rFonts w:ascii="Calibri" w:cs="Calibri" w:eastAsia="Calibri" w:hAnsi="Calibri"/>
                 <w:lang w:val="fr-FR"/>
               </w:rPr>
-              <w:t xml:space="preserve">1:30</w:t>
+              <w:t xml:space="preserve">0:10</w:t>
             </w:r>
           </w:p>
         </w:tc>
@@ -3417,7 +3383,7 @@
                 <w:rFonts w:ascii="Calibri" w:cs="Calibri" w:eastAsia="Calibri" w:hAnsi="Calibri"/>
                 <w:lang w:val="fr-FR"/>
               </w:rPr>
-              <w:t xml:space="preserve">26:55</w:t>
+              <w:t xml:space="preserve">24:05</w:t>
             </w:r>
           </w:p>
         </w:tc>
@@ -3482,7 +3448,7 @@
                 <w:rFonts w:ascii="Calibri" w:cs="Calibri" w:eastAsia="Calibri" w:hAnsi="Calibri"/>
                 <w:lang w:val="fr-FR"/>
               </w:rPr>
-              <w:t xml:space="preserve">Créer</w:t>
+              <w:t xml:space="preserve">Créer une skill en 5 étapes</w:t>
             </w:r>
           </w:p>
         </w:tc>
@@ -3512,7 +3478,7 @@
                 <w:rFonts w:ascii="Calibri" w:cs="Calibri" w:eastAsia="Calibri" w:hAnsi="Calibri"/>
                 <w:lang w:val="fr-FR"/>
               </w:rPr>
-              <w:t xml:space="preserve">0:10</w:t>
+              <w:t xml:space="preserve">1:00</w:t>
             </w:r>
           </w:p>
         </w:tc>
@@ -3542,7 +3508,7 @@
                 <w:rFonts w:ascii="Calibri" w:cs="Calibri" w:eastAsia="Calibri" w:hAnsi="Calibri"/>
                 <w:lang w:val="fr-FR"/>
               </w:rPr>
-              <w:t xml:space="preserve">27:05</w:t>
+              <w:t xml:space="preserve">25:05</w:t>
             </w:r>
           </w:p>
         </w:tc>
@@ -3605,7 +3571,7 @@
                 <w:rFonts w:ascii="Calibri" w:cs="Calibri" w:eastAsia="Calibri" w:hAnsi="Calibri"/>
                 <w:lang w:val="fr-FR"/>
               </w:rPr>
-              <w:t xml:space="preserve">Créer une skill en 5 étapes</w:t>
+              <w:t xml:space="preserve">skill-creator : la skill qui fabrique les skills</w:t>
             </w:r>
           </w:p>
         </w:tc>
@@ -3634,7 +3600,7 @@
                 <w:rFonts w:ascii="Calibri" w:cs="Calibri" w:eastAsia="Calibri" w:hAnsi="Calibri"/>
                 <w:lang w:val="fr-FR"/>
               </w:rPr>
-              <w:t xml:space="preserve">1:00</w:t>
+              <w:t xml:space="preserve">2:00</w:t>
             </w:r>
           </w:p>
         </w:tc>
@@ -3663,7 +3629,7 @@
                 <w:rFonts w:ascii="Calibri" w:cs="Calibri" w:eastAsia="Calibri" w:hAnsi="Calibri"/>
                 <w:lang w:val="fr-FR"/>
               </w:rPr>
-              <w:t xml:space="preserve">28:05</w:t>
+              <w:t xml:space="preserve">27:05</w:t>
             </w:r>
           </w:p>
         </w:tc>
@@ -3728,7 +3694,7 @@
                 <w:rFonts w:ascii="Calibri" w:cs="Calibri" w:eastAsia="Calibri" w:hAnsi="Calibri"/>
                 <w:lang w:val="fr-FR"/>
               </w:rPr>
-              <w:t xml:space="preserve">skill-creator : la skill qui fabrique les skills</w:t>
+              <w:t xml:space="preserve">skill-creator selon la porte</w:t>
             </w:r>
           </w:p>
         </w:tc>
@@ -3758,7 +3724,7 @@
                 <w:rFonts w:ascii="Calibri" w:cs="Calibri" w:eastAsia="Calibri" w:hAnsi="Calibri"/>
                 <w:lang w:val="fr-FR"/>
               </w:rPr>
-              <w:t xml:space="preserve">2:00</w:t>
+              <w:t xml:space="preserve">1:30</w:t>
             </w:r>
           </w:p>
         </w:tc>
@@ -3788,7 +3754,7 @@
                 <w:rFonts w:ascii="Calibri" w:cs="Calibri" w:eastAsia="Calibri" w:hAnsi="Calibri"/>
                 <w:lang w:val="fr-FR"/>
               </w:rPr>
-              <w:t xml:space="preserve">30:05</w:t>
+              <w:t xml:space="preserve">28:35</w:t>
             </w:r>
           </w:p>
         </w:tc>
@@ -3851,7 +3817,7 @@
                 <w:rFonts w:ascii="Calibri" w:cs="Calibri" w:eastAsia="Calibri" w:hAnsi="Calibri"/>
                 <w:lang w:val="fr-FR"/>
               </w:rPr>
-              <w:t xml:space="preserve">skill-creator selon la porte</w:t>
+              <w:t xml:space="preserve">Cowork ou Code pour créer une skill ?</w:t>
             </w:r>
           </w:p>
         </w:tc>
@@ -3880,7 +3846,7 @@
                 <w:rFonts w:ascii="Calibri" w:cs="Calibri" w:eastAsia="Calibri" w:hAnsi="Calibri"/>
                 <w:lang w:val="fr-FR"/>
               </w:rPr>
-              <w:t xml:space="preserve">1:30</w:t>
+              <w:t xml:space="preserve">2:00</w:t>
             </w:r>
           </w:p>
         </w:tc>
@@ -3909,7 +3875,7 @@
                 <w:rFonts w:ascii="Calibri" w:cs="Calibri" w:eastAsia="Calibri" w:hAnsi="Calibri"/>
                 <w:lang w:val="fr-FR"/>
               </w:rPr>
-              <w:t xml:space="preserve">31:35</w:t>
+              <w:t xml:space="preserve">30:35</w:t>
             </w:r>
           </w:p>
         </w:tc>
@@ -3974,7 +3940,7 @@
                 <w:rFonts w:ascii="Calibri" w:cs="Calibri" w:eastAsia="Calibri" w:hAnsi="Calibri"/>
                 <w:lang w:val="fr-FR"/>
               </w:rPr>
-              <w:t xml:space="preserve">Cowork ou Code pour créer une skill ?</w:t>
+              <w:t xml:space="preserve">Démo : on le demande à Claude</w:t>
             </w:r>
           </w:p>
         </w:tc>
@@ -4004,7 +3970,7 @@
                 <w:rFonts w:ascii="Calibri" w:cs="Calibri" w:eastAsia="Calibri" w:hAnsi="Calibri"/>
                 <w:lang w:val="fr-FR"/>
               </w:rPr>
-              <w:t xml:space="preserve">2:00</w:t>
+              <w:t xml:space="preserve">3:00</w:t>
             </w:r>
           </w:p>
         </w:tc>
@@ -4097,7 +4063,7 @@
                 <w:rFonts w:ascii="Calibri" w:cs="Calibri" w:eastAsia="Calibri" w:hAnsi="Calibri"/>
                 <w:lang w:val="fr-FR"/>
               </w:rPr>
-              <w:t xml:space="preserve">Démo : on le demande à Claude</w:t>
+              <w:t xml:space="preserve">Les 3 secrets d'une bonne skill</w:t>
             </w:r>
           </w:p>
         </w:tc>
@@ -4126,7 +4092,7 @@
                 <w:rFonts w:ascii="Calibri" w:cs="Calibri" w:eastAsia="Calibri" w:hAnsi="Calibri"/>
                 <w:lang w:val="fr-FR"/>
               </w:rPr>
-              <w:t xml:space="preserve">3:00</w:t>
+              <w:t xml:space="preserve">1:15</w:t>
             </w:r>
           </w:p>
         </w:tc>
@@ -4155,7 +4121,7 @@
                 <w:rFonts w:ascii="Calibri" w:cs="Calibri" w:eastAsia="Calibri" w:hAnsi="Calibri"/>
                 <w:lang w:val="fr-FR"/>
               </w:rPr>
-              <w:t xml:space="preserve">36:35</w:t>
+              <w:t xml:space="preserve">34:50</w:t>
             </w:r>
           </w:p>
         </w:tc>
@@ -4220,7 +4186,7 @@
                 <w:rFonts w:ascii="Calibri" w:cs="Calibri" w:eastAsia="Calibri" w:hAnsi="Calibri"/>
                 <w:lang w:val="fr-FR"/>
               </w:rPr>
-              <w:t xml:space="preserve">Les 3 secrets d'une bonne skill</w:t>
+              <w:t xml:space="preserve">Cas d'usage : votre charte dans une skill</w:t>
             </w:r>
           </w:p>
         </w:tc>
@@ -4250,7 +4216,7 @@
                 <w:rFonts w:ascii="Calibri" w:cs="Calibri" w:eastAsia="Calibri" w:hAnsi="Calibri"/>
                 <w:lang w:val="fr-FR"/>
               </w:rPr>
-              <w:t xml:space="preserve">1:15</w:t>
+              <w:t xml:space="preserve">2:30</w:t>
             </w:r>
           </w:p>
         </w:tc>
@@ -4280,7 +4246,7 @@
                 <w:rFonts w:ascii="Calibri" w:cs="Calibri" w:eastAsia="Calibri" w:hAnsi="Calibri"/>
                 <w:lang w:val="fr-FR"/>
               </w:rPr>
-              <w:t xml:space="preserve">37:50</w:t>
+              <w:t xml:space="preserve">37:20</w:t>
             </w:r>
           </w:p>
         </w:tc>
@@ -4343,7 +4309,7 @@
                 <w:rFonts w:ascii="Calibri" w:cs="Calibri" w:eastAsia="Calibri" w:hAnsi="Calibri"/>
                 <w:lang w:val="fr-FR"/>
               </w:rPr>
-              <w:t xml:space="preserve">Cas d'usage : votre charte dans une skill</w:t>
+              <w:t xml:space="preserve">Même charte, trois portes</w:t>
             </w:r>
           </w:p>
         </w:tc>
@@ -4372,7 +4338,7 @@
                 <w:rFonts w:ascii="Calibri" w:cs="Calibri" w:eastAsia="Calibri" w:hAnsi="Calibri"/>
                 <w:lang w:val="fr-FR"/>
               </w:rPr>
-              <w:t xml:space="preserve">2:30</w:t>
+              <w:t xml:space="preserve">1:30</w:t>
             </w:r>
           </w:p>
         </w:tc>
@@ -4401,7 +4367,7 @@
                 <w:rFonts w:ascii="Calibri" w:cs="Calibri" w:eastAsia="Calibri" w:hAnsi="Calibri"/>
                 <w:lang w:val="fr-FR"/>
               </w:rPr>
-              <w:t xml:space="preserve">40:20</w:t>
+              <w:t xml:space="preserve">38:50</w:t>
             </w:r>
           </w:p>
         </w:tc>
@@ -4466,7 +4432,7 @@
                 <w:rFonts w:ascii="Calibri" w:cs="Calibri" w:eastAsia="Calibri" w:hAnsi="Calibri"/>
                 <w:lang w:val="fr-FR"/>
               </w:rPr>
-              <w:t xml:space="preserve">Même charte, trois portes</w:t>
+              <w:t xml:space="preserve">Partager</w:t>
             </w:r>
           </w:p>
         </w:tc>
@@ -4496,7 +4462,7 @@
                 <w:rFonts w:ascii="Calibri" w:cs="Calibri" w:eastAsia="Calibri" w:hAnsi="Calibri"/>
                 <w:lang w:val="fr-FR"/>
               </w:rPr>
-              <w:t xml:space="preserve">1:30</w:t>
+              <w:t xml:space="preserve">0:10</w:t>
             </w:r>
           </w:p>
         </w:tc>
@@ -4526,7 +4492,7 @@
                 <w:rFonts w:ascii="Calibri" w:cs="Calibri" w:eastAsia="Calibri" w:hAnsi="Calibri"/>
                 <w:lang w:val="fr-FR"/>
               </w:rPr>
-              <w:t xml:space="preserve">41:50</w:t>
+              <w:t xml:space="preserve">39:00</w:t>
             </w:r>
           </w:p>
         </w:tc>
@@ -4589,7 +4555,7 @@
                 <w:rFonts w:ascii="Calibri" w:cs="Calibri" w:eastAsia="Calibri" w:hAnsi="Calibri"/>
                 <w:lang w:val="fr-FR"/>
               </w:rPr>
-              <w:t xml:space="preserve">Partager</w:t>
+              <w:t xml:space="preserve">Partager : trois cercles</w:t>
             </w:r>
           </w:p>
         </w:tc>
@@ -4618,7 +4584,7 @@
                 <w:rFonts w:ascii="Calibri" w:cs="Calibri" w:eastAsia="Calibri" w:hAnsi="Calibri"/>
                 <w:lang w:val="fr-FR"/>
               </w:rPr>
-              <w:t xml:space="preserve">0:10</w:t>
+              <w:t xml:space="preserve">2:30</w:t>
             </w:r>
           </w:p>
         </w:tc>
@@ -4647,7 +4613,7 @@
                 <w:rFonts w:ascii="Calibri" w:cs="Calibri" w:eastAsia="Calibri" w:hAnsi="Calibri"/>
                 <w:lang w:val="fr-FR"/>
               </w:rPr>
-              <w:t xml:space="preserve">42:00</w:t>
+              <w:t xml:space="preserve">41:30</w:t>
             </w:r>
           </w:p>
         </w:tc>
@@ -4712,7 +4678,7 @@
                 <w:rFonts w:ascii="Calibri" w:cs="Calibri" w:eastAsia="Calibri" w:hAnsi="Calibri"/>
                 <w:lang w:val="fr-FR"/>
               </w:rPr>
-              <w:t xml:space="preserve">Partager : trois cercles</w:t>
+              <w:t xml:space="preserve">Quiz : à vous de répondre !</w:t>
             </w:r>
           </w:p>
         </w:tc>
@@ -4742,7 +4708,7 @@
                 <w:rFonts w:ascii="Calibri" w:cs="Calibri" w:eastAsia="Calibri" w:hAnsi="Calibri"/>
                 <w:lang w:val="fr-FR"/>
               </w:rPr>
-              <w:t xml:space="preserve">2:30</w:t>
+              <w:t xml:space="preserve">0:30</w:t>
             </w:r>
           </w:p>
         </w:tc>
@@ -4772,7 +4738,7 @@
                 <w:rFonts w:ascii="Calibri" w:cs="Calibri" w:eastAsia="Calibri" w:hAnsi="Calibri"/>
                 <w:lang w:val="fr-FR"/>
               </w:rPr>
-              <w:t xml:space="preserve">44:30</w:t>
+              <w:t xml:space="preserve">42:00</w:t>
             </w:r>
           </w:p>
         </w:tc>
@@ -4835,7 +4801,7 @@
                 <w:rFonts w:ascii="Calibri" w:cs="Calibri" w:eastAsia="Calibri" w:hAnsi="Calibri"/>
                 <w:lang w:val="fr-FR"/>
               </w:rPr>
-              <w:t xml:space="preserve">Quiz : levez votre carton !</w:t>
+              <w:t xml:space="preserve">Question 1</w:t>
             </w:r>
           </w:p>
         </w:tc>
@@ -4864,7 +4830,7 @@
                 <w:rFonts w:ascii="Calibri" w:cs="Calibri" w:eastAsia="Calibri" w:hAnsi="Calibri"/>
                 <w:lang w:val="fr-FR"/>
               </w:rPr>
-              <w:t xml:space="preserve">0:30</w:t>
+              <w:t xml:space="preserve">0:40</w:t>
             </w:r>
           </w:p>
         </w:tc>
@@ -4893,7 +4859,7 @@
                 <w:rFonts w:ascii="Calibri" w:cs="Calibri" w:eastAsia="Calibri" w:hAnsi="Calibri"/>
                 <w:lang w:val="fr-FR"/>
               </w:rPr>
-              <w:t xml:space="preserve">45:00</w:t>
+              <w:t xml:space="preserve">42:40</w:t>
             </w:r>
           </w:p>
         </w:tc>
@@ -4958,7 +4924,7 @@
                 <w:rFonts w:ascii="Calibri" w:cs="Calibri" w:eastAsia="Calibri" w:hAnsi="Calibri"/>
                 <w:lang w:val="fr-FR"/>
               </w:rPr>
-              <w:t xml:space="preserve">Question 1</w:t>
+              <w:t xml:space="preserve">Question 1 · réponse</w:t>
             </w:r>
           </w:p>
         </w:tc>
@@ -4988,7 +4954,7 @@
                 <w:rFonts w:ascii="Calibri" w:cs="Calibri" w:eastAsia="Calibri" w:hAnsi="Calibri"/>
                 <w:lang w:val="fr-FR"/>
               </w:rPr>
-              <w:t xml:space="preserve">0:40</w:t>
+              <w:t xml:space="preserve">0:20</w:t>
             </w:r>
           </w:p>
         </w:tc>
@@ -5018,7 +4984,7 @@
                 <w:rFonts w:ascii="Calibri" w:cs="Calibri" w:eastAsia="Calibri" w:hAnsi="Calibri"/>
                 <w:lang w:val="fr-FR"/>
               </w:rPr>
-              <w:t xml:space="preserve">45:40</w:t>
+              <w:t xml:space="preserve">43:00</w:t>
             </w:r>
           </w:p>
         </w:tc>
@@ -5081,7 +5047,7 @@
                 <w:rFonts w:ascii="Calibri" w:cs="Calibri" w:eastAsia="Calibri" w:hAnsi="Calibri"/>
                 <w:lang w:val="fr-FR"/>
               </w:rPr>
-              <w:t xml:space="preserve">Question 1 · réponse</w:t>
+              <w:t xml:space="preserve">Question 2</w:t>
             </w:r>
           </w:p>
         </w:tc>
@@ -5110,7 +5076,7 @@
                 <w:rFonts w:ascii="Calibri" w:cs="Calibri" w:eastAsia="Calibri" w:hAnsi="Calibri"/>
                 <w:lang w:val="fr-FR"/>
               </w:rPr>
-              <w:t xml:space="preserve">0:20</w:t>
+              <w:t xml:space="preserve">0:40</w:t>
             </w:r>
           </w:p>
         </w:tc>
@@ -5139,7 +5105,7 @@
                 <w:rFonts w:ascii="Calibri" w:cs="Calibri" w:eastAsia="Calibri" w:hAnsi="Calibri"/>
                 <w:lang w:val="fr-FR"/>
               </w:rPr>
-              <w:t xml:space="preserve">46:00</w:t>
+              <w:t xml:space="preserve">43:40</w:t>
             </w:r>
           </w:p>
         </w:tc>
@@ -5204,7 +5170,7 @@
                 <w:rFonts w:ascii="Calibri" w:cs="Calibri" w:eastAsia="Calibri" w:hAnsi="Calibri"/>
                 <w:lang w:val="fr-FR"/>
               </w:rPr>
-              <w:t xml:space="preserve">Question 2</w:t>
+              <w:t xml:space="preserve">Question 2 · réponse</w:t>
             </w:r>
           </w:p>
         </w:tc>
@@ -5234,7 +5200,7 @@
                 <w:rFonts w:ascii="Calibri" w:cs="Calibri" w:eastAsia="Calibri" w:hAnsi="Calibri"/>
                 <w:lang w:val="fr-FR"/>
               </w:rPr>
-              <w:t xml:space="preserve">0:40</w:t>
+              <w:t xml:space="preserve">0:20</w:t>
             </w:r>
           </w:p>
         </w:tc>
@@ -5264,7 +5230,7 @@
                 <w:rFonts w:ascii="Calibri" w:cs="Calibri" w:eastAsia="Calibri" w:hAnsi="Calibri"/>
                 <w:lang w:val="fr-FR"/>
               </w:rPr>
-              <w:t xml:space="preserve">46:40</w:t>
+              <w:t xml:space="preserve">44:00</w:t>
             </w:r>
           </w:p>
         </w:tc>
@@ -5327,7 +5293,7 @@
                 <w:rFonts w:ascii="Calibri" w:cs="Calibri" w:eastAsia="Calibri" w:hAnsi="Calibri"/>
                 <w:lang w:val="fr-FR"/>
               </w:rPr>
-              <w:t xml:space="preserve">Question 2 · réponse</w:t>
+              <w:t xml:space="preserve">Question 3</w:t>
             </w:r>
           </w:p>
         </w:tc>
@@ -5356,7 +5322,7 @@
                 <w:rFonts w:ascii="Calibri" w:cs="Calibri" w:eastAsia="Calibri" w:hAnsi="Calibri"/>
                 <w:lang w:val="fr-FR"/>
               </w:rPr>
-              <w:t xml:space="preserve">0:20</w:t>
+              <w:t xml:space="preserve">0:40</w:t>
             </w:r>
           </w:p>
         </w:tc>
@@ -5385,7 +5351,7 @@
                 <w:rFonts w:ascii="Calibri" w:cs="Calibri" w:eastAsia="Calibri" w:hAnsi="Calibri"/>
                 <w:lang w:val="fr-FR"/>
               </w:rPr>
-              <w:t xml:space="preserve">47:00</w:t>
+              <w:t xml:space="preserve">44:40</w:t>
             </w:r>
           </w:p>
         </w:tc>
@@ -5450,7 +5416,7 @@
                 <w:rFonts w:ascii="Calibri" w:cs="Calibri" w:eastAsia="Calibri" w:hAnsi="Calibri"/>
                 <w:lang w:val="fr-FR"/>
               </w:rPr>
-              <w:t xml:space="preserve">Question 3</w:t>
+              <w:t xml:space="preserve">Question 3 · réponse</w:t>
             </w:r>
           </w:p>
         </w:tc>
@@ -5480,7 +5446,7 @@
                 <w:rFonts w:ascii="Calibri" w:cs="Calibri" w:eastAsia="Calibri" w:hAnsi="Calibri"/>
                 <w:lang w:val="fr-FR"/>
               </w:rPr>
-              <w:t xml:space="preserve">0:40</w:t>
+              <w:t xml:space="preserve">0:20</w:t>
             </w:r>
           </w:p>
         </w:tc>
@@ -5510,7 +5476,7 @@
                 <w:rFonts w:ascii="Calibri" w:cs="Calibri" w:eastAsia="Calibri" w:hAnsi="Calibri"/>
                 <w:lang w:val="fr-FR"/>
               </w:rPr>
-              <w:t xml:space="preserve">47:40</w:t>
+              <w:t xml:space="preserve">45:00</w:t>
             </w:r>
           </w:p>
         </w:tc>
@@ -5573,7 +5539,7 @@
                 <w:rFonts w:ascii="Calibri" w:cs="Calibri" w:eastAsia="Calibri" w:hAnsi="Calibri"/>
                 <w:lang w:val="fr-FR"/>
               </w:rPr>
-              <w:t xml:space="preserve">Question 3 · réponse</w:t>
+              <w:t xml:space="preserve">Question 4</w:t>
             </w:r>
           </w:p>
         </w:tc>
@@ -5602,7 +5568,7 @@
                 <w:rFonts w:ascii="Calibri" w:cs="Calibri" w:eastAsia="Calibri" w:hAnsi="Calibri"/>
                 <w:lang w:val="fr-FR"/>
               </w:rPr>
-              <w:t xml:space="preserve">0:20</w:t>
+              <w:t xml:space="preserve">0:40</w:t>
             </w:r>
           </w:p>
         </w:tc>
@@ -5631,7 +5597,7 @@
                 <w:rFonts w:ascii="Calibri" w:cs="Calibri" w:eastAsia="Calibri" w:hAnsi="Calibri"/>
                 <w:lang w:val="fr-FR"/>
               </w:rPr>
-              <w:t xml:space="preserve">48:00</w:t>
+              <w:t xml:space="preserve">45:40</w:t>
             </w:r>
           </w:p>
         </w:tc>
@@ -5696,7 +5662,7 @@
                 <w:rFonts w:ascii="Calibri" w:cs="Calibri" w:eastAsia="Calibri" w:hAnsi="Calibri"/>
                 <w:lang w:val="fr-FR"/>
               </w:rPr>
-              <w:t xml:space="preserve">Question 4</w:t>
+              <w:t xml:space="preserve">Question 4 · réponse</w:t>
             </w:r>
           </w:p>
         </w:tc>
@@ -5726,7 +5692,7 @@
                 <w:rFonts w:ascii="Calibri" w:cs="Calibri" w:eastAsia="Calibri" w:hAnsi="Calibri"/>
                 <w:lang w:val="fr-FR"/>
               </w:rPr>
-              <w:t xml:space="preserve">0:40</w:t>
+              <w:t xml:space="preserve">0:20</w:t>
             </w:r>
           </w:p>
         </w:tc>
@@ -5756,7 +5722,7 @@
                 <w:rFonts w:ascii="Calibri" w:cs="Calibri" w:eastAsia="Calibri" w:hAnsi="Calibri"/>
                 <w:lang w:val="fr-FR"/>
               </w:rPr>
-              <w:t xml:space="preserve">48:40</w:t>
+              <w:t xml:space="preserve">46:00</w:t>
             </w:r>
           </w:p>
         </w:tc>
@@ -5819,7 +5785,7 @@
                 <w:rFonts w:ascii="Calibri" w:cs="Calibri" w:eastAsia="Calibri" w:hAnsi="Calibri"/>
                 <w:lang w:val="fr-FR"/>
               </w:rPr>
-              <w:t xml:space="preserve">Question 4 · réponse</w:t>
+              <w:t xml:space="preserve">Question 5</w:t>
             </w:r>
           </w:p>
         </w:tc>
@@ -5848,7 +5814,7 @@
                 <w:rFonts w:ascii="Calibri" w:cs="Calibri" w:eastAsia="Calibri" w:hAnsi="Calibri"/>
                 <w:lang w:val="fr-FR"/>
               </w:rPr>
-              <w:t xml:space="preserve">0:20</w:t>
+              <w:t xml:space="preserve">0:40</w:t>
             </w:r>
           </w:p>
         </w:tc>
@@ -5877,7 +5843,7 @@
                 <w:rFonts w:ascii="Calibri" w:cs="Calibri" w:eastAsia="Calibri" w:hAnsi="Calibri"/>
                 <w:lang w:val="fr-FR"/>
               </w:rPr>
-              <w:t xml:space="preserve">49:00</w:t>
+              <w:t xml:space="preserve">46:40</w:t>
             </w:r>
           </w:p>
         </w:tc>
@@ -5942,7 +5908,7 @@
                 <w:rFonts w:ascii="Calibri" w:cs="Calibri" w:eastAsia="Calibri" w:hAnsi="Calibri"/>
                 <w:lang w:val="fr-FR"/>
               </w:rPr>
-              <w:t xml:space="preserve">Question 5</w:t>
+              <w:t xml:space="preserve">Question 5 · réponse</w:t>
             </w:r>
           </w:p>
         </w:tc>
@@ -5972,7 +5938,7 @@
                 <w:rFonts w:ascii="Calibri" w:cs="Calibri" w:eastAsia="Calibri" w:hAnsi="Calibri"/>
                 <w:lang w:val="fr-FR"/>
               </w:rPr>
-              <w:t xml:space="preserve">0:40</w:t>
+              <w:t xml:space="preserve">0:20</w:t>
             </w:r>
           </w:p>
         </w:tc>
@@ -6002,7 +5968,7 @@
                 <w:rFonts w:ascii="Calibri" w:cs="Calibri" w:eastAsia="Calibri" w:hAnsi="Calibri"/>
                 <w:lang w:val="fr-FR"/>
               </w:rPr>
-              <w:t xml:space="preserve">49:40</w:t>
+              <w:t xml:space="preserve">47:00</w:t>
             </w:r>
           </w:p>
         </w:tc>
@@ -6065,7 +6031,7 @@
                 <w:rFonts w:ascii="Calibri" w:cs="Calibri" w:eastAsia="Calibri" w:hAnsi="Calibri"/>
                 <w:lang w:val="fr-FR"/>
               </w:rPr>
-              <w:t xml:space="preserve">Question 5 · réponse</w:t>
+              <w:t xml:space="preserve">Question 6</w:t>
             </w:r>
           </w:p>
         </w:tc>
@@ -6094,7 +6060,7 @@
                 <w:rFonts w:ascii="Calibri" w:cs="Calibri" w:eastAsia="Calibri" w:hAnsi="Calibri"/>
                 <w:lang w:val="fr-FR"/>
               </w:rPr>
-              <w:t xml:space="preserve">0:20</w:t>
+              <w:t xml:space="preserve">0:40</w:t>
             </w:r>
           </w:p>
         </w:tc>
@@ -6123,7 +6089,7 @@
                 <w:rFonts w:ascii="Calibri" w:cs="Calibri" w:eastAsia="Calibri" w:hAnsi="Calibri"/>
                 <w:lang w:val="fr-FR"/>
               </w:rPr>
-              <w:t xml:space="preserve">50:00</w:t>
+              <w:t xml:space="preserve">47:40</w:t>
             </w:r>
           </w:p>
         </w:tc>
@@ -6188,7 +6154,7 @@
                 <w:rFonts w:ascii="Calibri" w:cs="Calibri" w:eastAsia="Calibri" w:hAnsi="Calibri"/>
                 <w:lang w:val="fr-FR"/>
               </w:rPr>
-              <w:t xml:space="preserve">Question 6</w:t>
+              <w:t xml:space="preserve">Question 6 · réponse</w:t>
             </w:r>
           </w:p>
         </w:tc>
@@ -6218,7 +6184,7 @@
                 <w:rFonts w:ascii="Calibri" w:cs="Calibri" w:eastAsia="Calibri" w:hAnsi="Calibri"/>
                 <w:lang w:val="fr-FR"/>
               </w:rPr>
-              <w:t xml:space="preserve">0:40</w:t>
+              <w:t xml:space="preserve">0:20</w:t>
             </w:r>
           </w:p>
         </w:tc>
@@ -6248,7 +6214,7 @@
                 <w:rFonts w:ascii="Calibri" w:cs="Calibri" w:eastAsia="Calibri" w:hAnsi="Calibri"/>
                 <w:lang w:val="fr-FR"/>
               </w:rPr>
-              <w:t xml:space="preserve">50:40</w:t>
+              <w:t xml:space="preserve">48:00</w:t>
             </w:r>
           </w:p>
         </w:tc>
@@ -6311,7 +6277,7 @@
                 <w:rFonts w:ascii="Calibri" w:cs="Calibri" w:eastAsia="Calibri" w:hAnsi="Calibri"/>
                 <w:lang w:val="fr-FR"/>
               </w:rPr>
-              <w:t xml:space="preserve">Question 6 · réponse</w:t>
+              <w:t xml:space="preserve">Question 7</w:t>
             </w:r>
           </w:p>
         </w:tc>
@@ -6340,7 +6306,7 @@
                 <w:rFonts w:ascii="Calibri" w:cs="Calibri" w:eastAsia="Calibri" w:hAnsi="Calibri"/>
                 <w:lang w:val="fr-FR"/>
               </w:rPr>
-              <w:t xml:space="preserve">0:20</w:t>
+              <w:t xml:space="preserve">0:40</w:t>
             </w:r>
           </w:p>
         </w:tc>
@@ -6369,7 +6335,7 @@
                 <w:rFonts w:ascii="Calibri" w:cs="Calibri" w:eastAsia="Calibri" w:hAnsi="Calibri"/>
                 <w:lang w:val="fr-FR"/>
               </w:rPr>
-              <w:t xml:space="preserve">51:00</w:t>
+              <w:t xml:space="preserve">48:40</w:t>
             </w:r>
           </w:p>
         </w:tc>
@@ -6434,7 +6400,7 @@
                 <w:rFonts w:ascii="Calibri" w:cs="Calibri" w:eastAsia="Calibri" w:hAnsi="Calibri"/>
                 <w:lang w:val="fr-FR"/>
               </w:rPr>
-              <w:t xml:space="preserve">Question 7</w:t>
+              <w:t xml:space="preserve">Question 7 · réponse</w:t>
             </w:r>
           </w:p>
         </w:tc>
@@ -6464,7 +6430,7 @@
                 <w:rFonts w:ascii="Calibri" w:cs="Calibri" w:eastAsia="Calibri" w:hAnsi="Calibri"/>
                 <w:lang w:val="fr-FR"/>
               </w:rPr>
-              <w:t xml:space="preserve">0:40</w:t>
+              <w:t xml:space="preserve">0:20</w:t>
             </w:r>
           </w:p>
         </w:tc>
@@ -6494,7 +6460,7 @@
                 <w:rFonts w:ascii="Calibri" w:cs="Calibri" w:eastAsia="Calibri" w:hAnsi="Calibri"/>
                 <w:lang w:val="fr-FR"/>
               </w:rPr>
-              <w:t xml:space="preserve">51:40</w:t>
+              <w:t xml:space="preserve">49:00</w:t>
             </w:r>
           </w:p>
         </w:tc>
@@ -6557,7 +6523,7 @@
                 <w:rFonts w:ascii="Calibri" w:cs="Calibri" w:eastAsia="Calibri" w:hAnsi="Calibri"/>
                 <w:lang w:val="fr-FR"/>
               </w:rPr>
-              <w:t xml:space="preserve">Question 7 · réponse</w:t>
+              <w:t xml:space="preserve">Question 8</w:t>
             </w:r>
           </w:p>
         </w:tc>
@@ -6586,7 +6552,7 @@
                 <w:rFonts w:ascii="Calibri" w:cs="Calibri" w:eastAsia="Calibri" w:hAnsi="Calibri"/>
                 <w:lang w:val="fr-FR"/>
               </w:rPr>
-              <w:t xml:space="preserve">0:20</w:t>
+              <w:t xml:space="preserve">0:40</w:t>
             </w:r>
           </w:p>
         </w:tc>
@@ -6615,7 +6581,7 @@
                 <w:rFonts w:ascii="Calibri" w:cs="Calibri" w:eastAsia="Calibri" w:hAnsi="Calibri"/>
                 <w:lang w:val="fr-FR"/>
               </w:rPr>
-              <w:t xml:space="preserve">52:00</w:t>
+              <w:t xml:space="preserve">49:40</w:t>
             </w:r>
           </w:p>
         </w:tc>
@@ -6680,7 +6646,7 @@
                 <w:rFonts w:ascii="Calibri" w:cs="Calibri" w:eastAsia="Calibri" w:hAnsi="Calibri"/>
                 <w:lang w:val="fr-FR"/>
               </w:rPr>
-              <w:t xml:space="preserve">Question 8</w:t>
+              <w:t xml:space="preserve">Question 8 · réponse</w:t>
             </w:r>
           </w:p>
         </w:tc>
@@ -6710,7 +6676,7 @@
                 <w:rFonts w:ascii="Calibri" w:cs="Calibri" w:eastAsia="Calibri" w:hAnsi="Calibri"/>
                 <w:lang w:val="fr-FR"/>
               </w:rPr>
-              <w:t xml:space="preserve">0:40</w:t>
+              <w:t xml:space="preserve">0:20</w:t>
             </w:r>
           </w:p>
         </w:tc>
@@ -6740,7 +6706,7 @@
                 <w:rFonts w:ascii="Calibri" w:cs="Calibri" w:eastAsia="Calibri" w:hAnsi="Calibri"/>
                 <w:lang w:val="fr-FR"/>
               </w:rPr>
-              <w:t xml:space="preserve">52:40</w:t>
+              <w:t xml:space="preserve">50:00</w:t>
             </w:r>
           </w:p>
         </w:tc>
@@ -6803,7 +6769,7 @@
                 <w:rFonts w:ascii="Calibri" w:cs="Calibri" w:eastAsia="Calibri" w:hAnsi="Calibri"/>
                 <w:lang w:val="fr-FR"/>
               </w:rPr>
-              <w:t xml:space="preserve">Question 8 · réponse</w:t>
+              <w:t xml:space="preserve">Question 9</w:t>
             </w:r>
           </w:p>
         </w:tc>
@@ -6832,7 +6798,7 @@
                 <w:rFonts w:ascii="Calibri" w:cs="Calibri" w:eastAsia="Calibri" w:hAnsi="Calibri"/>
                 <w:lang w:val="fr-FR"/>
               </w:rPr>
-              <w:t xml:space="preserve">0:20</w:t>
+              <w:t xml:space="preserve">0:40</w:t>
             </w:r>
           </w:p>
         </w:tc>
@@ -6861,7 +6827,7 @@
                 <w:rFonts w:ascii="Calibri" w:cs="Calibri" w:eastAsia="Calibri" w:hAnsi="Calibri"/>
                 <w:lang w:val="fr-FR"/>
               </w:rPr>
-              <w:t xml:space="preserve">53:00</w:t>
+              <w:t xml:space="preserve">50:40</w:t>
             </w:r>
           </w:p>
         </w:tc>
@@ -6926,7 +6892,7 @@
                 <w:rFonts w:ascii="Calibri" w:cs="Calibri" w:eastAsia="Calibri" w:hAnsi="Calibri"/>
                 <w:lang w:val="fr-FR"/>
               </w:rPr>
-              <w:t xml:space="preserve">Question 9</w:t>
+              <w:t xml:space="preserve">Question 9 · réponse</w:t>
             </w:r>
           </w:p>
         </w:tc>
@@ -6956,7 +6922,7 @@
                 <w:rFonts w:ascii="Calibri" w:cs="Calibri" w:eastAsia="Calibri" w:hAnsi="Calibri"/>
                 <w:lang w:val="fr-FR"/>
               </w:rPr>
-              <w:t xml:space="preserve">0:40</w:t>
+              <w:t xml:space="preserve">0:20</w:t>
             </w:r>
           </w:p>
         </w:tc>
@@ -6986,7 +6952,7 @@
                 <w:rFonts w:ascii="Calibri" w:cs="Calibri" w:eastAsia="Calibri" w:hAnsi="Calibri"/>
                 <w:lang w:val="fr-FR"/>
               </w:rPr>
-              <w:t xml:space="preserve">53:40</w:t>
+              <w:t xml:space="preserve">51:00</w:t>
             </w:r>
           </w:p>
         </w:tc>
@@ -7049,7 +7015,7 @@
                 <w:rFonts w:ascii="Calibri" w:cs="Calibri" w:eastAsia="Calibri" w:hAnsi="Calibri"/>
                 <w:lang w:val="fr-FR"/>
               </w:rPr>
-              <w:t xml:space="preserve">Question 9 · réponse</w:t>
+              <w:t xml:space="preserve">À retenir</w:t>
             </w:r>
           </w:p>
         </w:tc>
@@ -7078,7 +7044,7 @@
                 <w:rFonts w:ascii="Calibri" w:cs="Calibri" w:eastAsia="Calibri" w:hAnsi="Calibri"/>
                 <w:lang w:val="fr-FR"/>
               </w:rPr>
-              <w:t xml:space="preserve">0:20</w:t>
+              <w:t xml:space="preserve">1:30</w:t>
             </w:r>
           </w:p>
         </w:tc>
@@ -7107,7 +7073,7 @@
                 <w:rFonts w:ascii="Calibri" w:cs="Calibri" w:eastAsia="Calibri" w:hAnsi="Calibri"/>
                 <w:lang w:val="fr-FR"/>
               </w:rPr>
-              <w:t xml:space="preserve">54:00</w:t>
+              <w:t xml:space="preserve">52:30</w:t>
             </w:r>
           </w:p>
         </w:tc>
@@ -7172,7 +7138,7 @@
                 <w:rFonts w:ascii="Calibri" w:cs="Calibri" w:eastAsia="Calibri" w:hAnsi="Calibri"/>
                 <w:lang w:val="fr-FR"/>
               </w:rPr>
-              <w:t xml:space="preserve">À retenir</w:t>
+              <w:t xml:space="preserve">Restons en contact</w:t>
             </w:r>
           </w:p>
         </w:tc>
@@ -7202,7 +7168,7 @@
                 <w:rFonts w:ascii="Calibri" w:cs="Calibri" w:eastAsia="Calibri" w:hAnsi="Calibri"/>
                 <w:lang w:val="fr-FR"/>
               </w:rPr>
-              <w:t xml:space="preserve">1:30</w:t>
+              <w:t xml:space="preserve">atelier</w:t>
             </w:r>
           </w:p>
         </w:tc>
@@ -7216,127 +7182,6 @@
               <w:right w:val="single" w:color="D5D9E0" w:sz="4"/>
             </w:tcBorders>
             <w:shd w:fill="F1F3F6" w:color="auto" w:val="clear"/>
-            <w:tcMar>
-              <w:top w:type="dxa" w:w="60"/>
-              <w:left w:type="dxa" w:w="100"/>
-              <w:bottom w:type="dxa" w:w="60"/>
-              <w:right w:type="dxa" w:w="100"/>
-            </w:tcMar>
-          </w:tcPr>
-          <w:p>
-            <w:pPr>
-              <w:pStyle w:val="Body"/>
-            </w:pPr>
-            <w:r>
-              <w:rPr>
-                <w:rFonts w:ascii="Calibri" w:cs="Calibri" w:eastAsia="Calibri" w:hAnsi="Calibri"/>
-                <w:lang w:val="fr-FR"/>
-              </w:rPr>
-              <w:t xml:space="preserve">55:30</w:t>
-            </w:r>
-          </w:p>
-        </w:tc>
-      </w:tr>
-      <w:tr>
-        <w:trPr>
-          <w:tblHeader w:val="false"/>
-        </w:trPr>
-        <w:tc>
-          <w:tcPr>
-            <w:tcW w:type="dxa" w:w="700"/>
-            <w:tcBorders>
-              <w:top w:val="single" w:color="D5D9E0" w:sz="4"/>
-              <w:left w:val="single" w:color="D5D9E0" w:sz="4"/>
-              <w:bottom w:val="single" w:color="D5D9E0" w:sz="4"/>
-              <w:right w:val="single" w:color="D5D9E0" w:sz="4"/>
-            </w:tcBorders>
-            <w:tcMar>
-              <w:top w:type="dxa" w:w="60"/>
-              <w:left w:type="dxa" w:w="100"/>
-              <w:bottom w:type="dxa" w:w="60"/>
-              <w:right w:type="dxa" w:w="100"/>
-            </w:tcMar>
-          </w:tcPr>
-          <w:p>
-            <w:pPr>
-              <w:pStyle w:val="Body"/>
-            </w:pPr>
-            <w:r>
-              <w:rPr>
-                <w:rFonts w:ascii="Calibri" w:cs="Calibri" w:eastAsia="Calibri" w:hAnsi="Calibri"/>
-                <w:lang w:val="fr-FR"/>
-              </w:rPr>
-              <w:t xml:space="preserve">53</w:t>
-            </w:r>
-          </w:p>
-        </w:tc>
-        <w:tc>
-          <w:tcPr>
-            <w:tcW w:type="dxa" w:w="6138"/>
-            <w:tcBorders>
-              <w:top w:val="single" w:color="D5D9E0" w:sz="4"/>
-              <w:left w:val="single" w:color="D5D9E0" w:sz="4"/>
-              <w:bottom w:val="single" w:color="D5D9E0" w:sz="4"/>
-              <w:right w:val="single" w:color="D5D9E0" w:sz="4"/>
-            </w:tcBorders>
-            <w:tcMar>
-              <w:top w:type="dxa" w:w="60"/>
-              <w:left w:type="dxa" w:w="100"/>
-              <w:bottom w:type="dxa" w:w="60"/>
-              <w:right w:type="dxa" w:w="100"/>
-            </w:tcMar>
-          </w:tcPr>
-          <w:p>
-            <w:pPr>
-              <w:pStyle w:val="Body"/>
-            </w:pPr>
-            <w:r>
-              <w:rPr>
-                <w:rFonts w:ascii="Calibri" w:cs="Calibri" w:eastAsia="Calibri" w:hAnsi="Calibri"/>
-                <w:lang w:val="fr-FR"/>
-              </w:rPr>
-              <w:t xml:space="preserve">Restons en contact</w:t>
-            </w:r>
-          </w:p>
-        </w:tc>
-        <w:tc>
-          <w:tcPr>
-            <w:tcW w:type="dxa" w:w="1400"/>
-            <w:tcBorders>
-              <w:top w:val="single" w:color="D5D9E0" w:sz="4"/>
-              <w:left w:val="single" w:color="D5D9E0" w:sz="4"/>
-              <w:bottom w:val="single" w:color="D5D9E0" w:sz="4"/>
-              <w:right w:val="single" w:color="D5D9E0" w:sz="4"/>
-            </w:tcBorders>
-            <w:tcMar>
-              <w:top w:type="dxa" w:w="60"/>
-              <w:left w:type="dxa" w:w="100"/>
-              <w:bottom w:type="dxa" w:w="60"/>
-              <w:right w:type="dxa" w:w="100"/>
-            </w:tcMar>
-          </w:tcPr>
-          <w:p>
-            <w:pPr>
-              <w:pStyle w:val="Body"/>
-            </w:pPr>
-            <w:r>
-              <w:rPr>
-                <w:rFonts w:ascii="Calibri" w:cs="Calibri" w:eastAsia="Calibri" w:hAnsi="Calibri"/>
-                <w:lang w:val="fr-FR"/>
-              </w:rPr>
-              <w:t xml:space="preserve">atelier</w:t>
-            </w:r>
-          </w:p>
-        </w:tc>
-        <w:tc>
-          <w:tcPr>
-            <w:tcW w:type="dxa" w:w="1400"/>
-            <w:tcBorders>
-              <w:top w:val="single" w:color="D5D9E0" w:sz="4"/>
-              <w:left w:val="single" w:color="D5D9E0" w:sz="4"/>
-              <w:bottom w:val="single" w:color="D5D9E0" w:sz="4"/>
-              <w:right w:val="single" w:color="D5D9E0" w:sz="4"/>
-            </w:tcBorders>
             <w:tcMar>
               <w:top w:type="dxa" w:w="60"/>
               <w:left w:type="dxa" w:w="100"/>
@@ -7372,7 +7217,7 @@
           <w:color w:val="566070"/>
           <w:lang w:val="fr-FR"/>
         </w:rPr>
-        <w:t xml:space="preserve">Si vous prenez du retard, raccourcissez la diapo 10 (ne traiter que deux cartes), la démo de la diapo 27 (s'arrêter à l'enregistrement de la skill) et la diapo 30 (la survoler). Ne sacrifiez pas la démo Code (diapo 20) : c'est elle qui lève les peurs.</w:t>
+        <w:t xml:space="preserve">Si vous prenez du retard, raccourcissez la diapo 10 (ne traiter que deux cartes), la démo de la diapo 26 (s'arrêter à l'enregistrement de la skill) et la diapo 29 (la survoler). Ne sacrifiez pas les diapos sur Code et le mode plan (18 et 19) : ce sont elles qui lèvent les peurs.</w:t>
       </w:r>
     </w:p>
     <w:p>
@@ -7522,7 +7367,7 @@
           <w:rFonts w:ascii="Calibri" w:cs="Calibri" w:eastAsia="Calibri" w:hAnsi="Calibri"/>
           <w:lang w:val="fr-FR"/>
         </w:rPr>
-        <w:t xml:space="preserve">Bonjour à toutes et à tous. Pendant trente minutes, on va parler d'une fonction de Claude qui change la façon de travailler avec lui : les skills, qu'on peut traduire par « compétences ». Pas besoin de savoir coder : si vous savez expliquer une tâche à un nouveau collègue, vous savez créer une skill. Le déroulé : d'abord comprendre ce que c'est, ensuite voir où en trouver, puis comment en créer et en partager une. On finit par un petit quiz avec les cartons de couleur posés devant vous, et juste après, vous passez à la pratique sur vos propres cas.</w:t>
+        <w:t xml:space="preserve">Bonjour à toutes et à tous. Pendant trente minutes, on va parler d'une fonction de Claude qui change la façon de travailler avec lui : les skills, qu'on peut traduire par « compétences ». Pas besoin de savoir coder : si vous savez expliquer une tâche à un nouveau collègue, vous savez créer une skill. Le déroulé : d'abord comprendre ce que c'est, ensuite voir où en trouver, puis comment en créer et en partager une. On finit par un petit quiz où vous répondrez à voix haute, et juste après, vous passez à la pratique sur vos propres cas.</w:t>
       </w:r>
     </w:p>
     <w:p>
@@ -7890,7 +7735,7 @@
           <w:rFonts w:ascii="Calibri" w:cs="Calibri" w:eastAsia="Calibri" w:hAnsi="Calibri"/>
           <w:lang w:val="fr-FR"/>
         </w:rPr>
-        <w:t xml:space="preserve">Six étapes, un picto chacune. Chaque partie s'ouvre sur une diapo colorée avec son numéro et son picto, et le pied de page de chaque diapo rappelle la partie en cours. On termine par le quiz : gardez vos cartons à portée de main.</w:t>
+        <w:t xml:space="preserve">Six étapes, un picto chacune. Chaque partie s'ouvre sur une diapo colorée avec son numéro et son picto, et le pied de page de chaque diapo rappelle la partie en cours. On termine par un quiz, à l'oral.</w:t>
       </w:r>
     </w:p>
     <w:p>
@@ -9859,7 +9704,7 @@
           <w:rFonts w:ascii="Calibri" w:cs="Calibri" w:eastAsia="Calibri" w:hAnsi="Calibri"/>
           <w:lang w:val="fr-FR"/>
         </w:rPr>
-        <w:t xml:space="preserve">Trois portes, une même skill. Chat, c'est la conversation classique, sur le web ou dans l'application : vous dites « aide-moi à créer une skill », Claude vous interroge, rédige, et vous remet un fichier de skill à enregistrer. Cowork, c'est le mode où Claude travaille dans vos dossiers et produit de vrais fichiers. Petite actualité : Anthropic est en train de fusionner Chat et Cowork en un seul Claude. Selon votre offre, vous verrez encore deux onglets ou un seul (le déploiement a commencé pour Pro et Max, Team et Free suivront, et les administrateurs Enterprise sont prévenus à l'avance). Rien ne se perd : vos skills, projets et connecteurs suivent. Code, enfin, c'est Claude Code. Son nom fait peur, mais c'est simplement Claude qui travaille dans un dossier de votre ordinateur, avec plus de contrôle. Il est disponible dans un onglet de l'application de bureau, sans écran noir ni ligne de commande. Une bonne nouvelle pour finir : une skill enregistrée dans votre compte Claude vous suit dans les trois portes. Attention, la synchronisation va dans un seul sens : une skill créée dans Claude Code reste dans son dossier, et n'apparaît pas dans Chat ou Cowork tant qu'on ne l'a pas importée dans le compte.</w:t>
+        <w:t xml:space="preserve">Trois portes, une même skill. Chat, c'est la conversation classique, sur le web ou dans l'application : vous dites « aide-moi à créer une skill », Claude vous interroge, rédige, et vous remet un fichier de skill à enregistrer. Cowork, c'est le mode où Claude travaille dans vos dossiers et produit de vrais fichiers. Petite actualité : Chat et Cowork ont fusionné. Il n'y a plus qu'un seul Claude, qui converse et qui agit dans vos dossiers selon ce que vous lui demandez ; on garde ici les deux noms pour distinguer les deux façons de travailler. Rien ne s'est perdu dans la fusion : vos skills, projets et connecteurs ont suivi. Code, enfin, c'est Claude Code. Son nom fait peur, mais c'est simplement Claude qui travaille dans un dossier de votre ordinateur, avec plus de contrôle. Il est disponible dans un onglet de l'application de bureau, sans écran noir ni ligne de commande. Une bonne nouvelle pour finir : une skill enregistrée dans votre compte Claude vous suit dans les trois portes. Attention, la synchronisation va dans un seul sens : une skill créée dans Claude Code reste dans son dossier, et n'apparaît pas dans Chat ou Cowork tant qu'on ne l'a pas importée dans le compte.</w:t>
       </w:r>
     </w:p>
     <w:p>
@@ -10043,7 +9888,7 @@
           <w:rFonts w:ascii="Calibri" w:cs="Calibri" w:eastAsia="Calibri" w:hAnsi="Calibri"/>
           <w:lang w:val="fr-FR"/>
         </w:rPr>
-        <w:t xml:space="preserve">Chat. Avantages : rien à installer, ça marche dans le navigateur ; Claude vous guide avec sa skill de création de skills et vous pose les bonnes questions ; à la fin, il vous remet un fichier de skill, qu'il suffit d'enregistrer dans votre compte. Limites : Claude ne voit pas vos dossiers. Il faut joindre les fichiers un à un, et ajouter plus tard un modèle ou un exemple est moins fluide. Cowork. Avantages : Claude travaille directement dans un dossier de votre ordinateur. Il peut lire votre charte en PDF, vos anciens comptes rendus, vos modèles Word, et produire de vrais fichiers. C'est idéal quand la skill s'appuie sur des documents. Limites : il faut l'application de bureau, et la disponibilité dépend de votre offre (fusion en cours avec Chat). Code. Avantages : Claude voit tout le dossier de la skill, donc SKILL.md, exemples et modèles ensemble ; vous pouvez relire son plan avant qu'il ne touche à quoi que ce soit (le mode plan, j'y reviens) ; la skill est un simple dossier, facile à copier, à versionner et à partager avec une équipe ; enfin, on la teste immédiatement en tapant « / » suivi de son nom. Limites : l'interface impressionne la première fois, et il y a quelques mots nouveaux (dossier de travail, permission). C'est tout. Aucune de ces limites n'est technique : c'est de l'habitude.</w:t>
+        <w:t xml:space="preserve">Chat. Avantages : rien à installer, ça marche dans le navigateur ; Claude vous guide avec sa skill de création de skills et vous pose les bonnes questions ; à la fin, il vous remet un fichier de skill, qu'il suffit d'enregistrer dans votre compte. Limites : Claude ne voit pas vos dossiers. Il faut joindre les fichiers un à un, et ajouter plus tard un modèle ou un exemple est moins fluide. Cowork. Avantages : Claude travaille directement dans un dossier de votre ordinateur. Il peut lire votre charte en PDF, vos anciens comptes rendus, vos modèles Word, et produire de vrais fichiers. C'est idéal quand la skill s'appuie sur des documents. Limites : il faut l'application de bureau pour travailler sur vos dossiers, et il faut autoriser l'accès à chaque dossier. Code. Avantages : Claude voit tout le dossier de la skill, donc SKILL.md, exemples et modèles ensemble ; vous pouvez relire son plan avant qu'il ne touche à quoi que ce soit (le mode plan, j'y reviens) ; la skill est un simple dossier, facile à copier, à versionner et à partager avec une équipe ; enfin, on la teste immédiatement en tapant « / » suivi de son nom. Limites : l'interface impressionne la première fois, et il y a quelques mots nouveaux (dossier de travail, permission). C'est tout. Aucune de ces limites n'est technique : c'est de l'habitude.</w:t>
       </w:r>
     </w:p>
     <w:p>
@@ -10411,7 +10256,7 @@
           <w:rFonts w:ascii="Calibri" w:cs="Calibri" w:eastAsia="Calibri" w:hAnsi="Calibri"/>
           <w:lang w:val="fr-FR"/>
         </w:rPr>
-        <w:t xml:space="preserve">Le mode plan est une fonction de Claude Code. Quand il est activé, Claude peut lire vos fichiers et explorer le dossier, mais il n'a pas le droit de modifier quoi que ce soit. Son travail, c'est de vous proposer un plan : « je vais lire charte.pdf, créer tel dossier, écrire tel fichier avec telles sections, puis tester ». Vous lisez ce plan comme un devis. Trois réponses possibles : approuver et le laisser travailler ; approuver en validant chaque modification une par une ; ou dire « continue à planifier » et corriger (« ajoute une section sur les logos », « ne touche pas au dossier Archives »). Trois façons d'entrer en mode plan : les touches Maj + Tab, qui font défiler les modes ; commencer son message par /plan ; ou, dans l'application de bureau, le sélecteur de mode à côté de la zone de message. Pourquoi est-ce idéal pour créer une skill ? Parce qu'une skill, c'est d'abord une structure : quelles étapes, quels exemples, quels fichiers. Le plan vous montre cette structure avant qu'elle n'existe, et c'est le meilleur moment pour la corriger. Astuce : dans Chat, vous pouvez imiter ce fonctionnement en écrivant « propose-moi d'abord un plan, n'écris rien avant mon accord ».</w:t>
+        <w:t xml:space="preserve">Le mode plan est une fonction de Claude Code. Quand il est activé, Claude peut lire vos fichiers et explorer le dossier, mais il n'a pas le droit de modifier quoi que ce soit. Son travail, c'est de vous proposer un plan : « je vais lire charte.pdf, créer tel dossier, écrire tel fichier avec telles sections, puis tester ». Vous lisez ce plan comme un devis. Trois réponses possibles : approuver et le laisser travailler ; approuver en validant chaque modification une par une ; ou dire « continue à planifier » et corriger (« ajoute une section sur les logos », « ne touche pas au dossier Archives »). Deux façons d'entrer en mode plan : commencer son message par /plan, ou, dans l'application de bureau, choisir « Plan » dans le sélecteur de mode à côté de la zone de message. Pourquoi est-ce idéal pour créer une skill ? Parce qu'une skill, c'est d'abord une structure : quelles étapes, quels exemples, quels fichiers. Le plan vous montre cette structure avant qu'elle n'existe, et c'est le meilleur moment pour la corriger. Astuce : dans Chat, vous pouvez imiter ce fonctionnement en écrivant « propose-moi d'abord un plan, n'écris rien avant mon accord ».</w:t>
       </w:r>
     </w:p>
     <w:p>
@@ -10457,7 +10302,7 @@
           <w:rFonts w:ascii="Calibri" w:cs="Calibri" w:eastAsia="Calibri" w:hAnsi="Calibri"/>
           <w:lang w:val="fr-FR"/>
         </w:rPr>
-        <w:t xml:space="preserve">Voyons à quoi ça ressemble pour créer une vraie skill.</w:t>
+        <w:t xml:space="preserve">Récapitulons avec une question simple : quelle porte pour moi ?</w:t>
       </w:r>
     </w:p>
     <w:p>
@@ -10477,7 +10322,7 @@
           <w:rFonts w:ascii="Calibri" w:cs="Calibri" w:eastAsia="Calibri" w:hAnsi="Calibri"/>
           <w:lang w:val="fr-FR"/>
         </w:rPr>
-        <w:t xml:space="preserve">Diapo 20 · Démo : une skill avec Code</w:t>
+        <w:t xml:space="preserve">Diapo 20 · Quelle porte pour moi ?</w:t>
       </w:r>
     </w:p>
     <w:p>
@@ -10491,7 +10336,7 @@
           <wp:inline distT="0" distB="0" distL="0" distR="0">
             <wp:extent cx="4191000" cy="2362200"/>
             <wp:effectExtent t="0" r="0" b="0" l="0"/>
-            <wp:docPr id="16" name="diapo20" descr="Diapo 20 : Démo : une skill avec Code" title="Diapo 20"/>
+            <wp:docPr id="16" name="diapo20" descr="Diapo 20 : Quelle porte pour moi ?" title="Diapo 20"/>
             <wp:cNvGraphicFramePr>
               <a:graphicFrameLocks xmlns:a="http://schemas.openxmlformats.org/drawingml/2006/main" noChangeAspect="1"/>
             </wp:cNvGraphicFramePr>
@@ -10547,7 +10392,7 @@
           <w:rFonts w:ascii="Calibri" w:cs="Calibri" w:eastAsia="Calibri" w:hAnsi="Calibri"/>
           <w:lang w:val="fr-FR"/>
         </w:rPr>
-        <w:t xml:space="preserve">Montrer un parcours complet dans Claude Code, du dossier à la skill testée, en mode plan.</w:t>
+        <w:t xml:space="preserve">Donner une règle de choix simple et mémorisable.</w:t>
       </w:r>
     </w:p>
     <w:p>
@@ -10570,7 +10415,7 @@
           <w:rFonts w:ascii="Calibri" w:cs="Calibri" w:eastAsia="Calibri" w:hAnsi="Calibri"/>
           <w:lang w:val="fr-FR"/>
         </w:rPr>
-        <w:t xml:space="preserve">3:00</w:t>
+        <w:t xml:space="preserve">1:30</w:t>
       </w:r>
     </w:p>
     <w:p>
@@ -10595,30 +10440,7 @@
           <w:rFonts w:ascii="Calibri" w:cs="Calibri" w:eastAsia="Calibri" w:hAnsi="Calibri"/>
           <w:lang w:val="fr-FR"/>
         </w:rPr>
-        <w:t xml:space="preserve">En direct si possible, dans l'onglet Code de l'application de bureau ; sinon, commentez la maquette. Étape 1 : ouvrir un dossier. Ici, « charte » contient la charte graphique en PDF, le logo et un exemple de présentation réussie. Travaillez sur une copie. Étape 2 : passer en mode plan (sélecteur de mode ou Maj + Tab) et écrire : « Crée une skill charte-graphique à partir des fichiers de ce dossier, pour appliquer notre charte à toute présentation ou tout document. » Étape 3 : Claude lit les fichiers et affiche son plan : lire la charte et l'exemple, créer .claude/skills/charte-graphique/SKILL.md, ajouter un fichier de couleurs et de typographie, tester sur une diapo. Lisez-le à voix haute avec la salle et corrigez une chose, pour montrer qu'on garde la main. Étape 4 : approuver en validant chaque modification, pour que la salle voie chaque fichier apparaître (si la session a démarré en mode auto, c'est l'occasion de montrer qu'on peut choisir ce niveau de contrôle). Point de vigilance : si le dossier .claude/skills vient d'être créé pendant la session, Claude Code ne le voit pas encore. Ouvrez une nouvelle session sur le même dossier avant de tester, ou, mieux, créez ce dossier vide à l'avance dans le dossier de démo. Puis tester : tapez /charte-graphique, ou demandez « fais-moi une diapo de bienvenue ». La skill est rangée dans le dossier .claude/skills du projet : quiconque ouvre ce dossier avec Claude Code en profite. Pour l'avoir aussi dans Claude sur le web, demandez à Claude Code de la compresser en .zip, puis importez-la dans Personnaliser › Skills.</w:t>
-      </w:r>
-    </w:p>
-    <w:p>
-      <w:pPr>
-        <w:pStyle w:val="Body"/>
-        <w:spacing w:after="120"/>
-      </w:pPr>
-      <w:r>
-        <w:rPr>
-          <w:rFonts w:ascii="Calibri" w:cs="Calibri" w:eastAsia="Calibri" w:hAnsi="Calibri"/>
-          <w:b/>
-          <w:bCs/>
-          <w:color w:val="2F5FC4"/>
-          <w:lang w:val="fr-FR"/>
-        </w:rPr>
-        <w:t xml:space="preserve">Question à la salle — </w:t>
-      </w:r>
-      <w:r>
-        <w:rPr>
-          <w:rFonts w:ascii="Calibri" w:cs="Calibri" w:eastAsia="Calibri" w:hAnsi="Calibri"/>
-          <w:lang w:val="fr-FR"/>
-        </w:rPr>
-        <w:t xml:space="preserve">Pendant que Claude planifie : « Qu'est-ce que vous voudriez corriger dans ce plan ? »</w:t>
+        <w:t xml:space="preserve">Trois situations. Pour une première skill, surtout faite de texte (une méthode, un ton, un format) : Chat, c'est parfait. Si la skill s'appuie sur des fichiers (une charte en PDF, des modèles, des exemples) : Cowork ou Code, qui voient votre dossier. Si vous voulez relire un plan avant toute action, faire évoluer la skill dans le temps ou la partager avec une équipe : Code. Et ce n'est pas un choix définitif. Beaucoup de gens commencent une skill dans Chat, puis la reprennent dans Code quand elle grandit : on importe le dossier, et Claude Code l'améliore en mode plan.</w:t>
       </w:r>
     </w:p>
     <w:p>
@@ -10641,7 +10463,7 @@
           <w:rFonts w:ascii="Calibri" w:cs="Calibri" w:eastAsia="Calibri" w:hAnsi="Calibri"/>
           <w:lang w:val="fr-FR"/>
         </w:rPr>
-        <w:t xml:space="preserve">Récapitulons avec une question simple : quelle porte pour moi ?</w:t>
+        <w:t xml:space="preserve">Passons à la méthode de création, valable dans les trois portes.</w:t>
       </w:r>
     </w:p>
     <w:p>
@@ -10661,7 +10483,114 @@
           <w:rFonts w:ascii="Calibri" w:cs="Calibri" w:eastAsia="Calibri" w:hAnsi="Calibri"/>
           <w:lang w:val="fr-FR"/>
         </w:rPr>
-        <w:t xml:space="preserve">Diapo 21 · Quelle porte pour moi ?</w:t>
+        <w:t xml:space="preserve">Diapo 21 · Créer</w:t>
+      </w:r>
+    </w:p>
+    <w:p>
+      <w:pPr>
+        <w:pStyle w:val="Body"/>
+        <w:spacing w:after="120"/>
+      </w:pPr>
+      <w:r>
+        <w:rPr>
+          <w:rFonts w:ascii="Calibri" w:cs="Calibri" w:eastAsia="Calibri" w:hAnsi="Calibri"/>
+          <w:i/>
+          <w:iCs/>
+          <w:color w:val="566070"/>
+          <w:lang w:val="fr-FR"/>
+        </w:rPr>
+        <w:t xml:space="preserve">Diapo d'ouverture de partie : grand numéro et titre sur fond framboise.</w:t>
+      </w:r>
+    </w:p>
+    <w:p>
+      <w:pPr>
+        <w:pStyle w:val="Body"/>
+        <w:spacing w:after="120"/>
+      </w:pPr>
+      <w:r>
+        <w:rPr>
+          <w:rFonts w:ascii="Calibri" w:cs="Calibri" w:eastAsia="Calibri" w:hAnsi="Calibri"/>
+          <w:b/>
+          <w:bCs/>
+          <w:color w:val="B8235A"/>
+          <w:lang w:val="fr-FR"/>
+        </w:rPr>
+        <w:t xml:space="preserve">Objectif — </w:t>
+      </w:r>
+      <w:r>
+        <w:rPr>
+          <w:rFonts w:ascii="Calibri" w:cs="Calibri" w:eastAsia="Calibri" w:hAnsi="Calibri"/>
+          <w:lang w:val="fr-FR"/>
+        </w:rPr>
+        <w:t xml:space="preserve">Marquer le passage à la partie 5 et relancer l'attention.</w:t>
+      </w:r>
+    </w:p>
+    <w:p>
+      <w:pPr>
+        <w:pStyle w:val="Body"/>
+        <w:spacing w:after="120"/>
+      </w:pPr>
+      <w:r>
+        <w:rPr>
+          <w:rFonts w:ascii="Calibri" w:cs="Calibri" w:eastAsia="Calibri" w:hAnsi="Calibri"/>
+          <w:b/>
+          <w:bCs/>
+          <w:color w:val="566070"/>
+          <w:lang w:val="fr-FR"/>
+        </w:rPr>
+        <w:t xml:space="preserve">Timing — </w:t>
+      </w:r>
+      <w:r>
+        <w:rPr>
+          <w:rFonts w:ascii="Calibri" w:cs="Calibri" w:eastAsia="Calibri" w:hAnsi="Calibri"/>
+          <w:lang w:val="fr-FR"/>
+        </w:rPr>
+        <w:t xml:space="preserve">0:10</w:t>
+      </w:r>
+    </w:p>
+    <w:p>
+      <w:pPr>
+        <w:pStyle w:val="Heading3"/>
+      </w:pPr>
+      <w:r>
+        <w:rPr>
+          <w:rFonts w:ascii="Calibri" w:cs="Calibri" w:eastAsia="Calibri" w:hAnsi="Calibri"/>
+          <w:lang w:val="fr-FR"/>
+        </w:rPr>
+        <w:t xml:space="preserve">Script</w:t>
+      </w:r>
+    </w:p>
+    <w:p>
+      <w:pPr>
+        <w:pStyle w:val="Body"/>
+        <w:spacing w:after="120"/>
+      </w:pPr>
+      <w:r>
+        <w:rPr>
+          <w:rFonts w:ascii="Calibri" w:cs="Calibri" w:eastAsia="Calibri" w:hAnsi="Calibri"/>
+          <w:lang w:val="fr-FR"/>
+        </w:rPr>
+        <w:t xml:space="preserve">Cinquième étape : la méthode en cinq temps, une démonstration, les trois secrets d'une bonne skill et un cas d'usage officiel. Laissez la diapo quelques secondes, le temps que la salle se repère dans le programme.</w:t>
+      </w:r>
+    </w:p>
+    <w:p>
+      <w:pPr>
+        <w:pStyle w:val="Body"/>
+      </w:pPr>
+      <w:r>
+        <w:br w:type="page"/>
+      </w:r>
+    </w:p>
+    <w:p>
+      <w:pPr>
+        <w:pStyle w:val="Heading2"/>
+      </w:pPr>
+      <w:r>
+        <w:rPr>
+          <w:rFonts w:ascii="Calibri" w:cs="Calibri" w:eastAsia="Calibri" w:hAnsi="Calibri"/>
+          <w:lang w:val="fr-FR"/>
+        </w:rPr>
+        <w:t xml:space="preserve">Diapo 22 · Créer une skill en 5 étapes</w:t>
       </w:r>
     </w:p>
     <w:p>
@@ -10675,7 +10604,7 @@
           <wp:inline distT="0" distB="0" distL="0" distR="0">
             <wp:extent cx="4191000" cy="2362200"/>
             <wp:effectExtent t="0" r="0" b="0" l="0"/>
-            <wp:docPr id="17" name="diapo21" descr="Diapo 21 : Quelle porte pour moi ?" title="Diapo 21"/>
+            <wp:docPr id="17" name="diapo22" descr="Diapo 22 : Créer une skill en 5 étapes" title="Diapo 22"/>
             <wp:cNvGraphicFramePr>
               <a:graphicFrameLocks xmlns:a="http://schemas.openxmlformats.org/drawingml/2006/main" noChangeAspect="1"/>
             </wp:cNvGraphicFramePr>
@@ -10731,7 +10660,7 @@
           <w:rFonts w:ascii="Calibri" w:cs="Calibri" w:eastAsia="Calibri" w:hAnsi="Calibri"/>
           <w:lang w:val="fr-FR"/>
         </w:rPr>
-        <w:t xml:space="preserve">Donner une règle de choix simple et mémorisable.</w:t>
+        <w:t xml:space="preserve">Donner une méthode simple, réutilisable pendant l'atelier.</w:t>
       </w:r>
     </w:p>
     <w:p>
@@ -10754,7 +10683,7 @@
           <w:rFonts w:ascii="Calibri" w:cs="Calibri" w:eastAsia="Calibri" w:hAnsi="Calibri"/>
           <w:lang w:val="fr-FR"/>
         </w:rPr>
-        <w:t xml:space="preserve">1:30</w:t>
+        <w:t xml:space="preserve">1:00</w:t>
       </w:r>
     </w:p>
     <w:p>
@@ -10779,7 +10708,7 @@
           <w:rFonts w:ascii="Calibri" w:cs="Calibri" w:eastAsia="Calibri" w:hAnsi="Calibri"/>
           <w:lang w:val="fr-FR"/>
         </w:rPr>
-        <w:t xml:space="preserve">Trois situations. Pour une première skill, surtout faite de texte (une méthode, un ton, un format) : Chat, c'est parfait. Si la skill s'appuie sur des fichiers (une charte en PDF, des modèles, des exemples) : Cowork ou Code, qui voient votre dossier. Si vous voulez relire un plan avant toute action, faire évoluer la skill dans le temps ou la partager avec une équipe : Code. Et ce n'est pas un choix définitif. Beaucoup de gens commencent une skill dans Chat, puis la reprennent dans Code quand elle grandit : on importe le dossier, et Claude Code l'améliore en mode plan.</w:t>
+        <w:t xml:space="preserve">Un : repérer une tâche qui revient au moins une fois par semaine et qui se fait toujours de la même façon. Deux : la décrire à Claude comme à un nouveau collègue, avec si possible un exemple réussi (un ancien compte rendu, un mail type). Trois : laisser Claude générer la skill. Il s'appuie pour cela sur skill-creator, la skill d'Anthropic qui fabrique les skills : elle lui fait poser les bonnes questions, puis rédiger un SKILL.md conforme aux bonnes pratiques. Répondez-lui franchement. Quatre : tester, dans une nouvelle conversation, avec une demande naturelle, sans nommer la skill. Préparez trois demandes : deux qui doivent déclencher la skill, et une qui ne doit pas (par exemple « résume cet article » pour une skill de compte rendu). La mention « Using… » dans la réflexion de Claude indique si la skill a servi. Choisissez des demandes réalistes et un peu substantielles : Claude ne consulte pas une skill pour une tâche qu'il sait faire seul en une étape (« lis ce fichier »), même si la description correspond. Comparez aussi avec le résultat obtenu sans la skill : c'est ce qui prouve qu'elle apporte quelque chose. Anthropic résume la méthode ainsi : on conçoit avec un premier Claude, on teste avec un second dans une conversation neuve, et on rapporte au premier ce qu'on a observé. Cinq : ajuster. Si elle ne se déclenche pas, c'est presque toujours la description qu'il faut revoir. Si le résultat n'est pas bon, ce sont les instructions ou l'exemple. On boucle entre quatre et cinq deux ou trois fois : c'est normal.</w:t>
       </w:r>
     </w:p>
     <w:p>
@@ -10802,7 +10731,7 @@
           <w:rFonts w:ascii="Calibri" w:cs="Calibri" w:eastAsia="Calibri" w:hAnsi="Calibri"/>
           <w:lang w:val="fr-FR"/>
         </w:rPr>
-        <w:t xml:space="preserve">Passons à la méthode de création, valable dans les trois portes.</w:t>
+        <w:t xml:space="preserve">Je vous montre à quoi ça ressemble en vrai.</w:t>
       </w:r>
     </w:p>
     <w:p>
@@ -10822,114 +10751,7 @@
           <w:rFonts w:ascii="Calibri" w:cs="Calibri" w:eastAsia="Calibri" w:hAnsi="Calibri"/>
           <w:lang w:val="fr-FR"/>
         </w:rPr>
-        <w:t xml:space="preserve">Diapo 22 · Créer</w:t>
-      </w:r>
-    </w:p>
-    <w:p>
-      <w:pPr>
-        <w:pStyle w:val="Body"/>
-        <w:spacing w:after="120"/>
-      </w:pPr>
-      <w:r>
-        <w:rPr>
-          <w:rFonts w:ascii="Calibri" w:cs="Calibri" w:eastAsia="Calibri" w:hAnsi="Calibri"/>
-          <w:i/>
-          <w:iCs/>
-          <w:color w:val="566070"/>
-          <w:lang w:val="fr-FR"/>
-        </w:rPr>
-        <w:t xml:space="preserve">Diapo d'ouverture de partie : grand numéro et titre sur fond framboise.</w:t>
-      </w:r>
-    </w:p>
-    <w:p>
-      <w:pPr>
-        <w:pStyle w:val="Body"/>
-        <w:spacing w:after="120"/>
-      </w:pPr>
-      <w:r>
-        <w:rPr>
-          <w:rFonts w:ascii="Calibri" w:cs="Calibri" w:eastAsia="Calibri" w:hAnsi="Calibri"/>
-          <w:b/>
-          <w:bCs/>
-          <w:color w:val="B8235A"/>
-          <w:lang w:val="fr-FR"/>
-        </w:rPr>
-        <w:t xml:space="preserve">Objectif — </w:t>
-      </w:r>
-      <w:r>
-        <w:rPr>
-          <w:rFonts w:ascii="Calibri" w:cs="Calibri" w:eastAsia="Calibri" w:hAnsi="Calibri"/>
-          <w:lang w:val="fr-FR"/>
-        </w:rPr>
-        <w:t xml:space="preserve">Marquer le passage à la partie 5 et relancer l'attention.</w:t>
-      </w:r>
-    </w:p>
-    <w:p>
-      <w:pPr>
-        <w:pStyle w:val="Body"/>
-        <w:spacing w:after="120"/>
-      </w:pPr>
-      <w:r>
-        <w:rPr>
-          <w:rFonts w:ascii="Calibri" w:cs="Calibri" w:eastAsia="Calibri" w:hAnsi="Calibri"/>
-          <w:b/>
-          <w:bCs/>
-          <w:color w:val="566070"/>
-          <w:lang w:val="fr-FR"/>
-        </w:rPr>
-        <w:t xml:space="preserve">Timing — </w:t>
-      </w:r>
-      <w:r>
-        <w:rPr>
-          <w:rFonts w:ascii="Calibri" w:cs="Calibri" w:eastAsia="Calibri" w:hAnsi="Calibri"/>
-          <w:lang w:val="fr-FR"/>
-        </w:rPr>
-        <w:t xml:space="preserve">0:10</w:t>
-      </w:r>
-    </w:p>
-    <w:p>
-      <w:pPr>
-        <w:pStyle w:val="Heading3"/>
-      </w:pPr>
-      <w:r>
-        <w:rPr>
-          <w:rFonts w:ascii="Calibri" w:cs="Calibri" w:eastAsia="Calibri" w:hAnsi="Calibri"/>
-          <w:lang w:val="fr-FR"/>
-        </w:rPr>
-        <w:t xml:space="preserve">Script</w:t>
-      </w:r>
-    </w:p>
-    <w:p>
-      <w:pPr>
-        <w:pStyle w:val="Body"/>
-        <w:spacing w:after="120"/>
-      </w:pPr>
-      <w:r>
-        <w:rPr>
-          <w:rFonts w:ascii="Calibri" w:cs="Calibri" w:eastAsia="Calibri" w:hAnsi="Calibri"/>
-          <w:lang w:val="fr-FR"/>
-        </w:rPr>
-        <w:t xml:space="preserve">Cinquième étape : la méthode en cinq temps, une démonstration, les trois secrets d'une bonne skill et un cas d'usage officiel. Laissez la diapo quelques secondes, le temps que la salle se repère dans le programme.</w:t>
-      </w:r>
-    </w:p>
-    <w:p>
-      <w:pPr>
-        <w:pStyle w:val="Body"/>
-      </w:pPr>
-      <w:r>
-        <w:br w:type="page"/>
-      </w:r>
-    </w:p>
-    <w:p>
-      <w:pPr>
-        <w:pStyle w:val="Heading2"/>
-      </w:pPr>
-      <w:r>
-        <w:rPr>
-          <w:rFonts w:ascii="Calibri" w:cs="Calibri" w:eastAsia="Calibri" w:hAnsi="Calibri"/>
-          <w:lang w:val="fr-FR"/>
-        </w:rPr>
-        <w:t xml:space="preserve">Diapo 23 · Créer une skill en 5 étapes</w:t>
+        <w:t xml:space="preserve">Diapo 23 · skill-creator : la skill qui fabrique les skills</w:t>
       </w:r>
     </w:p>
     <w:p>
@@ -10943,7 +10765,7 @@
           <wp:inline distT="0" distB="0" distL="0" distR="0">
             <wp:extent cx="4191000" cy="2362200"/>
             <wp:effectExtent t="0" r="0" b="0" l="0"/>
-            <wp:docPr id="18" name="diapo23" descr="Diapo 23 : Créer une skill en 5 étapes" title="Diapo 23"/>
+            <wp:docPr id="18" name="diapo23" descr="Diapo 23 : skill-creator : la skill qui fabrique les skills" title="Diapo 23"/>
             <wp:cNvGraphicFramePr>
               <a:graphicFrameLocks xmlns:a="http://schemas.openxmlformats.org/drawingml/2006/main" noChangeAspect="1"/>
             </wp:cNvGraphicFramePr>
@@ -10999,7 +10821,7 @@
           <w:rFonts w:ascii="Calibri" w:cs="Calibri" w:eastAsia="Calibri" w:hAnsi="Calibri"/>
           <w:lang w:val="fr-FR"/>
         </w:rPr>
-        <w:t xml:space="preserve">Donner une méthode simple, réutilisable pendant l'atelier.</w:t>
+        <w:t xml:space="preserve">Présenter skill-creator, l'outil central de la création de skills, et sa boucle de travail.</w:t>
       </w:r>
     </w:p>
     <w:p>
@@ -11022,7 +10844,7 @@
           <w:rFonts w:ascii="Calibri" w:cs="Calibri" w:eastAsia="Calibri" w:hAnsi="Calibri"/>
           <w:lang w:val="fr-FR"/>
         </w:rPr>
-        <w:t xml:space="preserve">1:00</w:t>
+        <w:t xml:space="preserve">2:00</w:t>
       </w:r>
     </w:p>
     <w:p>
@@ -11047,7 +10869,30 @@
           <w:rFonts w:ascii="Calibri" w:cs="Calibri" w:eastAsia="Calibri" w:hAnsi="Calibri"/>
           <w:lang w:val="fr-FR"/>
         </w:rPr>
-        <w:t xml:space="preserve">Un : repérer une tâche qui revient au moins une fois par semaine et qui se fait toujours de la même façon. Deux : la décrire à Claude comme à un nouveau collègue, avec si possible un exemple réussi (un ancien compte rendu, un mail type). Trois : laisser Claude générer la skill. Il s'appuie pour cela sur skill-creator, la skill d'Anthropic qui fabrique les skills : elle lui fait poser les bonnes questions, puis rédiger un SKILL.md conforme aux bonnes pratiques. Répondez-lui franchement. Quatre : tester, dans une nouvelle conversation, avec une demande naturelle, sans nommer la skill. Préparez trois demandes : deux qui doivent déclencher la skill, et une qui ne doit pas (par exemple « résume cet article » pour une skill de compte rendu). La mention « Using… » dans la réflexion de Claude indique si la skill a servi. Choisissez des demandes réalistes et un peu substantielles : Claude ne consulte pas une skill pour une tâche qu'il sait faire seul en une étape (« lis ce fichier »), même si la description correspond. Comparez aussi avec le résultat obtenu sans la skill : c'est ce qui prouve qu'elle apporte quelque chose. Anthropic résume la méthode ainsi : on conçoit avec un premier Claude, on teste avec un second dans une conversation neuve, et on rapporte au premier ce qu'on a observé. Cinq : ajuster. Si elle ne se déclenche pas, c'est presque toujours la description qu'il faut revoir. Si le résultat n'est pas bon, ce sont les instructions ou l'exemple. On boucle entre quatre et cinq deux ou trois fois : c'est normal.</w:t>
+        <w:t xml:space="preserve">Quand vous demandez à Claude de créer une skill, il ne part pas de zéro : il ouvre skill-creator, une skill écrite par Anthropic dont le métier est… de fabriquer des skills. C'est elle qui donne la méthode. Un : comprendre, avec quatre questions : que doit faire la skill, quand doit-elle se déclencher (avec quels mots vous la demandez), quel format de résultat, et faut-il prévoir des tests. Elle creuse ensuite les cas particuliers et vous demande des exemples. Deux : rédiger le SKILL.md, en appliquant les bonnes pratiques (description précise, texte concis, fichiers annexes si besoin). Trois : tester sur deux ou trois demandes réalistes, celles que vous feriez vraiment. Quatre : comparer le résultat avec et sans la skill, pour vérifier qu'elle apporte quelque chose. Cinq : améliorer à partir de vos retours ; skill-creator cherche à généraliser plutôt qu'à coller à vos exemples. Six : affiner la description, en la testant sur une vingtaine de demandes, dont certaines ne doivent PAS déclencher la skill. À la fin, elle empaquette le tout en un fichier .skill : dans Claude, la carte du fichier affiche un bouton « Save skill » qui l'installe dans votre profil, si votre organisation l'autorise. Elle sait aussi améliorer une skill existante, en gardant son nom. Retenez : pour créer une skill, on ne demande pas « écris-moi un fichier », on dit « aide-moi à créer une skill », et skill-creator prend la main.</w:t>
+      </w:r>
+    </w:p>
+    <w:p>
+      <w:pPr>
+        <w:pStyle w:val="Body"/>
+        <w:spacing w:after="120"/>
+      </w:pPr>
+      <w:r>
+        <w:rPr>
+          <w:rFonts w:ascii="Calibri" w:cs="Calibri" w:eastAsia="Calibri" w:hAnsi="Calibri"/>
+          <w:b/>
+          <w:bCs/>
+          <w:color w:val="2F5FC4"/>
+          <w:lang w:val="fr-FR"/>
+        </w:rPr>
+        <w:t xml:space="preserve">Question à la salle — </w:t>
+      </w:r>
+      <w:r>
+        <w:rPr>
+          <w:rFonts w:ascii="Calibri" w:cs="Calibri" w:eastAsia="Calibri" w:hAnsi="Calibri"/>
+          <w:lang w:val="fr-FR"/>
+        </w:rPr>
+        <w:t xml:space="preserve">Laquelle de ces six étapes sauteriez-vous spontanément si vous faisiez seul ? (Souvent : comparer et affiner la description.)</w:t>
       </w:r>
     </w:p>
     <w:p>
@@ -11070,7 +10915,7 @@
           <w:rFonts w:ascii="Calibri" w:cs="Calibri" w:eastAsia="Calibri" w:hAnsi="Calibri"/>
           <w:lang w:val="fr-FR"/>
         </w:rPr>
-        <w:t xml:space="preserve">Je vous montre à quoi ça ressemble en vrai.</w:t>
+        <w:t xml:space="preserve">Mais skill-creator ne fait pas tout partout. Voyons ce qui change selon la porte.</w:t>
       </w:r>
     </w:p>
     <w:p>
@@ -11090,7 +10935,7 @@
           <w:rFonts w:ascii="Calibri" w:cs="Calibri" w:eastAsia="Calibri" w:hAnsi="Calibri"/>
           <w:lang w:val="fr-FR"/>
         </w:rPr>
-        <w:t xml:space="preserve">Diapo 24 · skill-creator : la skill qui fabrique les skills</w:t>
+        <w:t xml:space="preserve">Diapo 24 · skill-creator selon la porte</w:t>
       </w:r>
     </w:p>
     <w:p>
@@ -11104,7 +10949,7 @@
           <wp:inline distT="0" distB="0" distL="0" distR="0">
             <wp:extent cx="4191000" cy="2362200"/>
             <wp:effectExtent t="0" r="0" b="0" l="0"/>
-            <wp:docPr id="19" name="diapo24" descr="Diapo 24 : skill-creator : la skill qui fabrique les skills" title="Diapo 24"/>
+            <wp:docPr id="19" name="diapo24" descr="Diapo 24 : skill-creator selon la porte" title="Diapo 24"/>
             <wp:cNvGraphicFramePr>
               <a:graphicFrameLocks xmlns:a="http://schemas.openxmlformats.org/drawingml/2006/main" noChangeAspect="1"/>
             </wp:cNvGraphicFramePr>
@@ -11160,7 +11005,7 @@
           <w:rFonts w:ascii="Calibri" w:cs="Calibri" w:eastAsia="Calibri" w:hAnsi="Calibri"/>
           <w:lang w:val="fr-FR"/>
         </w:rPr>
-        <w:t xml:space="preserve">Présenter skill-creator, l'outil central de la création de skills, et sa boucle de travail.</w:t>
+        <w:t xml:space="preserve">Montrer que skill-creator est plus complète dans Cowork et Code, et en faire un argument pour oser Code.</w:t>
       </w:r>
     </w:p>
     <w:p>
@@ -11183,7 +11028,7 @@
           <w:rFonts w:ascii="Calibri" w:cs="Calibri" w:eastAsia="Calibri" w:hAnsi="Calibri"/>
           <w:lang w:val="fr-FR"/>
         </w:rPr>
-        <w:t xml:space="preserve">2:00</w:t>
+        <w:t xml:space="preserve">1:30</w:t>
       </w:r>
     </w:p>
     <w:p>
@@ -11208,30 +11053,7 @@
           <w:rFonts w:ascii="Calibri" w:cs="Calibri" w:eastAsia="Calibri" w:hAnsi="Calibri"/>
           <w:lang w:val="fr-FR"/>
         </w:rPr>
-        <w:t xml:space="preserve">Quand vous demandez à Claude de créer une skill, il ne part pas de zéro : il ouvre skill-creator, une skill écrite par Anthropic dont le métier est… de fabriquer des skills. C'est elle qui donne la méthode. Un : comprendre, avec quatre questions : que doit faire la skill, quand doit-elle se déclencher (avec quels mots vous la demandez), quel format de résultat, et faut-il prévoir des tests. Elle creuse ensuite les cas particuliers et vous demande des exemples. Deux : rédiger le SKILL.md, en appliquant les bonnes pratiques (description précise, texte concis, fichiers annexes si besoin). Trois : tester sur deux ou trois demandes réalistes, celles que vous feriez vraiment. Quatre : comparer le résultat avec et sans la skill, pour vérifier qu'elle apporte quelque chose. Cinq : améliorer à partir de vos retours ; skill-creator cherche à généraliser plutôt qu'à coller à vos exemples. Six : affiner la description, en la testant sur une vingtaine de demandes, dont certaines ne doivent PAS déclencher la skill. À la fin, elle empaquette le tout en un fichier .skill : dans Claude, la carte du fichier affiche un bouton « Save skill » qui l'installe dans votre profil, si votre organisation l'autorise. Elle sait aussi améliorer une skill existante, en gardant son nom. Retenez : pour créer une skill, on ne demande pas « écris-moi un fichier », on dit « aide-moi à créer une skill », et skill-creator prend la main.</w:t>
-      </w:r>
-    </w:p>
-    <w:p>
-      <w:pPr>
-        <w:pStyle w:val="Body"/>
-        <w:spacing w:after="120"/>
-      </w:pPr>
-      <w:r>
-        <w:rPr>
-          <w:rFonts w:ascii="Calibri" w:cs="Calibri" w:eastAsia="Calibri" w:hAnsi="Calibri"/>
-          <w:b/>
-          <w:bCs/>
-          <w:color w:val="2F5FC4"/>
-          <w:lang w:val="fr-FR"/>
-        </w:rPr>
-        <w:t xml:space="preserve">Question à la salle — </w:t>
-      </w:r>
-      <w:r>
-        <w:rPr>
-          <w:rFonts w:ascii="Calibri" w:cs="Calibri" w:eastAsia="Calibri" w:hAnsi="Calibri"/>
-          <w:lang w:val="fr-FR"/>
-        </w:rPr>
-        <w:t xml:space="preserve">Laquelle de ces six étapes sauteriez-vous spontanément si vous faisiez seul ? (Souvent : comparer et affiner la description.)</w:t>
+        <w:t xml:space="preserve">skill-creator s'adapte à l'endroit où elle tourne, et ses propres instructions le disent. Dans Chat, elle fait l'essentiel : l'entretien, la rédaction, et des tests qu'elle exécute elle-même, un par un. En revanche, elle n'y compare pas les résultats avec et sans la skill, elle présente les résultats dans la conversation, et elle ne peut pas affiner automatiquement la description, qui demande l'outil en ligne de commande de Claude Code. Dans Cowork et dans Claude Code, elle peut lancer les tests en parallèle, les comparer à une version sans skill, vous ouvrir une page de résultats à relire et commenter, et optimiser la description sur une vingtaine de demandes. Conclusion pratique : pour une première skill simple, Chat suffit. Pour une skill qui compte, que toute une équipe va utiliser, passez par Cowork ou Code : vous aurez la version complète de la méthode. Dans Claude Code, si skill-creator n'est pas déjà disponible via votre compte, on l'installe avec le plugin d'exemples du dépôt anthropics/skills (commandes dans la fiche B8).</w:t>
       </w:r>
     </w:p>
     <w:p>
@@ -11254,7 +11076,7 @@
           <w:rFonts w:ascii="Calibri" w:cs="Calibri" w:eastAsia="Calibri" w:hAnsi="Calibri"/>
           <w:lang w:val="fr-FR"/>
         </w:rPr>
-        <w:t xml:space="preserve">Mais skill-creator ne fait pas tout partout. Voyons ce qui change selon la porte.</w:t>
+        <w:t xml:space="preserve">Entre Cowork et Code, justement : pour une skill, où est la différence ?</w:t>
       </w:r>
     </w:p>
     <w:p>
@@ -11274,7 +11096,7 @@
           <w:rFonts w:ascii="Calibri" w:cs="Calibri" w:eastAsia="Calibri" w:hAnsi="Calibri"/>
           <w:lang w:val="fr-FR"/>
         </w:rPr>
-        <w:t xml:space="preserve">Diapo 25 · skill-creator selon la porte</w:t>
+        <w:t xml:space="preserve">Diapo 25 · Cowork ou Code pour créer une skill ?</w:t>
       </w:r>
     </w:p>
     <w:p>
@@ -11288,7 +11110,7 @@
           <wp:inline distT="0" distB="0" distL="0" distR="0">
             <wp:extent cx="4191000" cy="2362200"/>
             <wp:effectExtent t="0" r="0" b="0" l="0"/>
-            <wp:docPr id="20" name="diapo25" descr="Diapo 25 : skill-creator selon la porte" title="Diapo 25"/>
+            <wp:docPr id="20" name="diapo25" descr="Diapo 25 : Cowork ou Code pour créer une skill ?" title="Diapo 25"/>
             <wp:cNvGraphicFramePr>
               <a:graphicFrameLocks xmlns:a="http://schemas.openxmlformats.org/drawingml/2006/main" noChangeAspect="1"/>
             </wp:cNvGraphicFramePr>
@@ -11344,7 +11166,7 @@
           <w:rFonts w:ascii="Calibri" w:cs="Calibri" w:eastAsia="Calibri" w:hAnsi="Calibri"/>
           <w:lang w:val="fr-FR"/>
         </w:rPr>
-        <w:t xml:space="preserve">Montrer que skill-creator est plus complète dans Cowork et Code, et en faire un argument pour oser Code.</w:t>
+        <w:t xml:space="preserve">Distinguer Cowork et Code pour la création de skills : où vit la skill, ce que chacun permet, comment on partage.</w:t>
       </w:r>
     </w:p>
     <w:p>
@@ -11367,7 +11189,7 @@
           <w:rFonts w:ascii="Calibri" w:cs="Calibri" w:eastAsia="Calibri" w:hAnsi="Calibri"/>
           <w:lang w:val="fr-FR"/>
         </w:rPr>
-        <w:t xml:space="preserve">1:30</w:t>
+        <w:t xml:space="preserve">2:00</w:t>
       </w:r>
     </w:p>
     <w:p>
@@ -11392,7 +11214,30 @@
           <w:rFonts w:ascii="Calibri" w:cs="Calibri" w:eastAsia="Calibri" w:hAnsi="Calibri"/>
           <w:lang w:val="fr-FR"/>
         </w:rPr>
-        <w:t xml:space="preserve">skill-creator s'adapte à l'endroit où elle tourne, et ses propres instructions le disent. Dans Chat, elle fait l'essentiel : l'entretien, la rédaction, et des tests qu'elle exécute elle-même, un par un. En revanche, elle n'y compare pas les résultats avec et sans la skill, elle présente les résultats dans la conversation, et elle ne peut pas affiner automatiquement la description, qui demande l'outil en ligne de commande de Claude Code. Dans Cowork et dans Claude Code, elle peut lancer les tests en parallèle, les comparer à une version sans skill, vous ouvrir une page de résultats à relire et commenter, et optimiser la description sur une vingtaine de demandes. Conclusion pratique : pour une première skill simple, Chat suffit. Pour une skill qui compte, que toute une équipe va utiliser, passez par Cowork ou Code : vous aurez la version complète de la méthode. Dans Claude Code, si skill-creator n'est pas déjà disponible via votre compte, on l'installe avec le plugin d'exemples du dépôt anthropics/skills (commandes dans la fiche B8).</w:t>
+        <w:t xml:space="preserve">Cowork et Code savent tous deux créer une skill avec la méthode complète de skill-creator. La vraie différence, c'est l'endroit où la skill vit. Dans Cowork, elle vit dans votre compte Claude : skill-creator vous remet un fichier .skill, vous cliquez sur « Save skill », et elle est disponible partout où vous êtes connecté, dans Chat, dans Cowork et même dans Claude Code. Dans Code, la skill est un simple dossier, rangé dans .claude/skills du projet ou dans votre dossier personnel : rien à importer, elle marche tout de suite, mais seulement dans Claude Code. La synchronisation va du compte vers Code, jamais dans l'autre sens : pour l'avoir aussi dans Cowork, on compresse le dossier et on l'importe dans le compte. Deuxième différence : Code sait faire des choses que Cowork ne sait pas. Une skill écrite pour Code peut recevoir des paramètres (par exemple /compte-rendu réunion-du-12), lancer une commande pour récupérer des données fraîches avant de démarrer, ou être réservée à un lancement manuel, pour une action sensible. On y a aussi le mode plan, l'historique des versions et la relecture de chaque modification. Troisième différence, le partage : dans Cowork, on publie la skill dans l'organisation (offres Team et Enterprise) ; dans Code, on la range dans le dépôt Git du projet, et toute l'équipe l'obtient avec le projet. Un détail pratique pour la relecture des tests : dans Cowork, skill-creator produit une page de résultats à ouvrir soi-même ; dans Code, elle s'ouvre directement. En pratique : une skill métier pour tous, utilisée dans l'interface de Claude, c'est Cowork. Une skill qu'on veut versionner, faire relire ou partager avec une équipe technique, c'est Code. Et le meilleur des deux mondes : créer et tester dans Code, puis importer le fichier .skill dans le compte pour que tout le monde en profite.</w:t>
+      </w:r>
+    </w:p>
+    <w:p>
+      <w:pPr>
+        <w:pStyle w:val="Body"/>
+        <w:spacing w:after="120"/>
+      </w:pPr>
+      <w:r>
+        <w:rPr>
+          <w:rFonts w:ascii="Calibri" w:cs="Calibri" w:eastAsia="Calibri" w:hAnsi="Calibri"/>
+          <w:b/>
+          <w:bCs/>
+          <w:color w:val="2F5FC4"/>
+          <w:lang w:val="fr-FR"/>
+        </w:rPr>
+        <w:t xml:space="preserve">Question à la salle — </w:t>
+      </w:r>
+      <w:r>
+        <w:rPr>
+          <w:rFonts w:ascii="Calibri" w:cs="Calibri" w:eastAsia="Calibri" w:hAnsi="Calibri"/>
+          <w:lang w:val="fr-FR"/>
+        </w:rPr>
+        <w:t xml:space="preserve">Pour la skill que vous avez en tête : qui doit l'utiliser, et où ? Cela vous dit déjà quelle porte choisir.</w:t>
       </w:r>
     </w:p>
     <w:p>
@@ -11415,7 +11260,7 @@
           <w:rFonts w:ascii="Calibri" w:cs="Calibri" w:eastAsia="Calibri" w:hAnsi="Calibri"/>
           <w:lang w:val="fr-FR"/>
         </w:rPr>
-        <w:t xml:space="preserve">Entre Cowork et Code, justement : pour une skill, où est la différence ?</w:t>
+        <w:t xml:space="preserve">Voyons maintenant skill-creator à l'œuvre.</w:t>
       </w:r>
     </w:p>
     <w:p>
@@ -11435,7 +11280,7 @@
           <w:rFonts w:ascii="Calibri" w:cs="Calibri" w:eastAsia="Calibri" w:hAnsi="Calibri"/>
           <w:lang w:val="fr-FR"/>
         </w:rPr>
-        <w:t xml:space="preserve">Diapo 26 · Cowork ou Code pour créer une skill ?</w:t>
+        <w:t xml:space="preserve">Diapo 26 · Démo : on le demande à Claude</w:t>
       </w:r>
     </w:p>
     <w:p>
@@ -11449,7 +11294,7 @@
           <wp:inline distT="0" distB="0" distL="0" distR="0">
             <wp:extent cx="4191000" cy="2362200"/>
             <wp:effectExtent t="0" r="0" b="0" l="0"/>
-            <wp:docPr id="21" name="diapo26" descr="Diapo 26 : Cowork ou Code pour créer une skill ?" title="Diapo 26"/>
+            <wp:docPr id="21" name="diapo26" descr="Diapo 26 : Démo : on le demande à Claude" title="Diapo 26"/>
             <wp:cNvGraphicFramePr>
               <a:graphicFrameLocks xmlns:a="http://schemas.openxmlformats.org/drawingml/2006/main" noChangeAspect="1"/>
             </wp:cNvGraphicFramePr>
@@ -11505,7 +11350,7 @@
           <w:rFonts w:ascii="Calibri" w:cs="Calibri" w:eastAsia="Calibri" w:hAnsi="Calibri"/>
           <w:lang w:val="fr-FR"/>
         </w:rPr>
-        <w:t xml:space="preserve">Distinguer Cowork et Code pour la création de skills : où vit la skill, ce que chacun permet, comment on partage.</w:t>
+        <w:t xml:space="preserve">Démystifier la création par une démonstration courte (en direct, ou sur la maquette si le réseau fait défaut).</w:t>
       </w:r>
     </w:p>
     <w:p>
@@ -11528,7 +11373,7 @@
           <w:rFonts w:ascii="Calibri" w:cs="Calibri" w:eastAsia="Calibri" w:hAnsi="Calibri"/>
           <w:lang w:val="fr-FR"/>
         </w:rPr>
-        <w:t xml:space="preserve">2:00</w:t>
+        <w:t xml:space="preserve">3:00</w:t>
       </w:r>
     </w:p>
     <w:p>
@@ -11553,7 +11398,7 @@
           <w:rFonts w:ascii="Calibri" w:cs="Calibri" w:eastAsia="Calibri" w:hAnsi="Calibri"/>
           <w:lang w:val="fr-FR"/>
         </w:rPr>
-        <w:t xml:space="preserve">Cowork et Code savent tous deux créer une skill avec la méthode complète de skill-creator. La vraie différence, c'est l'endroit où la skill vit. Dans Cowork, elle vit dans votre compte Claude : skill-creator vous remet un fichier .skill, vous cliquez sur « Save skill », et elle est disponible partout où vous êtes connecté, dans Chat, dans Cowork et même dans Claude Code. Dans Code, la skill est un simple dossier, rangé dans .claude/skills du projet ou dans votre dossier personnel : rien à importer, elle marche tout de suite, mais seulement dans Claude Code. La synchronisation va du compte vers Code, jamais dans l'autre sens : pour l'avoir aussi dans Cowork, on compresse le dossier et on l'importe dans le compte. Deuxième différence : Code sait faire des choses que Cowork ne sait pas. Une skill écrite pour Code peut recevoir des paramètres (par exemple /compte-rendu réunion-du-12), lancer une commande pour récupérer des données fraîches avant de démarrer, ou être réservée à un lancement manuel, pour une action sensible. On y a aussi le mode plan, l'historique des versions et la relecture de chaque modification. Troisième différence, le partage : dans Cowork, on publie la skill dans l'organisation (offres Team et Enterprise) ; dans Code, on la range dans le dépôt Git du projet, et toute l'équipe l'obtient avec le projet. Un détail pratique pour la relecture des tests : dans Cowork, skill-creator produit une page de résultats à ouvrir soi-même ; dans Code, elle s'ouvre directement. En pratique : une skill métier pour tous, utilisée dans l'interface de Claude, c'est Cowork. Une skill qu'on veut versionner, faire relire ou partager avec une équipe technique, c'est Code. Et le meilleur des deux mondes : créer et tester dans Code, puis importer le fichier .skill dans le compte pour que tout le monde en profite. Réserve à mentionner : Cowork fusionne en ce moment avec Chat, l'interface peut évoluer.</w:t>
+        <w:t xml:space="preserve">Si la connexion le permet, faites la démo en direct dans Chat ; sinon, commentez la maquette. Tapez : « Aide-moi à créer une skill qui transforme mes notes de réunion en compte rendu à notre format. » Claude ouvre skill-creator : montrez à la salle la mention correspondante dans sa réflexion. Il pose les questions de la méthode : que doit faire la skill, quand la déclencher, quel format, qui lit ces comptes rendus, avez-vous un exemple ? Répondez, collez un ancien compte rendu réussi. Claude rédige le SKILL.md et vous le montre : faites lire la description à voix haute à la salle. Il propose ensuite deux ou trois demandes test : acceptez-les, c'est l'étape que tout le monde oublie. Puis il empaquette le tout en un fichier .skill : cliquez sur « Save skill » sur la carte du fichier (si ce bouton n'apparaît pas, par exemple parce que l'organisation ne l'autorise pas, téléchargez le fichier et importez-le avec le bouton « + »), puis vérifiez qu'il est activé dans la liste des skills (Personnaliser › Skills, ou Paramètres › Capacités selon l'interface). Enfin, testez : ouvrez une nouvelle conversation, collez des notes en vrac et dites simplement « tu peux m'en faire un compte rendu ? ». La skill doit se déclencher seule : on le voit à la mention « Using compte-rendu » (utilisation de la skill) dans la réflexion de Claude. Montrez cet indice à la salle, c'est le meilleur moyen de savoir si une skill a été utilisée. Si la démo prend du retard, arrêtez-vous après l'enregistrement : le test sera fait pendant l'atelier.</w:t>
       </w:r>
     </w:p>
     <w:p>
@@ -11576,7 +11421,7 @@
           <w:rFonts w:ascii="Calibri" w:cs="Calibri" w:eastAsia="Calibri" w:hAnsi="Calibri"/>
           <w:lang w:val="fr-FR"/>
         </w:rPr>
-        <w:t xml:space="preserve">Pour la skill que vous avez en tête : qui doit l'utiliser, et où ? Cela vous dit déjà quelle porte choisir.</w:t>
+        <w:t xml:space="preserve">Pendant que Claude rédige : « D'après vous, quelle question va-t-il nous poser ensuite ? »</w:t>
       </w:r>
     </w:p>
     <w:p>
@@ -11599,7 +11444,7 @@
           <w:rFonts w:ascii="Calibri" w:cs="Calibri" w:eastAsia="Calibri" w:hAnsi="Calibri"/>
           <w:lang w:val="fr-FR"/>
         </w:rPr>
-        <w:t xml:space="preserve">Voyons maintenant skill-creator à l'œuvre.</w:t>
+        <w:t xml:space="preserve">Ce qui fait la différence entre une skill moyenne et une bonne skill tient en trois secrets.</w:t>
       </w:r>
     </w:p>
     <w:p>
@@ -11619,7 +11464,7 @@
           <w:rFonts w:ascii="Calibri" w:cs="Calibri" w:eastAsia="Calibri" w:hAnsi="Calibri"/>
           <w:lang w:val="fr-FR"/>
         </w:rPr>
-        <w:t xml:space="preserve">Diapo 27 · Démo : on le demande à Claude</w:t>
+        <w:t xml:space="preserve">Diapo 27 · Les 3 secrets d'une bonne skill</w:t>
       </w:r>
     </w:p>
     <w:p>
@@ -11633,7 +11478,7 @@
           <wp:inline distT="0" distB="0" distL="0" distR="0">
             <wp:extent cx="4191000" cy="2362200"/>
             <wp:effectExtent t="0" r="0" b="0" l="0"/>
-            <wp:docPr id="22" name="diapo27" descr="Diapo 27 : Démo : on le demande à Claude" title="Diapo 27"/>
+            <wp:docPr id="22" name="diapo27" descr="Diapo 27 : Les 3 secrets d'une bonne skill" title="Diapo 27"/>
             <wp:cNvGraphicFramePr>
               <a:graphicFrameLocks xmlns:a="http://schemas.openxmlformats.org/drawingml/2006/main" noChangeAspect="1"/>
             </wp:cNvGraphicFramePr>
@@ -11689,7 +11534,7 @@
           <w:rFonts w:ascii="Calibri" w:cs="Calibri" w:eastAsia="Calibri" w:hAnsi="Calibri"/>
           <w:lang w:val="fr-FR"/>
         </w:rPr>
-        <w:t xml:space="preserve">Démystifier la création par une démonstration courte (en direct, ou sur la maquette si le réseau fait défaut).</w:t>
+        <w:t xml:space="preserve">Donner les trois critères de qualité à appliquer dès l'atelier.</w:t>
       </w:r>
     </w:p>
     <w:p>
@@ -11712,7 +11557,7 @@
           <w:rFonts w:ascii="Calibri" w:cs="Calibri" w:eastAsia="Calibri" w:hAnsi="Calibri"/>
           <w:lang w:val="fr-FR"/>
         </w:rPr>
-        <w:t xml:space="preserve">3:00</w:t>
+        <w:t xml:space="preserve">1:15</w:t>
       </w:r>
     </w:p>
     <w:p>
@@ -11737,30 +11582,7 @@
           <w:rFonts w:ascii="Calibri" w:cs="Calibri" w:eastAsia="Calibri" w:hAnsi="Calibri"/>
           <w:lang w:val="fr-FR"/>
         </w:rPr>
-        <w:t xml:space="preserve">Si la connexion le permet, faites la démo en direct dans Chat ; sinon, commentez la maquette. Tapez : « Aide-moi à créer une skill qui transforme mes notes de réunion en compte rendu à notre format. » Claude ouvre skill-creator : montrez à la salle la mention correspondante dans sa réflexion. Il pose les questions de la méthode : que doit faire la skill, quand la déclencher, quel format, qui lit ces comptes rendus, avez-vous un exemple ? Répondez, collez un ancien compte rendu réussi. Claude rédige le SKILL.md et vous le montre : faites lire la description à voix haute à la salle. Il propose ensuite deux ou trois demandes test : acceptez-les, c'est l'étape que tout le monde oublie. Puis il empaquette le tout en un fichier .skill : cliquez sur « Save skill » sur la carte du fichier (si ce bouton n'apparaît pas, par exemple parce que l'organisation ne l'autorise pas, téléchargez le fichier et importez-le avec le bouton « + »), puis vérifiez qu'il est activé dans la liste des skills (Personnaliser › Skills, ou Paramètres › Capacités selon l'interface). Enfin, testez : ouvrez une nouvelle conversation, collez des notes en vrac et dites simplement « tu peux m'en faire un compte rendu ? ». La skill doit se déclencher seule : on le voit à la mention « Using compte-rendu » (utilisation de la skill) dans la réflexion de Claude. Montrez cet indice à la salle, c'est le meilleur moyen de savoir si une skill a été utilisée. Si la démo prend du retard, arrêtez-vous après l'enregistrement : le test sera fait pendant l'atelier.</w:t>
-      </w:r>
-    </w:p>
-    <w:p>
-      <w:pPr>
-        <w:pStyle w:val="Body"/>
-        <w:spacing w:after="120"/>
-      </w:pPr>
-      <w:r>
-        <w:rPr>
-          <w:rFonts w:ascii="Calibri" w:cs="Calibri" w:eastAsia="Calibri" w:hAnsi="Calibri"/>
-          <w:b/>
-          <w:bCs/>
-          <w:color w:val="2F5FC4"/>
-          <w:lang w:val="fr-FR"/>
-        </w:rPr>
-        <w:t xml:space="preserve">Question à la salle — </w:t>
-      </w:r>
-      <w:r>
-        <w:rPr>
-          <w:rFonts w:ascii="Calibri" w:cs="Calibri" w:eastAsia="Calibri" w:hAnsi="Calibri"/>
-          <w:lang w:val="fr-FR"/>
-        </w:rPr>
-        <w:t xml:space="preserve">Pendant que Claude rédige : « D'après vous, quelle question va-t-il nous poser ensuite ? »</w:t>
+        <w:t xml:space="preserve">Premier secret : la description doit dire QUAND utiliser la skill, pas seulement ce qu'elle fait. « Compte rendu » ne suffit pas. Écrivez plutôt « Rédige un compte rendu de réunion à notre format. Utiliser quand l'utilisateur colle des notes de réunion ou demande un CR, une synthèse de réunion ou un relevé de décisions. » Écrivez-la comme la notice d'un outil, à la troisième personne (« Rédige… », pas « Je peux t'aider à… »), avec les mots que vos collègues emploient vraiment pour demander cette tâche. Deuxième secret : un exemple réussi vaut dix consignes. Claude imite très bien : donnez-lui un vrai compte rendu que vous aimez. Et dosez la liberté : des consignes souples pour une tâche de jugement (un compte rendu, un mail), des consignes strictes, voire un petit script, quand le résultat doit être identique à chaque fois (une charte graphique, un calcul). Troisième secret : une skill, une tâche. Mieux vaut trois petites skills claires qu'une grosse skill « tout-en-un » que Claude ne saura pas quand déclencher. Et restez concis : Claude est déjà très compétent, n'expliquez que ce qu'il ne peut pas deviner (votre format, vos règles, vos exemples). Si la skill grossit, gardez le SKILL.md court (moins de 500 lignes selon Anthropic) et rangez le détail dans des fichiers annexes que le SKILL.md cite directement, en disant quand les lire. Deux règles de forme : la description tient en 200 caractères maximum dans Claude, et le nom s'écrit en minuscules avec des tirets, sans les mots « claude » ni « anthropic ».</w:t>
       </w:r>
     </w:p>
     <w:p>
@@ -11783,7 +11605,7 @@
           <w:rFonts w:ascii="Calibri" w:cs="Calibri" w:eastAsia="Calibri" w:hAnsi="Calibri"/>
           <w:lang w:val="fr-FR"/>
         </w:rPr>
-        <w:t xml:space="preserve">Ce qui fait la différence entre une skill moyenne et une bonne skill tient en trois secrets.</w:t>
+        <w:t xml:space="preserve">Pour finir cette partie, un cas d'usage complet, proposé par Anthropic.</w:t>
       </w:r>
     </w:p>
     <w:p>
@@ -11803,7 +11625,7 @@
           <w:rFonts w:ascii="Calibri" w:cs="Calibri" w:eastAsia="Calibri" w:hAnsi="Calibri"/>
           <w:lang w:val="fr-FR"/>
         </w:rPr>
-        <w:t xml:space="preserve">Diapo 28 · Les 3 secrets d'une bonne skill</w:t>
+        <w:t xml:space="preserve">Diapo 28 · Cas d'usage : votre charte dans une skill</w:t>
       </w:r>
     </w:p>
     <w:p>
@@ -11817,7 +11639,7 @@
           <wp:inline distT="0" distB="0" distL="0" distR="0">
             <wp:extent cx="4191000" cy="2362200"/>
             <wp:effectExtent t="0" r="0" b="0" l="0"/>
-            <wp:docPr id="23" name="diapo28" descr="Diapo 28 : Les 3 secrets d'une bonne skill" title="Diapo 28"/>
+            <wp:docPr id="23" name="diapo28" descr="Diapo 28 : Cas d'usage : votre charte dans une skill" title="Diapo 28"/>
             <wp:cNvGraphicFramePr>
               <a:graphicFrameLocks xmlns:a="http://schemas.openxmlformats.org/drawingml/2006/main" noChangeAspect="1"/>
             </wp:cNvGraphicFramePr>
@@ -11873,7 +11695,7 @@
           <w:rFonts w:ascii="Calibri" w:cs="Calibri" w:eastAsia="Calibri" w:hAnsi="Calibri"/>
           <w:lang w:val="fr-FR"/>
         </w:rPr>
-        <w:t xml:space="preserve">Donner les trois critères de qualité à appliquer dès l'atelier.</w:t>
+        <w:t xml:space="preserve">Montrer un cas d'usage complet et officiel, que chacun pourra refaire seul.</w:t>
       </w:r>
     </w:p>
     <w:p>
@@ -11896,7 +11718,7 @@
           <w:rFonts w:ascii="Calibri" w:cs="Calibri" w:eastAsia="Calibri" w:hAnsi="Calibri"/>
           <w:lang w:val="fr-FR"/>
         </w:rPr>
-        <w:t xml:space="preserve">1:15</w:t>
+        <w:t xml:space="preserve">2:30</w:t>
       </w:r>
     </w:p>
     <w:p>
@@ -11921,7 +11743,30 @@
           <w:rFonts w:ascii="Calibri" w:cs="Calibri" w:eastAsia="Calibri" w:hAnsi="Calibri"/>
           <w:lang w:val="fr-FR"/>
         </w:rPr>
-        <w:t xml:space="preserve">Premier secret : la description doit dire QUAND utiliser la skill, pas seulement ce qu'elle fait. « Compte rendu » ne suffit pas. Écrivez plutôt « Rédige un compte rendu de réunion à notre format. Utiliser quand l'utilisateur colle des notes de réunion ou demande un CR, une synthèse de réunion ou un relevé de décisions. » Écrivez-la comme la notice d'un outil, à la troisième personne (« Rédige… », pas « Je peux t'aider à… »), avec les mots que vos collègues emploient vraiment pour demander cette tâche. Deuxième secret : un exemple réussi vaut dix consignes. Claude imite très bien : donnez-lui un vrai compte rendu que vous aimez. Et dosez la liberté : des consignes souples pour une tâche de jugement (un compte rendu, un mail), des consignes strictes, voire un petit script, quand le résultat doit être identique à chaque fois (une charte graphique, un calcul). Troisième secret : une skill, une tâche. Mieux vaut trois petites skills claires qu'une grosse skill « tout-en-un » que Claude ne saura pas quand déclencher. Et restez concis : Claude est déjà très compétent, n'expliquez que ce qu'il ne peut pas deviner (votre format, vos règles, vos exemples). Si la skill grossit, gardez le SKILL.md court (moins de 500 lignes selon Anthropic) et rangez le détail dans des fichiers annexes que le SKILL.md cite directement, en disant quand les lire. Deux règles de forme : la description tient en 200 caractères maximum dans Claude, et le nom s'écrit en minuscules avec des tirets, sans les mots « claude » ni « anthropic ».</w:t>
+        <w:t xml:space="preserve">Ce cas vient de Claude Academy, le site de formation d'Anthropic : « Empaquetez vos directives de marque dans un skill », environ vingt minutes. Le principe : vous donnez une fois pour toutes votre charte, et Claude l'applique à chaque présentation, document ou tableur, sans que vous ayez à la rappeler. À gauche, ce qu'on donne dans le prompt : la palette de couleurs avec le rôle de chacune (texte, fond, accent principal, accents secondaires), la typographie (une police pour les titres, une pour le texte, avec des polices de secours) et les règles d'application (quelle couleur pour quel élément, alterner les accents…). On peut aussi brancher Google Drive pour que Claude lise le fichier de charte lui-même. Au centre, ce que Claude crée : le SKILL.md, un fichier détaillé sur les couleurs et la typographie, des exemples d'usage et un petit script qui applique les couleurs toujours de la même façon. Vous n'avez pas à comprendre le script : il garantit simplement un résultat identique à chaque fois. Enfin, on teste avec une demande qui ne parle pas de charte : « crée une présentation de bilan trimestriel ». Si les couleurs et les polices sont justes, la skill fonctionne. La page propose ensuite de mettre à jour la skill et de la combiner avec d'autres. Le QR code mène à la ressource.</w:t>
+      </w:r>
+    </w:p>
+    <w:p>
+      <w:pPr>
+        <w:pStyle w:val="Body"/>
+        <w:spacing w:after="120"/>
+      </w:pPr>
+      <w:r>
+        <w:rPr>
+          <w:rFonts w:ascii="Calibri" w:cs="Calibri" w:eastAsia="Calibri" w:hAnsi="Calibri"/>
+          <w:b/>
+          <w:bCs/>
+          <w:color w:val="2F5FC4"/>
+          <w:lang w:val="fr-FR"/>
+        </w:rPr>
+        <w:t xml:space="preserve">Question à la salle — </w:t>
+      </w:r>
+      <w:r>
+        <w:rPr>
+          <w:rFonts w:ascii="Calibri" w:cs="Calibri" w:eastAsia="Calibri" w:hAnsi="Calibri"/>
+          <w:lang w:val="fr-FR"/>
+        </w:rPr>
+        <w:t xml:space="preserve">Qui a une charte graphique dans sa structure ? Où est-elle rangée aujourd'hui ?</w:t>
       </w:r>
     </w:p>
     <w:p>
@@ -11944,7 +11789,7 @@
           <w:rFonts w:ascii="Calibri" w:cs="Calibri" w:eastAsia="Calibri" w:hAnsi="Calibri"/>
           <w:lang w:val="fr-FR"/>
         </w:rPr>
-        <w:t xml:space="preserve">Pour finir cette partie, un cas d'usage complet, proposé par Anthropic.</w:t>
+        <w:t xml:space="preserve">Ce même cas se réalise dans les trois portes. Comparons.</w:t>
       </w:r>
     </w:p>
     <w:p>
@@ -11964,7 +11809,7 @@
           <w:rFonts w:ascii="Calibri" w:cs="Calibri" w:eastAsia="Calibri" w:hAnsi="Calibri"/>
           <w:lang w:val="fr-FR"/>
         </w:rPr>
-        <w:t xml:space="preserve">Diapo 29 · Cas d'usage : votre charte dans une skill</w:t>
+        <w:t xml:space="preserve">Diapo 29 · Même charte, trois portes</w:t>
       </w:r>
     </w:p>
     <w:p>
@@ -11978,7 +11823,7 @@
           <wp:inline distT="0" distB="0" distL="0" distR="0">
             <wp:extent cx="4191000" cy="2362200"/>
             <wp:effectExtent t="0" r="0" b="0" l="0"/>
-            <wp:docPr id="24" name="diapo29" descr="Diapo 29 : Cas d'usage : votre charte dans une skill" title="Diapo 29"/>
+            <wp:docPr id="24" name="diapo29" descr="Diapo 29 : Même charte, trois portes" title="Diapo 29"/>
             <wp:cNvGraphicFramePr>
               <a:graphicFrameLocks xmlns:a="http://schemas.openxmlformats.org/drawingml/2006/main" noChangeAspect="1"/>
             </wp:cNvGraphicFramePr>
@@ -12034,7 +11879,7 @@
           <w:rFonts w:ascii="Calibri" w:cs="Calibri" w:eastAsia="Calibri" w:hAnsi="Calibri"/>
           <w:lang w:val="fr-FR"/>
         </w:rPr>
-        <w:t xml:space="preserve">Montrer un cas d'usage complet et officiel, que chacun pourra refaire seul.</w:t>
+        <w:t xml:space="preserve">Relier le cas d'usage aux avantages de chaque porte, et montrer que Code est une option réaliste.</w:t>
       </w:r>
     </w:p>
     <w:p>
@@ -12057,7 +11902,7 @@
           <w:rFonts w:ascii="Calibri" w:cs="Calibri" w:eastAsia="Calibri" w:hAnsi="Calibri"/>
           <w:lang w:val="fr-FR"/>
         </w:rPr>
-        <w:t xml:space="preserve">2:30</w:t>
+        <w:t xml:space="preserve">1:30</w:t>
       </w:r>
     </w:p>
     <w:p>
@@ -12082,30 +11927,7 @@
           <w:rFonts w:ascii="Calibri" w:cs="Calibri" w:eastAsia="Calibri" w:hAnsi="Calibri"/>
           <w:lang w:val="fr-FR"/>
         </w:rPr>
-        <w:t xml:space="preserve">Ce cas vient de Claude Academy, le site de formation d'Anthropic : « Empaquetez vos directives de marque dans un skill », environ vingt minutes. Le principe : vous donnez une fois pour toutes votre charte, et Claude l'applique à chaque présentation, document ou tableur, sans que vous ayez à la rappeler. À gauche, ce qu'on donne dans le prompt : la palette de couleurs avec le rôle de chacune (texte, fond, accent principal, accents secondaires), la typographie (une police pour les titres, une pour le texte, avec des polices de secours) et les règles d'application (quelle couleur pour quel élément, alterner les accents…). On peut aussi brancher Google Drive pour que Claude lise le fichier de charte lui-même. Au centre, ce que Claude crée : le SKILL.md, un fichier détaillé sur les couleurs et la typographie, des exemples d'usage et un petit script qui applique les couleurs toujours de la même façon. Vous n'avez pas à comprendre le script : il garantit simplement un résultat identique à chaque fois. Enfin, on teste avec une demande qui ne parle pas de charte : « crée une présentation de bilan trimestriel ». Si les couleurs et les polices sont justes, la skill fonctionne. La page propose ensuite de mettre à jour la skill et de la combiner avec d'autres. Le QR code mène à la ressource.</w:t>
-      </w:r>
-    </w:p>
-    <w:p>
-      <w:pPr>
-        <w:pStyle w:val="Body"/>
-        <w:spacing w:after="120"/>
-      </w:pPr>
-      <w:r>
-        <w:rPr>
-          <w:rFonts w:ascii="Calibri" w:cs="Calibri" w:eastAsia="Calibri" w:hAnsi="Calibri"/>
-          <w:b/>
-          <w:bCs/>
-          <w:color w:val="2F5FC4"/>
-          <w:lang w:val="fr-FR"/>
-        </w:rPr>
-        <w:t xml:space="preserve">Question à la salle — </w:t>
-      </w:r>
-      <w:r>
-        <w:rPr>
-          <w:rFonts w:ascii="Calibri" w:cs="Calibri" w:eastAsia="Calibri" w:hAnsi="Calibri"/>
-          <w:lang w:val="fr-FR"/>
-        </w:rPr>
-        <w:t xml:space="preserve">Qui a une charte graphique dans sa structure ? Où est-elle rangée aujourd'hui ?</w:t>
+        <w:t xml:space="preserve">Même objectif, trois chemins. Dans Chat, vous collez le prompt de la page Academy avec vos couleurs et vos règles : Claude crée le fichier de skill et vous l'enregistrez dans votre compte. C'est le chemin décrit par la ressource. Dans Cowork, vous pointez le dossier qui contient votre charte en PDF : Claude la lit lui-même, crée la skill et produit une présentation d'exemple pour vérifier. Dans Code, vous faites pareil en mode plan : vous relisez la structure proposée, vous la corrigez, puis Claude écrit les fichiers et vous testez aussitôt avec /charte-graphique. Le résultat est le même : une skill qui applique votre charte partout. Ce qui change, c'est votre niveau de contrôle. Pendant l'atelier, vous pourrez suivre ce cas dans la porte de votre choix.</w:t>
       </w:r>
     </w:p>
     <w:p>
@@ -12128,7 +11950,7 @@
           <w:rFonts w:ascii="Calibri" w:cs="Calibri" w:eastAsia="Calibri" w:hAnsi="Calibri"/>
           <w:lang w:val="fr-FR"/>
         </w:rPr>
-        <w:t xml:space="preserve">Ce même cas se réalise dans les trois portes. Comparons.</w:t>
+        <w:t xml:space="preserve">Votre skill fonctionne : comment en faire profiter les autres ?</w:t>
       </w:r>
     </w:p>
     <w:p>
@@ -12148,7 +11970,114 @@
           <w:rFonts w:ascii="Calibri" w:cs="Calibri" w:eastAsia="Calibri" w:hAnsi="Calibri"/>
           <w:lang w:val="fr-FR"/>
         </w:rPr>
-        <w:t xml:space="preserve">Diapo 30 · Même charte, trois portes</w:t>
+        <w:t xml:space="preserve">Diapo 30 · Partager</w:t>
+      </w:r>
+    </w:p>
+    <w:p>
+      <w:pPr>
+        <w:pStyle w:val="Body"/>
+        <w:spacing w:after="120"/>
+      </w:pPr>
+      <w:r>
+        <w:rPr>
+          <w:rFonts w:ascii="Calibri" w:cs="Calibri" w:eastAsia="Calibri" w:hAnsi="Calibri"/>
+          <w:i/>
+          <w:iCs/>
+          <w:color w:val="566070"/>
+          <w:lang w:val="fr-FR"/>
+        </w:rPr>
+        <w:t xml:space="preserve">Diapo d'ouverture de partie : grand numéro et titre sur fond framboise.</w:t>
+      </w:r>
+    </w:p>
+    <w:p>
+      <w:pPr>
+        <w:pStyle w:val="Body"/>
+        <w:spacing w:after="120"/>
+      </w:pPr>
+      <w:r>
+        <w:rPr>
+          <w:rFonts w:ascii="Calibri" w:cs="Calibri" w:eastAsia="Calibri" w:hAnsi="Calibri"/>
+          <w:b/>
+          <w:bCs/>
+          <w:color w:val="B8235A"/>
+          <w:lang w:val="fr-FR"/>
+        </w:rPr>
+        <w:t xml:space="preserve">Objectif — </w:t>
+      </w:r>
+      <w:r>
+        <w:rPr>
+          <w:rFonts w:ascii="Calibri" w:cs="Calibri" w:eastAsia="Calibri" w:hAnsi="Calibri"/>
+          <w:lang w:val="fr-FR"/>
+        </w:rPr>
+        <w:t xml:space="preserve">Marquer le passage à la partie 6 et relancer l'attention.</w:t>
+      </w:r>
+    </w:p>
+    <w:p>
+      <w:pPr>
+        <w:pStyle w:val="Body"/>
+        <w:spacing w:after="120"/>
+      </w:pPr>
+      <w:r>
+        <w:rPr>
+          <w:rFonts w:ascii="Calibri" w:cs="Calibri" w:eastAsia="Calibri" w:hAnsi="Calibri"/>
+          <w:b/>
+          <w:bCs/>
+          <w:color w:val="566070"/>
+          <w:lang w:val="fr-FR"/>
+        </w:rPr>
+        <w:t xml:space="preserve">Timing — </w:t>
+      </w:r>
+      <w:r>
+        <w:rPr>
+          <w:rFonts w:ascii="Calibri" w:cs="Calibri" w:eastAsia="Calibri" w:hAnsi="Calibri"/>
+          <w:lang w:val="fr-FR"/>
+        </w:rPr>
+        <w:t xml:space="preserve">0:10</w:t>
+      </w:r>
+    </w:p>
+    <w:p>
+      <w:pPr>
+        <w:pStyle w:val="Heading3"/>
+      </w:pPr>
+      <w:r>
+        <w:rPr>
+          <w:rFonts w:ascii="Calibri" w:cs="Calibri" w:eastAsia="Calibri" w:hAnsi="Calibri"/>
+          <w:lang w:val="fr-FR"/>
+        </w:rPr>
+        <w:t xml:space="preserve">Script</w:t>
+      </w:r>
+    </w:p>
+    <w:p>
+      <w:pPr>
+        <w:pStyle w:val="Body"/>
+        <w:spacing w:after="120"/>
+      </w:pPr>
+      <w:r>
+        <w:rPr>
+          <w:rFonts w:ascii="Calibri" w:cs="Calibri" w:eastAsia="Calibri" w:hAnsi="Calibri"/>
+          <w:lang w:val="fr-FR"/>
+        </w:rPr>
+        <w:t xml:space="preserve">Dernière étape avant le quiz : comment faire profiter les autres de votre skill, selon votre offre et votre public. Laissez la diapo quelques secondes, le temps que la salle se repère dans le programme.</w:t>
+      </w:r>
+    </w:p>
+    <w:p>
+      <w:pPr>
+        <w:pStyle w:val="Body"/>
+      </w:pPr>
+      <w:r>
+        <w:br w:type="page"/>
+      </w:r>
+    </w:p>
+    <w:p>
+      <w:pPr>
+        <w:pStyle w:val="Heading2"/>
+      </w:pPr>
+      <w:r>
+        <w:rPr>
+          <w:rFonts w:ascii="Calibri" w:cs="Calibri" w:eastAsia="Calibri" w:hAnsi="Calibri"/>
+          <w:lang w:val="fr-FR"/>
+        </w:rPr>
+        <w:t xml:space="preserve">Diapo 31 · Partager : trois cercles</w:t>
       </w:r>
     </w:p>
     <w:p>
@@ -12162,7 +12091,7 @@
           <wp:inline distT="0" distB="0" distL="0" distR="0">
             <wp:extent cx="4191000" cy="2362200"/>
             <wp:effectExtent t="0" r="0" b="0" l="0"/>
-            <wp:docPr id="25" name="diapo30" descr="Diapo 30 : Même charte, trois portes" title="Diapo 30"/>
+            <wp:docPr id="25" name="diapo31" descr="Diapo 31 : Partager : trois cercles" title="Diapo 31"/>
             <wp:cNvGraphicFramePr>
               <a:graphicFrameLocks xmlns:a="http://schemas.openxmlformats.org/drawingml/2006/main" noChangeAspect="1"/>
             </wp:cNvGraphicFramePr>
@@ -12218,7 +12147,7 @@
           <w:rFonts w:ascii="Calibri" w:cs="Calibri" w:eastAsia="Calibri" w:hAnsi="Calibri"/>
           <w:lang w:val="fr-FR"/>
         </w:rPr>
-        <w:t xml:space="preserve">Relier le cas d'usage aux avantages de chaque porte, et montrer que Code est une option réaliste.</w:t>
+        <w:t xml:space="preserve">Présenter les modes de partage selon l'offre Claude et le public visé.</w:t>
       </w:r>
     </w:p>
     <w:p>
@@ -12241,7 +12170,7 @@
           <w:rFonts w:ascii="Calibri" w:cs="Calibri" w:eastAsia="Calibri" w:hAnsi="Calibri"/>
           <w:lang w:val="fr-FR"/>
         </w:rPr>
-        <w:t xml:space="preserve">1:30</w:t>
+        <w:t xml:space="preserve">2:30</w:t>
       </w:r>
     </w:p>
     <w:p>
@@ -12266,7 +12195,30 @@
           <w:rFonts w:ascii="Calibri" w:cs="Calibri" w:eastAsia="Calibri" w:hAnsi="Calibri"/>
           <w:lang w:val="fr-FR"/>
         </w:rPr>
-        <w:t xml:space="preserve">Même objectif, trois chemins. Dans Chat, vous collez le prompt de la page Academy avec vos couleurs et vos règles : Claude crée le fichier de skill et vous l'enregistrez dans votre compte. C'est le chemin décrit par la ressource. Dans Cowork, vous pointez le dossier qui contient votre charte en PDF : Claude la lit lui-même, crée la skill et produit une présentation d'exemple pour vérifier. Dans Code, vous faites pareil en mode plan : vous relisez la structure proposée, vous la corrigez, puis Claude écrit les fichiers et vous testez aussitôt avec /charte-graphique. Le résultat est le même : une skill qui applique votre charte partout. Ce qui change, c'est votre niveau de contrôle. Pendant l'atelier, vous pourrez suivre ce cas dans la porte de votre choix.</w:t>
+        <w:t xml:space="preserve">Premier cercle, vous-même et quelques personnes : on envoie le fichier de la skill (celui que Claude vous a remis à la création, ou un .zip du dossier ; selon la version, le menu de la skill propose aussi de la télécharger, à vérifier le jour J). Le destinataire l'importe avec le bouton « + ». Ça marche quelle que soit l'offre, gratuite, Pro ou Max. Deuxième cercle, votre équipe : en offre Team ou Enterprise, le menu « … » d'une skill propose « Partager » à des collègues choisis (ils peuvent l'activer, pas la modifier) et « Publier dans l'organisation » pour la rendre disponible à tous. Selon le réglage de l'administrateur, la publication peut passer par une relecture ; les skills fournies par l'administrateur sont activées d'office pour tout le monde. Troisième cercle, tout le monde : on publie le dossier sur GitHub, ou on l'emballe dans un plugin avec d'autres skills. Pour les équipes tech, il suffit aussi de déposer la skill dans le dossier .claude/skills d'un projet de code : toute l'équipe l'aura. Rappel : ce que vous partagez, les autres vont le lire… et Claude va l'exécuter. Relisez avant de publier, et n'y mettez jamais de mot de passe ni de donnée personnelle.</w:t>
+      </w:r>
+    </w:p>
+    <w:p>
+      <w:pPr>
+        <w:pStyle w:val="Body"/>
+        <w:spacing w:after="120"/>
+      </w:pPr>
+      <w:r>
+        <w:rPr>
+          <w:rFonts w:ascii="Calibri" w:cs="Calibri" w:eastAsia="Calibri" w:hAnsi="Calibri"/>
+          <w:b/>
+          <w:bCs/>
+          <w:color w:val="2F5FC4"/>
+          <w:lang w:val="fr-FR"/>
+        </w:rPr>
+        <w:t xml:space="preserve">Question à la salle — </w:t>
+      </w:r>
+      <w:r>
+        <w:rPr>
+          <w:rFonts w:ascii="Calibri" w:cs="Calibri" w:eastAsia="Calibri" w:hAnsi="Calibri"/>
+          <w:lang w:val="fr-FR"/>
+        </w:rPr>
+        <w:t xml:space="preserve">Dans votre structure, quelle offre avez-vous : individuelle, Team, Enterprise ? Qui est l'administrateur ?</w:t>
       </w:r>
     </w:p>
     <w:p>
@@ -12289,7 +12241,7 @@
           <w:rFonts w:ascii="Calibri" w:cs="Calibri" w:eastAsia="Calibri" w:hAnsi="Calibri"/>
           <w:lang w:val="fr-FR"/>
         </w:rPr>
-        <w:t xml:space="preserve">Votre skill fonctionne : comment en faire profiter les autres ?</w:t>
+        <w:t xml:space="preserve">Vous avez tout. Place au quiz !</w:t>
       </w:r>
     </w:p>
     <w:p>
@@ -12309,114 +12261,7 @@
           <w:rFonts w:ascii="Calibri" w:cs="Calibri" w:eastAsia="Calibri" w:hAnsi="Calibri"/>
           <w:lang w:val="fr-FR"/>
         </w:rPr>
-        <w:t xml:space="preserve">Diapo 31 · Partager</w:t>
-      </w:r>
-    </w:p>
-    <w:p>
-      <w:pPr>
-        <w:pStyle w:val="Body"/>
-        <w:spacing w:after="120"/>
-      </w:pPr>
-      <w:r>
-        <w:rPr>
-          <w:rFonts w:ascii="Calibri" w:cs="Calibri" w:eastAsia="Calibri" w:hAnsi="Calibri"/>
-          <w:i/>
-          <w:iCs/>
-          <w:color w:val="566070"/>
-          <w:lang w:val="fr-FR"/>
-        </w:rPr>
-        <w:t xml:space="preserve">Diapo d'ouverture de partie : grand numéro et titre sur fond framboise.</w:t>
-      </w:r>
-    </w:p>
-    <w:p>
-      <w:pPr>
-        <w:pStyle w:val="Body"/>
-        <w:spacing w:after="120"/>
-      </w:pPr>
-      <w:r>
-        <w:rPr>
-          <w:rFonts w:ascii="Calibri" w:cs="Calibri" w:eastAsia="Calibri" w:hAnsi="Calibri"/>
-          <w:b/>
-          <w:bCs/>
-          <w:color w:val="B8235A"/>
-          <w:lang w:val="fr-FR"/>
-        </w:rPr>
-        <w:t xml:space="preserve">Objectif — </w:t>
-      </w:r>
-      <w:r>
-        <w:rPr>
-          <w:rFonts w:ascii="Calibri" w:cs="Calibri" w:eastAsia="Calibri" w:hAnsi="Calibri"/>
-          <w:lang w:val="fr-FR"/>
-        </w:rPr>
-        <w:t xml:space="preserve">Marquer le passage à la partie 6 et relancer l'attention.</w:t>
-      </w:r>
-    </w:p>
-    <w:p>
-      <w:pPr>
-        <w:pStyle w:val="Body"/>
-        <w:spacing w:after="120"/>
-      </w:pPr>
-      <w:r>
-        <w:rPr>
-          <w:rFonts w:ascii="Calibri" w:cs="Calibri" w:eastAsia="Calibri" w:hAnsi="Calibri"/>
-          <w:b/>
-          <w:bCs/>
-          <w:color w:val="566070"/>
-          <w:lang w:val="fr-FR"/>
-        </w:rPr>
-        <w:t xml:space="preserve">Timing — </w:t>
-      </w:r>
-      <w:r>
-        <w:rPr>
-          <w:rFonts w:ascii="Calibri" w:cs="Calibri" w:eastAsia="Calibri" w:hAnsi="Calibri"/>
-          <w:lang w:val="fr-FR"/>
-        </w:rPr>
-        <w:t xml:space="preserve">0:10</w:t>
-      </w:r>
-    </w:p>
-    <w:p>
-      <w:pPr>
-        <w:pStyle w:val="Heading3"/>
-      </w:pPr>
-      <w:r>
-        <w:rPr>
-          <w:rFonts w:ascii="Calibri" w:cs="Calibri" w:eastAsia="Calibri" w:hAnsi="Calibri"/>
-          <w:lang w:val="fr-FR"/>
-        </w:rPr>
-        <w:t xml:space="preserve">Script</w:t>
-      </w:r>
-    </w:p>
-    <w:p>
-      <w:pPr>
-        <w:pStyle w:val="Body"/>
-        <w:spacing w:after="120"/>
-      </w:pPr>
-      <w:r>
-        <w:rPr>
-          <w:rFonts w:ascii="Calibri" w:cs="Calibri" w:eastAsia="Calibri" w:hAnsi="Calibri"/>
-          <w:lang w:val="fr-FR"/>
-        </w:rPr>
-        <w:t xml:space="preserve">Dernière étape avant le quiz : comment faire profiter les autres de votre skill, selon votre offre et votre public. Laissez la diapo quelques secondes, le temps que la salle se repère dans le programme.</w:t>
-      </w:r>
-    </w:p>
-    <w:p>
-      <w:pPr>
-        <w:pStyle w:val="Body"/>
-      </w:pPr>
-      <w:r>
-        <w:br w:type="page"/>
-      </w:r>
-    </w:p>
-    <w:p>
-      <w:pPr>
-        <w:pStyle w:val="Heading2"/>
-      </w:pPr>
-      <w:r>
-        <w:rPr>
-          <w:rFonts w:ascii="Calibri" w:cs="Calibri" w:eastAsia="Calibri" w:hAnsi="Calibri"/>
-          <w:lang w:val="fr-FR"/>
-        </w:rPr>
-        <w:t xml:space="preserve">Diapo 32 · Partager : trois cercles</w:t>
+        <w:t xml:space="preserve">Diapo 32 · Quiz : à vous de répondre !</w:t>
       </w:r>
     </w:p>
     <w:p>
@@ -12428,9 +12273,9 @@
       <w:r>
         <w:drawing>
           <wp:inline distT="0" distB="0" distL="0" distR="0">
-            <wp:extent cx="4191000" cy="2362200"/>
+            <wp:extent cx="2667000" cy="1504950"/>
             <wp:effectExtent t="0" r="0" b="0" l="0"/>
-            <wp:docPr id="26" name="diapo32" descr="Diapo 32 : Partager : trois cercles" title="Diapo 32"/>
+            <wp:docPr id="26" name="diapo32" descr="Diapo 32 : Quiz : à vous de répondre !" title="Diapo 32"/>
             <wp:cNvGraphicFramePr>
               <a:graphicFrameLocks xmlns:a="http://schemas.openxmlformats.org/drawingml/2006/main" noChangeAspect="1"/>
             </wp:cNvGraphicFramePr>
@@ -12453,7 +12298,7 @@
                   <pic:spPr bwMode="auto">
                     <a:xfrm>
                       <a:off x="0" y="0"/>
-                      <a:ext cx="4191000" cy="2362200"/>
+                      <a:ext cx="2667000" cy="1504950"/>
                     </a:xfrm>
                     <a:prstGeom prst="rect">
                       <a:avLst/>
@@ -12486,7 +12331,7 @@
           <w:rFonts w:ascii="Calibri" w:cs="Calibri" w:eastAsia="Calibri" w:hAnsi="Calibri"/>
           <w:lang w:val="fr-FR"/>
         </w:rPr>
-        <w:t xml:space="preserve">Présenter les modes de partage selon l'offre Claude et le public visé.</w:t>
+        <w:t xml:space="preserve">Lancer l'interaction orale et en poser la règle.</w:t>
       </w:r>
     </w:p>
     <w:p>
@@ -12509,7 +12354,7 @@
           <w:rFonts w:ascii="Calibri" w:cs="Calibri" w:eastAsia="Calibri" w:hAnsi="Calibri"/>
           <w:lang w:val="fr-FR"/>
         </w:rPr>
-        <w:t xml:space="preserve">2:30</w:t>
+        <w:t xml:space="preserve">0:30</w:t>
       </w:r>
     </w:p>
     <w:p>
@@ -12534,30 +12379,7 @@
           <w:rFonts w:ascii="Calibri" w:cs="Calibri" w:eastAsia="Calibri" w:hAnsi="Calibri"/>
           <w:lang w:val="fr-FR"/>
         </w:rPr>
-        <w:t xml:space="preserve">Premier cercle, vous-même et quelques personnes : on envoie le fichier de la skill (celui que Claude vous a remis à la création, ou un .zip du dossier ; selon la version, le menu de la skill propose aussi de la télécharger, à vérifier le jour J). Le destinataire l'importe avec le bouton « + ». Ça marche quelle que soit l'offre, gratuite, Pro ou Max. Deuxième cercle, votre équipe : en offre Team ou Enterprise, le menu « … » d'une skill propose « Partager » à des collègues choisis (ils peuvent l'activer, pas la modifier) et « Publier dans l'organisation » pour la rendre disponible à tous. Selon le réglage de l'administrateur, la publication peut passer par une relecture ; les skills fournies par l'administrateur sont activées d'office pour tout le monde. Troisième cercle, tout le monde : on publie le dossier sur GitHub, ou on l'emballe dans un plugin avec d'autres skills. Pour les équipes tech, il suffit aussi de déposer la skill dans le dossier .claude/skills d'un projet de code : toute l'équipe l'aura. Rappel : ce que vous partagez, les autres vont le lire… et Claude va l'exécuter. Relisez avant de publier, et n'y mettez jamais de mot de passe ni de donnée personnelle.</w:t>
-      </w:r>
-    </w:p>
-    <w:p>
-      <w:pPr>
-        <w:pStyle w:val="Body"/>
-        <w:spacing w:after="120"/>
-      </w:pPr>
-      <w:r>
-        <w:rPr>
-          <w:rFonts w:ascii="Calibri" w:cs="Calibri" w:eastAsia="Calibri" w:hAnsi="Calibri"/>
-          <w:b/>
-          <w:bCs/>
-          <w:color w:val="2F5FC4"/>
-          <w:lang w:val="fr-FR"/>
-        </w:rPr>
-        <w:t xml:space="preserve">Question à la salle — </w:t>
-      </w:r>
-      <w:r>
-        <w:rPr>
-          <w:rFonts w:ascii="Calibri" w:cs="Calibri" w:eastAsia="Calibri" w:hAnsi="Calibri"/>
-          <w:lang w:val="fr-FR"/>
-        </w:rPr>
-        <w:t xml:space="preserve">Dans votre structure, quelle offre avez-vous : individuelle, Team, Enterprise ? Qui est l'administrateur ?</w:t>
+        <w:t xml:space="preserve">Neuf questions, à l'oral. Je lis la question et les quatre réponses, je vous laisse quelques secondes de réflexion, puis vous répondez à voix haute : il suffit de dire la lettre. Pas de honte à se tromper : c'est justement ce qui nous intéresse. Quand les avis sont partagés, je demande à quelqu'un de défendre sa réponse avant de révéler la bonne.</w:t>
       </w:r>
     </w:p>
     <w:p>
@@ -12580,7 +12402,7 @@
           <w:rFonts w:ascii="Calibri" w:cs="Calibri" w:eastAsia="Calibri" w:hAnsi="Calibri"/>
           <w:lang w:val="fr-FR"/>
         </w:rPr>
-        <w:t xml:space="preserve">Vous avez tout. Sortez vos cartons : c'est l'heure du quiz !</w:t>
+        <w:t xml:space="preserve">Question 1.</w:t>
       </w:r>
     </w:p>
     <w:p>
@@ -12600,7 +12422,7 @@
           <w:rFonts w:ascii="Calibri" w:cs="Calibri" w:eastAsia="Calibri" w:hAnsi="Calibri"/>
           <w:lang w:val="fr-FR"/>
         </w:rPr>
-        <w:t xml:space="preserve">Diapo 33 · Quiz : levez votre carton !</w:t>
+        <w:t xml:space="preserve">Diapo 33 · Question 1</w:t>
       </w:r>
     </w:p>
     <w:p>
@@ -12614,7 +12436,7 @@
           <wp:inline distT="0" distB="0" distL="0" distR="0">
             <wp:extent cx="2667000" cy="1504950"/>
             <wp:effectExtent t="0" r="0" b="0" l="0"/>
-            <wp:docPr id="27" name="diapo33" descr="Diapo 33 : Quiz : levez votre carton !" title="Diapo 33"/>
+            <wp:docPr id="27" name="diapo33" descr="Diapo 33 : Question 1" title="Diapo 33"/>
             <wp:cNvGraphicFramePr>
               <a:graphicFrameLocks xmlns:a="http://schemas.openxmlformats.org/drawingml/2006/main" noChangeAspect="1"/>
             </wp:cNvGraphicFramePr>
@@ -12670,7 +12492,7 @@
           <w:rFonts w:ascii="Calibri" w:cs="Calibri" w:eastAsia="Calibri" w:hAnsi="Calibri"/>
           <w:lang w:val="fr-FR"/>
         </w:rPr>
-        <w:t xml:space="preserve">Lancer l'interaction et vérifier que chacun a ses cartons.</w:t>
+        <w:t xml:space="preserve">Question 1 : faire voter la salle.</w:t>
       </w:r>
     </w:p>
     <w:p>
@@ -12693,7 +12515,7 @@
           <w:rFonts w:ascii="Calibri" w:cs="Calibri" w:eastAsia="Calibri" w:hAnsi="Calibri"/>
           <w:lang w:val="fr-FR"/>
         </w:rPr>
-        <w:t xml:space="preserve">0:30</w:t>
+        <w:t xml:space="preserve">0:40</w:t>
       </w:r>
     </w:p>
     <w:p>
@@ -12718,7 +12540,30 @@
           <w:rFonts w:ascii="Calibri" w:cs="Calibri" w:eastAsia="Calibri" w:hAnsi="Calibri"/>
           <w:lang w:val="fr-FR"/>
         </w:rPr>
-        <w:t xml:space="preserve">Neuf questions. Pour chacune, je lis la question et les quatre réponses, je compte jusqu'à trois et tout le monde lève son carton en même temps. Pas de honte à se tromper : c'est justement ce qui nous intéresse. On regarde la répartition des couleurs dans la salle, puis je révèle la bonne réponse. Si vous n'avez pas de cartons, levez 1 à 4 doigts : un doigt pour A, deux pour B, trois pour C, quatre pour D.</w:t>
+        <w:t xml:space="preserve">Lire la question : « Qu'est-ce qui décide Claude à utiliser une skill ? » Puis les réponses : A, Son nom de fichier ; B, Sa description ; C, Sa longueur ; D, Sa date de création. Laisser cinq secondes de réflexion, puis demander les réponses à voix haute. Relever les lettres entendues (« j'entends beaucoup de B… quelques C ») sans donner d'indice.</w:t>
+      </w:r>
+    </w:p>
+    <w:p>
+      <w:pPr>
+        <w:pStyle w:val="Body"/>
+        <w:spacing w:after="120"/>
+      </w:pPr>
+      <w:r>
+        <w:rPr>
+          <w:rFonts w:ascii="Calibri" w:cs="Calibri" w:eastAsia="Calibri" w:hAnsi="Calibri"/>
+          <w:b/>
+          <w:bCs/>
+          <w:color w:val="2F5FC4"/>
+          <w:lang w:val="fr-FR"/>
+        </w:rPr>
+        <w:t xml:space="preserve">Question à la salle — </w:t>
+      </w:r>
+      <w:r>
+        <w:rPr>
+          <w:rFonts w:ascii="Calibri" w:cs="Calibri" w:eastAsia="Calibri" w:hAnsi="Calibri"/>
+          <w:lang w:val="fr-FR"/>
+        </w:rPr>
+        <w:t xml:space="preserve">Un volontaire pour défendre une autre réponse que celle de la majorité ?</w:t>
       </w:r>
     </w:p>
     <w:p>
@@ -12741,7 +12586,7 @@
           <w:rFonts w:ascii="Calibri" w:cs="Calibri" w:eastAsia="Calibri" w:hAnsi="Calibri"/>
           <w:lang w:val="fr-FR"/>
         </w:rPr>
-        <w:t xml:space="preserve">Question 1.</w:t>
+        <w:t xml:space="preserve">Clic : révélation de la réponse.</w:t>
       </w:r>
     </w:p>
     <w:p>
@@ -12761,7 +12606,7 @@
           <w:rFonts w:ascii="Calibri" w:cs="Calibri" w:eastAsia="Calibri" w:hAnsi="Calibri"/>
           <w:lang w:val="fr-FR"/>
         </w:rPr>
-        <w:t xml:space="preserve">Diapo 34 · Question 1</w:t>
+        <w:t xml:space="preserve">Diapo 34 · Question 1 · réponse</w:t>
       </w:r>
     </w:p>
     <w:p>
@@ -12775,7 +12620,7 @@
           <wp:inline distT="0" distB="0" distL="0" distR="0">
             <wp:extent cx="2667000" cy="1504950"/>
             <wp:effectExtent t="0" r="0" b="0" l="0"/>
-            <wp:docPr id="28" name="diapo34" descr="Diapo 34 : Question 1" title="Diapo 34"/>
+            <wp:docPr id="28" name="diapo34" descr="Diapo 34 : Question 1 · réponse" title="Diapo 34"/>
             <wp:cNvGraphicFramePr>
               <a:graphicFrameLocks xmlns:a="http://schemas.openxmlformats.org/drawingml/2006/main" noChangeAspect="1"/>
             </wp:cNvGraphicFramePr>
@@ -12831,7 +12676,7 @@
           <w:rFonts w:ascii="Calibri" w:cs="Calibri" w:eastAsia="Calibri" w:hAnsi="Calibri"/>
           <w:lang w:val="fr-FR"/>
         </w:rPr>
-        <w:t xml:space="preserve">Question 1 : faire voter la salle.</w:t>
+        <w:t xml:space="preserve">Corriger et consolider la notion de la question 1.</w:t>
       </w:r>
     </w:p>
     <w:p>
@@ -12854,7 +12699,7 @@
           <w:rFonts w:ascii="Calibri" w:cs="Calibri" w:eastAsia="Calibri" w:hAnsi="Calibri"/>
           <w:lang w:val="fr-FR"/>
         </w:rPr>
-        <w:t xml:space="preserve">0:40</w:t>
+        <w:t xml:space="preserve">0:20</w:t>
       </w:r>
     </w:p>
     <w:p>
@@ -12879,30 +12724,7 @@
           <w:rFonts w:ascii="Calibri" w:cs="Calibri" w:eastAsia="Calibri" w:hAnsi="Calibri"/>
           <w:lang w:val="fr-FR"/>
         </w:rPr>
-        <w:t xml:space="preserve">Lire la question : « Qu'est-ce qui décide Claude à utiliser une skill ? » Puis les réponses : A, Son nom de fichier ; B, Sa description ; C, Sa longueur ; D, Sa date de création. Compter « 1, 2, 3, cartons ! » Observer la salle et commenter la répartition (« beaucoup de bleu… quelques verts… ») sans donner d'indice.</w:t>
-      </w:r>
-    </w:p>
-    <w:p>
-      <w:pPr>
-        <w:pStyle w:val="Body"/>
-        <w:spacing w:after="120"/>
-      </w:pPr>
-      <w:r>
-        <w:rPr>
-          <w:rFonts w:ascii="Calibri" w:cs="Calibri" w:eastAsia="Calibri" w:hAnsi="Calibri"/>
-          <w:b/>
-          <w:bCs/>
-          <w:color w:val="2F5FC4"/>
-          <w:lang w:val="fr-FR"/>
-        </w:rPr>
-        <w:t xml:space="preserve">Question à la salle — </w:t>
-      </w:r>
-      <w:r>
-        <w:rPr>
-          <w:rFonts w:ascii="Calibri" w:cs="Calibri" w:eastAsia="Calibri" w:hAnsi="Calibri"/>
-          <w:lang w:val="fr-FR"/>
-        </w:rPr>
-        <w:t xml:space="preserve">Un volontaire pour défendre une autre réponse que celle de la majorité ?</w:t>
+        <w:t xml:space="preserve">Bonne réponse : B, « Sa description ». Claude lit en permanence le nom et la description de chaque skill activée, et c'est la description qui fait l'essentiel du choix. Une description floue fait une skill qui ne se déclenche jamais, ou qui se déclenche à tort. C'est la phrase la plus importante de la skill.</w:t>
       </w:r>
     </w:p>
     <w:p>
@@ -12925,7 +12747,7 @@
           <w:rFonts w:ascii="Calibri" w:cs="Calibri" w:eastAsia="Calibri" w:hAnsi="Calibri"/>
           <w:lang w:val="fr-FR"/>
         </w:rPr>
-        <w:t xml:space="preserve">Clic : révélation de la réponse.</w:t>
+        <w:t xml:space="preserve">Question 2.</w:t>
       </w:r>
     </w:p>
     <w:p>
@@ -12945,7 +12767,7 @@
           <w:rFonts w:ascii="Calibri" w:cs="Calibri" w:eastAsia="Calibri" w:hAnsi="Calibri"/>
           <w:lang w:val="fr-FR"/>
         </w:rPr>
-        <w:t xml:space="preserve">Diapo 35 · Question 1 · réponse</w:t>
+        <w:t xml:space="preserve">Diapo 35 · Question 2</w:t>
       </w:r>
     </w:p>
     <w:p>
@@ -12959,7 +12781,7 @@
           <wp:inline distT="0" distB="0" distL="0" distR="0">
             <wp:extent cx="2667000" cy="1504950"/>
             <wp:effectExtent t="0" r="0" b="0" l="0"/>
-            <wp:docPr id="29" name="diapo35" descr="Diapo 35 : Question 1 · réponse" title="Diapo 35"/>
+            <wp:docPr id="29" name="diapo35" descr="Diapo 35 : Question 2" title="Diapo 35"/>
             <wp:cNvGraphicFramePr>
               <a:graphicFrameLocks xmlns:a="http://schemas.openxmlformats.org/drawingml/2006/main" noChangeAspect="1"/>
             </wp:cNvGraphicFramePr>
@@ -13015,7 +12837,7 @@
           <w:rFonts w:ascii="Calibri" w:cs="Calibri" w:eastAsia="Calibri" w:hAnsi="Calibri"/>
           <w:lang w:val="fr-FR"/>
         </w:rPr>
-        <w:t xml:space="preserve">Corriger et consolider la notion de la question 1.</w:t>
+        <w:t xml:space="preserve">Question 2 : faire voter la salle.</w:t>
       </w:r>
     </w:p>
     <w:p>
@@ -13038,7 +12860,7 @@
           <w:rFonts w:ascii="Calibri" w:cs="Calibri" w:eastAsia="Calibri" w:hAnsi="Calibri"/>
           <w:lang w:val="fr-FR"/>
         </w:rPr>
-        <w:t xml:space="preserve">0:20</w:t>
+        <w:t xml:space="preserve">0:40</w:t>
       </w:r>
     </w:p>
     <w:p>
@@ -13063,7 +12885,30 @@
           <w:rFonts w:ascii="Calibri" w:cs="Calibri" w:eastAsia="Calibri" w:hAnsi="Calibri"/>
           <w:lang w:val="fr-FR"/>
         </w:rPr>
-        <w:t xml:space="preserve">Bonne réponse : B, « Sa description ». Claude lit en permanence le nom et la description de chaque skill activée, et c'est la description qui fait l'essentiel du choix. Une description floue fait une skill qui ne se déclenche jamais, ou qui se déclenche à tort. C'est la phrase la plus importante de la skill.</w:t>
+        <w:t xml:space="preserve">Lire la question : « « Tout le suivi du client Dupont » : projet ou skill ? » Puis les réponses : A, Un projet ; B, Une skill ; C, Les deux, obligatoirement ; D, Ni l'un ni l'autre. Laisser cinq secondes de réflexion, puis demander les réponses à voix haute. Relever les lettres entendues (« j'entends beaucoup de B… quelques C ») sans donner d'indice.</w:t>
+      </w:r>
+    </w:p>
+    <w:p>
+      <w:pPr>
+        <w:pStyle w:val="Body"/>
+        <w:spacing w:after="120"/>
+      </w:pPr>
+      <w:r>
+        <w:rPr>
+          <w:rFonts w:ascii="Calibri" w:cs="Calibri" w:eastAsia="Calibri" w:hAnsi="Calibri"/>
+          <w:b/>
+          <w:bCs/>
+          <w:color w:val="2F5FC4"/>
+          <w:lang w:val="fr-FR"/>
+        </w:rPr>
+        <w:t xml:space="preserve">Question à la salle — </w:t>
+      </w:r>
+      <w:r>
+        <w:rPr>
+          <w:rFonts w:ascii="Calibri" w:cs="Calibri" w:eastAsia="Calibri" w:hAnsi="Calibri"/>
+          <w:lang w:val="fr-FR"/>
+        </w:rPr>
+        <w:t xml:space="preserve">Un volontaire pour défendre une autre réponse que celle de la majorité ?</w:t>
       </w:r>
     </w:p>
     <w:p>
@@ -13086,7 +12931,7 @@
           <w:rFonts w:ascii="Calibri" w:cs="Calibri" w:eastAsia="Calibri" w:hAnsi="Calibri"/>
           <w:lang w:val="fr-FR"/>
         </w:rPr>
-        <w:t xml:space="preserve">Question 2.</w:t>
+        <w:t xml:space="preserve">Clic : révélation de la réponse.</w:t>
       </w:r>
     </w:p>
     <w:p>
@@ -13106,7 +12951,7 @@
           <w:rFonts w:ascii="Calibri" w:cs="Calibri" w:eastAsia="Calibri" w:hAnsi="Calibri"/>
           <w:lang w:val="fr-FR"/>
         </w:rPr>
-        <w:t xml:space="preserve">Diapo 36 · Question 2</w:t>
+        <w:t xml:space="preserve">Diapo 36 · Question 2 · réponse</w:t>
       </w:r>
     </w:p>
     <w:p>
@@ -13120,7 +12965,7 @@
           <wp:inline distT="0" distB="0" distL="0" distR="0">
             <wp:extent cx="2667000" cy="1504950"/>
             <wp:effectExtent t="0" r="0" b="0" l="0"/>
-            <wp:docPr id="30" name="diapo36" descr="Diapo 36 : Question 2" title="Diapo 36"/>
+            <wp:docPr id="30" name="diapo36" descr="Diapo 36 : Question 2 · réponse" title="Diapo 36"/>
             <wp:cNvGraphicFramePr>
               <a:graphicFrameLocks xmlns:a="http://schemas.openxmlformats.org/drawingml/2006/main" noChangeAspect="1"/>
             </wp:cNvGraphicFramePr>
@@ -13176,7 +13021,7 @@
           <w:rFonts w:ascii="Calibri" w:cs="Calibri" w:eastAsia="Calibri" w:hAnsi="Calibri"/>
           <w:lang w:val="fr-FR"/>
         </w:rPr>
-        <w:t xml:space="preserve">Question 2 : faire voter la salle.</w:t>
+        <w:t xml:space="preserve">Corriger et consolider la notion de la question 2.</w:t>
       </w:r>
     </w:p>
     <w:p>
@@ -13199,7 +13044,7 @@
           <w:rFonts w:ascii="Calibri" w:cs="Calibri" w:eastAsia="Calibri" w:hAnsi="Calibri"/>
           <w:lang w:val="fr-FR"/>
         </w:rPr>
-        <w:t xml:space="preserve">0:40</w:t>
+        <w:t xml:space="preserve">0:20</w:t>
       </w:r>
     </w:p>
     <w:p>
@@ -13224,30 +13069,7 @@
           <w:rFonts w:ascii="Calibri" w:cs="Calibri" w:eastAsia="Calibri" w:hAnsi="Calibri"/>
           <w:lang w:val="fr-FR"/>
         </w:rPr>
-        <w:t xml:space="preserve">Lire la question : « « Tout le suivi du client Dupont » : projet ou skill ? » Puis les réponses : A, Un projet ; B, Une skill ; C, Les deux, obligatoirement ; D, Ni l'un ni l'autre. Compter « 1, 2, 3, cartons ! » Observer la salle et commenter la répartition (« beaucoup de bleu… quelques verts… ») sans donner d'indice.</w:t>
-      </w:r>
-    </w:p>
-    <w:p>
-      <w:pPr>
-        <w:pStyle w:val="Body"/>
-        <w:spacing w:after="120"/>
-      </w:pPr>
-      <w:r>
-        <w:rPr>
-          <w:rFonts w:ascii="Calibri" w:cs="Calibri" w:eastAsia="Calibri" w:hAnsi="Calibri"/>
-          <w:b/>
-          <w:bCs/>
-          <w:color w:val="2F5FC4"/>
-          <w:lang w:val="fr-FR"/>
-        </w:rPr>
-        <w:t xml:space="preserve">Question à la salle — </w:t>
-      </w:r>
-      <w:r>
-        <w:rPr>
-          <w:rFonts w:ascii="Calibri" w:cs="Calibri" w:eastAsia="Calibri" w:hAnsi="Calibri"/>
-          <w:lang w:val="fr-FR"/>
-        </w:rPr>
-        <w:t xml:space="preserve">Un volontaire pour défendre une autre réponse que celle de la majorité ?</w:t>
+        <w:t xml:space="preserve">Bonne réponse : A, « Un projet ». Un sujet précis, avec ses documents et son historique, relève du projet. Le client Dupont n'est pas un savoir-faire réutilisable ailleurs. En revanche, « rédiger une relance client à notre manière » serait une skill… qu'on pourrait utiliser dans le projet Dupont.</w:t>
       </w:r>
     </w:p>
     <w:p>
@@ -13270,7 +13092,7 @@
           <w:rFonts w:ascii="Calibri" w:cs="Calibri" w:eastAsia="Calibri" w:hAnsi="Calibri"/>
           <w:lang w:val="fr-FR"/>
         </w:rPr>
-        <w:t xml:space="preserve">Clic : révélation de la réponse.</w:t>
+        <w:t xml:space="preserve">Question 3.</w:t>
       </w:r>
     </w:p>
     <w:p>
@@ -13290,7 +13112,7 @@
           <w:rFonts w:ascii="Calibri" w:cs="Calibri" w:eastAsia="Calibri" w:hAnsi="Calibri"/>
           <w:lang w:val="fr-FR"/>
         </w:rPr>
-        <w:t xml:space="preserve">Diapo 37 · Question 2 · réponse</w:t>
+        <w:t xml:space="preserve">Diapo 37 · Question 3</w:t>
       </w:r>
     </w:p>
     <w:p>
@@ -13304,7 +13126,7 @@
           <wp:inline distT="0" distB="0" distL="0" distR="0">
             <wp:extent cx="2667000" cy="1504950"/>
             <wp:effectExtent t="0" r="0" b="0" l="0"/>
-            <wp:docPr id="31" name="diapo37" descr="Diapo 37 : Question 2 · réponse" title="Diapo 37"/>
+            <wp:docPr id="31" name="diapo37" descr="Diapo 37 : Question 3" title="Diapo 37"/>
             <wp:cNvGraphicFramePr>
               <a:graphicFrameLocks xmlns:a="http://schemas.openxmlformats.org/drawingml/2006/main" noChangeAspect="1"/>
             </wp:cNvGraphicFramePr>
@@ -13360,7 +13182,7 @@
           <w:rFonts w:ascii="Calibri" w:cs="Calibri" w:eastAsia="Calibri" w:hAnsi="Calibri"/>
           <w:lang w:val="fr-FR"/>
         </w:rPr>
-        <w:t xml:space="preserve">Corriger et consolider la notion de la question 2.</w:t>
+        <w:t xml:space="preserve">Question 3 : faire voter la salle.</w:t>
       </w:r>
     </w:p>
     <w:p>
@@ -13383,7 +13205,7 @@
           <w:rFonts w:ascii="Calibri" w:cs="Calibri" w:eastAsia="Calibri" w:hAnsi="Calibri"/>
           <w:lang w:val="fr-FR"/>
         </w:rPr>
-        <w:t xml:space="preserve">0:20</w:t>
+        <w:t xml:space="preserve">0:40</w:t>
       </w:r>
     </w:p>
     <w:p>
@@ -13408,7 +13230,30 @@
           <w:rFonts w:ascii="Calibri" w:cs="Calibri" w:eastAsia="Calibri" w:hAnsi="Calibri"/>
           <w:lang w:val="fr-FR"/>
         </w:rPr>
-        <w:t xml:space="preserve">Bonne réponse : A, « Un projet ». Un sujet précis, avec ses documents et son historique, relève du projet. Le client Dupont n'est pas un savoir-faire réutilisable ailleurs. En revanche, « rédiger une relance client à notre manière » serait une skill… qu'on pourrait utiliser dans le projet Dupont.</w:t>
+        <w:t xml:space="preserve">Lire la question : « Quel fichier est indispensable dans une skill ? » Puis les réponses : A, README.txt ; B, config.json ; C, SKILL.md ; D, index.html. Laisser cinq secondes de réflexion, puis demander les réponses à voix haute. Relever les lettres entendues (« j'entends beaucoup de B… quelques C ») sans donner d'indice.</w:t>
+      </w:r>
+    </w:p>
+    <w:p>
+      <w:pPr>
+        <w:pStyle w:val="Body"/>
+        <w:spacing w:after="120"/>
+      </w:pPr>
+      <w:r>
+        <w:rPr>
+          <w:rFonts w:ascii="Calibri" w:cs="Calibri" w:eastAsia="Calibri" w:hAnsi="Calibri"/>
+          <w:b/>
+          <w:bCs/>
+          <w:color w:val="2F5FC4"/>
+          <w:lang w:val="fr-FR"/>
+        </w:rPr>
+        <w:t xml:space="preserve">Question à la salle — </w:t>
+      </w:r>
+      <w:r>
+        <w:rPr>
+          <w:rFonts w:ascii="Calibri" w:cs="Calibri" w:eastAsia="Calibri" w:hAnsi="Calibri"/>
+          <w:lang w:val="fr-FR"/>
+        </w:rPr>
+        <w:t xml:space="preserve">Un volontaire pour défendre une autre réponse que celle de la majorité ?</w:t>
       </w:r>
     </w:p>
     <w:p>
@@ -13431,7 +13276,7 @@
           <w:rFonts w:ascii="Calibri" w:cs="Calibri" w:eastAsia="Calibri" w:hAnsi="Calibri"/>
           <w:lang w:val="fr-FR"/>
         </w:rPr>
-        <w:t xml:space="preserve">Question 3.</w:t>
+        <w:t xml:space="preserve">Clic : révélation de la réponse.</w:t>
       </w:r>
     </w:p>
     <w:p>
@@ -13451,7 +13296,7 @@
           <w:rFonts w:ascii="Calibri" w:cs="Calibri" w:eastAsia="Calibri" w:hAnsi="Calibri"/>
           <w:lang w:val="fr-FR"/>
         </w:rPr>
-        <w:t xml:space="preserve">Diapo 38 · Question 3</w:t>
+        <w:t xml:space="preserve">Diapo 38 · Question 3 · réponse</w:t>
       </w:r>
     </w:p>
     <w:p>
@@ -13465,7 +13310,7 @@
           <wp:inline distT="0" distB="0" distL="0" distR="0">
             <wp:extent cx="2667000" cy="1504950"/>
             <wp:effectExtent t="0" r="0" b="0" l="0"/>
-            <wp:docPr id="32" name="diapo38" descr="Diapo 38 : Question 3" title="Diapo 38"/>
+            <wp:docPr id="32" name="diapo38" descr="Diapo 38 : Question 3 · réponse" title="Diapo 38"/>
             <wp:cNvGraphicFramePr>
               <a:graphicFrameLocks xmlns:a="http://schemas.openxmlformats.org/drawingml/2006/main" noChangeAspect="1"/>
             </wp:cNvGraphicFramePr>
@@ -13521,7 +13366,7 @@
           <w:rFonts w:ascii="Calibri" w:cs="Calibri" w:eastAsia="Calibri" w:hAnsi="Calibri"/>
           <w:lang w:val="fr-FR"/>
         </w:rPr>
-        <w:t xml:space="preserve">Question 3 : faire voter la salle.</w:t>
+        <w:t xml:space="preserve">Corriger et consolider la notion de la question 3.</w:t>
       </w:r>
     </w:p>
     <w:p>
@@ -13544,7 +13389,7 @@
           <w:rFonts w:ascii="Calibri" w:cs="Calibri" w:eastAsia="Calibri" w:hAnsi="Calibri"/>
           <w:lang w:val="fr-FR"/>
         </w:rPr>
-        <w:t xml:space="preserve">0:40</w:t>
+        <w:t xml:space="preserve">0:20</w:t>
       </w:r>
     </w:p>
     <w:p>
@@ -13569,30 +13414,7 @@
           <w:rFonts w:ascii="Calibri" w:cs="Calibri" w:eastAsia="Calibri" w:hAnsi="Calibri"/>
           <w:lang w:val="fr-FR"/>
         </w:rPr>
-        <w:t xml:space="preserve">Lire la question : « Quel fichier est indispensable dans une skill ? » Puis les réponses : A, README.txt ; B, config.json ; C, SKILL.md ; D, index.html. Compter « 1, 2, 3, cartons ! » Observer la salle et commenter la répartition (« beaucoup de bleu… quelques verts… ») sans donner d'indice.</w:t>
-      </w:r>
-    </w:p>
-    <w:p>
-      <w:pPr>
-        <w:pStyle w:val="Body"/>
-        <w:spacing w:after="120"/>
-      </w:pPr>
-      <w:r>
-        <w:rPr>
-          <w:rFonts w:ascii="Calibri" w:cs="Calibri" w:eastAsia="Calibri" w:hAnsi="Calibri"/>
-          <w:b/>
-          <w:bCs/>
-          <w:color w:val="2F5FC4"/>
-          <w:lang w:val="fr-FR"/>
-        </w:rPr>
-        <w:t xml:space="preserve">Question à la salle — </w:t>
-      </w:r>
-      <w:r>
-        <w:rPr>
-          <w:rFonts w:ascii="Calibri" w:cs="Calibri" w:eastAsia="Calibri" w:hAnsi="Calibri"/>
-          <w:lang w:val="fr-FR"/>
-        </w:rPr>
-        <w:t xml:space="preserve">Un volontaire pour défendre une autre réponse que celle de la majorité ?</w:t>
+        <w:t xml:space="preserve">Bonne réponse : C, « SKILL.md ». Une skill, c'est un dossier qui contient au minimum un fichier SKILL.md : un en-tête avec le nom et la description, puis les instructions en texte simple. Tout le reste (modèles, exemples, scripts) est facultatif.</w:t>
       </w:r>
     </w:p>
     <w:p>
@@ -13615,7 +13437,7 @@
           <w:rFonts w:ascii="Calibri" w:cs="Calibri" w:eastAsia="Calibri" w:hAnsi="Calibri"/>
           <w:lang w:val="fr-FR"/>
         </w:rPr>
-        <w:t xml:space="preserve">Clic : révélation de la réponse.</w:t>
+        <w:t xml:space="preserve">Question 4.</w:t>
       </w:r>
     </w:p>
     <w:p>
@@ -13635,7 +13457,7 @@
           <w:rFonts w:ascii="Calibri" w:cs="Calibri" w:eastAsia="Calibri" w:hAnsi="Calibri"/>
           <w:lang w:val="fr-FR"/>
         </w:rPr>
-        <w:t xml:space="preserve">Diapo 39 · Question 3 · réponse</w:t>
+        <w:t xml:space="preserve">Diapo 39 · Question 4</w:t>
       </w:r>
     </w:p>
     <w:p>
@@ -13649,7 +13471,7 @@
           <wp:inline distT="0" distB="0" distL="0" distR="0">
             <wp:extent cx="2667000" cy="1504950"/>
             <wp:effectExtent t="0" r="0" b="0" l="0"/>
-            <wp:docPr id="33" name="diapo39" descr="Diapo 39 : Question 3 · réponse" title="Diapo 39"/>
+            <wp:docPr id="33" name="diapo39" descr="Diapo 39 : Question 4" title="Diapo 39"/>
             <wp:cNvGraphicFramePr>
               <a:graphicFrameLocks xmlns:a="http://schemas.openxmlformats.org/drawingml/2006/main" noChangeAspect="1"/>
             </wp:cNvGraphicFramePr>
@@ -13705,7 +13527,7 @@
           <w:rFonts w:ascii="Calibri" w:cs="Calibri" w:eastAsia="Calibri" w:hAnsi="Calibri"/>
           <w:lang w:val="fr-FR"/>
         </w:rPr>
-        <w:t xml:space="preserve">Corriger et consolider la notion de la question 3.</w:t>
+        <w:t xml:space="preserve">Question 4 : faire voter la salle.</w:t>
       </w:r>
     </w:p>
     <w:p>
@@ -13728,7 +13550,7 @@
           <w:rFonts w:ascii="Calibri" w:cs="Calibri" w:eastAsia="Calibri" w:hAnsi="Calibri"/>
           <w:lang w:val="fr-FR"/>
         </w:rPr>
-        <w:t xml:space="preserve">0:20</w:t>
+        <w:t xml:space="preserve">0:40</w:t>
       </w:r>
     </w:p>
     <w:p>
@@ -13753,7 +13575,30 @@
           <w:rFonts w:ascii="Calibri" w:cs="Calibri" w:eastAsia="Calibri" w:hAnsi="Calibri"/>
           <w:lang w:val="fr-FR"/>
         </w:rPr>
-        <w:t xml:space="preserve">Bonne réponse : C, « SKILL.md ». Une skill, c'est un dossier qui contient au minimum un fichier SKILL.md : un en-tête avec le nom et la description, puis les instructions en texte simple. Tout le reste (modèles, exemples, scripts) est facultatif.</w:t>
+        <w:t xml:space="preserve">Lire la question : « Une skill géniale trouvée sur GitHub. Première chose ? » Puis les réponses : A, L'installer tout de suite ; B, La partager à l'équipe ; C, La renommer ; D, Lire son contenu. Laisser cinq secondes de réflexion, puis demander les réponses à voix haute. Relever les lettres entendues (« j'entends beaucoup de B… quelques C ») sans donner d'indice.</w:t>
+      </w:r>
+    </w:p>
+    <w:p>
+      <w:pPr>
+        <w:pStyle w:val="Body"/>
+        <w:spacing w:after="120"/>
+      </w:pPr>
+      <w:r>
+        <w:rPr>
+          <w:rFonts w:ascii="Calibri" w:cs="Calibri" w:eastAsia="Calibri" w:hAnsi="Calibri"/>
+          <w:b/>
+          <w:bCs/>
+          <w:color w:val="2F5FC4"/>
+          <w:lang w:val="fr-FR"/>
+        </w:rPr>
+        <w:t xml:space="preserve">Question à la salle — </w:t>
+      </w:r>
+      <w:r>
+        <w:rPr>
+          <w:rFonts w:ascii="Calibri" w:cs="Calibri" w:eastAsia="Calibri" w:hAnsi="Calibri"/>
+          <w:lang w:val="fr-FR"/>
+        </w:rPr>
+        <w:t xml:space="preserve">Un volontaire pour défendre une autre réponse que celle de la majorité ?</w:t>
       </w:r>
     </w:p>
     <w:p>
@@ -13776,7 +13621,7 @@
           <w:rFonts w:ascii="Calibri" w:cs="Calibri" w:eastAsia="Calibri" w:hAnsi="Calibri"/>
           <w:lang w:val="fr-FR"/>
         </w:rPr>
-        <w:t xml:space="preserve">Question 4.</w:t>
+        <w:t xml:space="preserve">Clic : révélation de la réponse.</w:t>
       </w:r>
     </w:p>
     <w:p>
@@ -13796,7 +13641,7 @@
           <w:rFonts w:ascii="Calibri" w:cs="Calibri" w:eastAsia="Calibri" w:hAnsi="Calibri"/>
           <w:lang w:val="fr-FR"/>
         </w:rPr>
-        <w:t xml:space="preserve">Diapo 40 · Question 4</w:t>
+        <w:t xml:space="preserve">Diapo 40 · Question 4 · réponse</w:t>
       </w:r>
     </w:p>
     <w:p>
@@ -13810,7 +13655,7 @@
           <wp:inline distT="0" distB="0" distL="0" distR="0">
             <wp:extent cx="2667000" cy="1504950"/>
             <wp:effectExtent t="0" r="0" b="0" l="0"/>
-            <wp:docPr id="34" name="diapo40" descr="Diapo 40 : Question 4" title="Diapo 40"/>
+            <wp:docPr id="34" name="diapo40" descr="Diapo 40 : Question 4 · réponse" title="Diapo 40"/>
             <wp:cNvGraphicFramePr>
               <a:graphicFrameLocks xmlns:a="http://schemas.openxmlformats.org/drawingml/2006/main" noChangeAspect="1"/>
             </wp:cNvGraphicFramePr>
@@ -13866,7 +13711,7 @@
           <w:rFonts w:ascii="Calibri" w:cs="Calibri" w:eastAsia="Calibri" w:hAnsi="Calibri"/>
           <w:lang w:val="fr-FR"/>
         </w:rPr>
-        <w:t xml:space="preserve">Question 4 : faire voter la salle.</w:t>
+        <w:t xml:space="preserve">Corriger et consolider la notion de la question 4.</w:t>
       </w:r>
     </w:p>
     <w:p>
@@ -13889,7 +13734,7 @@
           <w:rFonts w:ascii="Calibri" w:cs="Calibri" w:eastAsia="Calibri" w:hAnsi="Calibri"/>
           <w:lang w:val="fr-FR"/>
         </w:rPr>
-        <w:t xml:space="preserve">0:40</w:t>
+        <w:t xml:space="preserve">0:20</w:t>
       </w:r>
     </w:p>
     <w:p>
@@ -13914,30 +13759,7 @@
           <w:rFonts w:ascii="Calibri" w:cs="Calibri" w:eastAsia="Calibri" w:hAnsi="Calibri"/>
           <w:lang w:val="fr-FR"/>
         </w:rPr>
-        <w:t xml:space="preserve">Lire la question : « Une skill géniale trouvée sur GitHub. Première chose ? » Puis les réponses : A, L'installer tout de suite ; B, La partager à l'équipe ; C, La renommer ; D, Lire son contenu. Compter « 1, 2, 3, cartons ! » Observer la salle et commenter la répartition (« beaucoup de bleu… quelques verts… ») sans donner d'indice.</w:t>
-      </w:r>
-    </w:p>
-    <w:p>
-      <w:pPr>
-        <w:pStyle w:val="Body"/>
-        <w:spacing w:after="120"/>
-      </w:pPr>
-      <w:r>
-        <w:rPr>
-          <w:rFonts w:ascii="Calibri" w:cs="Calibri" w:eastAsia="Calibri" w:hAnsi="Calibri"/>
-          <w:b/>
-          <w:bCs/>
-          <w:color w:val="2F5FC4"/>
-          <w:lang w:val="fr-FR"/>
-        </w:rPr>
-        <w:t xml:space="preserve">Question à la salle — </w:t>
-      </w:r>
-      <w:r>
-        <w:rPr>
-          <w:rFonts w:ascii="Calibri" w:cs="Calibri" w:eastAsia="Calibri" w:hAnsi="Calibri"/>
-          <w:lang w:val="fr-FR"/>
-        </w:rPr>
-        <w:t xml:space="preserve">Un volontaire pour défendre une autre réponse que celle de la majorité ?</w:t>
+        <w:t xml:space="preserve">Bonne réponse : D, « Lire son contenu ». Une skill donne des instructions à Claude et peut contenir des scripts qu'il exécutera. On ne l'installe donc qu'après l'avoir lue et avoir identifié son auteur. C'est la même hygiène que pour une pièce jointe inconnue.</w:t>
       </w:r>
     </w:p>
     <w:p>
@@ -13960,7 +13782,7 @@
           <w:rFonts w:ascii="Calibri" w:cs="Calibri" w:eastAsia="Calibri" w:hAnsi="Calibri"/>
           <w:lang w:val="fr-FR"/>
         </w:rPr>
-        <w:t xml:space="preserve">Clic : révélation de la réponse.</w:t>
+        <w:t xml:space="preserve">Question 5.</w:t>
       </w:r>
     </w:p>
     <w:p>
@@ -13980,7 +13802,7 @@
           <w:rFonts w:ascii="Calibri" w:cs="Calibri" w:eastAsia="Calibri" w:hAnsi="Calibri"/>
           <w:lang w:val="fr-FR"/>
         </w:rPr>
-        <w:t xml:space="preserve">Diapo 41 · Question 4 · réponse</w:t>
+        <w:t xml:space="preserve">Diapo 41 · Question 5</w:t>
       </w:r>
     </w:p>
     <w:p>
@@ -13994,7 +13816,7 @@
           <wp:inline distT="0" distB="0" distL="0" distR="0">
             <wp:extent cx="2667000" cy="1504950"/>
             <wp:effectExtent t="0" r="0" b="0" l="0"/>
-            <wp:docPr id="35" name="diapo41" descr="Diapo 41 : Question 4 · réponse" title="Diapo 41"/>
+            <wp:docPr id="35" name="diapo41" descr="Diapo 41 : Question 5" title="Diapo 41"/>
             <wp:cNvGraphicFramePr>
               <a:graphicFrameLocks xmlns:a="http://schemas.openxmlformats.org/drawingml/2006/main" noChangeAspect="1"/>
             </wp:cNvGraphicFramePr>
@@ -14050,7 +13872,7 @@
           <w:rFonts w:ascii="Calibri" w:cs="Calibri" w:eastAsia="Calibri" w:hAnsi="Calibri"/>
           <w:lang w:val="fr-FR"/>
         </w:rPr>
-        <w:t xml:space="preserve">Corriger et consolider la notion de la question 4.</w:t>
+        <w:t xml:space="preserve">Question 5 : faire voter la salle.</w:t>
       </w:r>
     </w:p>
     <w:p>
@@ -14073,7 +13895,7 @@
           <w:rFonts w:ascii="Calibri" w:cs="Calibri" w:eastAsia="Calibri" w:hAnsi="Calibri"/>
           <w:lang w:val="fr-FR"/>
         </w:rPr>
-        <w:t xml:space="preserve">0:20</w:t>
+        <w:t xml:space="preserve">0:40</w:t>
       </w:r>
     </w:p>
     <w:p>
@@ -14098,7 +13920,30 @@
           <w:rFonts w:ascii="Calibri" w:cs="Calibri" w:eastAsia="Calibri" w:hAnsi="Calibri"/>
           <w:lang w:val="fr-FR"/>
         </w:rPr>
-        <w:t xml:space="preserve">Bonne réponse : D, « Lire son contenu ». Une skill donne des instructions à Claude et peut contenir des scripts qu'il exécutera. On ne l'installe donc qu'après l'avoir lue et avoir identifié son auteur. C'est la même hygiène que pour une pièce jointe inconnue.</w:t>
+        <w:t xml:space="preserve">Lire la question : « Le plus simple pour créer votre première skill ? » Puis les réponses : A, Apprendre à coder ; B, Le demander à Claude ; C, Acheter un plugin ; D, Écrire au support. Laisser cinq secondes de réflexion, puis demander les réponses à voix haute. Relever les lettres entendues (« j'entends beaucoup de B… quelques C ») sans donner d'indice.</w:t>
+      </w:r>
+    </w:p>
+    <w:p>
+      <w:pPr>
+        <w:pStyle w:val="Body"/>
+        <w:spacing w:after="120"/>
+      </w:pPr>
+      <w:r>
+        <w:rPr>
+          <w:rFonts w:ascii="Calibri" w:cs="Calibri" w:eastAsia="Calibri" w:hAnsi="Calibri"/>
+          <w:b/>
+          <w:bCs/>
+          <w:color w:val="2F5FC4"/>
+          <w:lang w:val="fr-FR"/>
+        </w:rPr>
+        <w:t xml:space="preserve">Question à la salle — </w:t>
+      </w:r>
+      <w:r>
+        <w:rPr>
+          <w:rFonts w:ascii="Calibri" w:cs="Calibri" w:eastAsia="Calibri" w:hAnsi="Calibri"/>
+          <w:lang w:val="fr-FR"/>
+        </w:rPr>
+        <w:t xml:space="preserve">Un volontaire pour défendre une autre réponse que celle de la majorité ?</w:t>
       </w:r>
     </w:p>
     <w:p>
@@ -14121,7 +13966,7 @@
           <w:rFonts w:ascii="Calibri" w:cs="Calibri" w:eastAsia="Calibri" w:hAnsi="Calibri"/>
           <w:lang w:val="fr-FR"/>
         </w:rPr>
-        <w:t xml:space="preserve">Question 5.</w:t>
+        <w:t xml:space="preserve">Clic : révélation de la réponse.</w:t>
       </w:r>
     </w:p>
     <w:p>
@@ -14141,7 +13986,7 @@
           <w:rFonts w:ascii="Calibri" w:cs="Calibri" w:eastAsia="Calibri" w:hAnsi="Calibri"/>
           <w:lang w:val="fr-FR"/>
         </w:rPr>
-        <w:t xml:space="preserve">Diapo 42 · Question 5</w:t>
+        <w:t xml:space="preserve">Diapo 42 · Question 5 · réponse</w:t>
       </w:r>
     </w:p>
     <w:p>
@@ -14155,7 +14000,7 @@
           <wp:inline distT="0" distB="0" distL="0" distR="0">
             <wp:extent cx="2667000" cy="1504950"/>
             <wp:effectExtent t="0" r="0" b="0" l="0"/>
-            <wp:docPr id="36" name="diapo42" descr="Diapo 42 : Question 5" title="Diapo 42"/>
+            <wp:docPr id="36" name="diapo42" descr="Diapo 42 : Question 5 · réponse" title="Diapo 42"/>
             <wp:cNvGraphicFramePr>
               <a:graphicFrameLocks xmlns:a="http://schemas.openxmlformats.org/drawingml/2006/main" noChangeAspect="1"/>
             </wp:cNvGraphicFramePr>
@@ -14211,7 +14056,7 @@
           <w:rFonts w:ascii="Calibri" w:cs="Calibri" w:eastAsia="Calibri" w:hAnsi="Calibri"/>
           <w:lang w:val="fr-FR"/>
         </w:rPr>
-        <w:t xml:space="preserve">Question 5 : faire voter la salle.</w:t>
+        <w:t xml:space="preserve">Corriger et consolider la notion de la question 5.</w:t>
       </w:r>
     </w:p>
     <w:p>
@@ -14234,7 +14079,7 @@
           <w:rFonts w:ascii="Calibri" w:cs="Calibri" w:eastAsia="Calibri" w:hAnsi="Calibri"/>
           <w:lang w:val="fr-FR"/>
         </w:rPr>
-        <w:t xml:space="preserve">0:40</w:t>
+        <w:t xml:space="preserve">0:20</w:t>
       </w:r>
     </w:p>
     <w:p>
@@ -14259,30 +14104,7 @@
           <w:rFonts w:ascii="Calibri" w:cs="Calibri" w:eastAsia="Calibri" w:hAnsi="Calibri"/>
           <w:lang w:val="fr-FR"/>
         </w:rPr>
-        <w:t xml:space="preserve">Lire la question : « Le plus simple pour créer votre première skill ? » Puis les réponses : A, Apprendre à coder ; B, Le demander à Claude ; C, Acheter un plugin ; D, Écrire au support. Compter « 1, 2, 3, cartons ! » Observer la salle et commenter la répartition (« beaucoup de bleu… quelques verts… ») sans donner d'indice.</w:t>
-      </w:r>
-    </w:p>
-    <w:p>
-      <w:pPr>
-        <w:pStyle w:val="Body"/>
-        <w:spacing w:after="120"/>
-      </w:pPr>
-      <w:r>
-        <w:rPr>
-          <w:rFonts w:ascii="Calibri" w:cs="Calibri" w:eastAsia="Calibri" w:hAnsi="Calibri"/>
-          <w:b/>
-          <w:bCs/>
-          <w:color w:val="2F5FC4"/>
-          <w:lang w:val="fr-FR"/>
-        </w:rPr>
-        <w:t xml:space="preserve">Question à la salle — </w:t>
-      </w:r>
-      <w:r>
-        <w:rPr>
-          <w:rFonts w:ascii="Calibri" w:cs="Calibri" w:eastAsia="Calibri" w:hAnsi="Calibri"/>
-          <w:lang w:val="fr-FR"/>
-        </w:rPr>
-        <w:t xml:space="preserve">Un volontaire pour défendre une autre réponse que celle de la majorité ?</w:t>
+        <w:t xml:space="preserve">Bonne réponse : B, « Le demander à Claude ». Il suffit de dire à Claude « aide-moi à créer une skill qui… ». Il pose des questions, rédige le SKILL.md et propose de l'enregistrer. Aucune ligne de code n'est nécessaire.</w:t>
       </w:r>
     </w:p>
     <w:p>
@@ -14305,7 +14127,7 @@
           <w:rFonts w:ascii="Calibri" w:cs="Calibri" w:eastAsia="Calibri" w:hAnsi="Calibri"/>
           <w:lang w:val="fr-FR"/>
         </w:rPr>
-        <w:t xml:space="preserve">Clic : révélation de la réponse.</w:t>
+        <w:t xml:space="preserve">Question 6.</w:t>
       </w:r>
     </w:p>
     <w:p>
@@ -14325,7 +14147,7 @@
           <w:rFonts w:ascii="Calibri" w:cs="Calibri" w:eastAsia="Calibri" w:hAnsi="Calibri"/>
           <w:lang w:val="fr-FR"/>
         </w:rPr>
-        <w:t xml:space="preserve">Diapo 43 · Question 5 · réponse</w:t>
+        <w:t xml:space="preserve">Diapo 43 · Question 6</w:t>
       </w:r>
     </w:p>
     <w:p>
@@ -14339,7 +14161,7 @@
           <wp:inline distT="0" distB="0" distL="0" distR="0">
             <wp:extent cx="2667000" cy="1504950"/>
             <wp:effectExtent t="0" r="0" b="0" l="0"/>
-            <wp:docPr id="37" name="diapo43" descr="Diapo 43 : Question 5 · réponse" title="Diapo 43"/>
+            <wp:docPr id="37" name="diapo43" descr="Diapo 43 : Question 6" title="Diapo 43"/>
             <wp:cNvGraphicFramePr>
               <a:graphicFrameLocks xmlns:a="http://schemas.openxmlformats.org/drawingml/2006/main" noChangeAspect="1"/>
             </wp:cNvGraphicFramePr>
@@ -14395,7 +14217,7 @@
           <w:rFonts w:ascii="Calibri" w:cs="Calibri" w:eastAsia="Calibri" w:hAnsi="Calibri"/>
           <w:lang w:val="fr-FR"/>
         </w:rPr>
-        <w:t xml:space="preserve">Corriger et consolider la notion de la question 5.</w:t>
+        <w:t xml:space="preserve">Question 6 : faire voter la salle.</w:t>
       </w:r>
     </w:p>
     <w:p>
@@ -14418,7 +14240,7 @@
           <w:rFonts w:ascii="Calibri" w:cs="Calibri" w:eastAsia="Calibri" w:hAnsi="Calibri"/>
           <w:lang w:val="fr-FR"/>
         </w:rPr>
-        <w:t xml:space="preserve">0:20</w:t>
+        <w:t xml:space="preserve">0:40</w:t>
       </w:r>
     </w:p>
     <w:p>
@@ -14443,7 +14265,30 @@
           <w:rFonts w:ascii="Calibri" w:cs="Calibri" w:eastAsia="Calibri" w:hAnsi="Calibri"/>
           <w:lang w:val="fr-FR"/>
         </w:rPr>
-        <w:t xml:space="preserve">Bonne réponse : B, « Le demander à Claude ». Il suffit de dire à Claude « aide-moi à créer une skill qui… ». Il pose des questions, rédige le SKILL.md et propose de l'enregistrer. Aucune ligne de code n'est nécessaire.</w:t>
+        <w:t xml:space="preserve">Lire la question : « Team/Enterprise : la rendre disponible à tous ? » Puis les réponses : A, L'envoyer par mail à chacun ; B, La copier dans un projet ; C, La publier dans l'organisation ; D, C'est impossible. Laisser cinq secondes de réflexion, puis demander les réponses à voix haute. Relever les lettres entendues (« j'entends beaucoup de B… quelques C ») sans donner d'indice.</w:t>
+      </w:r>
+    </w:p>
+    <w:p>
+      <w:pPr>
+        <w:pStyle w:val="Body"/>
+        <w:spacing w:after="120"/>
+      </w:pPr>
+      <w:r>
+        <w:rPr>
+          <w:rFonts w:ascii="Calibri" w:cs="Calibri" w:eastAsia="Calibri" w:hAnsi="Calibri"/>
+          <w:b/>
+          <w:bCs/>
+          <w:color w:val="2F5FC4"/>
+          <w:lang w:val="fr-FR"/>
+        </w:rPr>
+        <w:t xml:space="preserve">Question à la salle — </w:t>
+      </w:r>
+      <w:r>
+        <w:rPr>
+          <w:rFonts w:ascii="Calibri" w:cs="Calibri" w:eastAsia="Calibri" w:hAnsi="Calibri"/>
+          <w:lang w:val="fr-FR"/>
+        </w:rPr>
+        <w:t xml:space="preserve">Un volontaire pour défendre une autre réponse que celle de la majorité ?</w:t>
       </w:r>
     </w:p>
     <w:p>
@@ -14466,7 +14311,7 @@
           <w:rFonts w:ascii="Calibri" w:cs="Calibri" w:eastAsia="Calibri" w:hAnsi="Calibri"/>
           <w:lang w:val="fr-FR"/>
         </w:rPr>
-        <w:t xml:space="preserve">Question 6.</w:t>
+        <w:t xml:space="preserve">Clic : révélation de la réponse.</w:t>
       </w:r>
     </w:p>
     <w:p>
@@ -14486,7 +14331,7 @@
           <w:rFonts w:ascii="Calibri" w:cs="Calibri" w:eastAsia="Calibri" w:hAnsi="Calibri"/>
           <w:lang w:val="fr-FR"/>
         </w:rPr>
-        <w:t xml:space="preserve">Diapo 44 · Question 6</w:t>
+        <w:t xml:space="preserve">Diapo 44 · Question 6 · réponse</w:t>
       </w:r>
     </w:p>
     <w:p>
@@ -14500,7 +14345,7 @@
           <wp:inline distT="0" distB="0" distL="0" distR="0">
             <wp:extent cx="2667000" cy="1504950"/>
             <wp:effectExtent t="0" r="0" b="0" l="0"/>
-            <wp:docPr id="38" name="diapo44" descr="Diapo 44 : Question 6" title="Diapo 44"/>
+            <wp:docPr id="38" name="diapo44" descr="Diapo 44 : Question 6 · réponse" title="Diapo 44"/>
             <wp:cNvGraphicFramePr>
               <a:graphicFrameLocks xmlns:a="http://schemas.openxmlformats.org/drawingml/2006/main" noChangeAspect="1"/>
             </wp:cNvGraphicFramePr>
@@ -14556,7 +14401,7 @@
           <w:rFonts w:ascii="Calibri" w:cs="Calibri" w:eastAsia="Calibri" w:hAnsi="Calibri"/>
           <w:lang w:val="fr-FR"/>
         </w:rPr>
-        <w:t xml:space="preserve">Question 6 : faire voter la salle.</w:t>
+        <w:t xml:space="preserve">Corriger et consolider la notion de la question 6.</w:t>
       </w:r>
     </w:p>
     <w:p>
@@ -14579,7 +14424,7 @@
           <w:rFonts w:ascii="Calibri" w:cs="Calibri" w:eastAsia="Calibri" w:hAnsi="Calibri"/>
           <w:lang w:val="fr-FR"/>
         </w:rPr>
-        <w:t xml:space="preserve">0:40</w:t>
+        <w:t xml:space="preserve">0:20</w:t>
       </w:r>
     </w:p>
     <w:p>
@@ -14604,30 +14449,7 @@
           <w:rFonts w:ascii="Calibri" w:cs="Calibri" w:eastAsia="Calibri" w:hAnsi="Calibri"/>
           <w:lang w:val="fr-FR"/>
         </w:rPr>
-        <w:t xml:space="preserve">Lire la question : « Team/Enterprise : la rendre disponible à tous ? » Puis les réponses : A, L'envoyer par mail à chacun ; B, La copier dans un projet ; C, La publier dans l'organisation ; D, C'est impossible. Compter « 1, 2, 3, cartons ! » Observer la salle et commenter la répartition (« beaucoup de bleu… quelques verts… ») sans donner d'indice.</w:t>
-      </w:r>
-    </w:p>
-    <w:p>
-      <w:pPr>
-        <w:pStyle w:val="Body"/>
-        <w:spacing w:after="120"/>
-      </w:pPr>
-      <w:r>
-        <w:rPr>
-          <w:rFonts w:ascii="Calibri" w:cs="Calibri" w:eastAsia="Calibri" w:hAnsi="Calibri"/>
-          <w:b/>
-          <w:bCs/>
-          <w:color w:val="2F5FC4"/>
-          <w:lang w:val="fr-FR"/>
-        </w:rPr>
-        <w:t xml:space="preserve">Question à la salle — </w:t>
-      </w:r>
-      <w:r>
-        <w:rPr>
-          <w:rFonts w:ascii="Calibri" w:cs="Calibri" w:eastAsia="Calibri" w:hAnsi="Calibri"/>
-          <w:lang w:val="fr-FR"/>
-        </w:rPr>
-        <w:t xml:space="preserve">Un volontaire pour défendre une autre réponse que celle de la majorité ?</w:t>
+        <w:t xml:space="preserve">Bonne réponse : C, « La publier dans l'organisation ». Dans Personnaliser › Skills, « Publier dans l'organisation » la rend disponible à tous (avec une relecture si l'administrateur l'exige). « Partager » la donne à quelques collègues choisis. En offre individuelle, on passe par le fichier .zip.</w:t>
       </w:r>
     </w:p>
     <w:p>
@@ -14650,7 +14472,7 @@
           <w:rFonts w:ascii="Calibri" w:cs="Calibri" w:eastAsia="Calibri" w:hAnsi="Calibri"/>
           <w:lang w:val="fr-FR"/>
         </w:rPr>
-        <w:t xml:space="preserve">Clic : révélation de la réponse.</w:t>
+        <w:t xml:space="preserve">Question 7.</w:t>
       </w:r>
     </w:p>
     <w:p>
@@ -14670,7 +14492,7 @@
           <w:rFonts w:ascii="Calibri" w:cs="Calibri" w:eastAsia="Calibri" w:hAnsi="Calibri"/>
           <w:lang w:val="fr-FR"/>
         </w:rPr>
-        <w:t xml:space="preserve">Diapo 45 · Question 6 · réponse</w:t>
+        <w:t xml:space="preserve">Diapo 45 · Question 7</w:t>
       </w:r>
     </w:p>
     <w:p>
@@ -14684,7 +14506,7 @@
           <wp:inline distT="0" distB="0" distL="0" distR="0">
             <wp:extent cx="2667000" cy="1504950"/>
             <wp:effectExtent t="0" r="0" b="0" l="0"/>
-            <wp:docPr id="39" name="diapo45" descr="Diapo 45 : Question 6 · réponse" title="Diapo 45"/>
+            <wp:docPr id="39" name="diapo45" descr="Diapo 45 : Question 7" title="Diapo 45"/>
             <wp:cNvGraphicFramePr>
               <a:graphicFrameLocks xmlns:a="http://schemas.openxmlformats.org/drawingml/2006/main" noChangeAspect="1"/>
             </wp:cNvGraphicFramePr>
@@ -14740,7 +14562,7 @@
           <w:rFonts w:ascii="Calibri" w:cs="Calibri" w:eastAsia="Calibri" w:hAnsi="Calibri"/>
           <w:lang w:val="fr-FR"/>
         </w:rPr>
-        <w:t xml:space="preserve">Corriger et consolider la notion de la question 6.</w:t>
+        <w:t xml:space="preserve">Question 7 : faire voter la salle.</w:t>
       </w:r>
     </w:p>
     <w:p>
@@ -14763,7 +14585,7 @@
           <w:rFonts w:ascii="Calibri" w:cs="Calibri" w:eastAsia="Calibri" w:hAnsi="Calibri"/>
           <w:lang w:val="fr-FR"/>
         </w:rPr>
-        <w:t xml:space="preserve">0:20</w:t>
+        <w:t xml:space="preserve">0:40</w:t>
       </w:r>
     </w:p>
     <w:p>
@@ -14788,7 +14610,30 @@
           <w:rFonts w:ascii="Calibri" w:cs="Calibri" w:eastAsia="Calibri" w:hAnsi="Calibri"/>
           <w:lang w:val="fr-FR"/>
         </w:rPr>
-        <w:t xml:space="preserve">Bonne réponse : C, « La publier dans l'organisation ». Dans Personnaliser › Skills, « Publier dans l'organisation » la rend disponible à tous (avec une relecture si l'administrateur l'exige). « Partager » la donne à quelques collègues choisis. En offre individuelle, on passe par le fichier .zip.</w:t>
+        <w:t xml:space="preserve">Lire la question : « En mode plan, que fait Claude ? » Puis les réponses : A, Il modifie directement vos fichiers ; B, Il propose un plan et attend votre feu vert ; C, Il programme une tâche récurrente ; D, Il remplit votre agenda. Laisser cinq secondes de réflexion, puis demander les réponses à voix haute. Relever les lettres entendues (« j'entends beaucoup de B… quelques C ») sans donner d'indice.</w:t>
+      </w:r>
+    </w:p>
+    <w:p>
+      <w:pPr>
+        <w:pStyle w:val="Body"/>
+        <w:spacing w:after="120"/>
+      </w:pPr>
+      <w:r>
+        <w:rPr>
+          <w:rFonts w:ascii="Calibri" w:cs="Calibri" w:eastAsia="Calibri" w:hAnsi="Calibri"/>
+          <w:b/>
+          <w:bCs/>
+          <w:color w:val="2F5FC4"/>
+          <w:lang w:val="fr-FR"/>
+        </w:rPr>
+        <w:t xml:space="preserve">Question à la salle — </w:t>
+      </w:r>
+      <w:r>
+        <w:rPr>
+          <w:rFonts w:ascii="Calibri" w:cs="Calibri" w:eastAsia="Calibri" w:hAnsi="Calibri"/>
+          <w:lang w:val="fr-FR"/>
+        </w:rPr>
+        <w:t xml:space="preserve">Un volontaire pour défendre une autre réponse que celle de la majorité ?</w:t>
       </w:r>
     </w:p>
     <w:p>
@@ -14811,7 +14656,7 @@
           <w:rFonts w:ascii="Calibri" w:cs="Calibri" w:eastAsia="Calibri" w:hAnsi="Calibri"/>
           <w:lang w:val="fr-FR"/>
         </w:rPr>
-        <w:t xml:space="preserve">Question 7.</w:t>
+        <w:t xml:space="preserve">Clic : révélation de la réponse.</w:t>
       </w:r>
     </w:p>
     <w:p>
@@ -14831,7 +14676,7 @@
           <w:rFonts w:ascii="Calibri" w:cs="Calibri" w:eastAsia="Calibri" w:hAnsi="Calibri"/>
           <w:lang w:val="fr-FR"/>
         </w:rPr>
-        <w:t xml:space="preserve">Diapo 46 · Question 7</w:t>
+        <w:t xml:space="preserve">Diapo 46 · Question 7 · réponse</w:t>
       </w:r>
     </w:p>
     <w:p>
@@ -14845,7 +14690,7 @@
           <wp:inline distT="0" distB="0" distL="0" distR="0">
             <wp:extent cx="2667000" cy="1504950"/>
             <wp:effectExtent t="0" r="0" b="0" l="0"/>
-            <wp:docPr id="40" name="diapo46" descr="Diapo 46 : Question 7" title="Diapo 46"/>
+            <wp:docPr id="40" name="diapo46" descr="Diapo 46 : Question 7 · réponse" title="Diapo 46"/>
             <wp:cNvGraphicFramePr>
               <a:graphicFrameLocks xmlns:a="http://schemas.openxmlformats.org/drawingml/2006/main" noChangeAspect="1"/>
             </wp:cNvGraphicFramePr>
@@ -14901,7 +14746,7 @@
           <w:rFonts w:ascii="Calibri" w:cs="Calibri" w:eastAsia="Calibri" w:hAnsi="Calibri"/>
           <w:lang w:val="fr-FR"/>
         </w:rPr>
-        <w:t xml:space="preserve">Question 7 : faire voter la salle.</w:t>
+        <w:t xml:space="preserve">Corriger et consolider la notion de la question 7.</w:t>
       </w:r>
     </w:p>
     <w:p>
@@ -14924,7 +14769,7 @@
           <w:rFonts w:ascii="Calibri" w:cs="Calibri" w:eastAsia="Calibri" w:hAnsi="Calibri"/>
           <w:lang w:val="fr-FR"/>
         </w:rPr>
-        <w:t xml:space="preserve">0:40</w:t>
+        <w:t xml:space="preserve">0:20</w:t>
       </w:r>
     </w:p>
     <w:p>
@@ -14949,30 +14794,7 @@
           <w:rFonts w:ascii="Calibri" w:cs="Calibri" w:eastAsia="Calibri" w:hAnsi="Calibri"/>
           <w:lang w:val="fr-FR"/>
         </w:rPr>
-        <w:t xml:space="preserve">Lire la question : « En mode plan, que fait Claude ? » Puis les réponses : A, Il modifie directement vos fichiers ; B, Il propose un plan et attend votre feu vert ; C, Il programme une tâche récurrente ; D, Il remplit votre agenda. Compter « 1, 2, 3, cartons ! » Observer la salle et commenter la répartition (« beaucoup de bleu… quelques verts… ») sans donner d'indice.</w:t>
-      </w:r>
-    </w:p>
-    <w:p>
-      <w:pPr>
-        <w:pStyle w:val="Body"/>
-        <w:spacing w:after="120"/>
-      </w:pPr>
-      <w:r>
-        <w:rPr>
-          <w:rFonts w:ascii="Calibri" w:cs="Calibri" w:eastAsia="Calibri" w:hAnsi="Calibri"/>
-          <w:b/>
-          <w:bCs/>
-          <w:color w:val="2F5FC4"/>
-          <w:lang w:val="fr-FR"/>
-        </w:rPr>
-        <w:t xml:space="preserve">Question à la salle — </w:t>
-      </w:r>
-      <w:r>
-        <w:rPr>
-          <w:rFonts w:ascii="Calibri" w:cs="Calibri" w:eastAsia="Calibri" w:hAnsi="Calibri"/>
-          <w:lang w:val="fr-FR"/>
-        </w:rPr>
-        <w:t xml:space="preserve">Un volontaire pour défendre une autre réponse que celle de la majorité ?</w:t>
+        <w:t xml:space="preserve">Bonne réponse : B, « Il propose un plan et attend votre feu vert ». En mode plan, Claude lit et explore, mais ne modifie rien. Il présente un plan, et vous choisissez : approuver, approuver en validant chaque modification, ou continuer à planifier en le corrigeant. C'est la meilleure façon de débuter avec Claude Code.</w:t>
       </w:r>
     </w:p>
     <w:p>
@@ -14995,7 +14817,7 @@
           <w:rFonts w:ascii="Calibri" w:cs="Calibri" w:eastAsia="Calibri" w:hAnsi="Calibri"/>
           <w:lang w:val="fr-FR"/>
         </w:rPr>
-        <w:t xml:space="preserve">Clic : révélation de la réponse.</w:t>
+        <w:t xml:space="preserve">Question 8.</w:t>
       </w:r>
     </w:p>
     <w:p>
@@ -15015,7 +14837,7 @@
           <w:rFonts w:ascii="Calibri" w:cs="Calibri" w:eastAsia="Calibri" w:hAnsi="Calibri"/>
           <w:lang w:val="fr-FR"/>
         </w:rPr>
-        <w:t xml:space="preserve">Diapo 47 · Question 7 · réponse</w:t>
+        <w:t xml:space="preserve">Diapo 47 · Question 8</w:t>
       </w:r>
     </w:p>
     <w:p>
@@ -15029,7 +14851,7 @@
           <wp:inline distT="0" distB="0" distL="0" distR="0">
             <wp:extent cx="2667000" cy="1504950"/>
             <wp:effectExtent t="0" r="0" b="0" l="0"/>
-            <wp:docPr id="41" name="diapo47" descr="Diapo 47 : Question 7 · réponse" title="Diapo 47"/>
+            <wp:docPr id="41" name="diapo47" descr="Diapo 47 : Question 8" title="Diapo 47"/>
             <wp:cNvGraphicFramePr>
               <a:graphicFrameLocks xmlns:a="http://schemas.openxmlformats.org/drawingml/2006/main" noChangeAspect="1"/>
             </wp:cNvGraphicFramePr>
@@ -15085,7 +14907,7 @@
           <w:rFonts w:ascii="Calibri" w:cs="Calibri" w:eastAsia="Calibri" w:hAnsi="Calibri"/>
           <w:lang w:val="fr-FR"/>
         </w:rPr>
-        <w:t xml:space="preserve">Corriger et consolider la notion de la question 7.</w:t>
+        <w:t xml:space="preserve">Question 8 : faire voter la salle.</w:t>
       </w:r>
     </w:p>
     <w:p>
@@ -15108,7 +14930,7 @@
           <w:rFonts w:ascii="Calibri" w:cs="Calibri" w:eastAsia="Calibri" w:hAnsi="Calibri"/>
           <w:lang w:val="fr-FR"/>
         </w:rPr>
-        <w:t xml:space="preserve">0:20</w:t>
+        <w:t xml:space="preserve">0:40</w:t>
       </w:r>
     </w:p>
     <w:p>
@@ -15133,7 +14955,30 @@
           <w:rFonts w:ascii="Calibri" w:cs="Calibri" w:eastAsia="Calibri" w:hAnsi="Calibri"/>
           <w:lang w:val="fr-FR"/>
         </w:rPr>
-        <w:t xml:space="preserve">Bonne réponse : B, « Il propose un plan et attend votre feu vert ». En mode plan, Claude lit et explore, mais ne modifie rien. Il présente un plan, et vous choisissez : approuver, approuver en validant chaque modification, ou continuer à planifier en le corrigeant. C'est la meilleure façon de débuter avec Claude Code.</w:t>
+        <w:t xml:space="preserve">Lire la question : « Pour utiliser Claude Code, il faut… » Puis les réponses : A, Savoir programmer ; B, Ouvrir un terminal ; C, Un dossier et des consignes en français ; D, Une licence développeur. Laisser cinq secondes de réflexion, puis demander les réponses à voix haute. Relever les lettres entendues (« j'entends beaucoup de B… quelques C ») sans donner d'indice.</w:t>
+      </w:r>
+    </w:p>
+    <w:p>
+      <w:pPr>
+        <w:pStyle w:val="Body"/>
+        <w:spacing w:after="120"/>
+      </w:pPr>
+      <w:r>
+        <w:rPr>
+          <w:rFonts w:ascii="Calibri" w:cs="Calibri" w:eastAsia="Calibri" w:hAnsi="Calibri"/>
+          <w:b/>
+          <w:bCs/>
+          <w:color w:val="2F5FC4"/>
+          <w:lang w:val="fr-FR"/>
+        </w:rPr>
+        <w:t xml:space="preserve">Question à la salle — </w:t>
+      </w:r>
+      <w:r>
+        <w:rPr>
+          <w:rFonts w:ascii="Calibri" w:cs="Calibri" w:eastAsia="Calibri" w:hAnsi="Calibri"/>
+          <w:lang w:val="fr-FR"/>
+        </w:rPr>
+        <w:t xml:space="preserve">Un volontaire pour défendre une autre réponse que celle de la majorité ?</w:t>
       </w:r>
     </w:p>
     <w:p>
@@ -15156,7 +15001,7 @@
           <w:rFonts w:ascii="Calibri" w:cs="Calibri" w:eastAsia="Calibri" w:hAnsi="Calibri"/>
           <w:lang w:val="fr-FR"/>
         </w:rPr>
-        <w:t xml:space="preserve">Question 8.</w:t>
+        <w:t xml:space="preserve">Clic : révélation de la réponse.</w:t>
       </w:r>
     </w:p>
     <w:p>
@@ -15176,7 +15021,7 @@
           <w:rFonts w:ascii="Calibri" w:cs="Calibri" w:eastAsia="Calibri" w:hAnsi="Calibri"/>
           <w:lang w:val="fr-FR"/>
         </w:rPr>
-        <w:t xml:space="preserve">Diapo 48 · Question 8</w:t>
+        <w:t xml:space="preserve">Diapo 48 · Question 8 · réponse</w:t>
       </w:r>
     </w:p>
     <w:p>
@@ -15190,7 +15035,7 @@
           <wp:inline distT="0" distB="0" distL="0" distR="0">
             <wp:extent cx="2667000" cy="1504950"/>
             <wp:effectExtent t="0" r="0" b="0" l="0"/>
-            <wp:docPr id="42" name="diapo48" descr="Diapo 48 : Question 8" title="Diapo 48"/>
+            <wp:docPr id="42" name="diapo48" descr="Diapo 48 : Question 8 · réponse" title="Diapo 48"/>
             <wp:cNvGraphicFramePr>
               <a:graphicFrameLocks xmlns:a="http://schemas.openxmlformats.org/drawingml/2006/main" noChangeAspect="1"/>
             </wp:cNvGraphicFramePr>
@@ -15246,7 +15091,7 @@
           <w:rFonts w:ascii="Calibri" w:cs="Calibri" w:eastAsia="Calibri" w:hAnsi="Calibri"/>
           <w:lang w:val="fr-FR"/>
         </w:rPr>
-        <w:t xml:space="preserve">Question 8 : faire voter la salle.</w:t>
+        <w:t xml:space="preserve">Corriger et consolider la notion de la question 8.</w:t>
       </w:r>
     </w:p>
     <w:p>
@@ -15269,7 +15114,7 @@
           <w:rFonts w:ascii="Calibri" w:cs="Calibri" w:eastAsia="Calibri" w:hAnsi="Calibri"/>
           <w:lang w:val="fr-FR"/>
         </w:rPr>
-        <w:t xml:space="preserve">0:40</w:t>
+        <w:t xml:space="preserve">0:20</w:t>
       </w:r>
     </w:p>
     <w:p>
@@ -15294,30 +15139,7 @@
           <w:rFonts w:ascii="Calibri" w:cs="Calibri" w:eastAsia="Calibri" w:hAnsi="Calibri"/>
           <w:lang w:val="fr-FR"/>
         </w:rPr>
-        <w:t xml:space="preserve">Lire la question : « Pour utiliser Claude Code, il faut… » Puis les réponses : A, Savoir programmer ; B, Ouvrir un terminal ; C, Un dossier et des consignes en français ; D, Une licence développeur. Compter « 1, 2, 3, cartons ! » Observer la salle et commenter la répartition (« beaucoup de bleu… quelques verts… ») sans donner d'indice.</w:t>
-      </w:r>
-    </w:p>
-    <w:p>
-      <w:pPr>
-        <w:pStyle w:val="Body"/>
-        <w:spacing w:after="120"/>
-      </w:pPr>
-      <w:r>
-        <w:rPr>
-          <w:rFonts w:ascii="Calibri" w:cs="Calibri" w:eastAsia="Calibri" w:hAnsi="Calibri"/>
-          <w:b/>
-          <w:bCs/>
-          <w:color w:val="2F5FC4"/>
-          <w:lang w:val="fr-FR"/>
-        </w:rPr>
-        <w:t xml:space="preserve">Question à la salle — </w:t>
-      </w:r>
-      <w:r>
-        <w:rPr>
-          <w:rFonts w:ascii="Calibri" w:cs="Calibri" w:eastAsia="Calibri" w:hAnsi="Calibri"/>
-          <w:lang w:val="fr-FR"/>
-        </w:rPr>
-        <w:t xml:space="preserve">Un volontaire pour défendre une autre réponse que celle de la majorité ?</w:t>
+        <w:t xml:space="preserve">Bonne réponse : C, « Un dossier et des consignes en français ». Claude Code travaille dans n'importe quel dossier, y compris un dossier de documents. Il existe un onglet Code dans l'application de bureau, donc pas besoin de terminal, et on lui écrit en français comme dans Chat.</w:t>
       </w:r>
     </w:p>
     <w:p>
@@ -15340,7 +15162,7 @@
           <w:rFonts w:ascii="Calibri" w:cs="Calibri" w:eastAsia="Calibri" w:hAnsi="Calibri"/>
           <w:lang w:val="fr-FR"/>
         </w:rPr>
-        <w:t xml:space="preserve">Clic : révélation de la réponse.</w:t>
+        <w:t xml:space="preserve">Question 9.</w:t>
       </w:r>
     </w:p>
     <w:p>
@@ -15360,7 +15182,7 @@
           <w:rFonts w:ascii="Calibri" w:cs="Calibri" w:eastAsia="Calibri" w:hAnsi="Calibri"/>
           <w:lang w:val="fr-FR"/>
         </w:rPr>
-        <w:t xml:space="preserve">Diapo 49 · Question 8 · réponse</w:t>
+        <w:t xml:space="preserve">Diapo 49 · Question 9</w:t>
       </w:r>
     </w:p>
     <w:p>
@@ -15374,7 +15196,7 @@
           <wp:inline distT="0" distB="0" distL="0" distR="0">
             <wp:extent cx="2667000" cy="1504950"/>
             <wp:effectExtent t="0" r="0" b="0" l="0"/>
-            <wp:docPr id="43" name="diapo49" descr="Diapo 49 : Question 8 · réponse" title="Diapo 49"/>
+            <wp:docPr id="43" name="diapo49" descr="Diapo 49 : Question 9" title="Diapo 49"/>
             <wp:cNvGraphicFramePr>
               <a:graphicFrameLocks xmlns:a="http://schemas.openxmlformats.org/drawingml/2006/main" noChangeAspect="1"/>
             </wp:cNvGraphicFramePr>
@@ -15430,7 +15252,7 @@
           <w:rFonts w:ascii="Calibri" w:cs="Calibri" w:eastAsia="Calibri" w:hAnsi="Calibri"/>
           <w:lang w:val="fr-FR"/>
         </w:rPr>
-        <w:t xml:space="preserve">Corriger et consolider la notion de la question 8.</w:t>
+        <w:t xml:space="preserve">Question 9 : faire voter la salle.</w:t>
       </w:r>
     </w:p>
     <w:p>
@@ -15453,7 +15275,7 @@
           <w:rFonts w:ascii="Calibri" w:cs="Calibri" w:eastAsia="Calibri" w:hAnsi="Calibri"/>
           <w:lang w:val="fr-FR"/>
         </w:rPr>
-        <w:t xml:space="preserve">0:20</w:t>
+        <w:t xml:space="preserve">0:40</w:t>
       </w:r>
     </w:p>
     <w:p>
@@ -15478,7 +15300,30 @@
           <w:rFonts w:ascii="Calibri" w:cs="Calibri" w:eastAsia="Calibri" w:hAnsi="Calibri"/>
           <w:lang w:val="fr-FR"/>
         </w:rPr>
-        <w:t xml:space="preserve">Bonne réponse : C, « Un dossier et des consignes en français ». Claude Code travaille dans n'importe quel dossier, y compris un dossier de documents. Il existe un onglet Code dans l'application de bureau, donc pas besoin de terminal, et on lui écrit en français comme dans Chat.</w:t>
+        <w:t xml:space="preserve">Lire la question : « Pour vous aider à créer une skill, Claude s'appuie sur… » Puis les réponses : A, brand-guidelines ; B, skill-creator ; C, docx ; D, Rien, il improvise. Laisser cinq secondes de réflexion, puis demander les réponses à voix haute. Relever les lettres entendues (« j'entends beaucoup de B… quelques C ») sans donner d'indice.</w:t>
+      </w:r>
+    </w:p>
+    <w:p>
+      <w:pPr>
+        <w:pStyle w:val="Body"/>
+        <w:spacing w:after="120"/>
+      </w:pPr>
+      <w:r>
+        <w:rPr>
+          <w:rFonts w:ascii="Calibri" w:cs="Calibri" w:eastAsia="Calibri" w:hAnsi="Calibri"/>
+          <w:b/>
+          <w:bCs/>
+          <w:color w:val="2F5FC4"/>
+          <w:lang w:val="fr-FR"/>
+        </w:rPr>
+        <w:t xml:space="preserve">Question à la salle — </w:t>
+      </w:r>
+      <w:r>
+        <w:rPr>
+          <w:rFonts w:ascii="Calibri" w:cs="Calibri" w:eastAsia="Calibri" w:hAnsi="Calibri"/>
+          <w:lang w:val="fr-FR"/>
+        </w:rPr>
+        <w:t xml:space="preserve">Un volontaire pour défendre une autre réponse que celle de la majorité ?</w:t>
       </w:r>
     </w:p>
     <w:p>
@@ -15501,7 +15346,7 @@
           <w:rFonts w:ascii="Calibri" w:cs="Calibri" w:eastAsia="Calibri" w:hAnsi="Calibri"/>
           <w:lang w:val="fr-FR"/>
         </w:rPr>
-        <w:t xml:space="preserve">Question 9.</w:t>
+        <w:t xml:space="preserve">Clic : révélation de la réponse.</w:t>
       </w:r>
     </w:p>
     <w:p>
@@ -15521,7 +15366,7 @@
           <w:rFonts w:ascii="Calibri" w:cs="Calibri" w:eastAsia="Calibri" w:hAnsi="Calibri"/>
           <w:lang w:val="fr-FR"/>
         </w:rPr>
-        <w:t xml:space="preserve">Diapo 50 · Question 9</w:t>
+        <w:t xml:space="preserve">Diapo 50 · Question 9 · réponse</w:t>
       </w:r>
     </w:p>
     <w:p>
@@ -15535,7 +15380,7 @@
           <wp:inline distT="0" distB="0" distL="0" distR="0">
             <wp:extent cx="2667000" cy="1504950"/>
             <wp:effectExtent t="0" r="0" b="0" l="0"/>
-            <wp:docPr id="44" name="diapo50" descr="Diapo 50 : Question 9" title="Diapo 50"/>
+            <wp:docPr id="44" name="diapo50" descr="Diapo 50 : Question 9 · réponse" title="Diapo 50"/>
             <wp:cNvGraphicFramePr>
               <a:graphicFrameLocks xmlns:a="http://schemas.openxmlformats.org/drawingml/2006/main" noChangeAspect="1"/>
             </wp:cNvGraphicFramePr>
@@ -15591,7 +15436,7 @@
           <w:rFonts w:ascii="Calibri" w:cs="Calibri" w:eastAsia="Calibri" w:hAnsi="Calibri"/>
           <w:lang w:val="fr-FR"/>
         </w:rPr>
-        <w:t xml:space="preserve">Question 9 : faire voter la salle.</w:t>
+        <w:t xml:space="preserve">Corriger et consolider la notion de la question 9.</w:t>
       </w:r>
     </w:p>
     <w:p>
@@ -15614,7 +15459,7 @@
           <w:rFonts w:ascii="Calibri" w:cs="Calibri" w:eastAsia="Calibri" w:hAnsi="Calibri"/>
           <w:lang w:val="fr-FR"/>
         </w:rPr>
-        <w:t xml:space="preserve">0:40</w:t>
+        <w:t xml:space="preserve">0:20</w:t>
       </w:r>
     </w:p>
     <w:p>
@@ -15639,30 +15484,7 @@
           <w:rFonts w:ascii="Calibri" w:cs="Calibri" w:eastAsia="Calibri" w:hAnsi="Calibri"/>
           <w:lang w:val="fr-FR"/>
         </w:rPr>
-        <w:t xml:space="preserve">Lire la question : « Pour vous aider à créer une skill, Claude s'appuie sur… » Puis les réponses : A, brand-guidelines ; B, skill-creator ; C, docx ; D, Rien, il improvise. Compter « 1, 2, 3, cartons ! » Observer la salle et commenter la répartition (« beaucoup de bleu… quelques verts… ») sans donner d'indice.</w:t>
-      </w:r>
-    </w:p>
-    <w:p>
-      <w:pPr>
-        <w:pStyle w:val="Body"/>
-        <w:spacing w:after="120"/>
-      </w:pPr>
-      <w:r>
-        <w:rPr>
-          <w:rFonts w:ascii="Calibri" w:cs="Calibri" w:eastAsia="Calibri" w:hAnsi="Calibri"/>
-          <w:b/>
-          <w:bCs/>
-          <w:color w:val="2F5FC4"/>
-          <w:lang w:val="fr-FR"/>
-        </w:rPr>
-        <w:t xml:space="preserve">Question à la salle — </w:t>
-      </w:r>
-      <w:r>
-        <w:rPr>
-          <w:rFonts w:ascii="Calibri" w:cs="Calibri" w:eastAsia="Calibri" w:hAnsi="Calibri"/>
-          <w:lang w:val="fr-FR"/>
-        </w:rPr>
-        <w:t xml:space="preserve">Un volontaire pour défendre une autre réponse que celle de la majorité ?</w:t>
+        <w:t xml:space="preserve">Bonne réponse : B, « skill-creator ». skill-creator est la skill d'Anthropic qui fabrique les skills : elle guide l'entretien, la rédaction du SKILL.md, les tests, l'amélioration et l'affinage de la description, puis empaquette le résultat. Elle est plus complète dans Cowork et Claude Code que dans Chat.</w:t>
       </w:r>
     </w:p>
     <w:p>
@@ -15685,7 +15507,7 @@
           <w:rFonts w:ascii="Calibri" w:cs="Calibri" w:eastAsia="Calibri" w:hAnsi="Calibri"/>
           <w:lang w:val="fr-FR"/>
         </w:rPr>
-        <w:t xml:space="preserve">Clic : révélation de la réponse.</w:t>
+        <w:t xml:space="preserve">Dernière diapo avant l'atelier : ce qu'il faut retenir.</w:t>
       </w:r>
     </w:p>
     <w:p>
@@ -15705,7 +15527,7 @@
           <w:rFonts w:ascii="Calibri" w:cs="Calibri" w:eastAsia="Calibri" w:hAnsi="Calibri"/>
           <w:lang w:val="fr-FR"/>
         </w:rPr>
-        <w:t xml:space="preserve">Diapo 51 · Question 9 · réponse</w:t>
+        <w:t xml:space="preserve">Diapo 51 · À retenir</w:t>
       </w:r>
     </w:p>
     <w:p>
@@ -15717,9 +15539,9 @@
       <w:r>
         <w:drawing>
           <wp:inline distT="0" distB="0" distL="0" distR="0">
-            <wp:extent cx="2667000" cy="1504950"/>
+            <wp:extent cx="4191000" cy="2362200"/>
             <wp:effectExtent t="0" r="0" b="0" l="0"/>
-            <wp:docPr id="45" name="diapo51" descr="Diapo 51 : Question 9 · réponse" title="Diapo 51"/>
+            <wp:docPr id="45" name="diapo51" descr="Diapo 51 : À retenir" title="Diapo 51"/>
             <wp:cNvGraphicFramePr>
               <a:graphicFrameLocks xmlns:a="http://schemas.openxmlformats.org/drawingml/2006/main" noChangeAspect="1"/>
             </wp:cNvGraphicFramePr>
@@ -15742,7 +15564,7 @@
                   <pic:spPr bwMode="auto">
                     <a:xfrm>
                       <a:off x="0" y="0"/>
-                      <a:ext cx="2667000" cy="1504950"/>
+                      <a:ext cx="4191000" cy="2362200"/>
                     </a:xfrm>
                     <a:prstGeom prst="rect">
                       <a:avLst/>
@@ -15775,7 +15597,7 @@
           <w:rFonts w:ascii="Calibri" w:cs="Calibri" w:eastAsia="Calibri" w:hAnsi="Calibri"/>
           <w:lang w:val="fr-FR"/>
         </w:rPr>
-        <w:t xml:space="preserve">Corriger et consolider la notion de la question 9.</w:t>
+        <w:t xml:space="preserve">Synthétiser en trois idées et lancer l'atelier.</w:t>
       </w:r>
     </w:p>
     <w:p>
@@ -15798,7 +15620,7 @@
           <w:rFonts w:ascii="Calibri" w:cs="Calibri" w:eastAsia="Calibri" w:hAnsi="Calibri"/>
           <w:lang w:val="fr-FR"/>
         </w:rPr>
-        <w:t xml:space="preserve">0:20</w:t>
+        <w:t xml:space="preserve">1:30</w:t>
       </w:r>
     </w:p>
     <w:p>
@@ -15823,7 +15645,30 @@
           <w:rFonts w:ascii="Calibri" w:cs="Calibri" w:eastAsia="Calibri" w:hAnsi="Calibri"/>
           <w:lang w:val="fr-FR"/>
         </w:rPr>
-        <w:t xml:space="preserve">Bonne réponse : B, « skill-creator ». skill-creator est la skill d'Anthropic qui fabrique les skills : elle guide l'entretien, la rédaction du SKILL.md, les tests, l'amélioration et l'affinage de la description, puis empaquette le résultat. Elle est plus complète dans Cowork et Claude Code que dans Chat.</w:t>
+        <w:t xml:space="preserve">Quatre idées à garder. Une : une skill, c'est un savoir-faire rangé dans un dossier, que Claude ressort au bon moment. Deux : sa qualité tient à sa description, qui dit QUAND l'utiliser, et à un exemple réussi. Trois : on teste, on ajuste, et seulement ensuite on partage. Quatre : Claude Code n'est pas réservé aux développeurs. Commencez en mode plan, sur une copie de votre dossier, et vous garderez la main à chaque étape. Refaites le test du début : qui a encore peur de Claude Code ? Place à l'atelier. Consigne : choisissez une tâche que vous répétez chaque semaine (celles que nous avons notées au début peuvent servir) et créez-en la skill dans la porte de votre choix. Trois parcours sont proposés dans le document distribué : Chat, Cowork, ou Code accompagné en mode plan. Vous pouvez aussi suivre le cas de la charte graphique de Claude Academy. Objectif de fin d'atelier : une skill enregistrée, testée une fois dans une nouvelle conversation, et dont la description commence par ce qu'elle fait et continue par « Utiliser quand… ». Les notes distribuées contiennent le pas-à-pas et un prompt de départ ; tous les supports, présentation comprise, sont en ligne sur le dépôt GitHub dont l'adresse s'affiche en bas de la diapo.</w:t>
+      </w:r>
+    </w:p>
+    <w:p>
+      <w:pPr>
+        <w:pStyle w:val="Body"/>
+        <w:spacing w:after="120"/>
+      </w:pPr>
+      <w:r>
+        <w:rPr>
+          <w:rFonts w:ascii="Calibri" w:cs="Calibri" w:eastAsia="Calibri" w:hAnsi="Calibri"/>
+          <w:b/>
+          <w:bCs/>
+          <w:color w:val="2F5FC4"/>
+          <w:lang w:val="fr-FR"/>
+        </w:rPr>
+        <w:t xml:space="preserve">Question à la salle — </w:t>
+      </w:r>
+      <w:r>
+        <w:rPr>
+          <w:rFonts w:ascii="Calibri" w:cs="Calibri" w:eastAsia="Calibri" w:hAnsi="Calibri"/>
+          <w:lang w:val="fr-FR"/>
+        </w:rPr>
+        <w:t xml:space="preserve">Qui sait déjà quelle skill il ou elle va créer ?</w:t>
       </w:r>
     </w:p>
     <w:p>
@@ -15846,7 +15691,7 @@
           <w:rFonts w:ascii="Calibri" w:cs="Calibri" w:eastAsia="Calibri" w:hAnsi="Calibri"/>
           <w:lang w:val="fr-FR"/>
         </w:rPr>
-        <w:t xml:space="preserve">Dernière diapo avant l'atelier : ce qu'il faut retenir.</w:t>
+        <w:t xml:space="preserve">Je laisse mes coordonnées à l'écran pendant l'atelier.</w:t>
       </w:r>
     </w:p>
     <w:p>
@@ -15866,7 +15711,7 @@
           <w:rFonts w:ascii="Calibri" w:cs="Calibri" w:eastAsia="Calibri" w:hAnsi="Calibri"/>
           <w:lang w:val="fr-FR"/>
         </w:rPr>
-        <w:t xml:space="preserve">Diapo 52 · À retenir</w:t>
+        <w:t xml:space="preserve">Diapo 52 · Restons en contact</w:t>
       </w:r>
     </w:p>
     <w:p>
@@ -15878,9 +15723,9 @@
       <w:r>
         <w:drawing>
           <wp:inline distT="0" distB="0" distL="0" distR="0">
-            <wp:extent cx="4191000" cy="2362200"/>
+            <wp:extent cx="2667000" cy="1504950"/>
             <wp:effectExtent t="0" r="0" b="0" l="0"/>
-            <wp:docPr id="46" name="diapo52" descr="Diapo 52 : À retenir" title="Diapo 52"/>
+            <wp:docPr id="46" name="diapo52" descr="Diapo 52 : Restons en contact" title="Diapo 52"/>
             <wp:cNvGraphicFramePr>
               <a:graphicFrameLocks xmlns:a="http://schemas.openxmlformats.org/drawingml/2006/main" noChangeAspect="1"/>
             </wp:cNvGraphicFramePr>
@@ -15903,190 +15748,6 @@
                   <pic:spPr bwMode="auto">
                     <a:xfrm>
                       <a:off x="0" y="0"/>
-                      <a:ext cx="4191000" cy="2362200"/>
-                    </a:xfrm>
-                    <a:prstGeom prst="rect">
-                      <a:avLst/>
-                    </a:prstGeom>
-                  </pic:spPr>
-                </pic:pic>
-              </a:graphicData>
-            </a:graphic>
-          </wp:inline>
-        </w:drawing>
-      </w:r>
-    </w:p>
-    <w:p>
-      <w:pPr>
-        <w:pStyle w:val="Body"/>
-        <w:spacing w:after="120"/>
-      </w:pPr>
-      <w:r>
-        <w:rPr>
-          <w:rFonts w:ascii="Calibri" w:cs="Calibri" w:eastAsia="Calibri" w:hAnsi="Calibri"/>
-          <w:b/>
-          <w:bCs/>
-          <w:color w:val="B8235A"/>
-          <w:lang w:val="fr-FR"/>
-        </w:rPr>
-        <w:t xml:space="preserve">Objectif — </w:t>
-      </w:r>
-      <w:r>
-        <w:rPr>
-          <w:rFonts w:ascii="Calibri" w:cs="Calibri" w:eastAsia="Calibri" w:hAnsi="Calibri"/>
-          <w:lang w:val="fr-FR"/>
-        </w:rPr>
-        <w:t xml:space="preserve">Synthétiser en trois idées et lancer l'atelier.</w:t>
-      </w:r>
-    </w:p>
-    <w:p>
-      <w:pPr>
-        <w:pStyle w:val="Body"/>
-        <w:spacing w:after="120"/>
-      </w:pPr>
-      <w:r>
-        <w:rPr>
-          <w:rFonts w:ascii="Calibri" w:cs="Calibri" w:eastAsia="Calibri" w:hAnsi="Calibri"/>
-          <w:b/>
-          <w:bCs/>
-          <w:color w:val="566070"/>
-          <w:lang w:val="fr-FR"/>
-        </w:rPr>
-        <w:t xml:space="preserve">Timing — </w:t>
-      </w:r>
-      <w:r>
-        <w:rPr>
-          <w:rFonts w:ascii="Calibri" w:cs="Calibri" w:eastAsia="Calibri" w:hAnsi="Calibri"/>
-          <w:lang w:val="fr-FR"/>
-        </w:rPr>
-        <w:t xml:space="preserve">1:30</w:t>
-      </w:r>
-    </w:p>
-    <w:p>
-      <w:pPr>
-        <w:pStyle w:val="Heading3"/>
-      </w:pPr>
-      <w:r>
-        <w:rPr>
-          <w:rFonts w:ascii="Calibri" w:cs="Calibri" w:eastAsia="Calibri" w:hAnsi="Calibri"/>
-          <w:lang w:val="fr-FR"/>
-        </w:rPr>
-        <w:t xml:space="preserve">Script</w:t>
-      </w:r>
-    </w:p>
-    <w:p>
-      <w:pPr>
-        <w:pStyle w:val="Body"/>
-        <w:spacing w:after="120"/>
-      </w:pPr>
-      <w:r>
-        <w:rPr>
-          <w:rFonts w:ascii="Calibri" w:cs="Calibri" w:eastAsia="Calibri" w:hAnsi="Calibri"/>
-          <w:lang w:val="fr-FR"/>
-        </w:rPr>
-        <w:t xml:space="preserve">Quatre idées à garder. Une : une skill, c'est un savoir-faire rangé dans un dossier, que Claude ressort au bon moment. Deux : sa qualité tient à sa description, qui dit QUAND l'utiliser, et à un exemple réussi. Trois : on teste, on ajuste, et seulement ensuite on partage. Quatre : Claude Code n'est pas réservé aux développeurs. Commencez en mode plan, sur une copie de votre dossier, et vous garderez la main à chaque étape. Refaites le test du début : qui a encore peur de Claude Code ? Place à l'atelier. Consigne : choisissez une tâche que vous répétez chaque semaine (celles que nous avons notées au début peuvent servir) et créez-en la skill dans la porte de votre choix. Trois parcours sont proposés dans le document distribué : Chat, Cowork, ou Code accompagné en mode plan. Vous pouvez aussi suivre le cas de la charte graphique de Claude Academy. Objectif de fin d'atelier : une skill enregistrée, testée une fois dans une nouvelle conversation, et dont la description commence par ce qu'elle fait et continue par « Utiliser quand… ». Les notes distribuées contiennent le pas-à-pas et un prompt de départ ; tous les supports, présentation comprise, sont en ligne sur le dépôt GitHub dont l'adresse s'affiche en bas de la diapo.</w:t>
-      </w:r>
-    </w:p>
-    <w:p>
-      <w:pPr>
-        <w:pStyle w:val="Body"/>
-        <w:spacing w:after="120"/>
-      </w:pPr>
-      <w:r>
-        <w:rPr>
-          <w:rFonts w:ascii="Calibri" w:cs="Calibri" w:eastAsia="Calibri" w:hAnsi="Calibri"/>
-          <w:b/>
-          <w:bCs/>
-          <w:color w:val="2F5FC4"/>
-          <w:lang w:val="fr-FR"/>
-        </w:rPr>
-        <w:t xml:space="preserve">Question à la salle — </w:t>
-      </w:r>
-      <w:r>
-        <w:rPr>
-          <w:rFonts w:ascii="Calibri" w:cs="Calibri" w:eastAsia="Calibri" w:hAnsi="Calibri"/>
-          <w:lang w:val="fr-FR"/>
-        </w:rPr>
-        <w:t xml:space="preserve">Qui sait déjà quelle skill il ou elle va créer ?</w:t>
-      </w:r>
-    </w:p>
-    <w:p>
-      <w:pPr>
-        <w:pStyle w:val="Body"/>
-        <w:spacing w:after="120"/>
-      </w:pPr>
-      <w:r>
-        <w:rPr>
-          <w:rFonts w:ascii="Calibri" w:cs="Calibri" w:eastAsia="Calibri" w:hAnsi="Calibri"/>
-          <w:b/>
-          <w:bCs/>
-          <w:color w:val="1F7A50"/>
-          <w:lang w:val="fr-FR"/>
-        </w:rPr>
-        <w:t xml:space="preserve">Transition — </w:t>
-      </w:r>
-      <w:r>
-        <w:rPr>
-          <w:rFonts w:ascii="Calibri" w:cs="Calibri" w:eastAsia="Calibri" w:hAnsi="Calibri"/>
-          <w:lang w:val="fr-FR"/>
-        </w:rPr>
-        <w:t xml:space="preserve">Je laisse mes coordonnées à l'écran pendant l'atelier.</w:t>
-      </w:r>
-    </w:p>
-    <w:p>
-      <w:pPr>
-        <w:pStyle w:val="Body"/>
-      </w:pPr>
-      <w:r>
-        <w:br w:type="page"/>
-      </w:r>
-    </w:p>
-    <w:p>
-      <w:pPr>
-        <w:pStyle w:val="Heading2"/>
-      </w:pPr>
-      <w:r>
-        <w:rPr>
-          <w:rFonts w:ascii="Calibri" w:cs="Calibri" w:eastAsia="Calibri" w:hAnsi="Calibri"/>
-          <w:lang w:val="fr-FR"/>
-        </w:rPr>
-        <w:t xml:space="preserve">Diapo 53 · Restons en contact</w:t>
-      </w:r>
-    </w:p>
-    <w:p>
-      <w:pPr>
-        <w:pStyle w:val="Body"/>
-        <w:spacing w:after="160"/>
-        <w:jc w:val="center"/>
-      </w:pPr>
-      <w:r>
-        <w:drawing>
-          <wp:inline distT="0" distB="0" distL="0" distR="0">
-            <wp:extent cx="2667000" cy="1504950"/>
-            <wp:effectExtent t="0" r="0" b="0" l="0"/>
-            <wp:docPr id="47" name="diapo53" descr="Diapo 53 : Restons en contact" title="Diapo 53"/>
-            <wp:cNvGraphicFramePr>
-              <a:graphicFrameLocks xmlns:a="http://schemas.openxmlformats.org/drawingml/2006/main" noChangeAspect="1"/>
-            </wp:cNvGraphicFramePr>
-            <a:graphic xmlns:a="http://schemas.openxmlformats.org/drawingml/2006/main">
-              <a:graphicData uri="http://schemas.openxmlformats.org/drawingml/2006/picture">
-                <pic:pic xmlns:pic="http://schemas.openxmlformats.org/drawingml/2006/picture">
-                  <pic:nvPicPr>
-                    <pic:cNvPr id="0" name="" descr=""/>
-                    <pic:cNvPicPr>
-                      <a:picLocks noChangeAspect="1" noChangeArrowheads="1"/>
-                    </pic:cNvPicPr>
-                  </pic:nvPicPr>
-                  <pic:blipFill>
-                    <a:blip r:embed="rId54" cstate="none"/>
-                    <a:srcRect/>
-                    <a:stretch>
-                      <a:fillRect/>
-                    </a:stretch>
-                  </pic:blipFill>
-                  <pic:spPr bwMode="auto">
-                    <a:xfrm>
-                      <a:off x="0" y="0"/>
                       <a:ext cx="2667000" cy="1504950"/>
                     </a:xfrm>
                     <a:prstGeom prst="rect">
@@ -16168,7 +15829,7 @@
           <w:rFonts w:ascii="Calibri" w:cs="Calibri" w:eastAsia="Calibri" w:hAnsi="Calibri"/>
           <w:lang w:val="fr-FR"/>
         </w:rPr>
-        <w:t xml:space="preserve">Laissez cette diapo affichée pendant la mise en pratique. Le grand QR code mène au dépôt GitHub qui rassemble tous les supports de la séance : cette présentation, les notes du présentateur en PDF et en Word, les cartons du quiz et les sources pour les régénérer. Invitez la salle à le scanner dès maintenant : le pas-à-pas de l'atelier s'y trouve. Les petits QR codes mènent au profil LinkedIn, au GitHub et à la ressource Claude Academy sur la charte de marque, pour ceux qui veulent refaire le cas d'usage. Pour toute question après la séance, écrivez par mail.</w:t>
+        <w:t xml:space="preserve">Laissez cette diapo affichée pendant la mise en pratique. Le grand QR code mène au dépôt GitHub qui rassemble tous les supports de la séance : cette présentation, les notes du présentateur en PDF et en Word, et les sources pour les régénérer. Invitez la salle à le scanner dès maintenant : le pas-à-pas de l'atelier s'y trouve. Les petits QR codes mènent au profil LinkedIn, au GitHub et à la ressource Claude Academy sur la charte de marque, pour ceux qui veulent refaire le cas d'usage. Pour toute question après la séance, écrivez par mail.</w:t>
       </w:r>
     </w:p>
     <w:p>
@@ -16720,7 +16381,7 @@
                 <w:rFonts w:ascii="Calibri" w:cs="Calibri" w:eastAsia="Calibri" w:hAnsi="Calibri"/>
                 <w:lang w:val="fr-FR"/>
               </w:rPr>
-              <w:t xml:space="preserve">Le mode où Claude travaille dans vos dossiers et fichiers pour mener une tâche de bout en bout. En cours de fusion avec Chat en un seul « Claude ».</w:t>
+              <w:t xml:space="preserve">Le mode où Claude travaille dans vos dossiers et fichiers pour mener une tâche de bout en bout. Chat et Cowork ont fusionné : c'est désormais un seul Claude.</w:t>
             </w:r>
           </w:p>
         </w:tc>
@@ -18435,7 +18096,7 @@
           <w:rFonts w:ascii="Calibri" w:cs="Calibri" w:eastAsia="Calibri" w:hAnsi="Calibri"/>
           <w:lang w:val="fr-FR"/>
         </w:rPr>
-        <w:t xml:space="preserve">Passer en mode plan : sélecteur de mode à côté de la zone de message, touches Maj + Tab jusqu'à « mode plan », ou commencer le message par /plan.</w:t>
+        <w:t xml:space="preserve">Passer en mode plan : choisir « Plan » dans le sélecteur de mode à côté de la zone de message, ou commencer le message par /plan.</w:t>
       </w:r>
     </w:p>
     <w:p>
@@ -20331,7 +19992,7 @@
                 <w:color w:val="566070"/>
                 <w:lang w:val="fr-FR"/>
               </w:rPr>
-              <w:t xml:space="preserve">Cowork fusionne avec Chat en ce moment : l'interface peut évoluer. Le mode plan n'est documenté que pour Claude Code.</w:t>
+              <w:t xml:space="preserve">Le mode plan n'est documenté que pour Claude Code.</w:t>
             </w:r>
           </w:p>
         </w:tc>
@@ -22747,14 +22408,14 @@
         </w:numPr>
         <w:spacing w:after="60"/>
       </w:pPr>
-      <w:hyperlink w:history="1" r:id="rIdyvwswbbfrvhlbth3zrvra">
+      <w:hyperlink w:history="1" r:id="rIdqymik_cbfoild7doxkvts">
         <w:r>
           <w:rPr>
             <w:rStyle w:val="Hyperlink"/>
             <w:rFonts w:ascii="Calibri" w:cs="Calibri" w:eastAsia="Calibri" w:hAnsi="Calibri"/>
             <w:lang w:val="fr-FR"/>
           </w:rPr>
-          <w:t xml:space="preserve">Tous les supports de cette séance (présentation, notes, cartons, sources)</w:t>
+          <w:t xml:space="preserve">Tous les supports de cette séance (présentation, notes, sources)</w:t>
         </w:r>
       </w:hyperlink>
       <w:r>
@@ -22777,7 +22438,7 @@
         </w:numPr>
         <w:spacing w:after="60"/>
       </w:pPr>
-      <w:hyperlink w:history="1" r:id="rIdlqqxyu9d0rnqlbenv6rz_">
+      <w:hyperlink w:history="1" r:id="rIdebt2j7qirn8kx1pkbayge">
         <w:r>
           <w:rPr>
             <w:rStyle w:val="Hyperlink"/>
@@ -22807,7 +22468,7 @@
         </w:numPr>
         <w:spacing w:after="60"/>
       </w:pPr>
-      <w:hyperlink w:history="1" r:id="rIde6tveop0a-tjpd-yka1g7">
+      <w:hyperlink w:history="1" r:id="rIdiccew9h9cryc-vbsupqtd">
         <w:r>
           <w:rPr>
             <w:rStyle w:val="Hyperlink"/>
@@ -22837,7 +22498,7 @@
         </w:numPr>
         <w:spacing w:after="60"/>
       </w:pPr>
-      <w:hyperlink w:history="1" r:id="rIdm8pfervtbyncw_zt-xcmp">
+      <w:hyperlink w:history="1" r:id="rIdr9bxrcsl_lwa4caasdbzf">
         <w:r>
           <w:rPr>
             <w:rStyle w:val="Hyperlink"/>
@@ -22867,7 +22528,7 @@
         </w:numPr>
         <w:spacing w:after="60"/>
       </w:pPr>
-      <w:hyperlink w:history="1" r:id="rId7idkdlthjetrllyash2am">
+      <w:hyperlink w:history="1" r:id="rId4cms_czmyyf1vepg0n-ot">
         <w:r>
           <w:rPr>
             <w:rStyle w:val="Hyperlink"/>
@@ -22897,7 +22558,7 @@
         </w:numPr>
         <w:spacing w:after="60"/>
       </w:pPr>
-      <w:hyperlink w:history="1" r:id="rIdke6elt98tip7z8dvizvr_">
+      <w:hyperlink w:history="1" r:id="rIdu-o-_mtrcuaoxjdcosngr">
         <w:r>
           <w:rPr>
             <w:rStyle w:val="Hyperlink"/>
@@ -22927,7 +22588,7 @@
         </w:numPr>
         <w:spacing w:after="60"/>
       </w:pPr>
-      <w:hyperlink w:history="1" r:id="rIdamc8lvmolbud4-tko2jmo">
+      <w:hyperlink w:history="1" r:id="rIdr1tkg_xsmi1vamvhciuvu">
         <w:r>
           <w:rPr>
             <w:rStyle w:val="Hyperlink"/>
@@ -22957,7 +22618,7 @@
         </w:numPr>
         <w:spacing w:after="60"/>
       </w:pPr>
-      <w:hyperlink w:history="1" r:id="rIdeswh2mys2algtg7atxke4">
+      <w:hyperlink w:history="1" r:id="rIdyzt7pqehlqib3jkohq1jl">
         <w:r>
           <w:rPr>
             <w:rStyle w:val="Hyperlink"/>
@@ -22987,7 +22648,7 @@
         </w:numPr>
         <w:spacing w:after="60"/>
       </w:pPr>
-      <w:hyperlink w:history="1" r:id="rIdh6m_zlkxiqzs3wi1zgu6l">
+      <w:hyperlink w:history="1" r:id="rIds7_iu2o2kwxmrdu7yfpda">
         <w:r>
           <w:rPr>
             <w:rStyle w:val="Hyperlink"/>
@@ -23017,7 +22678,7 @@
         </w:numPr>
         <w:spacing w:after="60"/>
       </w:pPr>
-      <w:hyperlink w:history="1" r:id="rIdc3zxfvavdngb5zamqzhhm">
+      <w:hyperlink w:history="1" r:id="rIdofvkg95sjyumrjs13zwjj">
         <w:r>
           <w:rPr>
             <w:rStyle w:val="Hyperlink"/>
@@ -23047,7 +22708,7 @@
         </w:numPr>
         <w:spacing w:after="60"/>
       </w:pPr>
-      <w:hyperlink w:history="1" r:id="rIdxkqflswbcg9_q4ofgzf5i">
+      <w:hyperlink w:history="1" r:id="rIdyf6k0d4jdq2nkedb2l2w5">
         <w:r>
           <w:rPr>
             <w:rStyle w:val="Hyperlink"/>
@@ -23077,7 +22738,7 @@
         </w:numPr>
         <w:spacing w:after="60"/>
       </w:pPr>
-      <w:hyperlink w:history="1" r:id="rIdr4kkywep9aofy-tyzalg2">
+      <w:hyperlink w:history="1" r:id="rIdafxfsdwjbht3nkxszrso_">
         <w:r>
           <w:rPr>
             <w:rStyle w:val="Hyperlink"/>
@@ -23107,7 +22768,7 @@
         </w:numPr>
         <w:spacing w:after="60"/>
       </w:pPr>
-      <w:hyperlink w:history="1" r:id="rIdyuz9ukmb6enk8uizfxjjj">
+      <w:hyperlink w:history="1" r:id="rIds5gsvfp135rj5ic_01dxc">
         <w:r>
           <w:rPr>
             <w:rStyle w:val="Hyperlink"/>
@@ -23137,7 +22798,7 @@
         </w:numPr>
         <w:spacing w:after="60"/>
       </w:pPr>
-      <w:hyperlink w:history="1" r:id="rIdnos9iig369yy3zqigh4dp">
+      <w:hyperlink w:history="1" r:id="rIdd-luong_ggz4wonbob-la">
         <w:r>
           <w:rPr>
             <w:rStyle w:val="Hyperlink"/>
@@ -23167,7 +22828,7 @@
         </w:numPr>
         <w:spacing w:after="60"/>
       </w:pPr>
-      <w:hyperlink w:history="1" r:id="rIdp-urhrtzdd-sj8ybj3fjo">
+      <w:hyperlink w:history="1" r:id="rIdrzuczfatw-k-mlnsvmkvu">
         <w:r>
           <w:rPr>
             <w:rStyle w:val="Hyperlink"/>
@@ -23197,14 +22858,14 @@
         </w:numPr>
         <w:spacing w:after="60"/>
       </w:pPr>
-      <w:hyperlink w:history="1" r:id="rIdezim3mzf-hm5gnvkadd42">
+      <w:hyperlink w:history="1" r:id="rIdfgtv_aexlcbiwxudtjywq">
         <w:r>
           <w:rPr>
             <w:rStyle w:val="Hyperlink"/>
             <w:rFonts w:ascii="Calibri" w:cs="Calibri" w:eastAsia="Calibri" w:hAnsi="Calibri"/>
             <w:lang w:val="fr-FR"/>
           </w:rPr>
-          <w:t xml:space="preserve">Fusion de Cowork et de Chat (annonce)</w:t>
+          <w:t xml:space="preserve">Chat et Cowork réunis en un seul Claude (annonce)</w:t>
         </w:r>
       </w:hyperlink>
       <w:r>
@@ -23295,7 +22956,7 @@
           <w:rFonts w:ascii="Calibri" w:cs="Calibri" w:eastAsia="Calibri" w:hAnsi="Calibri"/>
           <w:lang w:val="fr-FR"/>
         </w:rPr>
-        <w:t xml:space="preserve">Dans le dossier de démo Code, créer à l'avance le dossier vide .claude/skills/ et régler le mode sur Manuel ou Plan.</w:t>
+        <w:t xml:space="preserve">Pour le parcours « Code accompagné » de l'atelier : créer à l'avance le dossier vide .claude/skills/ dans le dossier de travail, et régler le mode sur Manuel ou Plan.</w:t>
       </w:r>
     </w:p>
     <w:p>
@@ -23346,7 +23007,7 @@
           <w:rFonts w:ascii="Calibri" w:cs="Calibri" w:eastAsia="Calibri" w:hAnsi="Calibri"/>
           <w:lang w:val="fr-FR"/>
         </w:rPr>
-        <w:t xml:space="preserve">Les démos en direct (diapos 27 et 20) : prévoir les maquettes comme solution de repli si le réseau fait défaut.</w:t>
+        <w:t xml:space="preserve">La démo en direct (diapo 26) : prévoir la maquette comme solution de repli si le réseau fait défaut.</w:t>
       </w:r>
     </w:p>
     <w:p>
@@ -23363,7 +23024,7 @@
           <w:rFonts w:ascii="Calibri" w:cs="Calibri" w:eastAsia="Calibri" w:hAnsi="Calibri"/>
           <w:lang w:val="fr-FR"/>
         </w:rPr>
-        <w:t xml:space="preserve">L'état de la fusion Chat/Cowork selon l'offre des participants : deux onglets ou un seul « Claude » (déploiement commencé en septembre 2026 pour Pro et Max).</w:t>
+        <w:t xml:space="preserve">Que l'onglet Code de l'application de bureau est installé et connecté au compte sur le poste de démo, et sur les postes du parcours « Code accompagné ».</w:t>
       </w:r>
     </w:p>
     <w:p>
@@ -23380,23 +23041,6 @@
           <w:rFonts w:ascii="Calibri" w:cs="Calibri" w:eastAsia="Calibri" w:hAnsi="Calibri"/>
           <w:lang w:val="fr-FR"/>
         </w:rPr>
-        <w:t xml:space="preserve">Que l'onglet Code de l'application de bureau est installé et connecté au compte sur le poste de démo, et sur les postes du parcours « Code accompagné ».</w:t>
-      </w:r>
-    </w:p>
-    <w:p>
-      <w:pPr>
-        <w:pStyle w:val="Body"/>
-        <w:numPr>
-          <w:ilvl w:val="0"/>
-          <w:numId w:val="2"/>
-        </w:numPr>
-        <w:spacing w:after="60"/>
-      </w:pPr>
-      <w:r>
-        <w:rPr>
-          <w:rFonts w:ascii="Calibri" w:cs="Calibri" w:eastAsia="Calibri" w:hAnsi="Calibri"/>
-          <w:lang w:val="fr-FR"/>
-        </w:rPr>
         <w:t xml:space="preserve">En Team/Enterprise : si l'administrateur a désactivé le mode auto, l'option d'approbation du plan s'intitule « accepter automatiquement les modifications ».</w:t>
       </w:r>
     </w:p>
@@ -23459,7 +23103,7 @@
         </w:rPr>
         <w:t xml:space="preserve">Source : </w:t>
       </w:r>
-      <w:hyperlink w:history="1" r:id="rId2_jigbkiilswfpict4bkm">
+      <w:hyperlink w:history="1" r:id="rIdujtjlx906mvtqy2uisaba">
         <w:r>
           <w:rPr>
             <w:rStyle w:val="Hyperlink"/>

</xml_diff>

<commit_message>
Diapo 5 : les trois niveaux de lecture d'une skill (aide Claude)
Métadonnées toujours lues, corps du SKILL.md si utile, fichiers annexes si besoin.

Co-Authored-By: Claude Opus 5.5 <noreply@anthropic.com>
</commit_message>
<xml_diff>
--- a/skills-claude-notes-presentateur.docx
+++ b/skills-claude-notes-presentateur.docx
@@ -111,7 +111,7 @@
         </w:rPr>
         <w:t xml:space="preserve">LinkedIn : </w:t>
       </w:r>
-      <w:hyperlink w:history="1" r:id="rIdv1wy0wv_ilu-i8og3opof">
+      <w:hyperlink w:history="1" r:id="rIdvojymihjscvn7wabotnem">
         <w:r>
           <w:rPr>
             <w:rStyle w:val="Hyperlink"/>
@@ -142,7 +142,7 @@
         </w:rPr>
         <w:t xml:space="preserve">GitHub : </w:t>
       </w:r>
-      <w:hyperlink w:history="1" r:id="rIdzkf1dgtht2kmzxz-g8nzv">
+      <w:hyperlink w:history="1" r:id="rIdy-lh7ll05a1lfsyaiwxqc">
         <w:r>
           <w:rPr>
             <w:rStyle w:val="Hyperlink"/>
@@ -182,7 +182,7 @@
         <w:pStyle w:val="Body"/>
         <w:spacing w:after="120"/>
       </w:pPr>
-      <w:hyperlink w:history="1" r:id="rIdgcflye4pspimdyqy0db4g">
+      <w:hyperlink w:history="1" r:id="rIdxwltursev-x6foxy_ggvn">
         <w:r>
           <w:rPr>
             <w:rStyle w:val="Hyperlink"/>
@@ -1386,7 +1386,7 @@
                 <w:rFonts w:ascii="Calibri" w:cs="Calibri" w:eastAsia="Calibri" w:hAnsi="Calibri"/>
                 <w:lang w:val="fr-FR"/>
               </w:rPr>
-              <w:t xml:space="preserve">1:15</w:t>
+              <w:t xml:space="preserve">1:30</w:t>
             </w:r>
           </w:p>
         </w:tc>
@@ -1415,7 +1415,7 @@
                 <w:rFonts w:ascii="Calibri" w:cs="Calibri" w:eastAsia="Calibri" w:hAnsi="Calibri"/>
                 <w:lang w:val="fr-FR"/>
               </w:rPr>
-              <w:t xml:space="preserve">3:55</w:t>
+              <w:t xml:space="preserve">4:10</w:t>
             </w:r>
           </w:p>
         </w:tc>
@@ -1540,7 +1540,7 @@
                 <w:rFonts w:ascii="Calibri" w:cs="Calibri" w:eastAsia="Calibri" w:hAnsi="Calibri"/>
                 <w:lang w:val="fr-FR"/>
               </w:rPr>
-              <w:t xml:space="preserve">5:25</w:t>
+              <w:t xml:space="preserve">5:40</w:t>
             </w:r>
           </w:p>
         </w:tc>
@@ -1661,7 +1661,7 @@
                 <w:rFonts w:ascii="Calibri" w:cs="Calibri" w:eastAsia="Calibri" w:hAnsi="Calibri"/>
                 <w:lang w:val="fr-FR"/>
               </w:rPr>
-              <w:t xml:space="preserve">6:25</w:t>
+              <w:t xml:space="preserve">6:40</w:t>
             </w:r>
           </w:p>
         </w:tc>
@@ -1786,7 +1786,7 @@
                 <w:rFonts w:ascii="Calibri" w:cs="Calibri" w:eastAsia="Calibri" w:hAnsi="Calibri"/>
                 <w:lang w:val="fr-FR"/>
               </w:rPr>
-              <w:t xml:space="preserve">6:35</w:t>
+              <w:t xml:space="preserve">6:50</w:t>
             </w:r>
           </w:p>
         </w:tc>
@@ -1907,7 +1907,7 @@
                 <w:rFonts w:ascii="Calibri" w:cs="Calibri" w:eastAsia="Calibri" w:hAnsi="Calibri"/>
                 <w:lang w:val="fr-FR"/>
               </w:rPr>
-              <w:t xml:space="preserve">8:05</w:t>
+              <w:t xml:space="preserve">8:20</w:t>
             </w:r>
           </w:p>
         </w:tc>
@@ -2032,7 +2032,7 @@
                 <w:rFonts w:ascii="Calibri" w:cs="Calibri" w:eastAsia="Calibri" w:hAnsi="Calibri"/>
                 <w:lang w:val="fr-FR"/>
               </w:rPr>
-              <w:t xml:space="preserve">9:05</w:t>
+              <w:t xml:space="preserve">9:20</w:t>
             </w:r>
           </w:p>
         </w:tc>
@@ -2153,7 +2153,7 @@
                 <w:rFonts w:ascii="Calibri" w:cs="Calibri" w:eastAsia="Calibri" w:hAnsi="Calibri"/>
                 <w:lang w:val="fr-FR"/>
               </w:rPr>
-              <w:t xml:space="preserve">9:15</w:t>
+              <w:t xml:space="preserve">9:30</w:t>
             </w:r>
           </w:p>
         </w:tc>
@@ -2278,7 +2278,7 @@
                 <w:rFonts w:ascii="Calibri" w:cs="Calibri" w:eastAsia="Calibri" w:hAnsi="Calibri"/>
                 <w:lang w:val="fr-FR"/>
               </w:rPr>
-              <w:t xml:space="preserve">10:30</w:t>
+              <w:t xml:space="preserve">10:45</w:t>
             </w:r>
           </w:p>
         </w:tc>
@@ -2399,7 +2399,7 @@
                 <w:rFonts w:ascii="Calibri" w:cs="Calibri" w:eastAsia="Calibri" w:hAnsi="Calibri"/>
                 <w:lang w:val="fr-FR"/>
               </w:rPr>
-              <w:t xml:space="preserve">12:00</w:t>
+              <w:t xml:space="preserve">12:15</w:t>
             </w:r>
           </w:p>
         </w:tc>
@@ -2524,7 +2524,7 @@
                 <w:rFonts w:ascii="Calibri" w:cs="Calibri" w:eastAsia="Calibri" w:hAnsi="Calibri"/>
                 <w:lang w:val="fr-FR"/>
               </w:rPr>
-              <w:t xml:space="preserve">12:45</w:t>
+              <w:t xml:space="preserve">13:00</w:t>
             </w:r>
           </w:p>
         </w:tc>
@@ -2645,7 +2645,7 @@
                 <w:rFonts w:ascii="Calibri" w:cs="Calibri" w:eastAsia="Calibri" w:hAnsi="Calibri"/>
                 <w:lang w:val="fr-FR"/>
               </w:rPr>
-              <w:t xml:space="preserve">12:55</w:t>
+              <w:t xml:space="preserve">13:10</w:t>
             </w:r>
           </w:p>
         </w:tc>
@@ -2770,7 +2770,7 @@
                 <w:rFonts w:ascii="Calibri" w:cs="Calibri" w:eastAsia="Calibri" w:hAnsi="Calibri"/>
                 <w:lang w:val="fr-FR"/>
               </w:rPr>
-              <w:t xml:space="preserve">14:25</w:t>
+              <w:t xml:space="preserve">14:40</w:t>
             </w:r>
           </w:p>
         </w:tc>
@@ -2891,7 +2891,7 @@
                 <w:rFonts w:ascii="Calibri" w:cs="Calibri" w:eastAsia="Calibri" w:hAnsi="Calibri"/>
                 <w:lang w:val="fr-FR"/>
               </w:rPr>
-              <w:t xml:space="preserve">17:25</w:t>
+              <w:t xml:space="preserve">17:40</w:t>
             </w:r>
           </w:p>
         </w:tc>
@@ -3016,7 +3016,7 @@
                 <w:rFonts w:ascii="Calibri" w:cs="Calibri" w:eastAsia="Calibri" w:hAnsi="Calibri"/>
                 <w:lang w:val="fr-FR"/>
               </w:rPr>
-              <w:t xml:space="preserve">19:55</w:t>
+              <w:t xml:space="preserve">20:10</w:t>
             </w:r>
           </w:p>
         </w:tc>
@@ -3137,7 +3137,7 @@
                 <w:rFonts w:ascii="Calibri" w:cs="Calibri" w:eastAsia="Calibri" w:hAnsi="Calibri"/>
                 <w:lang w:val="fr-FR"/>
               </w:rPr>
-              <w:t xml:space="preserve">22:25</w:t>
+              <w:t xml:space="preserve">22:40</w:t>
             </w:r>
           </w:p>
         </w:tc>
@@ -3262,7 +3262,7 @@
                 <w:rFonts w:ascii="Calibri" w:cs="Calibri" w:eastAsia="Calibri" w:hAnsi="Calibri"/>
                 <w:lang w:val="fr-FR"/>
               </w:rPr>
-              <w:t xml:space="preserve">23:55</w:t>
+              <w:t xml:space="preserve">24:10</w:t>
             </w:r>
           </w:p>
         </w:tc>
@@ -3383,7 +3383,7 @@
                 <w:rFonts w:ascii="Calibri" w:cs="Calibri" w:eastAsia="Calibri" w:hAnsi="Calibri"/>
                 <w:lang w:val="fr-FR"/>
               </w:rPr>
-              <w:t xml:space="preserve">24:05</w:t>
+              <w:t xml:space="preserve">24:20</w:t>
             </w:r>
           </w:p>
         </w:tc>
@@ -3508,7 +3508,7 @@
                 <w:rFonts w:ascii="Calibri" w:cs="Calibri" w:eastAsia="Calibri" w:hAnsi="Calibri"/>
                 <w:lang w:val="fr-FR"/>
               </w:rPr>
-              <w:t xml:space="preserve">25:05</w:t>
+              <w:t xml:space="preserve">25:20</w:t>
             </w:r>
           </w:p>
         </w:tc>
@@ -3629,7 +3629,7 @@
                 <w:rFonts w:ascii="Calibri" w:cs="Calibri" w:eastAsia="Calibri" w:hAnsi="Calibri"/>
                 <w:lang w:val="fr-FR"/>
               </w:rPr>
-              <w:t xml:space="preserve">27:05</w:t>
+              <w:t xml:space="preserve">27:20</w:t>
             </w:r>
           </w:p>
         </w:tc>
@@ -3754,7 +3754,7 @@
                 <w:rFonts w:ascii="Calibri" w:cs="Calibri" w:eastAsia="Calibri" w:hAnsi="Calibri"/>
                 <w:lang w:val="fr-FR"/>
               </w:rPr>
-              <w:t xml:space="preserve">28:35</w:t>
+              <w:t xml:space="preserve">28:50</w:t>
             </w:r>
           </w:p>
         </w:tc>
@@ -3875,7 +3875,7 @@
                 <w:rFonts w:ascii="Calibri" w:cs="Calibri" w:eastAsia="Calibri" w:hAnsi="Calibri"/>
                 <w:lang w:val="fr-FR"/>
               </w:rPr>
-              <w:t xml:space="preserve">30:35</w:t>
+              <w:t xml:space="preserve">30:50</w:t>
             </w:r>
           </w:p>
         </w:tc>
@@ -4000,7 +4000,7 @@
                 <w:rFonts w:ascii="Calibri" w:cs="Calibri" w:eastAsia="Calibri" w:hAnsi="Calibri"/>
                 <w:lang w:val="fr-FR"/>
               </w:rPr>
-              <w:t xml:space="preserve">33:35</w:t>
+              <w:t xml:space="preserve">33:50</w:t>
             </w:r>
           </w:p>
         </w:tc>
@@ -4121,7 +4121,7 @@
                 <w:rFonts w:ascii="Calibri" w:cs="Calibri" w:eastAsia="Calibri" w:hAnsi="Calibri"/>
                 <w:lang w:val="fr-FR"/>
               </w:rPr>
-              <w:t xml:space="preserve">34:50</w:t>
+              <w:t xml:space="preserve">35:05</w:t>
             </w:r>
           </w:p>
         </w:tc>
@@ -4246,7 +4246,7 @@
                 <w:rFonts w:ascii="Calibri" w:cs="Calibri" w:eastAsia="Calibri" w:hAnsi="Calibri"/>
                 <w:lang w:val="fr-FR"/>
               </w:rPr>
-              <w:t xml:space="preserve">37:20</w:t>
+              <w:t xml:space="preserve">37:35</w:t>
             </w:r>
           </w:p>
         </w:tc>
@@ -4367,7 +4367,7 @@
                 <w:rFonts w:ascii="Calibri" w:cs="Calibri" w:eastAsia="Calibri" w:hAnsi="Calibri"/>
                 <w:lang w:val="fr-FR"/>
               </w:rPr>
-              <w:t xml:space="preserve">38:50</w:t>
+              <w:t xml:space="preserve">39:05</w:t>
             </w:r>
           </w:p>
         </w:tc>
@@ -4492,7 +4492,7 @@
                 <w:rFonts w:ascii="Calibri" w:cs="Calibri" w:eastAsia="Calibri" w:hAnsi="Calibri"/>
                 <w:lang w:val="fr-FR"/>
               </w:rPr>
-              <w:t xml:space="preserve">39:00</w:t>
+              <w:t xml:space="preserve">39:15</w:t>
             </w:r>
           </w:p>
         </w:tc>
@@ -4613,7 +4613,7 @@
                 <w:rFonts w:ascii="Calibri" w:cs="Calibri" w:eastAsia="Calibri" w:hAnsi="Calibri"/>
                 <w:lang w:val="fr-FR"/>
               </w:rPr>
-              <w:t xml:space="preserve">41:30</w:t>
+              <w:t xml:space="preserve">41:45</w:t>
             </w:r>
           </w:p>
         </w:tc>
@@ -4738,7 +4738,7 @@
                 <w:rFonts w:ascii="Calibri" w:cs="Calibri" w:eastAsia="Calibri" w:hAnsi="Calibri"/>
                 <w:lang w:val="fr-FR"/>
               </w:rPr>
-              <w:t xml:space="preserve">42:00</w:t>
+              <w:t xml:space="preserve">42:15</w:t>
             </w:r>
           </w:p>
         </w:tc>
@@ -4859,7 +4859,7 @@
                 <w:rFonts w:ascii="Calibri" w:cs="Calibri" w:eastAsia="Calibri" w:hAnsi="Calibri"/>
                 <w:lang w:val="fr-FR"/>
               </w:rPr>
-              <w:t xml:space="preserve">42:40</w:t>
+              <w:t xml:space="preserve">42:55</w:t>
             </w:r>
           </w:p>
         </w:tc>
@@ -4984,7 +4984,7 @@
                 <w:rFonts w:ascii="Calibri" w:cs="Calibri" w:eastAsia="Calibri" w:hAnsi="Calibri"/>
                 <w:lang w:val="fr-FR"/>
               </w:rPr>
-              <w:t xml:space="preserve">43:00</w:t>
+              <w:t xml:space="preserve">43:15</w:t>
             </w:r>
           </w:p>
         </w:tc>
@@ -5105,7 +5105,7 @@
                 <w:rFonts w:ascii="Calibri" w:cs="Calibri" w:eastAsia="Calibri" w:hAnsi="Calibri"/>
                 <w:lang w:val="fr-FR"/>
               </w:rPr>
-              <w:t xml:space="preserve">43:40</w:t>
+              <w:t xml:space="preserve">43:55</w:t>
             </w:r>
           </w:p>
         </w:tc>
@@ -5230,7 +5230,7 @@
                 <w:rFonts w:ascii="Calibri" w:cs="Calibri" w:eastAsia="Calibri" w:hAnsi="Calibri"/>
                 <w:lang w:val="fr-FR"/>
               </w:rPr>
-              <w:t xml:space="preserve">44:00</w:t>
+              <w:t xml:space="preserve">44:15</w:t>
             </w:r>
           </w:p>
         </w:tc>
@@ -5351,7 +5351,7 @@
                 <w:rFonts w:ascii="Calibri" w:cs="Calibri" w:eastAsia="Calibri" w:hAnsi="Calibri"/>
                 <w:lang w:val="fr-FR"/>
               </w:rPr>
-              <w:t xml:space="preserve">44:40</w:t>
+              <w:t xml:space="preserve">44:55</w:t>
             </w:r>
           </w:p>
         </w:tc>
@@ -5476,7 +5476,7 @@
                 <w:rFonts w:ascii="Calibri" w:cs="Calibri" w:eastAsia="Calibri" w:hAnsi="Calibri"/>
                 <w:lang w:val="fr-FR"/>
               </w:rPr>
-              <w:t xml:space="preserve">45:00</w:t>
+              <w:t xml:space="preserve">45:15</w:t>
             </w:r>
           </w:p>
         </w:tc>
@@ -5597,7 +5597,7 @@
                 <w:rFonts w:ascii="Calibri" w:cs="Calibri" w:eastAsia="Calibri" w:hAnsi="Calibri"/>
                 <w:lang w:val="fr-FR"/>
               </w:rPr>
-              <w:t xml:space="preserve">45:40</w:t>
+              <w:t xml:space="preserve">45:55</w:t>
             </w:r>
           </w:p>
         </w:tc>
@@ -5722,7 +5722,7 @@
                 <w:rFonts w:ascii="Calibri" w:cs="Calibri" w:eastAsia="Calibri" w:hAnsi="Calibri"/>
                 <w:lang w:val="fr-FR"/>
               </w:rPr>
-              <w:t xml:space="preserve">46:00</w:t>
+              <w:t xml:space="preserve">46:15</w:t>
             </w:r>
           </w:p>
         </w:tc>
@@ -5843,7 +5843,7 @@
                 <w:rFonts w:ascii="Calibri" w:cs="Calibri" w:eastAsia="Calibri" w:hAnsi="Calibri"/>
                 <w:lang w:val="fr-FR"/>
               </w:rPr>
-              <w:t xml:space="preserve">46:40</w:t>
+              <w:t xml:space="preserve">46:55</w:t>
             </w:r>
           </w:p>
         </w:tc>
@@ -5968,7 +5968,7 @@
                 <w:rFonts w:ascii="Calibri" w:cs="Calibri" w:eastAsia="Calibri" w:hAnsi="Calibri"/>
                 <w:lang w:val="fr-FR"/>
               </w:rPr>
-              <w:t xml:space="preserve">47:00</w:t>
+              <w:t xml:space="preserve">47:15</w:t>
             </w:r>
           </w:p>
         </w:tc>
@@ -6089,7 +6089,7 @@
                 <w:rFonts w:ascii="Calibri" w:cs="Calibri" w:eastAsia="Calibri" w:hAnsi="Calibri"/>
                 <w:lang w:val="fr-FR"/>
               </w:rPr>
-              <w:t xml:space="preserve">47:40</w:t>
+              <w:t xml:space="preserve">47:55</w:t>
             </w:r>
           </w:p>
         </w:tc>
@@ -6214,7 +6214,7 @@
                 <w:rFonts w:ascii="Calibri" w:cs="Calibri" w:eastAsia="Calibri" w:hAnsi="Calibri"/>
                 <w:lang w:val="fr-FR"/>
               </w:rPr>
-              <w:t xml:space="preserve">48:00</w:t>
+              <w:t xml:space="preserve">48:15</w:t>
             </w:r>
           </w:p>
         </w:tc>
@@ -6335,7 +6335,7 @@
                 <w:rFonts w:ascii="Calibri" w:cs="Calibri" w:eastAsia="Calibri" w:hAnsi="Calibri"/>
                 <w:lang w:val="fr-FR"/>
               </w:rPr>
-              <w:t xml:space="preserve">48:40</w:t>
+              <w:t xml:space="preserve">48:55</w:t>
             </w:r>
           </w:p>
         </w:tc>
@@ -6460,7 +6460,7 @@
                 <w:rFonts w:ascii="Calibri" w:cs="Calibri" w:eastAsia="Calibri" w:hAnsi="Calibri"/>
                 <w:lang w:val="fr-FR"/>
               </w:rPr>
-              <w:t xml:space="preserve">49:00</w:t>
+              <w:t xml:space="preserve">49:15</w:t>
             </w:r>
           </w:p>
         </w:tc>
@@ -6581,7 +6581,7 @@
                 <w:rFonts w:ascii="Calibri" w:cs="Calibri" w:eastAsia="Calibri" w:hAnsi="Calibri"/>
                 <w:lang w:val="fr-FR"/>
               </w:rPr>
-              <w:t xml:space="preserve">49:40</w:t>
+              <w:t xml:space="preserve">49:55</w:t>
             </w:r>
           </w:p>
         </w:tc>
@@ -6706,7 +6706,7 @@
                 <w:rFonts w:ascii="Calibri" w:cs="Calibri" w:eastAsia="Calibri" w:hAnsi="Calibri"/>
                 <w:lang w:val="fr-FR"/>
               </w:rPr>
-              <w:t xml:space="preserve">50:00</w:t>
+              <w:t xml:space="preserve">50:15</w:t>
             </w:r>
           </w:p>
         </w:tc>
@@ -6827,7 +6827,7 @@
                 <w:rFonts w:ascii="Calibri" w:cs="Calibri" w:eastAsia="Calibri" w:hAnsi="Calibri"/>
                 <w:lang w:val="fr-FR"/>
               </w:rPr>
-              <w:t xml:space="preserve">50:40</w:t>
+              <w:t xml:space="preserve">50:55</w:t>
             </w:r>
           </w:p>
         </w:tc>
@@ -6952,7 +6952,7 @@
                 <w:rFonts w:ascii="Calibri" w:cs="Calibri" w:eastAsia="Calibri" w:hAnsi="Calibri"/>
                 <w:lang w:val="fr-FR"/>
               </w:rPr>
-              <w:t xml:space="preserve">51:00</w:t>
+              <w:t xml:space="preserve">51:15</w:t>
             </w:r>
           </w:p>
         </w:tc>
@@ -7073,7 +7073,7 @@
                 <w:rFonts w:ascii="Calibri" w:cs="Calibri" w:eastAsia="Calibri" w:hAnsi="Calibri"/>
                 <w:lang w:val="fr-FR"/>
               </w:rPr>
-              <w:t xml:space="preserve">52:30</w:t>
+              <w:t xml:space="preserve">52:45</w:t>
             </w:r>
           </w:p>
         </w:tc>
@@ -7955,7 +7955,7 @@
           <w:rFonts w:ascii="Calibri" w:cs="Calibri" w:eastAsia="Calibri" w:hAnsi="Calibri"/>
           <w:lang w:val="fr-FR"/>
         </w:rPr>
-        <w:t xml:space="preserve">Donner une image mentale simple et durable de la skill.</w:t>
+        <w:t xml:space="preserve">Donner une image mentale simple et exacte de la façon dont Claude utilise une skill : trois niveaux de lecture.</w:t>
       </w:r>
     </w:p>
     <w:p>
@@ -7978,7 +7978,7 @@
           <w:rFonts w:ascii="Calibri" w:cs="Calibri" w:eastAsia="Calibri" w:hAnsi="Calibri"/>
           <w:lang w:val="fr-FR"/>
         </w:rPr>
-        <w:t xml:space="preserve">1:15</w:t>
+        <w:t xml:space="preserve">1:30</w:t>
       </w:r>
     </w:p>
     <w:p>
@@ -8003,7 +8003,7 @@
           <w:rFonts w:ascii="Calibri" w:cs="Calibri" w:eastAsia="Calibri" w:hAnsi="Calibri"/>
           <w:lang w:val="fr-FR"/>
         </w:rPr>
-        <w:t xml:space="preserve">Imaginez un classeur de fiches méthode posé à côté de Claude. Sur chaque fiche : un titre, une phrase qui dit quand s'en servir, puis la marche à suivre. Au début de chaque conversation, Claude ne lit que les titres et ces petites phrases. Ça ne lui coûte presque rien, donc vous pouvez avoir beaucoup de fiches. Quand vous demandez « fais-moi le compte rendu de cette réunion », il reconnaît la fiche qui correspond, la sort du classeur et suit la méthode. Les autres fiches restent fermées. C'est ce qui rend les skills efficaces : elles ne surchargent pas Claude, elles arrivent au bon moment. Et vous n'avez pas à y penser : c'est Claude qui va chercher la fiche. Vous pouvez aussi l'appeler vous-même en tapant « / » dans la zone de message.</w:t>
+        <w:t xml:space="preserve">Imaginez un classeur de fiches méthode posé à côté de Claude. L'aide officielle de Claude décrit précisément comment il s'en sert, en trois niveaux. Niveau 1 : pour chaque skill activée, Claude a toujours sous les yeux le nom et la description, c'est-à-dire l'onglet de la fiche et la phrase qui dit quand s'en servir. Juste assez pour savoir quand la skill est utile, sans charger tout son contenu ; c'est pour cela qu'on peut avoir beaucoup de skills sans encombrer Claude. Niveau 2 : quand votre demande correspond à une description (« fais-moi le compte rendu de cette réunion »), Claude sort la fiche et lit la méthode, le corps du fichier SKILL.md. Niveau 3 : si la méthode ne suffit pas, il consulte les fichiers annexes rangés avec la fiche, un modèle, un exemple, une grille, et seulement ceux dont il a besoin. Les autres fiches restent fermées. Deux conséquences pratiques. D'abord, tout se joue au niveau 1 : une description floue, et la fiche n'est jamais sortie du classeur. Ensuite, on peut mettre beaucoup de détails dans les annexes sans alourdir le travail de Claude, à condition que la méthode dise quand les lire. Vous n'avez rien à faire pour déclencher tout cela : Claude va chercher la fiche tout seul. Vous pouvez aussi l'appeler vous-même en tapant « / » dans la zone de message.</w:t>
       </w:r>
     </w:p>
     <w:p>
@@ -22408,7 +22408,7 @@
         </w:numPr>
         <w:spacing w:after="60"/>
       </w:pPr>
-      <w:hyperlink w:history="1" r:id="rIdqymik_cbfoild7doxkvts">
+      <w:hyperlink w:history="1" r:id="rIdqxziv5kfqehl7y67-f_uf">
         <w:r>
           <w:rPr>
             <w:rStyle w:val="Hyperlink"/>
@@ -22438,7 +22438,7 @@
         </w:numPr>
         <w:spacing w:after="60"/>
       </w:pPr>
-      <w:hyperlink w:history="1" r:id="rIdebt2j7qirn8kx1pkbayge">
+      <w:hyperlink w:history="1" r:id="rIdf3h01s5sxtkxtqsiac3wj">
         <w:r>
           <w:rPr>
             <w:rStyle w:val="Hyperlink"/>
@@ -22468,7 +22468,7 @@
         </w:numPr>
         <w:spacing w:after="60"/>
       </w:pPr>
-      <w:hyperlink w:history="1" r:id="rIdiccew9h9cryc-vbsupqtd">
+      <w:hyperlink w:history="1" r:id="rIdk0bejcx1w91nxw5cencbd">
         <w:r>
           <w:rPr>
             <w:rStyle w:val="Hyperlink"/>
@@ -22498,7 +22498,7 @@
         </w:numPr>
         <w:spacing w:after="60"/>
       </w:pPr>
-      <w:hyperlink w:history="1" r:id="rIdr9bxrcsl_lwa4caasdbzf">
+      <w:hyperlink w:history="1" r:id="rIdzkkagrjr3o0p5xuwsewkg">
         <w:r>
           <w:rPr>
             <w:rStyle w:val="Hyperlink"/>
@@ -22528,7 +22528,7 @@
         </w:numPr>
         <w:spacing w:after="60"/>
       </w:pPr>
-      <w:hyperlink w:history="1" r:id="rId4cms_czmyyf1vepg0n-ot">
+      <w:hyperlink w:history="1" r:id="rIdvyngvzuaf8tb2rj6ejruk">
         <w:r>
           <w:rPr>
             <w:rStyle w:val="Hyperlink"/>
@@ -22558,7 +22558,7 @@
         </w:numPr>
         <w:spacing w:after="60"/>
       </w:pPr>
-      <w:hyperlink w:history="1" r:id="rIdu-o-_mtrcuaoxjdcosngr">
+      <w:hyperlink w:history="1" r:id="rIdigm7t85ugipfzzwq-aig2">
         <w:r>
           <w:rPr>
             <w:rStyle w:val="Hyperlink"/>
@@ -22588,7 +22588,7 @@
         </w:numPr>
         <w:spacing w:after="60"/>
       </w:pPr>
-      <w:hyperlink w:history="1" r:id="rIdr1tkg_xsmi1vamvhciuvu">
+      <w:hyperlink w:history="1" r:id="rIdurce3vpdfehppdqbgcsoh">
         <w:r>
           <w:rPr>
             <w:rStyle w:val="Hyperlink"/>
@@ -22618,7 +22618,7 @@
         </w:numPr>
         <w:spacing w:after="60"/>
       </w:pPr>
-      <w:hyperlink w:history="1" r:id="rIdyzt7pqehlqib3jkohq1jl">
+      <w:hyperlink w:history="1" r:id="rIdrdpx1ss5iwshcm0slee8b">
         <w:r>
           <w:rPr>
             <w:rStyle w:val="Hyperlink"/>
@@ -22648,7 +22648,7 @@
         </w:numPr>
         <w:spacing w:after="60"/>
       </w:pPr>
-      <w:hyperlink w:history="1" r:id="rIds7_iu2o2kwxmrdu7yfpda">
+      <w:hyperlink w:history="1" r:id="rIdoizszqihp1zytgg7ntmg5">
         <w:r>
           <w:rPr>
             <w:rStyle w:val="Hyperlink"/>
@@ -22678,7 +22678,7 @@
         </w:numPr>
         <w:spacing w:after="60"/>
       </w:pPr>
-      <w:hyperlink w:history="1" r:id="rIdofvkg95sjyumrjs13zwjj">
+      <w:hyperlink w:history="1" r:id="rIdizm2jv2lg4idostzxdmlg">
         <w:r>
           <w:rPr>
             <w:rStyle w:val="Hyperlink"/>
@@ -22708,7 +22708,7 @@
         </w:numPr>
         <w:spacing w:after="60"/>
       </w:pPr>
-      <w:hyperlink w:history="1" r:id="rIdyf6k0d4jdq2nkedb2l2w5">
+      <w:hyperlink w:history="1" r:id="rIdnsoa575slpakwgufxj7dn">
         <w:r>
           <w:rPr>
             <w:rStyle w:val="Hyperlink"/>
@@ -22738,7 +22738,7 @@
         </w:numPr>
         <w:spacing w:after="60"/>
       </w:pPr>
-      <w:hyperlink w:history="1" r:id="rIdafxfsdwjbht3nkxszrso_">
+      <w:hyperlink w:history="1" r:id="rIdrp9awnrhcph6pi_ar8bwk">
         <w:r>
           <w:rPr>
             <w:rStyle w:val="Hyperlink"/>
@@ -22768,7 +22768,7 @@
         </w:numPr>
         <w:spacing w:after="60"/>
       </w:pPr>
-      <w:hyperlink w:history="1" r:id="rIds5gsvfp135rj5ic_01dxc">
+      <w:hyperlink w:history="1" r:id="rIdlzpnp9lfvdhjhjiaj77wk">
         <w:r>
           <w:rPr>
             <w:rStyle w:val="Hyperlink"/>
@@ -22798,7 +22798,7 @@
         </w:numPr>
         <w:spacing w:after="60"/>
       </w:pPr>
-      <w:hyperlink w:history="1" r:id="rIdd-luong_ggz4wonbob-la">
+      <w:hyperlink w:history="1" r:id="rId0rmn_ik7brex0yqfy0ryn">
         <w:r>
           <w:rPr>
             <w:rStyle w:val="Hyperlink"/>
@@ -22828,7 +22828,7 @@
         </w:numPr>
         <w:spacing w:after="60"/>
       </w:pPr>
-      <w:hyperlink w:history="1" r:id="rIdrzuczfatw-k-mlnsvmkvu">
+      <w:hyperlink w:history="1" r:id="rIdx48qeoflt83buxiaysujg">
         <w:r>
           <w:rPr>
             <w:rStyle w:val="Hyperlink"/>
@@ -22858,7 +22858,7 @@
         </w:numPr>
         <w:spacing w:after="60"/>
       </w:pPr>
-      <w:hyperlink w:history="1" r:id="rIdfgtv_aexlcbiwxudtjywq">
+      <w:hyperlink w:history="1" r:id="rIdtfqelvlj_ay-bj359l5fc">
         <w:r>
           <w:rPr>
             <w:rStyle w:val="Hyperlink"/>
@@ -23103,7 +23103,7 @@
         </w:rPr>
         <w:t xml:space="preserve">Source : </w:t>
       </w:r>
-      <w:hyperlink w:history="1" r:id="rIdujtjlx906mvtqy2uisaba">
+      <w:hyperlink w:history="1" r:id="rIdysvpdnzjwddlnifi78pnx">
         <w:r>
           <w:rPr>
             <w:rStyle w:val="Hyperlink"/>

</xml_diff>

<commit_message>
Notes présentateur : durée d'ouverture, déroulé et transition vers skill-creator
Co-Authored-By: Claude Opus 5.5 <noreply@anthropic.com>
</commit_message>
<xml_diff>
--- a/skills-claude-notes-presentateur.docx
+++ b/skills-claude-notes-presentateur.docx
@@ -111,7 +111,7 @@
         </w:rPr>
         <w:t xml:space="preserve">LinkedIn : </w:t>
       </w:r>
-      <w:hyperlink w:history="1" r:id="rIdvojymihjscvn7wabotnem">
+      <w:hyperlink w:history="1" r:id="rId7yiy1digtz0eqtid9ge0y">
         <w:r>
           <w:rPr>
             <w:rStyle w:val="Hyperlink"/>
@@ -142,7 +142,7 @@
         </w:rPr>
         <w:t xml:space="preserve">GitHub : </w:t>
       </w:r>
-      <w:hyperlink w:history="1" r:id="rIdy-lh7ll05a1lfsyaiwxqc">
+      <w:hyperlink w:history="1" r:id="rIdsumqvxbflayow63ci62rs">
         <w:r>
           <w:rPr>
             <w:rStyle w:val="Hyperlink"/>
@@ -182,7 +182,7 @@
         <w:pStyle w:val="Body"/>
         <w:spacing w:after="120"/>
       </w:pPr>
-      <w:hyperlink w:history="1" r:id="rIdxwltursev-x6foxy_ggvn">
+      <w:hyperlink w:history="1" r:id="rIdr89uuukrgf8gfcrencueh">
         <w:r>
           <w:rPr>
             <w:rStyle w:val="Hyperlink"/>
@@ -7367,7 +7367,7 @@
           <w:rFonts w:ascii="Calibri" w:cs="Calibri" w:eastAsia="Calibri" w:hAnsi="Calibri"/>
           <w:lang w:val="fr-FR"/>
         </w:rPr>
-        <w:t xml:space="preserve">Bonjour à toutes et à tous. Pendant trente minutes, on va parler d'une fonction de Claude qui change la façon de travailler avec lui : les skills, qu'on peut traduire par « compétences ». Pas besoin de savoir coder : si vous savez expliquer une tâche à un nouveau collègue, vous savez créer une skill. Le déroulé : d'abord comprendre ce que c'est, ensuite voir où en trouver, puis comment en créer et en partager une. On finit par un petit quiz où vous répondrez à voix haute, et juste après, vous passez à la pratique sur vos propres cas.</w:t>
+        <w:t xml:space="preserve">Bonjour à toutes et à tous. Pendant une petite heure, on va parler d'une fonction de Claude qui change la façon de travailler avec lui : les skills, qu'on peut traduire par « compétences ». Pas besoin de savoir coder : si vous savez expliquer une tâche à un nouveau collègue, vous savez créer une skill. Le déroulé : d'abord comprendre ce que c'est, ensuite voir où en trouver, puis choisir où la créer (Chat, Cowork ou Code, avec le mode plan pour ne rien casser), la créer avec skill-creator, la skill d'Anthropic qui fabrique les skills, et enfin la partager. On finit par un petit quiz où vous répondrez à voix haute, et juste après, vous passez à la pratique sur vos propres cas.</w:t>
       </w:r>
     </w:p>
     <w:p>
@@ -10731,7 +10731,7 @@
           <w:rFonts w:ascii="Calibri" w:cs="Calibri" w:eastAsia="Calibri" w:hAnsi="Calibri"/>
           <w:lang w:val="fr-FR"/>
         </w:rPr>
-        <w:t xml:space="preserve">Je vous montre à quoi ça ressemble en vrai.</w:t>
+        <w:t xml:space="preserve">L'étape 3, concrètement, qui la fait ? Une skill : skill-creator.</w:t>
       </w:r>
     </w:p>
     <w:p>
@@ -22408,7 +22408,7 @@
         </w:numPr>
         <w:spacing w:after="60"/>
       </w:pPr>
-      <w:hyperlink w:history="1" r:id="rIdqxziv5kfqehl7y67-f_uf">
+      <w:hyperlink w:history="1" r:id="rId8llg00n82eg3ammwb9y-b">
         <w:r>
           <w:rPr>
             <w:rStyle w:val="Hyperlink"/>
@@ -22438,7 +22438,7 @@
         </w:numPr>
         <w:spacing w:after="60"/>
       </w:pPr>
-      <w:hyperlink w:history="1" r:id="rIdf3h01s5sxtkxtqsiac3wj">
+      <w:hyperlink w:history="1" r:id="rIdhs2hrokg7hc96rbpwu2p4">
         <w:r>
           <w:rPr>
             <w:rStyle w:val="Hyperlink"/>
@@ -22468,7 +22468,7 @@
         </w:numPr>
         <w:spacing w:after="60"/>
       </w:pPr>
-      <w:hyperlink w:history="1" r:id="rIdk0bejcx1w91nxw5cencbd">
+      <w:hyperlink w:history="1" r:id="rIdsx8vhxqpu-agdscq2ewre">
         <w:r>
           <w:rPr>
             <w:rStyle w:val="Hyperlink"/>
@@ -22498,7 +22498,7 @@
         </w:numPr>
         <w:spacing w:after="60"/>
       </w:pPr>
-      <w:hyperlink w:history="1" r:id="rIdzkkagrjr3o0p5xuwsewkg">
+      <w:hyperlink w:history="1" r:id="rId0bito5na_rsqbyw_0q_wb">
         <w:r>
           <w:rPr>
             <w:rStyle w:val="Hyperlink"/>
@@ -22528,7 +22528,7 @@
         </w:numPr>
         <w:spacing w:after="60"/>
       </w:pPr>
-      <w:hyperlink w:history="1" r:id="rIdvyngvzuaf8tb2rj6ejruk">
+      <w:hyperlink w:history="1" r:id="rIdrvpuvniqjqvosl-koqj3n">
         <w:r>
           <w:rPr>
             <w:rStyle w:val="Hyperlink"/>
@@ -22558,7 +22558,7 @@
         </w:numPr>
         <w:spacing w:after="60"/>
       </w:pPr>
-      <w:hyperlink w:history="1" r:id="rIdigm7t85ugipfzzwq-aig2">
+      <w:hyperlink w:history="1" r:id="rIdhwt8gll1oqv3rbeus8bps">
         <w:r>
           <w:rPr>
             <w:rStyle w:val="Hyperlink"/>
@@ -22588,7 +22588,7 @@
         </w:numPr>
         <w:spacing w:after="60"/>
       </w:pPr>
-      <w:hyperlink w:history="1" r:id="rIdurce3vpdfehppdqbgcsoh">
+      <w:hyperlink w:history="1" r:id="rIdnlrduuo_rmhu-jgjqg5-0">
         <w:r>
           <w:rPr>
             <w:rStyle w:val="Hyperlink"/>
@@ -22618,7 +22618,7 @@
         </w:numPr>
         <w:spacing w:after="60"/>
       </w:pPr>
-      <w:hyperlink w:history="1" r:id="rIdrdpx1ss5iwshcm0slee8b">
+      <w:hyperlink w:history="1" r:id="rIdfplkj0zqp9is5bw0jat9g">
         <w:r>
           <w:rPr>
             <w:rStyle w:val="Hyperlink"/>
@@ -22648,7 +22648,7 @@
         </w:numPr>
         <w:spacing w:after="60"/>
       </w:pPr>
-      <w:hyperlink w:history="1" r:id="rIdoizszqihp1zytgg7ntmg5">
+      <w:hyperlink w:history="1" r:id="rIdppke_qkn41pevmrlzpepj">
         <w:r>
           <w:rPr>
             <w:rStyle w:val="Hyperlink"/>
@@ -22678,7 +22678,7 @@
         </w:numPr>
         <w:spacing w:after="60"/>
       </w:pPr>
-      <w:hyperlink w:history="1" r:id="rIdizm2jv2lg4idostzxdmlg">
+      <w:hyperlink w:history="1" r:id="rIdvfr3yil2lpryacnyqq8e4">
         <w:r>
           <w:rPr>
             <w:rStyle w:val="Hyperlink"/>
@@ -22708,7 +22708,7 @@
         </w:numPr>
         <w:spacing w:after="60"/>
       </w:pPr>
-      <w:hyperlink w:history="1" r:id="rIdnsoa575slpakwgufxj7dn">
+      <w:hyperlink w:history="1" r:id="rIdfrwwk8sjgzi8jdlkszq6t">
         <w:r>
           <w:rPr>
             <w:rStyle w:val="Hyperlink"/>
@@ -22738,7 +22738,7 @@
         </w:numPr>
         <w:spacing w:after="60"/>
       </w:pPr>
-      <w:hyperlink w:history="1" r:id="rIdrp9awnrhcph6pi_ar8bwk">
+      <w:hyperlink w:history="1" r:id="rId_2o4escdhowvoxcnuk5fn">
         <w:r>
           <w:rPr>
             <w:rStyle w:val="Hyperlink"/>
@@ -22768,7 +22768,7 @@
         </w:numPr>
         <w:spacing w:after="60"/>
       </w:pPr>
-      <w:hyperlink w:history="1" r:id="rIdlzpnp9lfvdhjhjiaj77wk">
+      <w:hyperlink w:history="1" r:id="rIdn6xxpdel9zeuabuqwtnzr">
         <w:r>
           <w:rPr>
             <w:rStyle w:val="Hyperlink"/>
@@ -22798,7 +22798,7 @@
         </w:numPr>
         <w:spacing w:after="60"/>
       </w:pPr>
-      <w:hyperlink w:history="1" r:id="rId0rmn_ik7brex0yqfy0ryn">
+      <w:hyperlink w:history="1" r:id="rIdsablvgqcdkzbjcgx634eo">
         <w:r>
           <w:rPr>
             <w:rStyle w:val="Hyperlink"/>
@@ -22828,7 +22828,7 @@
         </w:numPr>
         <w:spacing w:after="60"/>
       </w:pPr>
-      <w:hyperlink w:history="1" r:id="rIdx48qeoflt83buxiaysujg">
+      <w:hyperlink w:history="1" r:id="rIdnyahrwpmq9l743c-91ajt">
         <w:r>
           <w:rPr>
             <w:rStyle w:val="Hyperlink"/>
@@ -22858,7 +22858,7 @@
         </w:numPr>
         <w:spacing w:after="60"/>
       </w:pPr>
-      <w:hyperlink w:history="1" r:id="rIdtfqelvlj_ay-bj359l5fc">
+      <w:hyperlink w:history="1" r:id="rIdegotqfap1pq5kowkv6dxl">
         <w:r>
           <w:rPr>
             <w:rStyle w:val="Hyperlink"/>
@@ -23103,7 +23103,7 @@
         </w:rPr>
         <w:t xml:space="preserve">Source : </w:t>
       </w:r>
-      <w:hyperlink w:history="1" r:id="rIdysvpdnzjwddlnifi78pnx">
+      <w:hyperlink w:history="1" r:id="rIdvp8gq4uy_ntlsvdi6touq">
         <w:r>
           <w:rPr>
             <w:rStyle w:val="Hyperlink"/>

</xml_diff>